<commit_message>
Clarify ERP production calculation in TZ
</commit_message>
<xml_diff>
--- a/docs/TZ_ERP_1C_Akt_Sverki_Matrix.docx
+++ b/docs/TZ_ERP_1C_Akt_Sverki_Matrix.docx
@@ -320,7 +320,7 @@
                 <w:color w:val="1E1E1E"/>
                 <w:sz w:val="17"/>
               </w:rPr>
-              <w:t>PostgreSQL, Google Drive/Sheets, отдельный Python-модуль, замена действующего ERP-интерфейса.</w:t>
+              <w:t>отдельный Python-модуль, новая БД, замена действующего ERP-интерфейса, внешние аналитические источники как часть production-расчета.</w:t>
             </w:r>
           </w:p>
         </w:tc>
@@ -436,7 +436,7 @@
                 <w:color w:val="1E1E1E"/>
                 <w:sz w:val="19"/>
               </w:rPr>
-              <w:t>Матрица не должна подтягивать внешний Google Sheet как источник данных. Google-таблица используется только как исторический референс формы и логики. Производственный расчет должен воспроизводиться из MariaDB ERP и подтверждаться существующим сервисом 1С.</w:t>
+              <w:t>Матрица должна считать данные из MariaDB ERP и подтверждать их существующим сервисом 1С. Внешние аналитические файлы могут использоваться только для ручной проверки корректности расчетов и не входят в production-логику.</w:t>
             </w:r>
           </w:p>
         </w:tc>
@@ -3949,7 +3949,7 @@
                 <w:color w:val="1E1E1E"/>
                 <w:sz w:val="16"/>
               </w:rPr>
-              <w:t>`veda_akts_details_opers.f_sum` и/или прямой акт по операции</w:t>
+              <w:t>`get_realizsum` по реализации/актам и деталям операции</w:t>
             </w:r>
           </w:p>
         </w:tc>
@@ -4059,7 +4059,7 @@
                 <w:color w:val="1E1E1E"/>
                 <w:sz w:val="16"/>
               </w:rPr>
-              <w:t>`settlements.control_non_reimbursable_total` / `get_realizsum/get_profit`</w:t>
+              <w:t>`get_realizsum` по клиентской реализации, при необходимости контроль `get_profit`</w:t>
             </w:r>
           </w:p>
         </w:tc>
@@ -5105,7 +5105,7 @@
                 <w:color w:val="1E1E1E"/>
                 <w:sz w:val="15"/>
               </w:rPr>
-              <w:t>оплаты - возмещаемые - невозмещаемые</w:t>
+              <w:t>поступления - реализация</w:t>
             </w:r>
           </w:p>
         </w:tc>
@@ -5132,7 +5132,7 @@
                 <w:color w:val="1E1E1E"/>
                 <w:sz w:val="15"/>
               </w:rPr>
-              <w:t>для родительских строк сумма дочерних поставок.</w:t>
+              <w:t>сальдо поставки: дельта между распределенными поступлениями и реализацией (`get_realizsum`) по поставке.</w:t>
             </w:r>
           </w:p>
         </w:tc>
@@ -6911,7 +6911,7 @@
           <w:color w:val="1E1E1E"/>
           <w:sz w:val="21"/>
         </w:rPr>
-        <w:t>Копирование в буфер должно формировать плоский TSV: значения объединенных ячеек повторяются в каждой строке, чтобы бухгалтер мог вставить данные в Excel/Google Sheets без потери контекста.</w:t>
+        <w:t>Копирование в буфер должно формировать плоский TSV: значения объединенных ячеек повторяются в каждой строке, чтобы бухгалтер мог вставить данные в Excel без потери контекста.</w:t>
       </w:r>
     </w:p>
     <w:p>
@@ -7550,7 +7550,7 @@
           <w:color w:val="1E1E1E"/>
           <w:sz w:val="21"/>
         </w:rPr>
-        <w:t>Проверка выполнялась на свежих поставках договора 660/1, а не на историческом 2020 годе. Google Sheet использовался как референс формы; итоговый расчет ниже воспроизводится из MariaDB ERP.</w:t>
+        <w:t>Проверка выполнялась на свежих поставках договора 660/1. Итоговый расчет ниже воспроизводится из MariaDB ERP и должен совпадать с production-логикой PHP.</w:t>
       </w:r>
     </w:p>
     <w:tbl>
@@ -7900,7 +7900,7 @@
                 <w:color w:val="1E1E1E"/>
                 <w:sz w:val="16"/>
               </w:rPr>
-              <w:t>оплата 2 268 353,17; возмещаемые 2 152 392,27; невозмещаемые 196 372,85; дельта -80 411,95</w:t>
+              <w:t>поступления 2 268 353,17; реализация/get_realizsum: возмещаемые 2 152 392,27 и невозмещаемые 196 372,85; сальдо -80 411,95</w:t>
             </w:r>
           </w:p>
         </w:tc>
@@ -9807,7 +9807,7 @@
           <w:rFonts w:ascii="Calibri" w:hAnsi="Calibri"/>
           <w:sz w:val="20"/>
         </w:rPr>
-        <w:t>Свежий кейс 660/1 воспроизводит итоги: оплата 2 268 353,17; возм. 2 152 392,27; невозм. 196 372,85; дельта -80 411,95.</w:t>
+        <w:t>Свежий кейс 660/1 воспроизводит итоги: поступления 2 268 353,17; реализация/get_realizsum 2 348 765,12; сальдо -80 411,95.</w:t>
       </w:r>
     </w:p>
     <w:p>

</xml_diff>

<commit_message>
Add live MariaDB reconciliation validation
</commit_message>
<xml_diff>
--- a/docs/TZ_ERP_1C_Akt_Sverki_Matrix.docx
+++ b/docs/TZ_ERP_1C_Akt_Sverki_Matrix.docx
@@ -3676,7 +3676,7 @@
           <w:color w:val="282828"/>
           <w:sz w:val="15"/>
         </w:rPr>
-        <w:t>JOIN veda_acchist ah ON ah.f_id = ahd.f_achid</w:t>
+        <w:t>JOIN veda_acchist ah ON ah.f_id = ahd.f_acchistid</w:t>
       </w:r>
       <w:r>
         <w:br/>
@@ -4005,7 +4005,7 @@
                 <w:color w:val="1E1E1E"/>
                 <w:sz w:val="16"/>
               </w:rPr>
-              <w:t>Невозмещаемые клиентские</w:t>
+              <w:t>Невозмещаемые</w:t>
             </w:r>
           </w:p>
         </w:tc>
@@ -4032,7 +4032,7 @@
                 <w:color w:val="1E1E1E"/>
                 <w:sz w:val="16"/>
               </w:rPr>
-              <w:t>f_isvozm = 2 + прямой клиентский акт/реализация</w:t>
+              <w:t>f_isvozm = 2</w:t>
             </w:r>
           </w:p>
         </w:tc>
@@ -4059,7 +4059,7 @@
                 <w:color w:val="1E1E1E"/>
                 <w:sz w:val="16"/>
               </w:rPr>
-              <w:t>`get_realizsum` по клиентской реализации, при необходимости контроль `get_profit`</w:t>
+              <w:t>`get_realizsum` по реализации/актам и деталям операции</w:t>
             </w:r>
           </w:p>
         </w:tc>
@@ -4142,7 +4142,7 @@
                 <w:color w:val="1E1E1E"/>
                 <w:sz w:val="16"/>
               </w:rPr>
-              <w:t>f_isvozm = 2 через `veda_akts_details_opers`</w:t>
+              <w:t>подрядная себестоимость без клиентской реализации</w:t>
             </w:r>
           </w:p>
         </w:tc>
@@ -4856,7 +4856,7 @@
                 <w:color w:val="1E1E1E"/>
                 <w:sz w:val="15"/>
               </w:rPr>
-              <w:t>f_isvozm=1, детали актов/операций</w:t>
+              <w:t>`get_realizsum`, f_isvozm=1</w:t>
             </w:r>
           </w:p>
         </w:tc>
@@ -4939,7 +4939,7 @@
                 <w:color w:val="1E1E1E"/>
                 <w:sz w:val="15"/>
               </w:rPr>
-              <w:t>клиентские невозмещаемые начисления, не подрядчик</w:t>
+              <w:t>`get_realizsum`, f_isvozm=2</w:t>
             </w:r>
           </w:p>
         </w:tc>
@@ -4966,7 +4966,7 @@
                 <w:color w:val="1E1E1E"/>
                 <w:sz w:val="15"/>
               </w:rPr>
-              <w:t>f_isvozm=2 из расходов подрядчика не включать.</w:t>
+              <w:t>подрядные расходы без клиентской реализации не включать.</w:t>
             </w:r>
           </w:p>
         </w:tc>
@@ -6372,7 +6372,7 @@
           <w:color w:val="1E1E1E"/>
           <w:sz w:val="21"/>
         </w:rPr>
-        <w:t>Excel не должен быть простым экспортом экранной матрицы. Требуется бухгалтерская форма как в референсе: счета и оплаты идут строками, а расходы, СФ/УПД и дельта объединяются по количеству строк счетов внутри спецификации.</w:t>
+        <w:t>Excel не должен быть простым экспортом экранной матрицы. Требуется бухгалтерская форма: счета и оплаты идут строками, а расходы, СФ/УПД и дельта объединяются по количеству строк счетов внутри спецификации.</w:t>
       </w:r>
     </w:p>
     <w:tbl>
@@ -6922,7 +6922,7 @@
       <w:r>
         <w:drawing>
           <wp:inline xmlns:a="http://schemas.openxmlformats.org/drawingml/2006/main" xmlns:pic="http://schemas.openxmlformats.org/drawingml/2006/picture">
-            <wp:extent cx="5760720" cy="3750381"/>
+            <wp:extent cx="5760720" cy="6971541"/>
             <wp:docPr id="3" name="Picture 3"/>
             <wp:cNvGraphicFramePr>
               <a:graphicFrameLocks noChangeAspect="1"/>
@@ -6931,7 +6931,7 @@
               <a:graphicData uri="http://schemas.openxmlformats.org/drawingml/2006/picture">
                 <pic:pic>
                   <pic:nvPicPr>
-                    <pic:cNvPr id="0" name="aero_trade_660_1_fresh_export.png"/>
+                    <pic:cNvPr id="0" name="aero_trade_660_1_live_export.png"/>
                     <pic:cNvPicPr/>
                   </pic:nvPicPr>
                   <pic:blipFill>
@@ -6943,7 +6943,7 @@
                   <pic:spPr>
                     <a:xfrm>
                       <a:off x="0" y="0"/>
-                      <a:ext cx="5760720" cy="3750381"/>
+                      <a:ext cx="5760720" cy="6971541"/>
                     </a:xfrm>
                     <a:prstGeom prst="rect"/>
                   </pic:spPr>
@@ -7900,7 +7900,7 @@
                 <w:color w:val="1E1E1E"/>
                 <w:sz w:val="16"/>
               </w:rPr>
-              <w:t>поступления 2 268 353,17; реализация/get_realizsum: возмещаемые 2 152 392,27 и невозмещаемые 196 372,85; сальдо -80 411,95</w:t>
+              <w:t>поступления/get_paidsum 2 331 111,33; реализация/get_realizsum: возмещаемые 2 152 392,27 и невозмещаемые 263 133,46; сальдо -84 414,40</w:t>
             </w:r>
           </w:p>
         </w:tc>
@@ -7956,7 +7956,7 @@
                 <w:color w:val="1E1E1E"/>
                 <w:sz w:val="16"/>
               </w:rPr>
-              <w:t>расходы подрядчика `f_isvozm=2` через details_opers исключаются из взаиморасчета, но логируются</w:t>
+              <w:t>`get_paidsum` совпал с `SUM(veda_acchist_docs.f_clssum)`; подрядные расходы без клиентской реализации исключаются из взаиморасчета, но логируются</w:t>
             </w:r>
           </w:p>
         </w:tc>
@@ -8125,7 +8125,7 @@
                 <w:color w:val="1F4D78"/>
                 <w:sz w:val="15"/>
               </w:rPr>
-              <w:t>Исключено</w:t>
+              <w:t>Реализация</w:t>
             </w:r>
           </w:p>
         </w:tc>
@@ -8212,7 +8212,7 @@
                 <w:color w:val="1E1E1E"/>
                 <w:sz w:val="15"/>
               </w:rPr>
-              <w:t>174 585,57</w:t>
+              <w:t>199 375,04</w:t>
             </w:r>
           </w:p>
         </w:tc>
@@ -8268,7 +8268,7 @@
                 <w:color w:val="1E1E1E"/>
                 <w:sz w:val="15"/>
               </w:rPr>
-              <w:t>14 900,65</w:t>
+              <w:t>41 275,82</w:t>
             </w:r>
           </w:p>
         </w:tc>
@@ -8296,7 +8296,7 @@
                 <w:color w:val="1E1E1E"/>
                 <w:sz w:val="15"/>
               </w:rPr>
-              <w:t>1 980,91</w:t>
+              <w:t>226 457,70</w:t>
             </w:r>
           </w:p>
         </w:tc>
@@ -8324,7 +8324,7 @@
                 <w:color w:val="1E1E1E"/>
                 <w:sz w:val="15"/>
               </w:rPr>
-              <w:t>-25 496,96</w:t>
+              <w:t>-27 082,66</w:t>
             </w:r>
           </w:p>
         </w:tc>
@@ -8382,7 +8382,7 @@
                 <w:color w:val="1E1E1E"/>
                 <w:sz w:val="15"/>
               </w:rPr>
-              <w:t>117 446,61</w:t>
+              <w:t>134 234,42</w:t>
             </w:r>
           </w:p>
         </w:tc>
@@ -8438,7 +8438,7 @@
                 <w:color w:val="1E1E1E"/>
                 <w:sz w:val="15"/>
               </w:rPr>
-              <w:t>10 027,64</w:t>
+              <w:t>27 882,63</w:t>
             </w:r>
           </w:p>
         </w:tc>
@@ -8466,7 +8466,7 @@
                 <w:color w:val="1E1E1E"/>
                 <w:sz w:val="15"/>
               </w:rPr>
-              <w:t>1 333,16</w:t>
+              <w:t>152 460,30</w:t>
             </w:r>
           </w:p>
         </w:tc>
@@ -8494,7 +8494,7 @@
                 <w:color w:val="1E1E1E"/>
                 <w:sz w:val="15"/>
               </w:rPr>
-              <w:t>-17 158,70</w:t>
+              <w:t>-18 225,88</w:t>
             </w:r>
           </w:p>
         </w:tc>
@@ -8552,7 +8552,7 @@
                 <w:color w:val="1E1E1E"/>
                 <w:sz w:val="15"/>
               </w:rPr>
-              <w:t>149 336,16</w:t>
+              <w:t>170 517,04</w:t>
             </w:r>
           </w:p>
         </w:tc>
@@ -8608,7 +8608,7 @@
                 <w:color w:val="1E1E1E"/>
                 <w:sz w:val="15"/>
               </w:rPr>
-              <w:t>12 681,23</w:t>
+              <w:t>35 211,68</w:t>
             </w:r>
           </w:p>
         </w:tc>
@@ -8636,7 +8636,7 @@
                 <w:color w:val="1E1E1E"/>
                 <w:sz w:val="15"/>
               </w:rPr>
-              <w:t>1 685,93</w:t>
+              <w:t>193 566,13</w:t>
             </w:r>
           </w:p>
         </w:tc>
@@ -8664,7 +8664,7 @@
                 <w:color w:val="1E1E1E"/>
                 <w:sz w:val="15"/>
               </w:rPr>
-              <w:t>-21 699,52</w:t>
+              <w:t>-23 049,09</w:t>
             </w:r>
           </w:p>
         </w:tc>
@@ -8806,7 +8806,7 @@
                 <w:color w:val="1E1E1E"/>
                 <w:sz w:val="15"/>
               </w:rPr>
-              <w:t>5 000,00</w:t>
+              <w:t>452 879,51</w:t>
             </w:r>
           </w:p>
         </w:tc>
@@ -8976,7 +8976,7 @@
                 <w:color w:val="1E1E1E"/>
                 <w:sz w:val="15"/>
               </w:rPr>
-              <w:t>3 543,41</w:t>
+              <w:t>313 918,98</w:t>
             </w:r>
           </w:p>
         </w:tc>
@@ -9146,7 +9146,7 @@
                 <w:color w:val="1E1E1E"/>
                 <w:sz w:val="15"/>
               </w:rPr>
-              <w:t>1 456,59</w:t>
+              <w:t>129 072,24</w:t>
             </w:r>
           </w:p>
         </w:tc>
@@ -9316,7 +9316,7 @@
                 <w:color w:val="1E1E1E"/>
                 <w:sz w:val="15"/>
               </w:rPr>
-              <w:t>5 000,00</w:t>
+              <w:t>452 879,51</w:t>
             </w:r>
           </w:p>
         </w:tc>
@@ -9486,7 +9486,7 @@
                 <w:color w:val="1E1E1E"/>
                 <w:sz w:val="15"/>
               </w:rPr>
-              <w:t>5 000,00</w:t>
+              <w:t>494 291,36</w:t>
             </w:r>
           </w:p>
         </w:tc>
@@ -9572,7 +9572,7 @@
                 <w:color w:val="1E1E1E"/>
                 <w:sz w:val="15"/>
               </w:rPr>
-              <w:t>2 268 353,17</w:t>
+              <w:t>2 331 111,33</w:t>
             </w:r>
           </w:p>
         </w:tc>
@@ -9628,7 +9628,7 @@
                 <w:color w:val="1E1E1E"/>
                 <w:sz w:val="15"/>
               </w:rPr>
-              <w:t>196 372,85</w:t>
+              <w:t>263 133,46</w:t>
             </w:r>
           </w:p>
         </w:tc>
@@ -9656,7 +9656,7 @@
                 <w:color w:val="1E1E1E"/>
                 <w:sz w:val="15"/>
               </w:rPr>
-              <w:t>25 000,00</w:t>
+              <w:t>2 415 525,73</w:t>
             </w:r>
           </w:p>
         </w:tc>
@@ -9684,7 +9684,7 @@
                 <w:color w:val="1E1E1E"/>
                 <w:sz w:val="15"/>
               </w:rPr>
-              <w:t>-80 411,95</w:t>
+              <w:t>-84 414,40</w:t>
             </w:r>
           </w:p>
         </w:tc>
@@ -9731,7 +9731,7 @@
                 <w:color w:val="1F4D78"/>
                 <w:sz w:val="20"/>
               </w:rPr>
-              <w:t>Критичный пример</w:t>
+              <w:t>Проверка источника</w:t>
             </w:r>
           </w:p>
           <w:p>
@@ -9744,7 +9744,7 @@
                 <w:color w:val="1E1E1E"/>
                 <w:sz w:val="19"/>
               </w:rPr>
-              <w:t>Для поставки 1063 сумма 3 091,01 по доп. отчету берется из `veda_akts_details_opers.f_sum` для операции 378519, акта 14837, детали 184531. Если брать только основной отчет или только `veda_corrects_opers`, расчет будет неполным.</w:t>
+              <w:t>Контрольный JSON и XLSX собраны серверным скриптом из MariaDB ERP. Для каждой поставки проверено равенство `get_paidsum` и распределенной оплаты `SUM(veda_acchist_docs.f_clssum)`, а дельта рассчитана как `SUM(get_paidsum) - SUM(get_realizsum)`.</w:t>
             </w:r>
           </w:p>
         </w:tc>
@@ -9807,7 +9807,7 @@
           <w:rFonts w:ascii="Calibri" w:hAnsi="Calibri"/>
           <w:sz w:val="20"/>
         </w:rPr>
-        <w:t>Свежий кейс 660/1 воспроизводит итоги: поступления 2 268 353,17; реализация/get_realizsum 2 348 765,12; сальдо -80 411,95.</w:t>
+        <w:t>Свежий кейс 660/1 воспроизводит live-итоги MariaDB: поступления/get_paidsum 2 331 111,33; реализация/get_realizsum 2 415 525,73; сальдо -84 414,40.</w:t>
       </w:r>
     </w:p>
     <w:p>
@@ -9833,7 +9833,7 @@
           <w:rFonts w:ascii="Calibri" w:hAnsi="Calibri"/>
           <w:sz w:val="20"/>
         </w:rPr>
-        <w:t>`f_isvozm=1` идет в возмещаемые расходы; `f_isvozm=2` клиентских начислений идет в невозмещаемые; `f_isvozm=2` расходов подрядчика исключается из сальдо.</w:t>
+        <w:t>`f_isvozm=1` идет в возмещаемые расходы; `f_isvozm=2` идет в невозмещаемые расходы через `get_realizsum`; подрядные расходы без клиентской реализации исключаются из сальдо.</w:t>
       </w:r>
     </w:p>
     <w:p>
@@ -9885,7 +9885,7 @@
           <w:rFonts w:ascii="Calibri" w:hAnsi="Calibri"/>
           <w:sz w:val="20"/>
         </w:rPr>
-        <w:t>Автотесты reference-модуля проходят: `npm test` по текущему PR.</w:t>
+        <w:t>Автотесты live-валидации проходят: `npm test` по текущему PR.</w:t>
       </w:r>
     </w:p>
     <w:sectPr>

</xml_diff>

<commit_message>
Document matrix and XLSX build algorithm
</commit_message>
<xml_diff>
--- a/docs/TZ_ERP_1C_Akt_Sverki_Matrix.docx
+++ b/docs/TZ_ERP_1C_Akt_Sverki_Matrix.docx
@@ -4257,6 +4257,1816 @@
                 <w:sz w:val="19"/>
               </w:rPr>
               <w:t>Если услуга подрядчика отражена в 1С как расходы компании на вкладке `Услуги` с субконто `Агентское вознаграждение / Услуги сторонних организаций`, договор клиента нельзя искусственно подтягивать в взаиморасчет. Такая строка подтверждает себестоимость, но не должна менять сальдо клиента.</w:t>
+            </w:r>
+          </w:p>
+        </w:tc>
+      </w:tr>
+    </w:tbl>
+    <w:p>
+      <w:pPr>
+        <w:spacing w:after="40"/>
+      </w:pPr>
+    </w:p>
+    <w:p>
+      <w:pPr>
+        <w:pStyle w:val="Heading2"/>
+        <w:keepNext/>
+      </w:pPr>
+      <w:r/>
+      <w:r>
+        <w:rPr>
+          <w:rFonts w:ascii="Calibri" w:hAnsi="Calibri"/>
+          <w:b/>
+          <w:color w:val="2E74B5"/>
+          <w:sz w:val="26"/>
+        </w:rPr>
+        <w:t>5.5 Сквозной алгоритм для PHP-разработчика</w:t>
+      </w:r>
+    </w:p>
+    <w:p>
+      <w:pPr>
+        <w:spacing w:before="0" w:after="120" w:line="300" w:lineRule="auto"/>
+      </w:pPr>
+      <w:r>
+        <w:rPr>
+          <w:rFonts w:ascii="Calibri" w:hAnsi="Calibri"/>
+          <w:color w:val="1E1E1E"/>
+          <w:sz w:val="21"/>
+        </w:rPr>
+        <w:t>Матрица должна строиться не из Excel и не из внешнего файла. Источник экрана и XLSX - один нормализованный массив блоков поставок. Ниже указано, какие данные собрать, что агрегировать и в какие колонки положить.</w:t>
+      </w:r>
+    </w:p>
+    <w:tbl>
+      <w:tblGrid>
+        <w:gridCol w:w="700"/>
+        <w:gridCol w:w="4380"/>
+        <w:gridCol w:w="4280"/>
+      </w:tblGrid>
+      <w:tblPr>
+        <w:tblStyle w:val="TableGrid"/>
+        <w:tblW w:type="dxa" w:w="9360"/>
+        <w:tblLayout w:type="fixed"/>
+        <w:tblLook w:firstColumn="1" w:firstRow="1" w:lastColumn="0" w:lastRow="0" w:noHBand="0" w:noVBand="1" w:val="04A0"/>
+        <w:tblInd w:w="120" w:type="dxa"/>
+      </w:tblPr>
+      <w:tr>
+        <w:tc>
+          <w:tcPr>
+            <w:tcW w:type="dxa" w:w="700"/>
+            <w:tcMar>
+              <w:top w:w="80" w:type="dxa"/>
+              <w:start w:w="120" w:type="dxa"/>
+              <w:bottom w:w="80" w:type="dxa"/>
+              <w:end w:w="120" w:type="dxa"/>
+            </w:tcMar>
+            <w:vAlign w:val="center"/>
+            <w:shd w:fill="E8EEF5"/>
+          </w:tcPr>
+          <w:p>
+            <w:pPr>
+              <w:spacing w:before="0" w:after="0" w:line="252" w:lineRule="auto"/>
+              <w:jc w:val="center"/>
+            </w:pPr>
+            <w:r/>
+            <w:r>
+              <w:rPr>
+                <w:rFonts w:ascii="Calibri" w:hAnsi="Calibri"/>
+                <w:b/>
+                <w:color w:val="1F4D78"/>
+                <w:sz w:val="14"/>
+              </w:rPr>
+              <w:t>Шаг</w:t>
+            </w:r>
+          </w:p>
+        </w:tc>
+        <w:tc>
+          <w:tcPr>
+            <w:tcW w:type="dxa" w:w="4380"/>
+            <w:tcMar>
+              <w:top w:w="80" w:type="dxa"/>
+              <w:start w:w="120" w:type="dxa"/>
+              <w:bottom w:w="80" w:type="dxa"/>
+              <w:end w:w="120" w:type="dxa"/>
+            </w:tcMar>
+            <w:vAlign w:val="center"/>
+            <w:shd w:fill="E8EEF5"/>
+          </w:tcPr>
+          <w:p>
+            <w:pPr>
+              <w:spacing w:before="0" w:after="0" w:line="252" w:lineRule="auto"/>
+              <w:jc w:val="center"/>
+            </w:pPr>
+            <w:r/>
+            <w:r>
+              <w:rPr>
+                <w:rFonts w:ascii="Calibri" w:hAnsi="Calibri"/>
+                <w:b/>
+                <w:color w:val="1F4D78"/>
+                <w:sz w:val="14"/>
+              </w:rPr>
+              <w:t>Данные / запрос</w:t>
+            </w:r>
+          </w:p>
+        </w:tc>
+        <w:tc>
+          <w:tcPr>
+            <w:tcW w:type="dxa" w:w="4280"/>
+            <w:tcMar>
+              <w:top w:w="80" w:type="dxa"/>
+              <w:start w:w="120" w:type="dxa"/>
+              <w:bottom w:w="80" w:type="dxa"/>
+              <w:end w:w="120" w:type="dxa"/>
+            </w:tcMar>
+            <w:vAlign w:val="center"/>
+            <w:shd w:fill="E8EEF5"/>
+          </w:tcPr>
+          <w:p>
+            <w:pPr>
+              <w:spacing w:before="0" w:after="0" w:line="252" w:lineRule="auto"/>
+              <w:jc w:val="center"/>
+            </w:pPr>
+            <w:r/>
+            <w:r>
+              <w:rPr>
+                <w:rFonts w:ascii="Calibri" w:hAnsi="Calibri"/>
+                <w:b/>
+                <w:color w:val="1F4D78"/>
+                <w:sz w:val="14"/>
+              </w:rPr>
+              <w:t>Что сохранить в блоке поставки</w:t>
+            </w:r>
+          </w:p>
+        </w:tc>
+      </w:tr>
+      <w:tr>
+        <w:tc>
+          <w:tcPr>
+            <w:tcW w:type="dxa" w:w="700"/>
+            <w:tcMar>
+              <w:top w:w="80" w:type="dxa"/>
+              <w:start w:w="120" w:type="dxa"/>
+              <w:bottom w:w="80" w:type="dxa"/>
+              <w:end w:w="120" w:type="dxa"/>
+            </w:tcMar>
+            <w:vAlign w:val="center"/>
+          </w:tcPr>
+          <w:p>
+            <w:pPr>
+              <w:spacing w:before="0" w:after="0" w:line="252" w:lineRule="auto"/>
+            </w:pPr>
+            <w:r/>
+            <w:r>
+              <w:rPr>
+                <w:rFonts w:ascii="Calibri" w:hAnsi="Calibri"/>
+                <w:b w:val="0"/>
+                <w:color w:val="1E1E1E"/>
+                <w:sz w:val="14"/>
+              </w:rPr>
+              <w:t>1. Контекст</w:t>
+            </w:r>
+          </w:p>
+        </w:tc>
+        <w:tc>
+          <w:tcPr>
+            <w:tcW w:type="dxa" w:w="4380"/>
+            <w:tcMar>
+              <w:top w:w="80" w:type="dxa"/>
+              <w:start w:w="120" w:type="dxa"/>
+              <w:bottom w:w="80" w:type="dxa"/>
+              <w:end w:w="120" w:type="dxa"/>
+            </w:tcMar>
+            <w:vAlign w:val="center"/>
+          </w:tcPr>
+          <w:p>
+            <w:pPr>
+              <w:spacing w:before="0" w:after="0" w:line="252" w:lineRule="auto"/>
+            </w:pPr>
+            <w:r/>
+            <w:r>
+              <w:rPr>
+                <w:rFonts w:ascii="Calibri" w:hAnsi="Calibri"/>
+                <w:b w:val="0"/>
+                <w:color w:val="1E1E1E"/>
+                <w:sz w:val="14"/>
+              </w:rPr>
+              <w:t>`veda_contacts -&gt; veda_clients -&gt; veda_dogs -&gt; veda_specs`; фильтры `contact_id`, `client_id`, `dog_id`, период или список `spec_id/f_num`.</w:t>
+            </w:r>
+          </w:p>
+        </w:tc>
+        <w:tc>
+          <w:tcPr>
+            <w:tcW w:type="dxa" w:w="4280"/>
+            <w:tcMar>
+              <w:top w:w="80" w:type="dxa"/>
+              <w:start w:w="120" w:type="dxa"/>
+              <w:bottom w:w="80" w:type="dxa"/>
+              <w:end w:w="120" w:type="dxa"/>
+            </w:tcMar>
+            <w:vAlign w:val="center"/>
+          </w:tcPr>
+          <w:p>
+            <w:pPr>
+              <w:spacing w:before="0" w:after="0" w:line="252" w:lineRule="auto"/>
+            </w:pPr>
+            <w:r/>
+            <w:r>
+              <w:rPr>
+                <w:rFonts w:ascii="Calibri" w:hAnsi="Calibri"/>
+                <w:b w:val="0"/>
+                <w:color w:val="1E1E1E"/>
+                <w:sz w:val="14"/>
+              </w:rPr>
+              <w:t>`contact`, `legal`, `dog`, `spec`: id, название, ИНН, номер договора, код 1С, номер/дата поставки.</w:t>
+            </w:r>
+          </w:p>
+        </w:tc>
+      </w:tr>
+      <w:tr>
+        <w:tc>
+          <w:tcPr>
+            <w:tcW w:type="dxa" w:w="700"/>
+            <w:tcMar>
+              <w:top w:w="80" w:type="dxa"/>
+              <w:start w:w="120" w:type="dxa"/>
+              <w:bottom w:w="80" w:type="dxa"/>
+              <w:end w:w="120" w:type="dxa"/>
+            </w:tcMar>
+            <w:vAlign w:val="center"/>
+          </w:tcPr>
+          <w:p>
+            <w:pPr>
+              <w:spacing w:before="0" w:after="0" w:line="252" w:lineRule="auto"/>
+            </w:pPr>
+            <w:r/>
+            <w:r>
+              <w:rPr>
+                <w:rFonts w:ascii="Calibri" w:hAnsi="Calibri"/>
+                <w:b w:val="0"/>
+                <w:color w:val="1E1E1E"/>
+                <w:sz w:val="14"/>
+              </w:rPr>
+              <w:t>2. Операции</w:t>
+            </w:r>
+          </w:p>
+        </w:tc>
+        <w:tc>
+          <w:tcPr>
+            <w:tcW w:type="dxa" w:w="4380"/>
+            <w:tcMar>
+              <w:top w:w="80" w:type="dxa"/>
+              <w:start w:w="120" w:type="dxa"/>
+              <w:bottom w:w="80" w:type="dxa"/>
+              <w:end w:w="120" w:type="dxa"/>
+            </w:tcMar>
+            <w:vAlign w:val="center"/>
+          </w:tcPr>
+          <w:p>
+            <w:pPr>
+              <w:spacing w:before="0" w:after="0" w:line="252" w:lineRule="auto"/>
+            </w:pPr>
+            <w:r/>
+            <w:r>
+              <w:rPr>
+                <w:rFonts w:ascii="Calibri" w:hAnsi="Calibri"/>
+                <w:b w:val="0"/>
+                <w:color w:val="1E1E1E"/>
+                <w:sz w:val="14"/>
+              </w:rPr>
+              <w:t>`veda_spec_invoices` по `f_parenttype=2` и по `f_parenttype=4` через `veda_categs(f_ctgtype=24, f_objecttype=5)`.</w:t>
+            </w:r>
+          </w:p>
+        </w:tc>
+        <w:tc>
+          <w:tcPr>
+            <w:tcW w:type="dxa" w:w="4280"/>
+            <w:tcMar>
+              <w:top w:w="80" w:type="dxa"/>
+              <w:start w:w="120" w:type="dxa"/>
+              <w:bottom w:w="80" w:type="dxa"/>
+              <w:end w:w="120" w:type="dxa"/>
+            </w:tcMar>
+            <w:vAlign w:val="center"/>
+          </w:tcPr>
+          <w:p>
+            <w:pPr>
+              <w:spacing w:before="0" w:after="0" w:line="252" w:lineRule="auto"/>
+            </w:pPr>
+            <w:r/>
+            <w:r>
+              <w:rPr>
+                <w:rFonts w:ascii="Calibri" w:hAnsi="Calibri"/>
+                <w:b w:val="0"/>
+                <w:color w:val="1E1E1E"/>
+                <w:sz w:val="14"/>
+              </w:rPr>
+              <w:t>`operations[]`: `oper_id`, тип операции, `f_isvozm`, НДС, `get_paidsum`, `get_realizsum`, `get_expensessum`, `get_profit`.</w:t>
+            </w:r>
+          </w:p>
+        </w:tc>
+      </w:tr>
+      <w:tr>
+        <w:tc>
+          <w:tcPr>
+            <w:tcW w:type="dxa" w:w="700"/>
+            <w:tcMar>
+              <w:top w:w="80" w:type="dxa"/>
+              <w:start w:w="120" w:type="dxa"/>
+              <w:bottom w:w="80" w:type="dxa"/>
+              <w:end w:w="120" w:type="dxa"/>
+            </w:tcMar>
+            <w:vAlign w:val="center"/>
+          </w:tcPr>
+          <w:p>
+            <w:pPr>
+              <w:spacing w:before="0" w:after="0" w:line="252" w:lineRule="auto"/>
+            </w:pPr>
+            <w:r/>
+            <w:r>
+              <w:rPr>
+                <w:rFonts w:ascii="Calibri" w:hAnsi="Calibri"/>
+                <w:b w:val="0"/>
+                <w:color w:val="1E1E1E"/>
+                <w:sz w:val="14"/>
+              </w:rPr>
+              <w:t>3. Счета</w:t>
+            </w:r>
+          </w:p>
+        </w:tc>
+        <w:tc>
+          <w:tcPr>
+            <w:tcW w:type="dxa" w:w="4380"/>
+            <w:tcMar>
+              <w:top w:w="80" w:type="dxa"/>
+              <w:start w:w="120" w:type="dxa"/>
+              <w:bottom w:w="80" w:type="dxa"/>
+              <w:end w:w="120" w:type="dxa"/>
+            </w:tcMar>
+            <w:vAlign w:val="center"/>
+          </w:tcPr>
+          <w:p>
+            <w:pPr>
+              <w:spacing w:before="0" w:after="0" w:line="252" w:lineRule="auto"/>
+            </w:pPr>
+            <w:r/>
+            <w:r>
+              <w:rPr>
+                <w:rFonts w:ascii="Calibri" w:hAnsi="Calibri"/>
+                <w:b w:val="0"/>
+                <w:color w:val="1E1E1E"/>
+                <w:sz w:val="14"/>
+              </w:rPr>
+              <w:t>Из `fetch_erp_docs(spec_id)` брать `doc_kind='schet'`, `type_name='Счет покупателю'`, `invoice_id=0`; при отдельном SQL - только `veda_schets.f_type=1` и основной счет.</w:t>
+            </w:r>
+          </w:p>
+        </w:tc>
+        <w:tc>
+          <w:tcPr>
+            <w:tcW w:type="dxa" w:w="4280"/>
+            <w:tcMar>
+              <w:top w:w="80" w:type="dxa"/>
+              <w:start w:w="120" w:type="dxa"/>
+              <w:bottom w:w="80" w:type="dxa"/>
+              <w:end w:w="120" w:type="dxa"/>
+            </w:tcMar>
+            <w:vAlign w:val="center"/>
+          </w:tcPr>
+          <w:p>
+            <w:pPr>
+              <w:spacing w:before="0" w:after="0" w:line="252" w:lineRule="auto"/>
+            </w:pPr>
+            <w:r/>
+            <w:r>
+              <w:rPr>
+                <w:rFonts w:ascii="Calibri" w:hAnsi="Calibri"/>
+                <w:b w:val="0"/>
+                <w:color w:val="1E1E1E"/>
+                <w:sz w:val="14"/>
+              </w:rPr>
+              <w:t>`customer_invoices[]`: номер, дата, сумма, валюта, код 1С. Счета поставщиков не добавлять.</w:t>
+            </w:r>
+          </w:p>
+        </w:tc>
+      </w:tr>
+      <w:tr>
+        <w:tc>
+          <w:tcPr>
+            <w:tcW w:type="dxa" w:w="700"/>
+            <w:tcMar>
+              <w:top w:w="80" w:type="dxa"/>
+              <w:start w:w="120" w:type="dxa"/>
+              <w:bottom w:w="80" w:type="dxa"/>
+              <w:end w:w="120" w:type="dxa"/>
+            </w:tcMar>
+            <w:vAlign w:val="center"/>
+          </w:tcPr>
+          <w:p>
+            <w:pPr>
+              <w:spacing w:before="0" w:after="0" w:line="252" w:lineRule="auto"/>
+            </w:pPr>
+            <w:r/>
+            <w:r>
+              <w:rPr>
+                <w:rFonts w:ascii="Calibri" w:hAnsi="Calibri"/>
+                <w:b w:val="0"/>
+                <w:color w:val="1E1E1E"/>
+                <w:sz w:val="14"/>
+              </w:rPr>
+              <w:t>4. Оплаты</w:t>
+            </w:r>
+          </w:p>
+        </w:tc>
+        <w:tc>
+          <w:tcPr>
+            <w:tcW w:type="dxa" w:w="4380"/>
+            <w:tcMar>
+              <w:top w:w="80" w:type="dxa"/>
+              <w:start w:w="120" w:type="dxa"/>
+              <w:bottom w:w="80" w:type="dxa"/>
+              <w:end w:w="120" w:type="dxa"/>
+            </w:tcMar>
+            <w:vAlign w:val="center"/>
+          </w:tcPr>
+          <w:p>
+            <w:pPr>
+              <w:spacing w:before="0" w:after="0" w:line="252" w:lineRule="auto"/>
+            </w:pPr>
+            <w:r/>
+            <w:r>
+              <w:rPr>
+                <w:rFonts w:ascii="Calibri" w:hAnsi="Calibri"/>
+                <w:b w:val="0"/>
+                <w:color w:val="1E1E1E"/>
+                <w:sz w:val="14"/>
+              </w:rPr>
+              <w:t>`SUM(veda_acchist_docs.f_clssum)` по `f_doctype=3`, `f_docid IN operation_ids`, `JOIN veda_acchist ON f_acchistid`, `ah.f_type=0`; контроль с `get_paidsum(oper_id)`.</w:t>
+            </w:r>
+          </w:p>
+        </w:tc>
+        <w:tc>
+          <w:tcPr>
+            <w:tcW w:type="dxa" w:w="4280"/>
+            <w:tcMar>
+              <w:top w:w="80" w:type="dxa"/>
+              <w:start w:w="120" w:type="dxa"/>
+              <w:bottom w:w="80" w:type="dxa"/>
+              <w:end w:w="120" w:type="dxa"/>
+            </w:tcMar>
+            <w:vAlign w:val="center"/>
+          </w:tcPr>
+          <w:p>
+            <w:pPr>
+              <w:spacing w:before="0" w:after="0" w:line="252" w:lineRule="auto"/>
+            </w:pPr>
+            <w:r/>
+            <w:r>
+              <w:rPr>
+                <w:rFonts w:ascii="Calibri" w:hAnsi="Calibri"/>
+                <w:b w:val="0"/>
+                <w:color w:val="1E1E1E"/>
+                <w:sz w:val="14"/>
+              </w:rPr>
+              <w:t>`paid_total_get_paidsum`, `paid_total_acchist_docs`; если различаются больше 0,01 - статус `PAYMENT_ROUTINE_VS_DOCS_MISMATCH`.</w:t>
+            </w:r>
+          </w:p>
+        </w:tc>
+      </w:tr>
+      <w:tr>
+        <w:tc>
+          <w:tcPr>
+            <w:tcW w:type="dxa" w:w="700"/>
+            <w:tcMar>
+              <w:top w:w="80" w:type="dxa"/>
+              <w:start w:w="120" w:type="dxa"/>
+              <w:bottom w:w="80" w:type="dxa"/>
+              <w:end w:w="120" w:type="dxa"/>
+            </w:tcMar>
+            <w:vAlign w:val="center"/>
+          </w:tcPr>
+          <w:p>
+            <w:pPr>
+              <w:spacing w:before="0" w:after="0" w:line="252" w:lineRule="auto"/>
+            </w:pPr>
+            <w:r/>
+            <w:r>
+              <w:rPr>
+                <w:rFonts w:ascii="Calibri" w:hAnsi="Calibri"/>
+                <w:b w:val="0"/>
+                <w:color w:val="1E1E1E"/>
+                <w:sz w:val="14"/>
+              </w:rPr>
+              <w:t>5. Реализация</w:t>
+            </w:r>
+          </w:p>
+        </w:tc>
+        <w:tc>
+          <w:tcPr>
+            <w:tcW w:type="dxa" w:w="4380"/>
+            <w:tcMar>
+              <w:top w:w="80" w:type="dxa"/>
+              <w:start w:w="120" w:type="dxa"/>
+              <w:bottom w:w="80" w:type="dxa"/>
+              <w:end w:w="120" w:type="dxa"/>
+            </w:tcMar>
+            <w:vAlign w:val="center"/>
+          </w:tcPr>
+          <w:p>
+            <w:pPr>
+              <w:spacing w:before="0" w:after="0" w:line="252" w:lineRule="auto"/>
+            </w:pPr>
+            <w:r/>
+            <w:r>
+              <w:rPr>
+                <w:rFonts w:ascii="Calibri" w:hAnsi="Calibri"/>
+                <w:b w:val="0"/>
+                <w:color w:val="1E1E1E"/>
+                <w:sz w:val="14"/>
+              </w:rPr>
+              <w:t>Для каждой операции взять `get_realizsum(oper_id)` и разделить по `veda_spec_invoices.f_isvozm`.</w:t>
+            </w:r>
+          </w:p>
+        </w:tc>
+        <w:tc>
+          <w:tcPr>
+            <w:tcW w:type="dxa" w:w="4280"/>
+            <w:tcMar>
+              <w:top w:w="80" w:type="dxa"/>
+              <w:start w:w="120" w:type="dxa"/>
+              <w:bottom w:w="80" w:type="dxa"/>
+              <w:end w:w="120" w:type="dxa"/>
+            </w:tcMar>
+            <w:vAlign w:val="center"/>
+          </w:tcPr>
+          <w:p>
+            <w:pPr>
+              <w:spacing w:before="0" w:after="0" w:line="252" w:lineRule="auto"/>
+            </w:pPr>
+            <w:r/>
+            <w:r>
+              <w:rPr>
+                <w:rFonts w:ascii="Calibri" w:hAnsi="Calibri"/>
+                <w:b w:val="0"/>
+                <w:color w:val="1E1E1E"/>
+                <w:sz w:val="14"/>
+              </w:rPr>
+              <w:t>`reimbursable = SUM(get_realizsum WHERE f_isvozm=1)`, `non_reimbursable = SUM(get_realizsum WHERE f_isvozm=2)`.</w:t>
+            </w:r>
+          </w:p>
+        </w:tc>
+      </w:tr>
+      <w:tr>
+        <w:tc>
+          <w:tcPr>
+            <w:tcW w:type="dxa" w:w="700"/>
+            <w:tcMar>
+              <w:top w:w="80" w:type="dxa"/>
+              <w:start w:w="120" w:type="dxa"/>
+              <w:bottom w:w="80" w:type="dxa"/>
+              <w:end w:w="120" w:type="dxa"/>
+            </w:tcMar>
+            <w:vAlign w:val="center"/>
+          </w:tcPr>
+          <w:p>
+            <w:pPr>
+              <w:spacing w:before="0" w:after="0" w:line="252" w:lineRule="auto"/>
+            </w:pPr>
+            <w:r/>
+            <w:r>
+              <w:rPr>
+                <w:rFonts w:ascii="Calibri" w:hAnsi="Calibri"/>
+                <w:b w:val="0"/>
+                <w:color w:val="1E1E1E"/>
+                <w:sz w:val="14"/>
+              </w:rPr>
+              <w:t>6. Закрывающие документы</w:t>
+            </w:r>
+          </w:p>
+        </w:tc>
+        <w:tc>
+          <w:tcPr>
+            <w:tcW w:type="dxa" w:w="4380"/>
+            <w:tcMar>
+              <w:top w:w="80" w:type="dxa"/>
+              <w:start w:w="120" w:type="dxa"/>
+              <w:bottom w:w="80" w:type="dxa"/>
+              <w:end w:w="120" w:type="dxa"/>
+            </w:tcMar>
+            <w:vAlign w:val="center"/>
+          </w:tcPr>
+          <w:p>
+            <w:pPr>
+              <w:spacing w:before="0" w:after="0" w:line="252" w:lineRule="auto"/>
+            </w:pPr>
+            <w:r/>
+            <w:r>
+              <w:rPr>
+                <w:rFonts w:ascii="Calibri" w:hAnsi="Calibri"/>
+                <w:b w:val="0"/>
+                <w:color w:val="1E1E1E"/>
+                <w:sz w:val="14"/>
+              </w:rPr>
+              <w:t>Из `fetch_erp_docs(spec_id)` брать `doc_kind='act'`; дедупликация по `code1c/number/date/sum`.</w:t>
+            </w:r>
+          </w:p>
+        </w:tc>
+        <w:tc>
+          <w:tcPr>
+            <w:tcW w:type="dxa" w:w="4280"/>
+            <w:tcMar>
+              <w:top w:w="80" w:type="dxa"/>
+              <w:start w:w="120" w:type="dxa"/>
+              <w:bottom w:w="80" w:type="dxa"/>
+              <w:end w:w="120" w:type="dxa"/>
+            </w:tcMar>
+            <w:vAlign w:val="center"/>
+          </w:tcPr>
+          <w:p>
+            <w:pPr>
+              <w:spacing w:before="0" w:after="0" w:line="252" w:lineRule="auto"/>
+            </w:pPr>
+            <w:r/>
+            <w:r>
+              <w:rPr>
+                <w:rFonts w:ascii="Calibri" w:hAnsi="Calibri"/>
+                <w:b w:val="0"/>
+                <w:color w:val="1E1E1E"/>
+                <w:sz w:val="14"/>
+              </w:rPr>
+              <w:t>`closing_docs[]`: каждый акт/УПД/СФ отдельной строкой; не сворачивать в `+N документов`.</w:t>
+            </w:r>
+          </w:p>
+        </w:tc>
+      </w:tr>
+      <w:tr>
+        <w:tc>
+          <w:tcPr>
+            <w:tcW w:type="dxa" w:w="700"/>
+            <w:tcMar>
+              <w:top w:w="80" w:type="dxa"/>
+              <w:start w:w="120" w:type="dxa"/>
+              <w:bottom w:w="80" w:type="dxa"/>
+              <w:end w:w="120" w:type="dxa"/>
+            </w:tcMar>
+            <w:vAlign w:val="center"/>
+          </w:tcPr>
+          <w:p>
+            <w:pPr>
+              <w:spacing w:before="0" w:after="0" w:line="252" w:lineRule="auto"/>
+            </w:pPr>
+            <w:r/>
+            <w:r>
+              <w:rPr>
+                <w:rFonts w:ascii="Calibri" w:hAnsi="Calibri"/>
+                <w:b w:val="0"/>
+                <w:color w:val="1E1E1E"/>
+                <w:sz w:val="14"/>
+              </w:rPr>
+              <w:t>7. Дельта</w:t>
+            </w:r>
+          </w:p>
+        </w:tc>
+        <w:tc>
+          <w:tcPr>
+            <w:tcW w:type="dxa" w:w="4380"/>
+            <w:tcMar>
+              <w:top w:w="80" w:type="dxa"/>
+              <w:start w:w="120" w:type="dxa"/>
+              <w:bottom w:w="80" w:type="dxa"/>
+              <w:end w:w="120" w:type="dxa"/>
+            </w:tcMar>
+            <w:vAlign w:val="center"/>
+          </w:tcPr>
+          <w:p>
+            <w:pPr>
+              <w:spacing w:before="0" w:after="0" w:line="252" w:lineRule="auto"/>
+            </w:pPr>
+            <w:r/>
+            <w:r>
+              <w:rPr>
+                <w:rFonts w:ascii="Calibri" w:hAnsi="Calibri"/>
+                <w:b w:val="0"/>
+                <w:color w:val="1E1E1E"/>
+                <w:sz w:val="14"/>
+              </w:rPr>
+              <w:t>`delta = SUM(get_paidsum) - SUM(get_realizsum)`.</w:t>
+            </w:r>
+          </w:p>
+        </w:tc>
+        <w:tc>
+          <w:tcPr>
+            <w:tcW w:type="dxa" w:w="4280"/>
+            <w:tcMar>
+              <w:top w:w="80" w:type="dxa"/>
+              <w:start w:w="120" w:type="dxa"/>
+              <w:bottom w:w="80" w:type="dxa"/>
+              <w:end w:w="120" w:type="dxa"/>
+            </w:tcMar>
+            <w:vAlign w:val="center"/>
+          </w:tcPr>
+          <w:p>
+            <w:pPr>
+              <w:spacing w:before="0" w:after="0" w:line="252" w:lineRule="auto"/>
+            </w:pPr>
+            <w:r/>
+            <w:r>
+              <w:rPr>
+                <w:rFonts w:ascii="Calibri" w:hAnsi="Calibri"/>
+                <w:b w:val="0"/>
+                <w:color w:val="1E1E1E"/>
+                <w:sz w:val="14"/>
+              </w:rPr>
+              <w:t>`settlement_delta_paid_minus_realization`; ненулевое значение - статус `SETTLEMENT_BALANCE_NONZERO`, а не ошибка SQL.</w:t>
+            </w:r>
+          </w:p>
+        </w:tc>
+      </w:tr>
+    </w:tbl>
+    <w:p>
+      <w:pPr>
+        <w:spacing w:after="40"/>
+      </w:pPr>
+    </w:p>
+    <w:p>
+      <w:pPr>
+        <w:spacing w:before="0" w:after="120" w:line="252" w:lineRule="auto"/>
+        <w:ind w:left="216"/>
+      </w:pPr>
+      <w:r>
+        <w:rPr>
+          <w:rFonts w:ascii="Courier New" w:hAnsi="Courier New"/>
+          <w:color w:val="282828"/>
+          <w:sz w:val="15"/>
+        </w:rPr>
+        <w:t>// PHP-структура, которую должен отдавать backend экрана и XLSX</w:t>
+      </w:r>
+      <w:r>
+        <w:br/>
+      </w:r>
+      <w:r>
+        <w:rPr>
+          <w:rFonts w:ascii="Courier New" w:hAnsi="Courier New"/>
+          <w:color w:val="282828"/>
+          <w:sz w:val="15"/>
+        </w:rPr>
+        <w:t>foreach ($specs as $spec) {</w:t>
+      </w:r>
+      <w:r>
+        <w:br/>
+      </w:r>
+      <w:r>
+        <w:rPr>
+          <w:rFonts w:ascii="Courier New" w:hAnsi="Courier New"/>
+          <w:color w:val="282828"/>
+          <w:sz w:val="15"/>
+        </w:rPr>
+        <w:t xml:space="preserve">    $operations = fetch_operations($spec['spec_id']); // f_parenttype 2/4</w:t>
+      </w:r>
+      <w:r>
+        <w:br/>
+      </w:r>
+      <w:r>
+        <w:rPr>
+          <w:rFonts w:ascii="Courier New" w:hAnsi="Courier New"/>
+          <w:color w:val="282828"/>
+          <w:sz w:val="15"/>
+        </w:rPr>
+        <w:t xml:space="preserve">    $docs       = fetch_erp_docs($spec['spec_id']);   // счета + акты/УПД/СФ</w:t>
+      </w:r>
+      <w:r>
+        <w:br/>
+      </w:r>
+      <w:r>
+        <w:rPr>
+          <w:rFonts w:ascii="Courier New" w:hAnsi="Courier New"/>
+          <w:color w:val="282828"/>
+          <w:sz w:val="15"/>
+        </w:rPr>
+        <w:t xml:space="preserve">    $payments   = fetch_payments($spec['spec_id']);   // veda_acchist_docs.f_clssum</w:t>
+      </w:r>
+      <w:r>
+        <w:br/>
+      </w:r>
+      <w:r>
+        <w:rPr>
+          <w:rFonts w:ascii="Courier New" w:hAnsi="Courier New"/>
+          <w:color w:val="282828"/>
+          <w:sz w:val="15"/>
+        </w:rPr>
+      </w:r>
+      <w:r>
+        <w:br/>
+      </w:r>
+      <w:r>
+        <w:rPr>
+          <w:rFonts w:ascii="Courier New" w:hAnsi="Courier New"/>
+          <w:color w:val="282828"/>
+          <w:sz w:val="15"/>
+        </w:rPr>
+        <w:t xml:space="preserve">    $customerInvoices = filter($docs, doc_kind='schet', type_name='Счет покупателю', invoice_id=0);</w:t>
+      </w:r>
+      <w:r>
+        <w:br/>
+      </w:r>
+      <w:r>
+        <w:rPr>
+          <w:rFonts w:ascii="Courier New" w:hAnsi="Courier New"/>
+          <w:color w:val="282828"/>
+          <w:sz w:val="15"/>
+        </w:rPr>
+        <w:t xml:space="preserve">    $closingDocs      = unique(filter($docs, doc_kind='act'), code1c, number, date, sum);</w:t>
+      </w:r>
+      <w:r>
+        <w:br/>
+      </w:r>
+      <w:r>
+        <w:rPr>
+          <w:rFonts w:ascii="Courier New" w:hAnsi="Courier New"/>
+          <w:color w:val="282828"/>
+          <w:sz w:val="15"/>
+        </w:rPr>
+      </w:r>
+      <w:r>
+        <w:br/>
+      </w:r>
+      <w:r>
+        <w:rPr>
+          <w:rFonts w:ascii="Courier New" w:hAnsi="Courier New"/>
+          <w:color w:val="282828"/>
+          <w:sz w:val="15"/>
+        </w:rPr>
+        <w:t xml:space="preserve">    $paidByRoutine = SUM($operations.get_paidsum);</w:t>
+      </w:r>
+      <w:r>
+        <w:br/>
+      </w:r>
+      <w:r>
+        <w:rPr>
+          <w:rFonts w:ascii="Courier New" w:hAnsi="Courier New"/>
+          <w:color w:val="282828"/>
+          <w:sz w:val="15"/>
+        </w:rPr>
+        <w:t xml:space="preserve">    $paidByDocs    = SUM($payments WHERE direction='incoming'.classified_sum);</w:t>
+      </w:r>
+      <w:r>
+        <w:br/>
+      </w:r>
+      <w:r>
+        <w:rPr>
+          <w:rFonts w:ascii="Courier New" w:hAnsi="Courier New"/>
+          <w:color w:val="282828"/>
+          <w:sz w:val="15"/>
+        </w:rPr>
+        <w:t xml:space="preserve">    $reimb         = SUM($operations WHERE f_isvozm=1 . get_realizsum);</w:t>
+      </w:r>
+      <w:r>
+        <w:br/>
+      </w:r>
+      <w:r>
+        <w:rPr>
+          <w:rFonts w:ascii="Courier New" w:hAnsi="Courier New"/>
+          <w:color w:val="282828"/>
+          <w:sz w:val="15"/>
+        </w:rPr>
+        <w:t xml:space="preserve">    $nonReimb      = SUM($operations WHERE f_isvozm=2 . get_realizsum);</w:t>
+      </w:r>
+      <w:r>
+        <w:br/>
+      </w:r>
+      <w:r>
+        <w:rPr>
+          <w:rFonts w:ascii="Courier New" w:hAnsi="Courier New"/>
+          <w:color w:val="282828"/>
+          <w:sz w:val="15"/>
+        </w:rPr>
+        <w:t xml:space="preserve">    $realization   = $reimb + $nonReimb + SUM(unclassified get_realizsum);</w:t>
+      </w:r>
+      <w:r>
+        <w:br/>
+      </w:r>
+      <w:r>
+        <w:rPr>
+          <w:rFonts w:ascii="Courier New" w:hAnsi="Courier New"/>
+          <w:color w:val="282828"/>
+          <w:sz w:val="15"/>
+        </w:rPr>
+        <w:t xml:space="preserve">    $delta         = $paidByRoutine - $realization;</w:t>
+      </w:r>
+      <w:r>
+        <w:br/>
+      </w:r>
+      <w:r>
+        <w:rPr>
+          <w:rFonts w:ascii="Courier New" w:hAnsi="Courier New"/>
+          <w:color w:val="282828"/>
+          <w:sz w:val="15"/>
+        </w:rPr>
+        <w:t>}</w:t>
+      </w:r>
+    </w:p>
+    <w:tbl>
+      <w:tblGrid>
+        <w:gridCol w:w="1650"/>
+        <w:gridCol w:w="5100"/>
+        <w:gridCol w:w="2610"/>
+      </w:tblGrid>
+      <w:tblPr>
+        <w:tblStyle w:val="TableGrid"/>
+        <w:tblW w:type="dxa" w:w="9360"/>
+        <w:tblLayout w:type="fixed"/>
+        <w:tblLook w:firstColumn="1" w:firstRow="1" w:lastColumn="0" w:lastRow="0" w:noHBand="0" w:noVBand="1" w:val="04A0"/>
+        <w:tblInd w:w="120" w:type="dxa"/>
+      </w:tblPr>
+      <w:tr>
+        <w:tc>
+          <w:tcPr>
+            <w:tcW w:type="dxa" w:w="1650"/>
+            <w:tcMar>
+              <w:top w:w="80" w:type="dxa"/>
+              <w:start w:w="120" w:type="dxa"/>
+              <w:bottom w:w="80" w:type="dxa"/>
+              <w:end w:w="120" w:type="dxa"/>
+            </w:tcMar>
+            <w:vAlign w:val="center"/>
+            <w:shd w:fill="E8EEF5"/>
+          </w:tcPr>
+          <w:p>
+            <w:pPr>
+              <w:spacing w:before="0" w:after="0" w:line="252" w:lineRule="auto"/>
+              <w:jc w:val="center"/>
+            </w:pPr>
+            <w:r/>
+            <w:r>
+              <w:rPr>
+                <w:rFonts w:ascii="Calibri" w:hAnsi="Calibri"/>
+                <w:b/>
+                <w:color w:val="1F4D78"/>
+                <w:sz w:val="14"/>
+              </w:rPr>
+              <w:t>Колонка XLSX</w:t>
+            </w:r>
+          </w:p>
+        </w:tc>
+        <w:tc>
+          <w:tcPr>
+            <w:tcW w:type="dxa" w:w="5100"/>
+            <w:tcMar>
+              <w:top w:w="80" w:type="dxa"/>
+              <w:start w:w="120" w:type="dxa"/>
+              <w:bottom w:w="80" w:type="dxa"/>
+              <w:end w:w="120" w:type="dxa"/>
+            </w:tcMar>
+            <w:vAlign w:val="center"/>
+            <w:shd w:fill="E8EEF5"/>
+          </w:tcPr>
+          <w:p>
+            <w:pPr>
+              <w:spacing w:before="0" w:after="0" w:line="252" w:lineRule="auto"/>
+              <w:jc w:val="center"/>
+            </w:pPr>
+            <w:r/>
+            <w:r>
+              <w:rPr>
+                <w:rFonts w:ascii="Calibri" w:hAnsi="Calibri"/>
+                <w:b/>
+                <w:color w:val="1F4D78"/>
+                <w:sz w:val="14"/>
+              </w:rPr>
+              <w:t>Заполнение</w:t>
+            </w:r>
+          </w:p>
+        </w:tc>
+        <w:tc>
+          <w:tcPr>
+            <w:tcW w:type="dxa" w:w="2610"/>
+            <w:tcMar>
+              <w:top w:w="80" w:type="dxa"/>
+              <w:start w:w="120" w:type="dxa"/>
+              <w:bottom w:w="80" w:type="dxa"/>
+              <w:end w:w="120" w:type="dxa"/>
+            </w:tcMar>
+            <w:vAlign w:val="center"/>
+            <w:shd w:fill="E8EEF5"/>
+          </w:tcPr>
+          <w:p>
+            <w:pPr>
+              <w:spacing w:before="0" w:after="0" w:line="252" w:lineRule="auto"/>
+              <w:jc w:val="center"/>
+            </w:pPr>
+            <w:r/>
+            <w:r>
+              <w:rPr>
+                <w:rFonts w:ascii="Calibri" w:hAnsi="Calibri"/>
+                <w:b/>
+                <w:color w:val="1F4D78"/>
+                <w:sz w:val="14"/>
+              </w:rPr>
+              <w:t>Формат/объединение</w:t>
+            </w:r>
+          </w:p>
+        </w:tc>
+      </w:tr>
+      <w:tr>
+        <w:tc>
+          <w:tcPr>
+            <w:tcW w:type="dxa" w:w="1650"/>
+            <w:tcMar>
+              <w:top w:w="80" w:type="dxa"/>
+              <w:start w:w="120" w:type="dxa"/>
+              <w:bottom w:w="80" w:type="dxa"/>
+              <w:end w:w="120" w:type="dxa"/>
+            </w:tcMar>
+            <w:vAlign w:val="center"/>
+          </w:tcPr>
+          <w:p>
+            <w:pPr>
+              <w:spacing w:before="0" w:after="0" w:line="252" w:lineRule="auto"/>
+            </w:pPr>
+            <w:r/>
+            <w:r>
+              <w:rPr>
+                <w:rFonts w:ascii="Calibri" w:hAnsi="Calibri"/>
+                <w:b w:val="0"/>
+                <w:color w:val="1E1E1E"/>
+                <w:sz w:val="14"/>
+              </w:rPr>
+              <w:t>A `№ спецификации`</w:t>
+            </w:r>
+          </w:p>
+        </w:tc>
+        <w:tc>
+          <w:tcPr>
+            <w:tcW w:type="dxa" w:w="5100"/>
+            <w:tcMar>
+              <w:top w:w="80" w:type="dxa"/>
+              <w:start w:w="120" w:type="dxa"/>
+              <w:bottom w:w="80" w:type="dxa"/>
+              <w:end w:w="120" w:type="dxa"/>
+            </w:tcMar>
+            <w:vAlign w:val="center"/>
+          </w:tcPr>
+          <w:p>
+            <w:pPr>
+              <w:spacing w:before="0" w:after="0" w:line="252" w:lineRule="auto"/>
+            </w:pPr>
+            <w:r/>
+            <w:r>
+              <w:rPr>
+                <w:rFonts w:ascii="Calibri" w:hAnsi="Calibri"/>
+                <w:b w:val="0"/>
+                <w:color w:val="1E1E1E"/>
+                <w:sz w:val="14"/>
+              </w:rPr>
+              <w:t>`Спецификация {spec_num}` из `veda_specs.f_num`.</w:t>
+            </w:r>
+          </w:p>
+        </w:tc>
+        <w:tc>
+          <w:tcPr>
+            <w:tcW w:type="dxa" w:w="2610"/>
+            <w:tcMar>
+              <w:top w:w="80" w:type="dxa"/>
+              <w:start w:w="120" w:type="dxa"/>
+              <w:bottom w:w="80" w:type="dxa"/>
+              <w:end w:w="120" w:type="dxa"/>
+            </w:tcMar>
+            <w:vAlign w:val="center"/>
+          </w:tcPr>
+          <w:p>
+            <w:pPr>
+              <w:spacing w:before="0" w:after="0" w:line="252" w:lineRule="auto"/>
+            </w:pPr>
+            <w:r/>
+            <w:r>
+              <w:rPr>
+                <w:rFonts w:ascii="Calibri" w:hAnsi="Calibri"/>
+                <w:b w:val="0"/>
+                <w:color w:val="1E1E1E"/>
+                <w:sz w:val="14"/>
+              </w:rPr>
+              <w:t>Объединить по числу строк счетов поставки.</w:t>
+            </w:r>
+          </w:p>
+        </w:tc>
+      </w:tr>
+      <w:tr>
+        <w:tc>
+          <w:tcPr>
+            <w:tcW w:type="dxa" w:w="1650"/>
+            <w:tcMar>
+              <w:top w:w="80" w:type="dxa"/>
+              <w:start w:w="120" w:type="dxa"/>
+              <w:bottom w:w="80" w:type="dxa"/>
+              <w:end w:w="120" w:type="dxa"/>
+            </w:tcMar>
+            <w:vAlign w:val="center"/>
+          </w:tcPr>
+          <w:p>
+            <w:pPr>
+              <w:spacing w:before="0" w:after="0" w:line="252" w:lineRule="auto"/>
+            </w:pPr>
+            <w:r/>
+            <w:r>
+              <w:rPr>
+                <w:rFonts w:ascii="Calibri" w:hAnsi="Calibri"/>
+                <w:b w:val="0"/>
+                <w:color w:val="1E1E1E"/>
+                <w:sz w:val="14"/>
+              </w:rPr>
+              <w:t>C `Счет`</w:t>
+            </w:r>
+          </w:p>
+        </w:tc>
+        <w:tc>
+          <w:tcPr>
+            <w:tcW w:type="dxa" w:w="5100"/>
+            <w:tcMar>
+              <w:top w:w="80" w:type="dxa"/>
+              <w:start w:w="120" w:type="dxa"/>
+              <w:bottom w:w="80" w:type="dxa"/>
+              <w:end w:w="120" w:type="dxa"/>
+            </w:tcMar>
+            <w:vAlign w:val="center"/>
+          </w:tcPr>
+          <w:p>
+            <w:pPr>
+              <w:spacing w:before="0" w:after="0" w:line="252" w:lineRule="auto"/>
+            </w:pPr>
+            <w:r/>
+            <w:r>
+              <w:rPr>
+                <w:rFonts w:ascii="Calibri" w:hAnsi="Calibri"/>
+                <w:b w:val="0"/>
+                <w:color w:val="1E1E1E"/>
+                <w:sz w:val="14"/>
+              </w:rPr>
+              <w:t>Каждый `customer_invoices[].number` отдельной строкой.</w:t>
+            </w:r>
+          </w:p>
+        </w:tc>
+        <w:tc>
+          <w:tcPr>
+            <w:tcW w:type="dxa" w:w="2610"/>
+            <w:tcMar>
+              <w:top w:w="80" w:type="dxa"/>
+              <w:start w:w="120" w:type="dxa"/>
+              <w:bottom w:w="80" w:type="dxa"/>
+              <w:end w:w="120" w:type="dxa"/>
+            </w:tcMar>
+            <w:vAlign w:val="center"/>
+          </w:tcPr>
+          <w:p>
+            <w:pPr>
+              <w:spacing w:before="0" w:after="0" w:line="252" w:lineRule="auto"/>
+            </w:pPr>
+            <w:r/>
+            <w:r>
+              <w:rPr>
+                <w:rFonts w:ascii="Calibri" w:hAnsi="Calibri"/>
+                <w:b w:val="0"/>
+                <w:color w:val="1E1E1E"/>
+                <w:sz w:val="14"/>
+              </w:rPr>
+              <w:t>Не объединять, строки идут вертикально.</w:t>
+            </w:r>
+          </w:p>
+        </w:tc>
+      </w:tr>
+      <w:tr>
+        <w:tc>
+          <w:tcPr>
+            <w:tcW w:type="dxa" w:w="1650"/>
+            <w:tcMar>
+              <w:top w:w="80" w:type="dxa"/>
+              <w:start w:w="120" w:type="dxa"/>
+              <w:bottom w:w="80" w:type="dxa"/>
+              <w:end w:w="120" w:type="dxa"/>
+            </w:tcMar>
+            <w:vAlign w:val="center"/>
+          </w:tcPr>
+          <w:p>
+            <w:pPr>
+              <w:spacing w:before="0" w:after="0" w:line="252" w:lineRule="auto"/>
+            </w:pPr>
+            <w:r/>
+            <w:r>
+              <w:rPr>
+                <w:rFonts w:ascii="Calibri" w:hAnsi="Calibri"/>
+                <w:b w:val="0"/>
+                <w:color w:val="1E1E1E"/>
+                <w:sz w:val="14"/>
+              </w:rPr>
+              <w:t>D `Сумма по счету`</w:t>
+            </w:r>
+          </w:p>
+        </w:tc>
+        <w:tc>
+          <w:tcPr>
+            <w:tcW w:type="dxa" w:w="5100"/>
+            <w:tcMar>
+              <w:top w:w="80" w:type="dxa"/>
+              <w:start w:w="120" w:type="dxa"/>
+              <w:bottom w:w="80" w:type="dxa"/>
+              <w:end w:w="120" w:type="dxa"/>
+            </w:tcMar>
+            <w:vAlign w:val="center"/>
+          </w:tcPr>
+          <w:p>
+            <w:pPr>
+              <w:spacing w:before="0" w:after="0" w:line="252" w:lineRule="auto"/>
+            </w:pPr>
+            <w:r/>
+            <w:r>
+              <w:rPr>
+                <w:rFonts w:ascii="Calibri" w:hAnsi="Calibri"/>
+                <w:b w:val="0"/>
+                <w:color w:val="1E1E1E"/>
+                <w:sz w:val="14"/>
+              </w:rPr>
+              <w:t>`customer_invoices[].sum + currency`.</w:t>
+            </w:r>
+          </w:p>
+        </w:tc>
+        <w:tc>
+          <w:tcPr>
+            <w:tcW w:type="dxa" w:w="2610"/>
+            <w:tcMar>
+              <w:top w:w="80" w:type="dxa"/>
+              <w:start w:w="120" w:type="dxa"/>
+              <w:bottom w:w="80" w:type="dxa"/>
+              <w:end w:w="120" w:type="dxa"/>
+            </w:tcMar>
+            <w:vAlign w:val="center"/>
+          </w:tcPr>
+          <w:p>
+            <w:pPr>
+              <w:spacing w:before="0" w:after="0" w:line="252" w:lineRule="auto"/>
+            </w:pPr>
+            <w:r/>
+            <w:r>
+              <w:rPr>
+                <w:rFonts w:ascii="Calibri" w:hAnsi="Calibri"/>
+                <w:b w:val="0"/>
+                <w:color w:val="1E1E1E"/>
+                <w:sz w:val="14"/>
+              </w:rPr>
+              <w:t>Не суммировать разные валюты без курса.</w:t>
+            </w:r>
+          </w:p>
+        </w:tc>
+      </w:tr>
+      <w:tr>
+        <w:tc>
+          <w:tcPr>
+            <w:tcW w:type="dxa" w:w="1650"/>
+            <w:tcMar>
+              <w:top w:w="80" w:type="dxa"/>
+              <w:start w:w="120" w:type="dxa"/>
+              <w:bottom w:w="80" w:type="dxa"/>
+              <w:end w:w="120" w:type="dxa"/>
+            </w:tcMar>
+            <w:vAlign w:val="center"/>
+          </w:tcPr>
+          <w:p>
+            <w:pPr>
+              <w:spacing w:before="0" w:after="0" w:line="252" w:lineRule="auto"/>
+            </w:pPr>
+            <w:r/>
+            <w:r>
+              <w:rPr>
+                <w:rFonts w:ascii="Calibri" w:hAnsi="Calibri"/>
+                <w:b w:val="0"/>
+                <w:color w:val="1E1E1E"/>
+                <w:sz w:val="14"/>
+              </w:rPr>
+              <w:t>E `Сумма оплаты`</w:t>
+            </w:r>
+          </w:p>
+        </w:tc>
+        <w:tc>
+          <w:tcPr>
+            <w:tcW w:type="dxa" w:w="5100"/>
+            <w:tcMar>
+              <w:top w:w="80" w:type="dxa"/>
+              <w:start w:w="120" w:type="dxa"/>
+              <w:bottom w:w="80" w:type="dxa"/>
+              <w:end w:w="120" w:type="dxa"/>
+            </w:tcMar>
+            <w:vAlign w:val="center"/>
+          </w:tcPr>
+          <w:p>
+            <w:pPr>
+              <w:spacing w:before="0" w:after="0" w:line="252" w:lineRule="auto"/>
+            </w:pPr>
+            <w:r/>
+            <w:r>
+              <w:rPr>
+                <w:rFonts w:ascii="Calibri" w:hAnsi="Calibri"/>
+                <w:b w:val="0"/>
+                <w:color w:val="1E1E1E"/>
+                <w:sz w:val="14"/>
+              </w:rPr>
+              <w:t>`paid_total_get_paidsum`.</w:t>
+            </w:r>
+          </w:p>
+        </w:tc>
+        <w:tc>
+          <w:tcPr>
+            <w:tcW w:type="dxa" w:w="2610"/>
+            <w:tcMar>
+              <w:top w:w="80" w:type="dxa"/>
+              <w:start w:w="120" w:type="dxa"/>
+              <w:bottom w:w="80" w:type="dxa"/>
+              <w:end w:w="120" w:type="dxa"/>
+            </w:tcMar>
+            <w:vAlign w:val="center"/>
+          </w:tcPr>
+          <w:p>
+            <w:pPr>
+              <w:spacing w:before="0" w:after="0" w:line="252" w:lineRule="auto"/>
+            </w:pPr>
+            <w:r/>
+            <w:r>
+              <w:rPr>
+                <w:rFonts w:ascii="Calibri" w:hAnsi="Calibri"/>
+                <w:b w:val="0"/>
+                <w:color w:val="1E1E1E"/>
+                <w:sz w:val="14"/>
+              </w:rPr>
+              <w:t>Объединить по поставке; контроль с `paid_total_acchist_docs`.</w:t>
+            </w:r>
+          </w:p>
+        </w:tc>
+      </w:tr>
+      <w:tr>
+        <w:tc>
+          <w:tcPr>
+            <w:tcW w:type="dxa" w:w="1650"/>
+            <w:tcMar>
+              <w:top w:w="80" w:type="dxa"/>
+              <w:start w:w="120" w:type="dxa"/>
+              <w:bottom w:w="80" w:type="dxa"/>
+              <w:end w:w="120" w:type="dxa"/>
+            </w:tcMar>
+            <w:vAlign w:val="center"/>
+          </w:tcPr>
+          <w:p>
+            <w:pPr>
+              <w:spacing w:before="0" w:after="0" w:line="252" w:lineRule="auto"/>
+            </w:pPr>
+            <w:r/>
+            <w:r>
+              <w:rPr>
+                <w:rFonts w:ascii="Calibri" w:hAnsi="Calibri"/>
+                <w:b w:val="0"/>
+                <w:color w:val="1E1E1E"/>
+                <w:sz w:val="14"/>
+              </w:rPr>
+              <w:t>G `Возмещаемые расходы`</w:t>
+            </w:r>
+          </w:p>
+        </w:tc>
+        <w:tc>
+          <w:tcPr>
+            <w:tcW w:type="dxa" w:w="5100"/>
+            <w:tcMar>
+              <w:top w:w="80" w:type="dxa"/>
+              <w:start w:w="120" w:type="dxa"/>
+              <w:bottom w:w="80" w:type="dxa"/>
+              <w:end w:w="120" w:type="dxa"/>
+            </w:tcMar>
+            <w:vAlign w:val="center"/>
+          </w:tcPr>
+          <w:p>
+            <w:pPr>
+              <w:spacing w:before="0" w:after="0" w:line="252" w:lineRule="auto"/>
+            </w:pPr>
+            <w:r/>
+            <w:r>
+              <w:rPr>
+                <w:rFonts w:ascii="Calibri" w:hAnsi="Calibri"/>
+                <w:b w:val="0"/>
+                <w:color w:val="1E1E1E"/>
+                <w:sz w:val="14"/>
+              </w:rPr>
+              <w:t>`reimbursable_realization_get_realizsum`.</w:t>
+            </w:r>
+          </w:p>
+        </w:tc>
+        <w:tc>
+          <w:tcPr>
+            <w:tcW w:type="dxa" w:w="2610"/>
+            <w:tcMar>
+              <w:top w:w="80" w:type="dxa"/>
+              <w:start w:w="120" w:type="dxa"/>
+              <w:bottom w:w="80" w:type="dxa"/>
+              <w:end w:w="120" w:type="dxa"/>
+            </w:tcMar>
+            <w:vAlign w:val="center"/>
+          </w:tcPr>
+          <w:p>
+            <w:pPr>
+              <w:spacing w:before="0" w:after="0" w:line="252" w:lineRule="auto"/>
+            </w:pPr>
+            <w:r/>
+            <w:r>
+              <w:rPr>
+                <w:rFonts w:ascii="Calibri" w:hAnsi="Calibri"/>
+                <w:b w:val="0"/>
+                <w:color w:val="1E1E1E"/>
+                <w:sz w:val="14"/>
+              </w:rPr>
+              <w:t>Объединить по поставке, деньги вправо.</w:t>
+            </w:r>
+          </w:p>
+        </w:tc>
+      </w:tr>
+      <w:tr>
+        <w:tc>
+          <w:tcPr>
+            <w:tcW w:type="dxa" w:w="1650"/>
+            <w:tcMar>
+              <w:top w:w="80" w:type="dxa"/>
+              <w:start w:w="120" w:type="dxa"/>
+              <w:bottom w:w="80" w:type="dxa"/>
+              <w:end w:w="120" w:type="dxa"/>
+            </w:tcMar>
+            <w:vAlign w:val="center"/>
+          </w:tcPr>
+          <w:p>
+            <w:pPr>
+              <w:spacing w:before="0" w:after="0" w:line="252" w:lineRule="auto"/>
+            </w:pPr>
+            <w:r/>
+            <w:r>
+              <w:rPr>
+                <w:rFonts w:ascii="Calibri" w:hAnsi="Calibri"/>
+                <w:b w:val="0"/>
+                <w:color w:val="1E1E1E"/>
+                <w:sz w:val="14"/>
+              </w:rPr>
+              <w:t>H `Невозмещаемые расходы`</w:t>
+            </w:r>
+          </w:p>
+        </w:tc>
+        <w:tc>
+          <w:tcPr>
+            <w:tcW w:type="dxa" w:w="5100"/>
+            <w:tcMar>
+              <w:top w:w="80" w:type="dxa"/>
+              <w:start w:w="120" w:type="dxa"/>
+              <w:bottom w:w="80" w:type="dxa"/>
+              <w:end w:w="120" w:type="dxa"/>
+            </w:tcMar>
+            <w:vAlign w:val="center"/>
+          </w:tcPr>
+          <w:p>
+            <w:pPr>
+              <w:spacing w:before="0" w:after="0" w:line="252" w:lineRule="auto"/>
+            </w:pPr>
+            <w:r/>
+            <w:r>
+              <w:rPr>
+                <w:rFonts w:ascii="Calibri" w:hAnsi="Calibri"/>
+                <w:b w:val="0"/>
+                <w:color w:val="1E1E1E"/>
+                <w:sz w:val="14"/>
+              </w:rPr>
+              <w:t>`non_reimbursable_realization_get_realizsum`.</w:t>
+            </w:r>
+          </w:p>
+        </w:tc>
+        <w:tc>
+          <w:tcPr>
+            <w:tcW w:type="dxa" w:w="2610"/>
+            <w:tcMar>
+              <w:top w:w="80" w:type="dxa"/>
+              <w:start w:w="120" w:type="dxa"/>
+              <w:bottom w:w="80" w:type="dxa"/>
+              <w:end w:w="120" w:type="dxa"/>
+            </w:tcMar>
+            <w:vAlign w:val="center"/>
+          </w:tcPr>
+          <w:p>
+            <w:pPr>
+              <w:spacing w:before="0" w:after="0" w:line="252" w:lineRule="auto"/>
+            </w:pPr>
+            <w:r/>
+            <w:r>
+              <w:rPr>
+                <w:rFonts w:ascii="Calibri" w:hAnsi="Calibri"/>
+                <w:b w:val="0"/>
+                <w:color w:val="1E1E1E"/>
+                <w:sz w:val="14"/>
+              </w:rPr>
+              <w:t>Объединить по поставке, деньги вправо.</w:t>
+            </w:r>
+          </w:p>
+        </w:tc>
+      </w:tr>
+      <w:tr>
+        <w:tc>
+          <w:tcPr>
+            <w:tcW w:type="dxa" w:w="1650"/>
+            <w:tcMar>
+              <w:top w:w="80" w:type="dxa"/>
+              <w:start w:w="120" w:type="dxa"/>
+              <w:bottom w:w="80" w:type="dxa"/>
+              <w:end w:w="120" w:type="dxa"/>
+            </w:tcMar>
+            <w:vAlign w:val="center"/>
+          </w:tcPr>
+          <w:p>
+            <w:pPr>
+              <w:spacing w:before="0" w:after="0" w:line="252" w:lineRule="auto"/>
+            </w:pPr>
+            <w:r/>
+            <w:r>
+              <w:rPr>
+                <w:rFonts w:ascii="Calibri" w:hAnsi="Calibri"/>
+                <w:b w:val="0"/>
+                <w:color w:val="1E1E1E"/>
+                <w:sz w:val="14"/>
+              </w:rPr>
+              <w:t>J `№ счф`</w:t>
+            </w:r>
+          </w:p>
+        </w:tc>
+        <w:tc>
+          <w:tcPr>
+            <w:tcW w:type="dxa" w:w="5100"/>
+            <w:tcMar>
+              <w:top w:w="80" w:type="dxa"/>
+              <w:start w:w="120" w:type="dxa"/>
+              <w:bottom w:w="80" w:type="dxa"/>
+              <w:end w:w="120" w:type="dxa"/>
+            </w:tcMar>
+            <w:vAlign w:val="center"/>
+          </w:tcPr>
+          <w:p>
+            <w:pPr>
+              <w:spacing w:before="0" w:after="0" w:line="252" w:lineRule="auto"/>
+            </w:pPr>
+            <w:r/>
+            <w:r>
+              <w:rPr>
+                <w:rFonts w:ascii="Calibri" w:hAnsi="Calibri"/>
+                <w:b w:val="0"/>
+                <w:color w:val="1E1E1E"/>
+                <w:sz w:val="14"/>
+              </w:rPr>
+              <w:t>`closing_docs` строками: `{code1c|number} от {date} ({sum})`.</w:t>
+            </w:r>
+          </w:p>
+        </w:tc>
+        <w:tc>
+          <w:tcPr>
+            <w:tcW w:type="dxa" w:w="2610"/>
+            <w:tcMar>
+              <w:top w:w="80" w:type="dxa"/>
+              <w:start w:w="120" w:type="dxa"/>
+              <w:bottom w:w="80" w:type="dxa"/>
+              <w:end w:w="120" w:type="dxa"/>
+            </w:tcMar>
+            <w:vAlign w:val="center"/>
+          </w:tcPr>
+          <w:p>
+            <w:pPr>
+              <w:spacing w:before="0" w:after="0" w:line="252" w:lineRule="auto"/>
+            </w:pPr>
+            <w:r/>
+            <w:r>
+              <w:rPr>
+                <w:rFonts w:ascii="Calibri" w:hAnsi="Calibri"/>
+                <w:b w:val="0"/>
+                <w:color w:val="1E1E1E"/>
+                <w:sz w:val="14"/>
+              </w:rPr>
+              <w:t>Объединить по поставке, перенос строки внутри ячейки.</w:t>
+            </w:r>
+          </w:p>
+        </w:tc>
+      </w:tr>
+      <w:tr>
+        <w:tc>
+          <w:tcPr>
+            <w:tcW w:type="dxa" w:w="1650"/>
+            <w:tcMar>
+              <w:top w:w="80" w:type="dxa"/>
+              <w:start w:w="120" w:type="dxa"/>
+              <w:bottom w:w="80" w:type="dxa"/>
+              <w:end w:w="120" w:type="dxa"/>
+            </w:tcMar>
+            <w:vAlign w:val="center"/>
+          </w:tcPr>
+          <w:p>
+            <w:pPr>
+              <w:spacing w:before="0" w:after="0" w:line="252" w:lineRule="auto"/>
+            </w:pPr>
+            <w:r/>
+            <w:r>
+              <w:rPr>
+                <w:rFonts w:ascii="Calibri" w:hAnsi="Calibri"/>
+                <w:b w:val="0"/>
+                <w:color w:val="1E1E1E"/>
+                <w:sz w:val="14"/>
+              </w:rPr>
+              <w:t>K `(+/-)`</w:t>
+            </w:r>
+          </w:p>
+        </w:tc>
+        <w:tc>
+          <w:tcPr>
+            <w:tcW w:type="dxa" w:w="5100"/>
+            <w:tcMar>
+              <w:top w:w="80" w:type="dxa"/>
+              <w:start w:w="120" w:type="dxa"/>
+              <w:bottom w:w="80" w:type="dxa"/>
+              <w:end w:w="120" w:type="dxa"/>
+            </w:tcMar>
+            <w:vAlign w:val="center"/>
+          </w:tcPr>
+          <w:p>
+            <w:pPr>
+              <w:spacing w:before="0" w:after="0" w:line="252" w:lineRule="auto"/>
+            </w:pPr>
+            <w:r/>
+            <w:r>
+              <w:rPr>
+                <w:rFonts w:ascii="Calibri" w:hAnsi="Calibri"/>
+                <w:b w:val="0"/>
+                <w:color w:val="1E1E1E"/>
+                <w:sz w:val="14"/>
+              </w:rPr>
+              <w:t>`settlement_delta_paid_minus_realization`.</w:t>
+            </w:r>
+          </w:p>
+        </w:tc>
+        <w:tc>
+          <w:tcPr>
+            <w:tcW w:type="dxa" w:w="2610"/>
+            <w:tcMar>
+              <w:top w:w="80" w:type="dxa"/>
+              <w:start w:w="120" w:type="dxa"/>
+              <w:bottom w:w="80" w:type="dxa"/>
+              <w:end w:w="120" w:type="dxa"/>
+            </w:tcMar>
+            <w:vAlign w:val="center"/>
+          </w:tcPr>
+          <w:p>
+            <w:pPr>
+              <w:spacing w:before="0" w:after="0" w:line="252" w:lineRule="auto"/>
+            </w:pPr>
+            <w:r/>
+            <w:r>
+              <w:rPr>
+                <w:rFonts w:ascii="Calibri" w:hAnsi="Calibri"/>
+                <w:b w:val="0"/>
+                <w:color w:val="1E1E1E"/>
+                <w:sz w:val="14"/>
+              </w:rPr>
+              <w:t>Объединить по поставке; красный фон/текст при ненуле.</w:t>
+            </w:r>
+          </w:p>
+        </w:tc>
+      </w:tr>
+      <w:tr>
+        <w:tc>
+          <w:tcPr>
+            <w:tcW w:type="dxa" w:w="1650"/>
+            <w:tcMar>
+              <w:top w:w="80" w:type="dxa"/>
+              <w:start w:w="120" w:type="dxa"/>
+              <w:bottom w:w="80" w:type="dxa"/>
+              <w:end w:w="120" w:type="dxa"/>
+            </w:tcMar>
+            <w:vAlign w:val="center"/>
+          </w:tcPr>
+          <w:p>
+            <w:pPr>
+              <w:spacing w:before="0" w:after="0" w:line="252" w:lineRule="auto"/>
+            </w:pPr>
+            <w:r/>
+            <w:r>
+              <w:rPr>
+                <w:rFonts w:ascii="Calibri" w:hAnsi="Calibri"/>
+                <w:b w:val="0"/>
+                <w:color w:val="1E1E1E"/>
+                <w:sz w:val="14"/>
+              </w:rPr>
+              <w:t>ИТОГО</w:t>
+            </w:r>
+          </w:p>
+        </w:tc>
+        <w:tc>
+          <w:tcPr>
+            <w:tcW w:type="dxa" w:w="5100"/>
+            <w:tcMar>
+              <w:top w:w="80" w:type="dxa"/>
+              <w:start w:w="120" w:type="dxa"/>
+              <w:bottom w:w="80" w:type="dxa"/>
+              <w:end w:w="120" w:type="dxa"/>
+            </w:tcMar>
+            <w:vAlign w:val="center"/>
+          </w:tcPr>
+          <w:p>
+            <w:pPr>
+              <w:spacing w:before="0" w:after="0" w:line="252" w:lineRule="auto"/>
+            </w:pPr>
+            <w:r/>
+            <w:r>
+              <w:rPr>
+                <w:rFonts w:ascii="Calibri" w:hAnsi="Calibri"/>
+                <w:b w:val="0"/>
+                <w:color w:val="1E1E1E"/>
+                <w:sz w:val="14"/>
+              </w:rPr>
+              <w:t>Суммы E/G/H/K по всем поставкам выборки.</w:t>
+            </w:r>
+          </w:p>
+        </w:tc>
+        <w:tc>
+          <w:tcPr>
+            <w:tcW w:type="dxa" w:w="2610"/>
+            <w:tcMar>
+              <w:top w:w="80" w:type="dxa"/>
+              <w:start w:w="120" w:type="dxa"/>
+              <w:bottom w:w="80" w:type="dxa"/>
+              <w:end w:w="120" w:type="dxa"/>
+            </w:tcMar>
+            <w:vAlign w:val="center"/>
+          </w:tcPr>
+          <w:p>
+            <w:pPr>
+              <w:spacing w:before="0" w:after="0" w:line="252" w:lineRule="auto"/>
+            </w:pPr>
+            <w:r/>
+            <w:r>
+              <w:rPr>
+                <w:rFonts w:ascii="Calibri" w:hAnsi="Calibri"/>
+                <w:b w:val="0"/>
+                <w:color w:val="1E1E1E"/>
+                <w:sz w:val="14"/>
+              </w:rPr>
+              <w:t>Подпись `ИТОГО`, без номеров строк внешних таблиц.</w:t>
+            </w:r>
+          </w:p>
+        </w:tc>
+      </w:tr>
+    </w:tbl>
+    <w:p>
+      <w:pPr>
+        <w:spacing w:after="40"/>
+      </w:pPr>
+    </w:p>
+    <w:tbl>
+      <w:tblGrid>
+        <w:gridCol w:w="9360"/>
+      </w:tblGrid>
+      <w:tblPr>
+        <w:tblStyle w:val="TableGrid"/>
+        <w:tblW w:type="dxa" w:w="9360"/>
+        <w:tblLayout w:type="fixed"/>
+        <w:tblLook w:firstColumn="1" w:firstRow="1" w:lastColumn="0" w:lastRow="0" w:noHBand="0" w:noVBand="1" w:val="04A0"/>
+        <w:tblInd w:w="120" w:type="dxa"/>
+      </w:tblPr>
+      <w:tr>
+        <w:tc>
+          <w:tcPr>
+            <w:tcW w:type="dxa" w:w="9360"/>
+            <w:tcMar>
+              <w:top w:w="80" w:type="dxa"/>
+              <w:start w:w="120" w:type="dxa"/>
+              <w:bottom w:w="80" w:type="dxa"/>
+              <w:end w:w="120" w:type="dxa"/>
+            </w:tcMar>
+            <w:vAlign w:val="center"/>
+            <w:shd w:fill="F4F6F9"/>
+          </w:tcPr>
+          <w:p>
+            <w:pPr>
+              <w:spacing w:after="60"/>
+            </w:pPr>
+            <w:r/>
+            <w:r>
+              <w:rPr>
+                <w:rFonts w:ascii="Calibri" w:hAnsi="Calibri"/>
+                <w:b/>
+                <w:color w:val="1F4D78"/>
+                <w:sz w:val="20"/>
+              </w:rPr>
+              <w:t>Где смотреть рабочий пример</w:t>
+            </w:r>
+          </w:p>
+          <w:p>
+            <w:pPr>
+              <w:spacing w:after="0" w:line="288" w:lineRule="auto"/>
+            </w:pPr>
+            <w:r>
+              <w:rPr>
+                <w:rFonts w:ascii="Calibri" w:hAnsi="Calibri"/>
+                <w:color w:val="1E1E1E"/>
+                <w:sz w:val="19"/>
+              </w:rPr>
+              <w:t>В репозитории рабочая реализация проверки находится в `tools/server_mariadb_reconciliation_report.py`. Она не является production PHP-кодом, но фиксирует SQL-связи, формулы, структуру JSON и правила XLSX, которые PHP-разработчик должен повторить в ERP.</w:t>
             </w:r>
           </w:p>
         </w:tc>

</xml_diff>

<commit_message>
Finalize live ERP reconciliation TZ artifacts
</commit_message>
<xml_diff>
--- a/docs/TZ_ERP_1C_Akt_Sverki_Matrix.docx
+++ b/docs/TZ_ERP_1C_Akt_Sverki_Matrix.docx
@@ -152,7 +152,7 @@
                 <w:color w:val="1E1E1E"/>
                 <w:sz w:val="17"/>
               </w:rPr>
-              <w:t>LIVE MariaDB / 2026-06-24 / версия с разделом 5.5</w:t>
+              <w:t>LIVE MariaDB / 2026-06-24 / финальное ТЗ для ERP-разработчика</w:t>
             </w:r>
           </w:p>
         </w:tc>
@@ -1858,7 +1858,7 @@
       <w:r>
         <w:drawing>
           <wp:inline xmlns:a="http://schemas.openxmlformats.org/drawingml/2006/main" xmlns:pic="http://schemas.openxmlformats.org/drawingml/2006/picture">
-            <wp:extent cx="5760720" cy="3240405"/>
+            <wp:extent cx="5760720" cy="3600450"/>
             <wp:docPr id="1" name="Picture 1"/>
             <wp:cNvGraphicFramePr>
               <a:graphicFrameLocks noChangeAspect="1"/>
@@ -1867,7 +1867,7 @@
               <a:graphicData uri="http://schemas.openxmlformats.org/drawingml/2006/picture">
                 <pic:pic>
                   <pic:nvPicPr>
-                    <pic:cNvPr id="0" name="matrix_aero_trade_660_1_fresh_fixture.png"/>
+                    <pic:cNvPr id="0" name="matrix_aero_trade_660_1_live_mariadb.png"/>
                     <pic:cNvPicPr/>
                   </pic:nvPicPr>
                   <pic:blipFill>
@@ -1879,7 +1879,7 @@
                   <pic:spPr>
                     <a:xfrm>
                       <a:off x="0" y="0"/>
-                      <a:ext cx="5760720" cy="3240405"/>
+                      <a:ext cx="5760720" cy="3600450"/>
                     </a:xfrm>
                     <a:prstGeom prst="rect"/>
                   </pic:spPr>
@@ -1961,11 +1961,6 @@
       </w:r>
     </w:p>
     <w:p>
-      <w:r>
-        <w:br w:type="page"/>
-      </w:r>
-    </w:p>
-    <w:p>
       <w:pPr>
         <w:pStyle w:val="Heading1"/>
         <w:keepNext/>
@@ -2370,7 +2365,7 @@
                 <w:color w:val="1E1E1E"/>
                 <w:sz w:val="15"/>
               </w:rPr>
-              <w:t>veda_specs</w:t>
+              <w:t>view_specs / veda_specs</w:t>
             </w:r>
           </w:p>
         </w:tc>
@@ -2424,7 +2419,7 @@
                 <w:color w:val="1E1E1E"/>
                 <w:sz w:val="15"/>
               </w:rPr>
-              <w:t>f_kod1cb, f_kod1cp, номер заявки, договор 660/1</w:t>
+              <w:t>spec_id, spec_number, spec_num_short, spec_type/spec_subtype или f_typez/f_subtype, f_kod1cb, f_kod1cp</w:t>
             </w:r>
           </w:p>
         </w:tc>
@@ -2451,7 +2446,7 @@
                 <w:color w:val="1E1E1E"/>
                 <w:sz w:val="15"/>
               </w:rPr>
-              <w:t>№ спецификации</w:t>
+              <w:t>№ спецификации / заявки</w:t>
             </w:r>
           </w:p>
         </w:tc>
@@ -3444,6 +3439,820 @@
     </w:p>
     <w:p>
       <w:pPr>
+        <w:pStyle w:val="Heading2"/>
+        <w:keepNext/>
+      </w:pPr>
+      <w:r/>
+      <w:r>
+        <w:rPr>
+          <w:rFonts w:ascii="Calibri" w:hAnsi="Calibri"/>
+          <w:b/>
+          <w:color w:val="2E74B5"/>
+          <w:sz w:val="26"/>
+        </w:rPr>
+        <w:t>4.2 Что передаем и что сравниваем</w:t>
+      </w:r>
+    </w:p>
+    <w:tbl>
+      <w:tblGrid>
+        <w:gridCol w:w="1200"/>
+        <w:gridCol w:w="2830"/>
+        <w:gridCol w:w="2530"/>
+        <w:gridCol w:w="2800"/>
+      </w:tblGrid>
+      <w:tblPr>
+        <w:tblStyle w:val="TableGrid"/>
+        <w:tblW w:type="dxa" w:w="9360"/>
+        <w:tblLayout w:type="fixed"/>
+        <w:tblLook w:firstColumn="1" w:firstRow="1" w:lastColumn="0" w:lastRow="0" w:noHBand="0" w:noVBand="1" w:val="04A0"/>
+        <w:tblInd w:w="120" w:type="dxa"/>
+      </w:tblPr>
+      <w:tr>
+        <w:tc>
+          <w:tcPr>
+            <w:tcW w:type="dxa" w:w="1200"/>
+            <w:tcMar>
+              <w:top w:w="80" w:type="dxa"/>
+              <w:start w:w="120" w:type="dxa"/>
+              <w:bottom w:w="80" w:type="dxa"/>
+              <w:end w:w="120" w:type="dxa"/>
+            </w:tcMar>
+            <w:vAlign w:val="center"/>
+            <w:shd w:fill="E8EEF5"/>
+          </w:tcPr>
+          <w:p>
+            <w:pPr>
+              <w:spacing w:before="0" w:after="0" w:line="252" w:lineRule="auto"/>
+              <w:jc w:val="center"/>
+            </w:pPr>
+            <w:r/>
+            <w:r>
+              <w:rPr>
+                <w:rFonts w:ascii="Calibri" w:hAnsi="Calibri"/>
+                <w:b/>
+                <w:color w:val="1F4D78"/>
+                <w:sz w:val="14"/>
+              </w:rPr>
+              <w:t>Блок</w:t>
+            </w:r>
+          </w:p>
+        </w:tc>
+        <w:tc>
+          <w:tcPr>
+            <w:tcW w:type="dxa" w:w="2830"/>
+            <w:tcMar>
+              <w:top w:w="80" w:type="dxa"/>
+              <w:start w:w="120" w:type="dxa"/>
+              <w:bottom w:w="80" w:type="dxa"/>
+              <w:end w:w="120" w:type="dxa"/>
+            </w:tcMar>
+            <w:vAlign w:val="center"/>
+            <w:shd w:fill="E8EEF5"/>
+          </w:tcPr>
+          <w:p>
+            <w:pPr>
+              <w:spacing w:before="0" w:after="0" w:line="252" w:lineRule="auto"/>
+              <w:jc w:val="center"/>
+            </w:pPr>
+            <w:r/>
+            <w:r>
+              <w:rPr>
+                <w:rFonts w:ascii="Calibri" w:hAnsi="Calibri"/>
+                <w:b/>
+                <w:color w:val="1F4D78"/>
+                <w:sz w:val="14"/>
+              </w:rPr>
+              <w:t>ERP передает / выбирает</w:t>
+            </w:r>
+          </w:p>
+        </w:tc>
+        <w:tc>
+          <w:tcPr>
+            <w:tcW w:type="dxa" w:w="2530"/>
+            <w:tcMar>
+              <w:top w:w="80" w:type="dxa"/>
+              <w:start w:w="120" w:type="dxa"/>
+              <w:bottom w:w="80" w:type="dxa"/>
+              <w:end w:w="120" w:type="dxa"/>
+            </w:tcMar>
+            <w:vAlign w:val="center"/>
+            <w:shd w:fill="E8EEF5"/>
+          </w:tcPr>
+          <w:p>
+            <w:pPr>
+              <w:spacing w:before="0" w:after="0" w:line="252" w:lineRule="auto"/>
+              <w:jc w:val="center"/>
+            </w:pPr>
+            <w:r/>
+            <w:r>
+              <w:rPr>
+                <w:rFonts w:ascii="Calibri" w:hAnsi="Calibri"/>
+                <w:b/>
+                <w:color w:val="1F4D78"/>
+                <w:sz w:val="14"/>
+              </w:rPr>
+              <w:t>1С возвращает</w:t>
+            </w:r>
+          </w:p>
+        </w:tc>
+        <w:tc>
+          <w:tcPr>
+            <w:tcW w:type="dxa" w:w="2800"/>
+            <w:tcMar>
+              <w:top w:w="80" w:type="dxa"/>
+              <w:start w:w="120" w:type="dxa"/>
+              <w:bottom w:w="80" w:type="dxa"/>
+              <w:end w:w="120" w:type="dxa"/>
+            </w:tcMar>
+            <w:vAlign w:val="center"/>
+            <w:shd w:fill="E8EEF5"/>
+          </w:tcPr>
+          <w:p>
+            <w:pPr>
+              <w:spacing w:before="0" w:after="0" w:line="252" w:lineRule="auto"/>
+              <w:jc w:val="center"/>
+            </w:pPr>
+            <w:r/>
+            <w:r>
+              <w:rPr>
+                <w:rFonts w:ascii="Calibri" w:hAnsi="Calibri"/>
+                <w:b/>
+                <w:color w:val="1F4D78"/>
+                <w:sz w:val="14"/>
+              </w:rPr>
+              <w:t>Сравнение</w:t>
+            </w:r>
+          </w:p>
+        </w:tc>
+      </w:tr>
+      <w:tr>
+        <w:tc>
+          <w:tcPr>
+            <w:tcW w:type="dxa" w:w="1200"/>
+            <w:tcMar>
+              <w:top w:w="80" w:type="dxa"/>
+              <w:start w:w="120" w:type="dxa"/>
+              <w:bottom w:w="80" w:type="dxa"/>
+              <w:end w:w="120" w:type="dxa"/>
+            </w:tcMar>
+            <w:vAlign w:val="center"/>
+          </w:tcPr>
+          <w:p>
+            <w:pPr>
+              <w:spacing w:before="0" w:after="0" w:line="252" w:lineRule="auto"/>
+            </w:pPr>
+            <w:r/>
+            <w:r>
+              <w:rPr>
+                <w:rFonts w:ascii="Calibri" w:hAnsi="Calibri"/>
+                <w:b w:val="0"/>
+                <w:color w:val="1E1E1E"/>
+                <w:sz w:val="14"/>
+              </w:rPr>
+              <w:t>Контрагент</w:t>
+            </w:r>
+          </w:p>
+        </w:tc>
+        <w:tc>
+          <w:tcPr>
+            <w:tcW w:type="dxa" w:w="2830"/>
+            <w:tcMar>
+              <w:top w:w="80" w:type="dxa"/>
+              <w:start w:w="120" w:type="dxa"/>
+              <w:bottom w:w="80" w:type="dxa"/>
+              <w:end w:w="120" w:type="dxa"/>
+            </w:tcMar>
+            <w:vAlign w:val="center"/>
+          </w:tcPr>
+          <w:p>
+            <w:pPr>
+              <w:spacing w:before="0" w:after="0" w:line="252" w:lineRule="auto"/>
+            </w:pPr>
+            <w:r/>
+            <w:r>
+              <w:rPr>
+                <w:rFonts w:ascii="Calibri" w:hAnsi="Calibri"/>
+                <w:b w:val="0"/>
+                <w:color w:val="1E1E1E"/>
+                <w:sz w:val="14"/>
+              </w:rPr>
+              <w:t>`contact_id`, `client_id`, ИНН, КПП, код 1С ЮЛ</w:t>
+            </w:r>
+          </w:p>
+        </w:tc>
+        <w:tc>
+          <w:tcPr>
+            <w:tcW w:type="dxa" w:w="2530"/>
+            <w:tcMar>
+              <w:top w:w="80" w:type="dxa"/>
+              <w:start w:w="120" w:type="dxa"/>
+              <w:bottom w:w="80" w:type="dxa"/>
+              <w:end w:w="120" w:type="dxa"/>
+            </w:tcMar>
+            <w:vAlign w:val="center"/>
+          </w:tcPr>
+          <w:p>
+            <w:pPr>
+              <w:spacing w:before="0" w:after="0" w:line="252" w:lineRule="auto"/>
+            </w:pPr>
+            <w:r/>
+            <w:r>
+              <w:rPr>
+                <w:rFonts w:ascii="Calibri" w:hAnsi="Calibri"/>
+                <w:b w:val="0"/>
+                <w:color w:val="1E1E1E"/>
+                <w:sz w:val="14"/>
+              </w:rPr>
+              <w:t>`getClients`: код, ИНН, КПП, название, удален</w:t>
+            </w:r>
+          </w:p>
+        </w:tc>
+        <w:tc>
+          <w:tcPr>
+            <w:tcW w:type="dxa" w:w="2800"/>
+            <w:tcMar>
+              <w:top w:w="80" w:type="dxa"/>
+              <w:start w:w="120" w:type="dxa"/>
+              <w:bottom w:w="80" w:type="dxa"/>
+              <w:end w:w="120" w:type="dxa"/>
+            </w:tcMar>
+            <w:vAlign w:val="center"/>
+          </w:tcPr>
+          <w:p>
+            <w:pPr>
+              <w:spacing w:before="0" w:after="0" w:line="252" w:lineRule="auto"/>
+            </w:pPr>
+            <w:r/>
+            <w:r>
+              <w:rPr>
+                <w:rFonts w:ascii="Calibri" w:hAnsi="Calibri"/>
+                <w:b w:val="0"/>
+                <w:color w:val="1E1E1E"/>
+                <w:sz w:val="14"/>
+              </w:rPr>
+              <w:t>контрагент найден и не удален; ИНН/КПП не конфликтуют</w:t>
+            </w:r>
+          </w:p>
+        </w:tc>
+      </w:tr>
+      <w:tr>
+        <w:tc>
+          <w:tcPr>
+            <w:tcW w:type="dxa" w:w="1200"/>
+            <w:tcMar>
+              <w:top w:w="80" w:type="dxa"/>
+              <w:start w:w="120" w:type="dxa"/>
+              <w:bottom w:w="80" w:type="dxa"/>
+              <w:end w:w="120" w:type="dxa"/>
+            </w:tcMar>
+            <w:vAlign w:val="center"/>
+          </w:tcPr>
+          <w:p>
+            <w:pPr>
+              <w:spacing w:before="0" w:after="0" w:line="252" w:lineRule="auto"/>
+            </w:pPr>
+            <w:r/>
+            <w:r>
+              <w:rPr>
+                <w:rFonts w:ascii="Calibri" w:hAnsi="Calibri"/>
+                <w:b w:val="0"/>
+                <w:color w:val="1E1E1E"/>
+                <w:sz w:val="14"/>
+              </w:rPr>
+              <w:t>Договор</w:t>
+            </w:r>
+          </w:p>
+        </w:tc>
+        <w:tc>
+          <w:tcPr>
+            <w:tcW w:type="dxa" w:w="2830"/>
+            <w:tcMar>
+              <w:top w:w="80" w:type="dxa"/>
+              <w:start w:w="120" w:type="dxa"/>
+              <w:bottom w:w="80" w:type="dxa"/>
+              <w:end w:w="120" w:type="dxa"/>
+            </w:tcMar>
+            <w:vAlign w:val="center"/>
+          </w:tcPr>
+          <w:p>
+            <w:pPr>
+              <w:spacing w:before="0" w:after="0" w:line="252" w:lineRule="auto"/>
+            </w:pPr>
+            <w:r/>
+            <w:r>
+              <w:rPr>
+                <w:rFonts w:ascii="Calibri" w:hAnsi="Calibri"/>
+                <w:b w:val="0"/>
+                <w:color w:val="1E1E1E"/>
+                <w:sz w:val="14"/>
+              </w:rPr>
+              <w:t>`dog_id`, номер, дата, организация, `dog_code1c`</w:t>
+            </w:r>
+          </w:p>
+        </w:tc>
+        <w:tc>
+          <w:tcPr>
+            <w:tcW w:type="dxa" w:w="2530"/>
+            <w:tcMar>
+              <w:top w:w="80" w:type="dxa"/>
+              <w:start w:w="120" w:type="dxa"/>
+              <w:bottom w:w="80" w:type="dxa"/>
+              <w:end w:w="120" w:type="dxa"/>
+            </w:tcMar>
+            <w:vAlign w:val="center"/>
+          </w:tcPr>
+          <w:p>
+            <w:pPr>
+              <w:spacing w:before="0" w:after="0" w:line="252" w:lineRule="auto"/>
+            </w:pPr>
+            <w:r/>
+            <w:r>
+              <w:rPr>
+                <w:rFonts w:ascii="Calibri" w:hAnsi="Calibri"/>
+                <w:b w:val="0"/>
+                <w:color w:val="1E1E1E"/>
+                <w:sz w:val="14"/>
+              </w:rPr>
+              <w:t>`getClients.dogs` или `getcoacsuinfo`: код договора, номер, организация</w:t>
+            </w:r>
+          </w:p>
+        </w:tc>
+        <w:tc>
+          <w:tcPr>
+            <w:tcW w:type="dxa" w:w="2800"/>
+            <w:tcMar>
+              <w:top w:w="80" w:type="dxa"/>
+              <w:start w:w="120" w:type="dxa"/>
+              <w:bottom w:w="80" w:type="dxa"/>
+              <w:end w:w="120" w:type="dxa"/>
+            </w:tcMar>
+            <w:vAlign w:val="center"/>
+          </w:tcPr>
+          <w:p>
+            <w:pPr>
+              <w:spacing w:before="0" w:after="0" w:line="252" w:lineRule="auto"/>
+            </w:pPr>
+            <w:r/>
+            <w:r>
+              <w:rPr>
+                <w:rFonts w:ascii="Calibri" w:hAnsi="Calibri"/>
+                <w:b w:val="0"/>
+                <w:color w:val="1E1E1E"/>
+                <w:sz w:val="14"/>
+              </w:rPr>
+              <w:t>код/номер договора и организация совпадают</w:t>
+            </w:r>
+          </w:p>
+        </w:tc>
+      </w:tr>
+      <w:tr>
+        <w:tc>
+          <w:tcPr>
+            <w:tcW w:type="dxa" w:w="1200"/>
+            <w:tcMar>
+              <w:top w:w="80" w:type="dxa"/>
+              <w:start w:w="120" w:type="dxa"/>
+              <w:bottom w:w="80" w:type="dxa"/>
+              <w:end w:w="120" w:type="dxa"/>
+            </w:tcMar>
+            <w:vAlign w:val="center"/>
+          </w:tcPr>
+          <w:p>
+            <w:pPr>
+              <w:spacing w:before="0" w:after="0" w:line="252" w:lineRule="auto"/>
+            </w:pPr>
+            <w:r/>
+            <w:r>
+              <w:rPr>
+                <w:rFonts w:ascii="Calibri" w:hAnsi="Calibri"/>
+                <w:b w:val="0"/>
+                <w:color w:val="1E1E1E"/>
+                <w:sz w:val="14"/>
+              </w:rPr>
+              <w:t>Поставка</w:t>
+            </w:r>
+          </w:p>
+        </w:tc>
+        <w:tc>
+          <w:tcPr>
+            <w:tcW w:type="dxa" w:w="2830"/>
+            <w:tcMar>
+              <w:top w:w="80" w:type="dxa"/>
+              <w:start w:w="120" w:type="dxa"/>
+              <w:bottom w:w="80" w:type="dxa"/>
+              <w:end w:w="120" w:type="dxa"/>
+            </w:tcMar>
+            <w:vAlign w:val="center"/>
+          </w:tcPr>
+          <w:p>
+            <w:pPr>
+              <w:spacing w:before="0" w:after="0" w:line="252" w:lineRule="auto"/>
+            </w:pPr>
+            <w:r/>
+            <w:r>
+              <w:rPr>
+                <w:rFonts w:ascii="Calibri" w:hAnsi="Calibri"/>
+                <w:b w:val="0"/>
+                <w:color w:val="1E1E1E"/>
+                <w:sz w:val="14"/>
+              </w:rPr>
+              <w:t>`spec_id`, `f_num`, `view_specs.spec_type`, `spec_subtype`, `f_kod1cb/f_kod1cp`</w:t>
+            </w:r>
+          </w:p>
+        </w:tc>
+        <w:tc>
+          <w:tcPr>
+            <w:tcW w:type="dxa" w:w="2530"/>
+            <w:tcMar>
+              <w:top w:w="80" w:type="dxa"/>
+              <w:start w:w="120" w:type="dxa"/>
+              <w:bottom w:w="80" w:type="dxa"/>
+              <w:end w:w="120" w:type="dxa"/>
+            </w:tcMar>
+            <w:vAlign w:val="center"/>
+          </w:tcPr>
+          <w:p>
+            <w:pPr>
+              <w:spacing w:before="0" w:after="0" w:line="252" w:lineRule="auto"/>
+            </w:pPr>
+            <w:r/>
+            <w:r>
+              <w:rPr>
+                <w:rFonts w:ascii="Calibri" w:hAnsi="Calibri"/>
+                <w:b w:val="0"/>
+                <w:color w:val="1E1E1E"/>
+                <w:sz w:val="14"/>
+              </w:rPr>
+              <w:t>договоры-заявки/спецификации из 1С по кодам</w:t>
+            </w:r>
+          </w:p>
+        </w:tc>
+        <w:tc>
+          <w:tcPr>
+            <w:tcW w:type="dxa" w:w="2800"/>
+            <w:tcMar>
+              <w:top w:w="80" w:type="dxa"/>
+              <w:start w:w="120" w:type="dxa"/>
+              <w:bottom w:w="80" w:type="dxa"/>
+              <w:end w:w="120" w:type="dxa"/>
+            </w:tcMar>
+            <w:vAlign w:val="center"/>
+          </w:tcPr>
+          <w:p>
+            <w:pPr>
+              <w:spacing w:before="0" w:after="0" w:line="252" w:lineRule="auto"/>
+            </w:pPr>
+            <w:r/>
+            <w:r>
+              <w:rPr>
+                <w:rFonts w:ascii="Calibri" w:hAnsi="Calibri"/>
+                <w:b w:val="0"/>
+                <w:color w:val="1E1E1E"/>
+                <w:sz w:val="14"/>
+              </w:rPr>
+              <w:t>тип и номер выводятся из ERP; полный ОК возможен только если код 1С найден</w:t>
+            </w:r>
+          </w:p>
+        </w:tc>
+      </w:tr>
+      <w:tr>
+        <w:tc>
+          <w:tcPr>
+            <w:tcW w:type="dxa" w:w="1200"/>
+            <w:tcMar>
+              <w:top w:w="80" w:type="dxa"/>
+              <w:start w:w="120" w:type="dxa"/>
+              <w:bottom w:w="80" w:type="dxa"/>
+              <w:end w:w="120" w:type="dxa"/>
+            </w:tcMar>
+            <w:vAlign w:val="center"/>
+          </w:tcPr>
+          <w:p>
+            <w:pPr>
+              <w:spacing w:before="0" w:after="0" w:line="252" w:lineRule="auto"/>
+            </w:pPr>
+            <w:r/>
+            <w:r>
+              <w:rPr>
+                <w:rFonts w:ascii="Calibri" w:hAnsi="Calibri"/>
+                <w:b w:val="0"/>
+                <w:color w:val="1E1E1E"/>
+                <w:sz w:val="14"/>
+              </w:rPr>
+              <w:t>Счет</w:t>
+            </w:r>
+          </w:p>
+        </w:tc>
+        <w:tc>
+          <w:tcPr>
+            <w:tcW w:type="dxa" w:w="2830"/>
+            <w:tcMar>
+              <w:top w:w="80" w:type="dxa"/>
+              <w:start w:w="120" w:type="dxa"/>
+              <w:bottom w:w="80" w:type="dxa"/>
+              <w:end w:w="120" w:type="dxa"/>
+            </w:tcMar>
+            <w:vAlign w:val="center"/>
+          </w:tcPr>
+          <w:p>
+            <w:pPr>
+              <w:spacing w:before="0" w:after="0" w:line="252" w:lineRule="auto"/>
+            </w:pPr>
+            <w:r/>
+            <w:r>
+              <w:rPr>
+                <w:rFonts w:ascii="Calibri" w:hAnsi="Calibri"/>
+                <w:b w:val="0"/>
+                <w:color w:val="1E1E1E"/>
+                <w:sz w:val="14"/>
+              </w:rPr>
+              <w:t>покупательские `veda_schets.f_type=1` по операциям поставки</w:t>
+            </w:r>
+          </w:p>
+        </w:tc>
+        <w:tc>
+          <w:tcPr>
+            <w:tcW w:type="dxa" w:w="2530"/>
+            <w:tcMar>
+              <w:top w:w="80" w:type="dxa"/>
+              <w:start w:w="120" w:type="dxa"/>
+              <w:bottom w:w="80" w:type="dxa"/>
+              <w:end w:w="120" w:type="dxa"/>
+            </w:tcMar>
+            <w:vAlign w:val="center"/>
+          </w:tcPr>
+          <w:p>
+            <w:pPr>
+              <w:spacing w:before="0" w:after="0" w:line="252" w:lineRule="auto"/>
+            </w:pPr>
+            <w:r/>
+            <w:r>
+              <w:rPr>
+                <w:rFonts w:ascii="Calibri" w:hAnsi="Calibri"/>
+                <w:b w:val="0"/>
+                <w:color w:val="1E1E1E"/>
+                <w:sz w:val="14"/>
+              </w:rPr>
+              <w:t>`getAcchist`/счет 1С в расшифровке или SOAP-документ счета</w:t>
+            </w:r>
+          </w:p>
+        </w:tc>
+        <w:tc>
+          <w:tcPr>
+            <w:tcW w:type="dxa" w:w="2800"/>
+            <w:tcMar>
+              <w:top w:w="80" w:type="dxa"/>
+              <w:start w:w="120" w:type="dxa"/>
+              <w:bottom w:w="80" w:type="dxa"/>
+              <w:end w:w="120" w:type="dxa"/>
+            </w:tcMar>
+            <w:vAlign w:val="center"/>
+          </w:tcPr>
+          <w:p>
+            <w:pPr>
+              <w:spacing w:before="0" w:after="0" w:line="252" w:lineRule="auto"/>
+            </w:pPr>
+            <w:r/>
+            <w:r>
+              <w:rPr>
+                <w:rFonts w:ascii="Calibri" w:hAnsi="Calibri"/>
+                <w:b w:val="0"/>
+                <w:color w:val="1E1E1E"/>
+                <w:sz w:val="14"/>
+              </w:rPr>
+              <w:t>номер, дата, сумма, валюта, организация, контрагент</w:t>
+            </w:r>
+          </w:p>
+        </w:tc>
+      </w:tr>
+      <w:tr>
+        <w:tc>
+          <w:tcPr>
+            <w:tcW w:type="dxa" w:w="1200"/>
+            <w:tcMar>
+              <w:top w:w="80" w:type="dxa"/>
+              <w:start w:w="120" w:type="dxa"/>
+              <w:bottom w:w="80" w:type="dxa"/>
+              <w:end w:w="120" w:type="dxa"/>
+            </w:tcMar>
+            <w:vAlign w:val="center"/>
+          </w:tcPr>
+          <w:p>
+            <w:pPr>
+              <w:spacing w:before="0" w:after="0" w:line="252" w:lineRule="auto"/>
+            </w:pPr>
+            <w:r/>
+            <w:r>
+              <w:rPr>
+                <w:rFonts w:ascii="Calibri" w:hAnsi="Calibri"/>
+                <w:b w:val="0"/>
+                <w:color w:val="1E1E1E"/>
+                <w:sz w:val="14"/>
+              </w:rPr>
+              <w:t>Оплата</w:t>
+            </w:r>
+          </w:p>
+        </w:tc>
+        <w:tc>
+          <w:tcPr>
+            <w:tcW w:type="dxa" w:w="2830"/>
+            <w:tcMar>
+              <w:top w:w="80" w:type="dxa"/>
+              <w:start w:w="120" w:type="dxa"/>
+              <w:bottom w:w="80" w:type="dxa"/>
+              <w:end w:w="120" w:type="dxa"/>
+            </w:tcMar>
+            <w:vAlign w:val="center"/>
+          </w:tcPr>
+          <w:p>
+            <w:pPr>
+              <w:spacing w:before="0" w:after="0" w:line="252" w:lineRule="auto"/>
+            </w:pPr>
+            <w:r/>
+            <w:r>
+              <w:rPr>
+                <w:rFonts w:ascii="Calibri" w:hAnsi="Calibri"/>
+                <w:b w:val="0"/>
+                <w:color w:val="1E1E1E"/>
+                <w:sz w:val="14"/>
+              </w:rPr>
+              <w:t>`veda_acchist_docs.f_clssum`, `f_docid`, `f_acchistid`</w:t>
+            </w:r>
+          </w:p>
+        </w:tc>
+        <w:tc>
+          <w:tcPr>
+            <w:tcW w:type="dxa" w:w="2530"/>
+            <w:tcMar>
+              <w:top w:w="80" w:type="dxa"/>
+              <w:start w:w="120" w:type="dxa"/>
+              <w:bottom w:w="80" w:type="dxa"/>
+              <w:end w:w="120" w:type="dxa"/>
+            </w:tcMar>
+            <w:vAlign w:val="center"/>
+          </w:tcPr>
+          <w:p>
+            <w:pPr>
+              <w:spacing w:before="0" w:after="0" w:line="252" w:lineRule="auto"/>
+            </w:pPr>
+            <w:r/>
+            <w:r>
+              <w:rPr>
+                <w:rFonts w:ascii="Calibri" w:hAnsi="Calibri"/>
+                <w:b w:val="0"/>
+                <w:color w:val="1E1E1E"/>
+                <w:sz w:val="14"/>
+              </w:rPr>
+              <w:t>`getAcchist`: банковский документ и расшифровка платежа</w:t>
+            </w:r>
+          </w:p>
+        </w:tc>
+        <w:tc>
+          <w:tcPr>
+            <w:tcW w:type="dxa" w:w="2800"/>
+            <w:tcMar>
+              <w:top w:w="80" w:type="dxa"/>
+              <w:start w:w="120" w:type="dxa"/>
+              <w:bottom w:w="80" w:type="dxa"/>
+              <w:end w:w="120" w:type="dxa"/>
+            </w:tcMar>
+            <w:vAlign w:val="center"/>
+          </w:tcPr>
+          <w:p>
+            <w:pPr>
+              <w:spacing w:before="0" w:after="0" w:line="252" w:lineRule="auto"/>
+            </w:pPr>
+            <w:r/>
+            <w:r>
+              <w:rPr>
+                <w:rFonts w:ascii="Calibri" w:hAnsi="Calibri"/>
+                <w:b w:val="0"/>
+                <w:color w:val="1E1E1E"/>
+                <w:sz w:val="14"/>
+              </w:rPr>
+              <w:t>сравнивается распределенная доля, а не полная сумма банковской выписки</w:t>
+            </w:r>
+          </w:p>
+        </w:tc>
+      </w:tr>
+      <w:tr>
+        <w:tc>
+          <w:tcPr>
+            <w:tcW w:type="dxa" w:w="1200"/>
+            <w:tcMar>
+              <w:top w:w="80" w:type="dxa"/>
+              <w:start w:w="120" w:type="dxa"/>
+              <w:bottom w:w="80" w:type="dxa"/>
+              <w:end w:w="120" w:type="dxa"/>
+            </w:tcMar>
+            <w:vAlign w:val="center"/>
+          </w:tcPr>
+          <w:p>
+            <w:pPr>
+              <w:spacing w:before="0" w:after="0" w:line="252" w:lineRule="auto"/>
+            </w:pPr>
+            <w:r/>
+            <w:r>
+              <w:rPr>
+                <w:rFonts w:ascii="Calibri" w:hAnsi="Calibri"/>
+                <w:b w:val="0"/>
+                <w:color w:val="1E1E1E"/>
+                <w:sz w:val="14"/>
+              </w:rPr>
+              <w:t>Реализация</w:t>
+            </w:r>
+          </w:p>
+        </w:tc>
+        <w:tc>
+          <w:tcPr>
+            <w:tcW w:type="dxa" w:w="2830"/>
+            <w:tcMar>
+              <w:top w:w="80" w:type="dxa"/>
+              <w:start w:w="120" w:type="dxa"/>
+              <w:bottom w:w="80" w:type="dxa"/>
+              <w:end w:w="120" w:type="dxa"/>
+            </w:tcMar>
+            <w:vAlign w:val="center"/>
+          </w:tcPr>
+          <w:p>
+            <w:pPr>
+              <w:spacing w:before="0" w:after="0" w:line="252" w:lineRule="auto"/>
+            </w:pPr>
+            <w:r/>
+            <w:r>
+              <w:rPr>
+                <w:rFonts w:ascii="Calibri" w:hAnsi="Calibri"/>
+                <w:b w:val="0"/>
+                <w:color w:val="1E1E1E"/>
+                <w:sz w:val="14"/>
+              </w:rPr>
+              <w:t>`get_realizsum(oper_id)` по операциям `f_isvozm=1/2`</w:t>
+            </w:r>
+          </w:p>
+        </w:tc>
+        <w:tc>
+          <w:tcPr>
+            <w:tcW w:type="dxa" w:w="2530"/>
+            <w:tcMar>
+              <w:top w:w="80" w:type="dxa"/>
+              <w:start w:w="120" w:type="dxa"/>
+              <w:bottom w:w="80" w:type="dxa"/>
+              <w:end w:w="120" w:type="dxa"/>
+            </w:tcMar>
+            <w:vAlign w:val="center"/>
+          </w:tcPr>
+          <w:p>
+            <w:pPr>
+              <w:spacing w:before="0" w:after="0" w:line="252" w:lineRule="auto"/>
+            </w:pPr>
+            <w:r/>
+            <w:r>
+              <w:rPr>
+                <w:rFonts w:ascii="Calibri" w:hAnsi="Calibri"/>
+                <w:b w:val="0"/>
+                <w:color w:val="1E1E1E"/>
+                <w:sz w:val="14"/>
+              </w:rPr>
+              <w:t>`getAkts`, `getEDOArh/getEDPacket`: акты, УПД/СФ, строки услуг</w:t>
+            </w:r>
+          </w:p>
+        </w:tc>
+        <w:tc>
+          <w:tcPr>
+            <w:tcW w:type="dxa" w:w="2800"/>
+            <w:tcMar>
+              <w:top w:w="80" w:type="dxa"/>
+              <w:start w:w="120" w:type="dxa"/>
+              <w:bottom w:w="80" w:type="dxa"/>
+              <w:end w:w="120" w:type="dxa"/>
+            </w:tcMar>
+            <w:vAlign w:val="center"/>
+          </w:tcPr>
+          <w:p>
+            <w:pPr>
+              <w:spacing w:before="0" w:after="0" w:line="252" w:lineRule="auto"/>
+            </w:pPr>
+            <w:r/>
+            <w:r>
+              <w:rPr>
+                <w:rFonts w:ascii="Calibri" w:hAnsi="Calibri"/>
+                <w:b w:val="0"/>
+                <w:color w:val="1E1E1E"/>
+                <w:sz w:val="14"/>
+              </w:rPr>
+              <w:t>сумма, НДС, закрывающий документ, договор строки</w:t>
+            </w:r>
+          </w:p>
+        </w:tc>
+      </w:tr>
+    </w:tbl>
+    <w:p>
+      <w:pPr>
+        <w:spacing w:after="40"/>
+      </w:pPr>
+    </w:p>
+    <w:p>
+      <w:pPr>
         <w:pStyle w:val="Heading1"/>
         <w:keepNext/>
       </w:pPr>
@@ -3457,6 +4266,380 @@
         </w:rPr>
         <w:t>5. ERP-селекты и правила расчета</w:t>
       </w:r>
+    </w:p>
+    <w:p>
+      <w:pPr>
+        <w:pStyle w:val="Heading2"/>
+        <w:keepNext/>
+      </w:pPr>
+      <w:r/>
+      <w:r>
+        <w:rPr>
+          <w:rFonts w:ascii="Calibri" w:hAnsi="Calibri"/>
+          <w:b/>
+          <w:color w:val="2E74B5"/>
+          <w:sz w:val="26"/>
+        </w:rPr>
+        <w:t>5.0 Ограничения выборки</w:t>
+      </w:r>
+    </w:p>
+    <w:tbl>
+      <w:tblGrid>
+        <w:gridCol w:w="2100"/>
+        <w:gridCol w:w="7260"/>
+      </w:tblGrid>
+      <w:tblPr>
+        <w:tblStyle w:val="TableGrid"/>
+        <w:tblW w:type="dxa" w:w="9360"/>
+        <w:tblLayout w:type="fixed"/>
+        <w:tblLook w:firstColumn="1" w:firstRow="1" w:lastColumn="0" w:lastRow="0" w:noHBand="0" w:noVBand="1" w:val="04A0"/>
+        <w:tblInd w:w="120" w:type="dxa"/>
+      </w:tblPr>
+      <w:tr>
+        <w:tc>
+          <w:tcPr>
+            <w:tcW w:type="dxa" w:w="2100"/>
+            <w:tcMar>
+              <w:top w:w="80" w:type="dxa"/>
+              <w:start w:w="120" w:type="dxa"/>
+              <w:bottom w:w="80" w:type="dxa"/>
+              <w:end w:w="120" w:type="dxa"/>
+            </w:tcMar>
+            <w:vAlign w:val="center"/>
+            <w:shd w:fill="E8EEF5"/>
+          </w:tcPr>
+          <w:p>
+            <w:pPr>
+              <w:spacing w:before="0" w:after="0" w:line="252" w:lineRule="auto"/>
+              <w:jc w:val="center"/>
+            </w:pPr>
+            <w:r/>
+            <w:r>
+              <w:rPr>
+                <w:rFonts w:ascii="Calibri" w:hAnsi="Calibri"/>
+                <w:b/>
+                <w:color w:val="1F4D78"/>
+                <w:sz w:val="16"/>
+              </w:rPr>
+              <w:t>Ограничение</w:t>
+            </w:r>
+          </w:p>
+        </w:tc>
+        <w:tc>
+          <w:tcPr>
+            <w:tcW w:type="dxa" w:w="7260"/>
+            <w:tcMar>
+              <w:top w:w="80" w:type="dxa"/>
+              <w:start w:w="120" w:type="dxa"/>
+              <w:bottom w:w="80" w:type="dxa"/>
+              <w:end w:w="120" w:type="dxa"/>
+            </w:tcMar>
+            <w:vAlign w:val="center"/>
+            <w:shd w:fill="E8EEF5"/>
+          </w:tcPr>
+          <w:p>
+            <w:pPr>
+              <w:spacing w:before="0" w:after="0" w:line="252" w:lineRule="auto"/>
+              <w:jc w:val="center"/>
+            </w:pPr>
+            <w:r/>
+            <w:r>
+              <w:rPr>
+                <w:rFonts w:ascii="Calibri" w:hAnsi="Calibri"/>
+                <w:b/>
+                <w:color w:val="1F4D78"/>
+                <w:sz w:val="16"/>
+              </w:rPr>
+              <w:t>Требование</w:t>
+            </w:r>
+          </w:p>
+        </w:tc>
+      </w:tr>
+      <w:tr>
+        <w:tc>
+          <w:tcPr>
+            <w:tcW w:type="dxa" w:w="2100"/>
+            <w:tcMar>
+              <w:top w:w="80" w:type="dxa"/>
+              <w:start w:w="120" w:type="dxa"/>
+              <w:bottom w:w="80" w:type="dxa"/>
+              <w:end w:w="120" w:type="dxa"/>
+            </w:tcMar>
+            <w:vAlign w:val="center"/>
+          </w:tcPr>
+          <w:p>
+            <w:pPr>
+              <w:spacing w:before="0" w:after="0" w:line="252" w:lineRule="auto"/>
+            </w:pPr>
+            <w:r/>
+            <w:r>
+              <w:rPr>
+                <w:rFonts w:ascii="Calibri" w:hAnsi="Calibri"/>
+                <w:b w:val="0"/>
+                <w:color w:val="1E1E1E"/>
+                <w:sz w:val="16"/>
+              </w:rPr>
+              <w:t>Фильтр обязателен</w:t>
+            </w:r>
+          </w:p>
+        </w:tc>
+        <w:tc>
+          <w:tcPr>
+            <w:tcW w:type="dxa" w:w="7260"/>
+            <w:tcMar>
+              <w:top w:w="80" w:type="dxa"/>
+              <w:start w:w="120" w:type="dxa"/>
+              <w:bottom w:w="80" w:type="dxa"/>
+              <w:end w:w="120" w:type="dxa"/>
+            </w:tcMar>
+            <w:vAlign w:val="center"/>
+          </w:tcPr>
+          <w:p>
+            <w:pPr>
+              <w:spacing w:before="0" w:after="0" w:line="252" w:lineRule="auto"/>
+            </w:pPr>
+            <w:r/>
+            <w:r>
+              <w:rPr>
+                <w:rFonts w:ascii="Calibri" w:hAnsi="Calibri"/>
+                <w:b w:val="0"/>
+                <w:color w:val="1E1E1E"/>
+                <w:sz w:val="16"/>
+              </w:rPr>
+              <w:t>Запуск без клиента/периода/договора запрещен. Минимум: клиент + период; для первичного экрана желательно договор.</w:t>
+            </w:r>
+          </w:p>
+        </w:tc>
+      </w:tr>
+      <w:tr>
+        <w:tc>
+          <w:tcPr>
+            <w:tcW w:type="dxa" w:w="2100"/>
+            <w:tcMar>
+              <w:top w:w="80" w:type="dxa"/>
+              <w:start w:w="120" w:type="dxa"/>
+              <w:bottom w:w="80" w:type="dxa"/>
+              <w:end w:w="120" w:type="dxa"/>
+            </w:tcMar>
+            <w:vAlign w:val="center"/>
+          </w:tcPr>
+          <w:p>
+            <w:pPr>
+              <w:spacing w:before="0" w:after="0" w:line="252" w:lineRule="auto"/>
+            </w:pPr>
+            <w:r/>
+            <w:r>
+              <w:rPr>
+                <w:rFonts w:ascii="Calibri" w:hAnsi="Calibri"/>
+                <w:b w:val="0"/>
+                <w:color w:val="1E1E1E"/>
+                <w:sz w:val="16"/>
+              </w:rPr>
+              <w:t>Размер страницы</w:t>
+            </w:r>
+          </w:p>
+        </w:tc>
+        <w:tc>
+          <w:tcPr>
+            <w:tcW w:type="dxa" w:w="7260"/>
+            <w:tcMar>
+              <w:top w:w="80" w:type="dxa"/>
+              <w:start w:w="120" w:type="dxa"/>
+              <w:bottom w:w="80" w:type="dxa"/>
+              <w:end w:w="120" w:type="dxa"/>
+            </w:tcMar>
+            <w:vAlign w:val="center"/>
+          </w:tcPr>
+          <w:p>
+            <w:pPr>
+              <w:spacing w:before="0" w:after="0" w:line="252" w:lineRule="auto"/>
+            </w:pPr>
+            <w:r/>
+            <w:r>
+              <w:rPr>
+                <w:rFonts w:ascii="Calibri" w:hAnsi="Calibri"/>
+                <w:b w:val="0"/>
+                <w:color w:val="1E1E1E"/>
+                <w:sz w:val="16"/>
+              </w:rPr>
+              <w:t>Экран матрицы показывает до 50 поставок за один запрос. Для большего объема нужна пагинация или фоновая XLSX-задача.</w:t>
+            </w:r>
+          </w:p>
+        </w:tc>
+      </w:tr>
+      <w:tr>
+        <w:tc>
+          <w:tcPr>
+            <w:tcW w:type="dxa" w:w="2100"/>
+            <w:tcMar>
+              <w:top w:w="80" w:type="dxa"/>
+              <w:start w:w="120" w:type="dxa"/>
+              <w:bottom w:w="80" w:type="dxa"/>
+              <w:end w:w="120" w:type="dxa"/>
+            </w:tcMar>
+            <w:vAlign w:val="center"/>
+          </w:tcPr>
+          <w:p>
+            <w:pPr>
+              <w:spacing w:before="0" w:after="0" w:line="252" w:lineRule="auto"/>
+            </w:pPr>
+            <w:r/>
+            <w:r>
+              <w:rPr>
+                <w:rFonts w:ascii="Calibri" w:hAnsi="Calibri"/>
+                <w:b w:val="0"/>
+                <w:color w:val="1E1E1E"/>
+                <w:sz w:val="16"/>
+              </w:rPr>
+              <w:t>Тяжелые процедуры</w:t>
+            </w:r>
+          </w:p>
+        </w:tc>
+        <w:tc>
+          <w:tcPr>
+            <w:tcW w:type="dxa" w:w="7260"/>
+            <w:tcMar>
+              <w:top w:w="80" w:type="dxa"/>
+              <w:start w:w="120" w:type="dxa"/>
+              <w:bottom w:w="80" w:type="dxa"/>
+              <w:end w:w="120" w:type="dxa"/>
+            </w:tcMar>
+            <w:vAlign w:val="center"/>
+          </w:tcPr>
+          <w:p>
+            <w:pPr>
+              <w:spacing w:before="0" w:after="0" w:line="252" w:lineRule="auto"/>
+            </w:pPr>
+            <w:r/>
+            <w:r>
+              <w:rPr>
+                <w:rFonts w:ascii="Calibri" w:hAnsi="Calibri"/>
+                <w:b w:val="0"/>
+                <w:color w:val="1E1E1E"/>
+                <w:sz w:val="16"/>
+              </w:rPr>
+              <w:t>`get_paidsum`, `get_realizsum`, `get_expensessum`, `get_profit` считать только по выбранным `spec_id` и их операциям, не по всему договору без лимита.</w:t>
+            </w:r>
+          </w:p>
+        </w:tc>
+      </w:tr>
+      <w:tr>
+        <w:tc>
+          <w:tcPr>
+            <w:tcW w:type="dxa" w:w="2100"/>
+            <w:tcMar>
+              <w:top w:w="80" w:type="dxa"/>
+              <w:start w:w="120" w:type="dxa"/>
+              <w:bottom w:w="80" w:type="dxa"/>
+              <w:end w:w="120" w:type="dxa"/>
+            </w:tcMar>
+            <w:vAlign w:val="center"/>
+          </w:tcPr>
+          <w:p>
+            <w:pPr>
+              <w:spacing w:before="0" w:after="0" w:line="252" w:lineRule="auto"/>
+            </w:pPr>
+            <w:r/>
+            <w:r>
+              <w:rPr>
+                <w:rFonts w:ascii="Calibri" w:hAnsi="Calibri"/>
+                <w:b w:val="0"/>
+                <w:color w:val="1E1E1E"/>
+                <w:sz w:val="16"/>
+              </w:rPr>
+              <w:t>SOAP 1С</w:t>
+            </w:r>
+          </w:p>
+        </w:tc>
+        <w:tc>
+          <w:tcPr>
+            <w:tcW w:type="dxa" w:w="7260"/>
+            <w:tcMar>
+              <w:top w:w="80" w:type="dxa"/>
+              <w:start w:w="120" w:type="dxa"/>
+              <w:bottom w:w="80" w:type="dxa"/>
+              <w:end w:w="120" w:type="dxa"/>
+            </w:tcMar>
+            <w:vAlign w:val="center"/>
+          </w:tcPr>
+          <w:p>
+            <w:pPr>
+              <w:spacing w:before="0" w:after="0" w:line="252" w:lineRule="auto"/>
+            </w:pPr>
+            <w:r/>
+            <w:r>
+              <w:rPr>
+                <w:rFonts w:ascii="Calibri" w:hAnsi="Calibri"/>
+                <w:b w:val="0"/>
+                <w:color w:val="1E1E1E"/>
+                <w:sz w:val="16"/>
+              </w:rPr>
+              <w:t>Вызовы 1С выполнять батчами по организациям/периодам; не дергать 1С отдельно на каждую строку таблицы, если можно получить период одним вызовом.</w:t>
+            </w:r>
+          </w:p>
+        </w:tc>
+      </w:tr>
+      <w:tr>
+        <w:tc>
+          <w:tcPr>
+            <w:tcW w:type="dxa" w:w="2100"/>
+            <w:tcMar>
+              <w:top w:w="80" w:type="dxa"/>
+              <w:start w:w="120" w:type="dxa"/>
+              <w:bottom w:w="80" w:type="dxa"/>
+              <w:end w:w="120" w:type="dxa"/>
+            </w:tcMar>
+            <w:vAlign w:val="center"/>
+          </w:tcPr>
+          <w:p>
+            <w:pPr>
+              <w:spacing w:before="0" w:after="0" w:line="252" w:lineRule="auto"/>
+            </w:pPr>
+            <w:r/>
+            <w:r>
+              <w:rPr>
+                <w:rFonts w:ascii="Calibri" w:hAnsi="Calibri"/>
+                <w:b w:val="0"/>
+                <w:color w:val="1E1E1E"/>
+                <w:sz w:val="16"/>
+              </w:rPr>
+              <w:t>Документы внутри поставки</w:t>
+            </w:r>
+          </w:p>
+        </w:tc>
+        <w:tc>
+          <w:tcPr>
+            <w:tcW w:type="dxa" w:w="7260"/>
+            <w:tcMar>
+              <w:top w:w="80" w:type="dxa"/>
+              <w:start w:w="120" w:type="dxa"/>
+              <w:bottom w:w="80" w:type="dxa"/>
+              <w:end w:w="120" w:type="dxa"/>
+            </w:tcMar>
+            <w:vAlign w:val="center"/>
+          </w:tcPr>
+          <w:p>
+            <w:pPr>
+              <w:spacing w:before="0" w:after="0" w:line="252" w:lineRule="auto"/>
+            </w:pPr>
+            <w:r/>
+            <w:r>
+              <w:rPr>
+                <w:rFonts w:ascii="Calibri" w:hAnsi="Calibri"/>
+                <w:b w:val="0"/>
+                <w:color w:val="1E1E1E"/>
+                <w:sz w:val="16"/>
+              </w:rPr>
+              <w:t>На экране показывать агрегаты; полный список актов/СФ/УПД выводить в раскрытии или XLSX, чтобы не раздувать матрицу.</w:t>
+            </w:r>
+          </w:p>
+        </w:tc>
+      </w:tr>
+    </w:tbl>
+    <w:p>
+      <w:pPr>
+        <w:spacing w:after="40"/>
+      </w:pPr>
     </w:p>
     <w:p>
       <w:pPr>
@@ -4349,7 +5532,7 @@
           <w:color w:val="1E1E1E"/>
           <w:sz w:val="21"/>
         </w:rPr>
-        <w:t>Матрица должна строиться не из Excel и не из внешнего файла. Источник экрана и XLSX - один нормализованный массив блоков поставок. Ниже указано, какие данные собрать, что агрегировать и в какие колонки положить.</w:t>
+        <w:t>Матрица должна строиться не из Excel и не из внешнего файла. Источник экрана и XLSX - один нормализованный набор блоков поставок. Ниже указано, какие данные собрать, что агрегировать и в какие колонки положить.</w:t>
       </w:r>
     </w:p>
     <w:tbl>
@@ -4505,7 +5688,7 @@
                 <w:color w:val="1E1E1E"/>
                 <w:sz w:val="14"/>
               </w:rPr>
-              <w:t>`veda_contacts -&gt; veda_clients -&gt; veda_dogs -&gt; veda_specs`; фильтры `contact_id`, `client_id`, `dog_id`, период или список `spec_id/f_num`.</w:t>
+              <w:t>`veda_contacts -&gt; veda_clients -&gt; veda_dogs -&gt; view_specs/veda_specs`; фильтры `contact_id`, `client_id`, `dog_id`, период или список `spec_id/f_num`.</w:t>
             </w:r>
           </w:p>
         </w:tc>
@@ -4532,7 +5715,7 @@
                 <w:color w:val="1E1E1E"/>
                 <w:sz w:val="14"/>
               </w:rPr>
-              <w:t>`contact`, `legal`, `dog`, `spec`: id, название, ИНН, номер договора, код 1С, номер/дата поставки.</w:t>
+              <w:t>Клиент, ЮЛ, договор, поставка: id, название, ИНН, номер договора, код 1С, `spec_type`, `spec_subtype`, номер/дата поставки.</w:t>
             </w:r>
           </w:p>
         </w:tc>
@@ -5041,182 +6224,419 @@
         <w:spacing w:after="40"/>
       </w:pPr>
     </w:p>
+    <w:tbl>
+      <w:tblGrid>
+        <w:gridCol w:w="2050"/>
+        <w:gridCol w:w="7310"/>
+      </w:tblGrid>
+      <w:tblPr>
+        <w:tblStyle w:val="TableGrid"/>
+        <w:tblW w:type="dxa" w:w="9360"/>
+        <w:tblLayout w:type="fixed"/>
+        <w:tblLook w:firstColumn="1" w:firstRow="1" w:lastColumn="0" w:lastRow="0" w:noHBand="0" w:noVBand="1" w:val="04A0"/>
+        <w:tblInd w:w="120" w:type="dxa"/>
+      </w:tblPr>
+      <w:tr>
+        <w:tc>
+          <w:tcPr>
+            <w:tcW w:type="dxa" w:w="2050"/>
+            <w:tcMar>
+              <w:top w:w="80" w:type="dxa"/>
+              <w:start w:w="120" w:type="dxa"/>
+              <w:bottom w:w="80" w:type="dxa"/>
+              <w:end w:w="120" w:type="dxa"/>
+            </w:tcMar>
+            <w:vAlign w:val="center"/>
+            <w:shd w:fill="E8EEF5"/>
+          </w:tcPr>
+          <w:p>
+            <w:pPr>
+              <w:spacing w:before="0" w:after="0" w:line="252" w:lineRule="auto"/>
+              <w:jc w:val="center"/>
+            </w:pPr>
+            <w:r/>
+            <w:r>
+              <w:rPr>
+                <w:rFonts w:ascii="Calibri" w:hAnsi="Calibri"/>
+                <w:b/>
+                <w:color w:val="1F4D78"/>
+                <w:sz w:val="15"/>
+              </w:rPr>
+              <w:t>Нормализованный блок</w:t>
+            </w:r>
+          </w:p>
+        </w:tc>
+        <w:tc>
+          <w:tcPr>
+            <w:tcW w:type="dxa" w:w="7310"/>
+            <w:tcMar>
+              <w:top w:w="80" w:type="dxa"/>
+              <w:start w:w="120" w:type="dxa"/>
+              <w:bottom w:w="80" w:type="dxa"/>
+              <w:end w:w="120" w:type="dxa"/>
+            </w:tcMar>
+            <w:vAlign w:val="center"/>
+            <w:shd w:fill="E8EEF5"/>
+          </w:tcPr>
+          <w:p>
+            <w:pPr>
+              <w:spacing w:before="0" w:after="0" w:line="252" w:lineRule="auto"/>
+              <w:jc w:val="center"/>
+            </w:pPr>
+            <w:r/>
+            <w:r>
+              <w:rPr>
+                <w:rFonts w:ascii="Calibri" w:hAnsi="Calibri"/>
+                <w:b/>
+                <w:color w:val="1F4D78"/>
+                <w:sz w:val="15"/>
+              </w:rPr>
+              <w:t>Обязательные поля</w:t>
+            </w:r>
+          </w:p>
+        </w:tc>
+      </w:tr>
+      <w:tr>
+        <w:tc>
+          <w:tcPr>
+            <w:tcW w:type="dxa" w:w="2050"/>
+            <w:tcMar>
+              <w:top w:w="80" w:type="dxa"/>
+              <w:start w:w="120" w:type="dxa"/>
+              <w:bottom w:w="80" w:type="dxa"/>
+              <w:end w:w="120" w:type="dxa"/>
+            </w:tcMar>
+            <w:vAlign w:val="center"/>
+          </w:tcPr>
+          <w:p>
+            <w:pPr>
+              <w:spacing w:before="0" w:after="0" w:line="252" w:lineRule="auto"/>
+            </w:pPr>
+            <w:r/>
+            <w:r>
+              <w:rPr>
+                <w:rFonts w:ascii="Calibri" w:hAnsi="Calibri"/>
+                <w:b w:val="0"/>
+                <w:color w:val="1E1E1E"/>
+                <w:sz w:val="15"/>
+              </w:rPr>
+              <w:t>Контекст</w:t>
+            </w:r>
+          </w:p>
+        </w:tc>
+        <w:tc>
+          <w:tcPr>
+            <w:tcW w:type="dxa" w:w="7310"/>
+            <w:tcMar>
+              <w:top w:w="80" w:type="dxa"/>
+              <w:start w:w="120" w:type="dxa"/>
+              <w:bottom w:w="80" w:type="dxa"/>
+              <w:end w:w="120" w:type="dxa"/>
+            </w:tcMar>
+            <w:vAlign w:val="center"/>
+          </w:tcPr>
+          <w:p>
+            <w:pPr>
+              <w:spacing w:before="0" w:after="0" w:line="252" w:lineRule="auto"/>
+            </w:pPr>
+            <w:r/>
+            <w:r>
+              <w:rPr>
+                <w:rFonts w:ascii="Calibri" w:hAnsi="Calibri"/>
+                <w:b w:val="0"/>
+                <w:color w:val="1E1E1E"/>
+                <w:sz w:val="15"/>
+              </w:rPr>
+              <w:t>`contact_id/name/inn`, `client_id/name/inn`, `dog_id/number/code1c`, `spec_id/number/type/subtype/date/name/code1c`.</w:t>
+            </w:r>
+          </w:p>
+        </w:tc>
+      </w:tr>
+      <w:tr>
+        <w:tc>
+          <w:tcPr>
+            <w:tcW w:type="dxa" w:w="2050"/>
+            <w:tcMar>
+              <w:top w:w="80" w:type="dxa"/>
+              <w:start w:w="120" w:type="dxa"/>
+              <w:bottom w:w="80" w:type="dxa"/>
+              <w:end w:w="120" w:type="dxa"/>
+            </w:tcMar>
+            <w:vAlign w:val="center"/>
+          </w:tcPr>
+          <w:p>
+            <w:pPr>
+              <w:spacing w:before="0" w:after="0" w:line="252" w:lineRule="auto"/>
+            </w:pPr>
+            <w:r/>
+            <w:r>
+              <w:rPr>
+                <w:rFonts w:ascii="Calibri" w:hAnsi="Calibri"/>
+                <w:b w:val="0"/>
+                <w:color w:val="1E1E1E"/>
+                <w:sz w:val="15"/>
+              </w:rPr>
+              <w:t>Счета покупателю</w:t>
+            </w:r>
+          </w:p>
+        </w:tc>
+        <w:tc>
+          <w:tcPr>
+            <w:tcW w:type="dxa" w:w="7310"/>
+            <w:tcMar>
+              <w:top w:w="80" w:type="dxa"/>
+              <w:start w:w="120" w:type="dxa"/>
+              <w:bottom w:w="80" w:type="dxa"/>
+              <w:end w:w="120" w:type="dxa"/>
+            </w:tcMar>
+            <w:vAlign w:val="center"/>
+          </w:tcPr>
+          <w:p>
+            <w:pPr>
+              <w:spacing w:before="0" w:after="0" w:line="252" w:lineRule="auto"/>
+            </w:pPr>
+            <w:r/>
+            <w:r>
+              <w:rPr>
+                <w:rFonts w:ascii="Calibri" w:hAnsi="Calibri"/>
+                <w:b w:val="0"/>
+                <w:color w:val="1E1E1E"/>
+                <w:sz w:val="15"/>
+              </w:rPr>
+              <w:t>список `number`, `date`, `sum`, `currency`, `code1c`; только `f_type=1`, основной счет без дублей дочерних строк.</w:t>
+            </w:r>
+          </w:p>
+        </w:tc>
+      </w:tr>
+      <w:tr>
+        <w:tc>
+          <w:tcPr>
+            <w:tcW w:type="dxa" w:w="2050"/>
+            <w:tcMar>
+              <w:top w:w="80" w:type="dxa"/>
+              <w:start w:w="120" w:type="dxa"/>
+              <w:bottom w:w="80" w:type="dxa"/>
+              <w:end w:w="120" w:type="dxa"/>
+            </w:tcMar>
+            <w:vAlign w:val="center"/>
+          </w:tcPr>
+          <w:p>
+            <w:pPr>
+              <w:spacing w:before="0" w:after="0" w:line="252" w:lineRule="auto"/>
+            </w:pPr>
+            <w:r/>
+            <w:r>
+              <w:rPr>
+                <w:rFonts w:ascii="Calibri" w:hAnsi="Calibri"/>
+                <w:b w:val="0"/>
+                <w:color w:val="1E1E1E"/>
+                <w:sz w:val="15"/>
+              </w:rPr>
+              <w:t>Оплаты</w:t>
+            </w:r>
+          </w:p>
+        </w:tc>
+        <w:tc>
+          <w:tcPr>
+            <w:tcW w:type="dxa" w:w="7310"/>
+            <w:tcMar>
+              <w:top w:w="80" w:type="dxa"/>
+              <w:start w:w="120" w:type="dxa"/>
+              <w:bottom w:w="80" w:type="dxa"/>
+              <w:end w:w="120" w:type="dxa"/>
+            </w:tcMar>
+            <w:vAlign w:val="center"/>
+          </w:tcPr>
+          <w:p>
+            <w:pPr>
+              <w:spacing w:before="0" w:after="0" w:line="252" w:lineRule="auto"/>
+            </w:pPr>
+            <w:r/>
+            <w:r>
+              <w:rPr>
+                <w:rFonts w:ascii="Calibri" w:hAnsi="Calibri"/>
+                <w:b w:val="0"/>
+                <w:color w:val="1E1E1E"/>
+                <w:sz w:val="15"/>
+              </w:rPr>
+              <w:t>`paid_total_get_paidsum`, `paid_total_acchist_docs`, список распределенных платежей по `f_clssum`.</w:t>
+            </w:r>
+          </w:p>
+        </w:tc>
+      </w:tr>
+      <w:tr>
+        <w:tc>
+          <w:tcPr>
+            <w:tcW w:type="dxa" w:w="2050"/>
+            <w:tcMar>
+              <w:top w:w="80" w:type="dxa"/>
+              <w:start w:w="120" w:type="dxa"/>
+              <w:bottom w:w="80" w:type="dxa"/>
+              <w:end w:w="120" w:type="dxa"/>
+            </w:tcMar>
+            <w:vAlign w:val="center"/>
+          </w:tcPr>
+          <w:p>
+            <w:pPr>
+              <w:spacing w:before="0" w:after="0" w:line="252" w:lineRule="auto"/>
+            </w:pPr>
+            <w:r/>
+            <w:r>
+              <w:rPr>
+                <w:rFonts w:ascii="Calibri" w:hAnsi="Calibri"/>
+                <w:b w:val="0"/>
+                <w:color w:val="1E1E1E"/>
+                <w:sz w:val="15"/>
+              </w:rPr>
+              <w:t>Реализация</w:t>
+            </w:r>
+          </w:p>
+        </w:tc>
+        <w:tc>
+          <w:tcPr>
+            <w:tcW w:type="dxa" w:w="7310"/>
+            <w:tcMar>
+              <w:top w:w="80" w:type="dxa"/>
+              <w:start w:w="120" w:type="dxa"/>
+              <w:bottom w:w="80" w:type="dxa"/>
+              <w:end w:w="120" w:type="dxa"/>
+            </w:tcMar>
+            <w:vAlign w:val="center"/>
+          </w:tcPr>
+          <w:p>
+            <w:pPr>
+              <w:spacing w:before="0" w:after="0" w:line="252" w:lineRule="auto"/>
+            </w:pPr>
+            <w:r/>
+            <w:r>
+              <w:rPr>
+                <w:rFonts w:ascii="Calibri" w:hAnsi="Calibri"/>
+                <w:b w:val="0"/>
+                <w:color w:val="1E1E1E"/>
+                <w:sz w:val="15"/>
+              </w:rPr>
+              <w:t>`reimbursable_realization_get_realizsum`, `non_reimbursable_realization_get_realizsum`, `realization_total_get_realizsum`.</w:t>
+            </w:r>
+          </w:p>
+        </w:tc>
+      </w:tr>
+      <w:tr>
+        <w:tc>
+          <w:tcPr>
+            <w:tcW w:type="dxa" w:w="2050"/>
+            <w:tcMar>
+              <w:top w:w="80" w:type="dxa"/>
+              <w:start w:w="120" w:type="dxa"/>
+              <w:bottom w:w="80" w:type="dxa"/>
+              <w:end w:w="120" w:type="dxa"/>
+            </w:tcMar>
+            <w:vAlign w:val="center"/>
+          </w:tcPr>
+          <w:p>
+            <w:pPr>
+              <w:spacing w:before="0" w:after="0" w:line="252" w:lineRule="auto"/>
+            </w:pPr>
+            <w:r/>
+            <w:r>
+              <w:rPr>
+                <w:rFonts w:ascii="Calibri" w:hAnsi="Calibri"/>
+                <w:b w:val="0"/>
+                <w:color w:val="1E1E1E"/>
+                <w:sz w:val="15"/>
+              </w:rPr>
+              <w:t>Закрывающие документы</w:t>
+            </w:r>
+          </w:p>
+        </w:tc>
+        <w:tc>
+          <w:tcPr>
+            <w:tcW w:type="dxa" w:w="7310"/>
+            <w:tcMar>
+              <w:top w:w="80" w:type="dxa"/>
+              <w:start w:w="120" w:type="dxa"/>
+              <w:bottom w:w="80" w:type="dxa"/>
+              <w:end w:w="120" w:type="dxa"/>
+            </w:tcMar>
+            <w:vAlign w:val="center"/>
+          </w:tcPr>
+          <w:p>
+            <w:pPr>
+              <w:spacing w:before="0" w:after="0" w:line="252" w:lineRule="auto"/>
+            </w:pPr>
+            <w:r/>
+            <w:r>
+              <w:rPr>
+                <w:rFonts w:ascii="Calibri" w:hAnsi="Calibri"/>
+                <w:b w:val="0"/>
+                <w:color w:val="1E1E1E"/>
+                <w:sz w:val="15"/>
+              </w:rPr>
+              <w:t>все акты/УПД/СФ: `number`, `date`, `sum`, `code1c`, `nds_rate`; без сокращения до счетчика документов в XLSX.</w:t>
+            </w:r>
+          </w:p>
+        </w:tc>
+      </w:tr>
+      <w:tr>
+        <w:tc>
+          <w:tcPr>
+            <w:tcW w:type="dxa" w:w="2050"/>
+            <w:tcMar>
+              <w:top w:w="80" w:type="dxa"/>
+              <w:start w:w="120" w:type="dxa"/>
+              <w:bottom w:w="80" w:type="dxa"/>
+              <w:end w:w="120" w:type="dxa"/>
+            </w:tcMar>
+            <w:vAlign w:val="center"/>
+          </w:tcPr>
+          <w:p>
+            <w:pPr>
+              <w:spacing w:before="0" w:after="0" w:line="252" w:lineRule="auto"/>
+            </w:pPr>
+            <w:r/>
+            <w:r>
+              <w:rPr>
+                <w:rFonts w:ascii="Calibri" w:hAnsi="Calibri"/>
+                <w:b w:val="0"/>
+                <w:color w:val="1E1E1E"/>
+                <w:sz w:val="15"/>
+              </w:rPr>
+              <w:t>Статусы</w:t>
+            </w:r>
+          </w:p>
+        </w:tc>
+        <w:tc>
+          <w:tcPr>
+            <w:tcW w:type="dxa" w:w="7310"/>
+            <w:tcMar>
+              <w:top w:w="80" w:type="dxa"/>
+              <w:start w:w="120" w:type="dxa"/>
+              <w:bottom w:w="80" w:type="dxa"/>
+              <w:end w:w="120" w:type="dxa"/>
+            </w:tcMar>
+            <w:vAlign w:val="center"/>
+          </w:tcPr>
+          <w:p>
+            <w:pPr>
+              <w:spacing w:before="0" w:after="0" w:line="252" w:lineRule="auto"/>
+            </w:pPr>
+            <w:r/>
+            <w:r>
+              <w:rPr>
+                <w:rFonts w:ascii="Calibri" w:hAnsi="Calibri"/>
+                <w:b w:val="0"/>
+                <w:color w:val="1E1E1E"/>
+                <w:sz w:val="15"/>
+              </w:rPr>
+              <w:t>массив кодов расхождений с суммами ERP/1С, операцией, документом и причиной.</w:t>
+            </w:r>
+          </w:p>
+        </w:tc>
+      </w:tr>
+    </w:tbl>
     <w:p>
       <w:pPr>
-        <w:spacing w:before="0" w:after="120" w:line="252" w:lineRule="auto"/>
-        <w:ind w:left="216"/>
+        <w:spacing w:after="40"/>
       </w:pPr>
-      <w:r>
-        <w:rPr>
-          <w:rFonts w:ascii="Courier New" w:hAnsi="Courier New"/>
-          <w:color w:val="282828"/>
-          <w:sz w:val="15"/>
-        </w:rPr>
-        <w:t>// PHP-структура, которую должен отдавать backend экрана и XLSX</w:t>
-      </w:r>
-      <w:r>
-        <w:br/>
-      </w:r>
-      <w:r>
-        <w:rPr>
-          <w:rFonts w:ascii="Courier New" w:hAnsi="Courier New"/>
-          <w:color w:val="282828"/>
-          <w:sz w:val="15"/>
-        </w:rPr>
-        <w:t>foreach ($specs as $spec) {</w:t>
-      </w:r>
-      <w:r>
-        <w:br/>
-      </w:r>
-      <w:r>
-        <w:rPr>
-          <w:rFonts w:ascii="Courier New" w:hAnsi="Courier New"/>
-          <w:color w:val="282828"/>
-          <w:sz w:val="15"/>
-        </w:rPr>
-        <w:t xml:space="preserve">    $operations = fetch_operations($spec['spec_id']); // f_parenttype 2/4</w:t>
-      </w:r>
-      <w:r>
-        <w:br/>
-      </w:r>
-      <w:r>
-        <w:rPr>
-          <w:rFonts w:ascii="Courier New" w:hAnsi="Courier New"/>
-          <w:color w:val="282828"/>
-          <w:sz w:val="15"/>
-        </w:rPr>
-        <w:t xml:space="preserve">    $docs       = fetch_erp_docs($spec['spec_id']);   // счета + акты/УПД/СФ</w:t>
-      </w:r>
-      <w:r>
-        <w:br/>
-      </w:r>
-      <w:r>
-        <w:rPr>
-          <w:rFonts w:ascii="Courier New" w:hAnsi="Courier New"/>
-          <w:color w:val="282828"/>
-          <w:sz w:val="15"/>
-        </w:rPr>
-        <w:t xml:space="preserve">    $payments   = fetch_payments($spec['spec_id']);   // veda_acchist_docs.f_clssum</w:t>
-      </w:r>
-      <w:r>
-        <w:br/>
-      </w:r>
-      <w:r>
-        <w:rPr>
-          <w:rFonts w:ascii="Courier New" w:hAnsi="Courier New"/>
-          <w:color w:val="282828"/>
-          <w:sz w:val="15"/>
-        </w:rPr>
-      </w:r>
-      <w:r>
-        <w:br/>
-      </w:r>
-      <w:r>
-        <w:rPr>
-          <w:rFonts w:ascii="Courier New" w:hAnsi="Courier New"/>
-          <w:color w:val="282828"/>
-          <w:sz w:val="15"/>
-        </w:rPr>
-        <w:t xml:space="preserve">    $customerInvoices = filter($docs, doc_kind='schet', type_name='Счет покупателю', invoice_id=0);</w:t>
-      </w:r>
-      <w:r>
-        <w:br/>
-      </w:r>
-      <w:r>
-        <w:rPr>
-          <w:rFonts w:ascii="Courier New" w:hAnsi="Courier New"/>
-          <w:color w:val="282828"/>
-          <w:sz w:val="15"/>
-        </w:rPr>
-        <w:t xml:space="preserve">    $closingDocs      = unique(filter($docs, doc_kind='act'), code1c, number, date, sum);</w:t>
-      </w:r>
-      <w:r>
-        <w:br/>
-      </w:r>
-      <w:r>
-        <w:rPr>
-          <w:rFonts w:ascii="Courier New" w:hAnsi="Courier New"/>
-          <w:color w:val="282828"/>
-          <w:sz w:val="15"/>
-        </w:rPr>
-      </w:r>
-      <w:r>
-        <w:br/>
-      </w:r>
-      <w:r>
-        <w:rPr>
-          <w:rFonts w:ascii="Courier New" w:hAnsi="Courier New"/>
-          <w:color w:val="282828"/>
-          <w:sz w:val="15"/>
-        </w:rPr>
-        <w:t xml:space="preserve">    $paidByRoutine = SUM($operations.get_paidsum);</w:t>
-      </w:r>
-      <w:r>
-        <w:br/>
-      </w:r>
-      <w:r>
-        <w:rPr>
-          <w:rFonts w:ascii="Courier New" w:hAnsi="Courier New"/>
-          <w:color w:val="282828"/>
-          <w:sz w:val="15"/>
-        </w:rPr>
-        <w:t xml:space="preserve">    $paidByDocs    = SUM($payments WHERE direction='incoming'.classified_sum);</w:t>
-      </w:r>
-      <w:r>
-        <w:br/>
-      </w:r>
-      <w:r>
-        <w:rPr>
-          <w:rFonts w:ascii="Courier New" w:hAnsi="Courier New"/>
-          <w:color w:val="282828"/>
-          <w:sz w:val="15"/>
-        </w:rPr>
-        <w:t xml:space="preserve">    $reimb         = SUM($operations WHERE f_isvozm=1 . get_realizsum);</w:t>
-      </w:r>
-      <w:r>
-        <w:br/>
-      </w:r>
-      <w:r>
-        <w:rPr>
-          <w:rFonts w:ascii="Courier New" w:hAnsi="Courier New"/>
-          <w:color w:val="282828"/>
-          <w:sz w:val="15"/>
-        </w:rPr>
-        <w:t xml:space="preserve">    $nonReimb      = SUM($operations WHERE f_isvozm=2 . get_realizsum);</w:t>
-      </w:r>
-      <w:r>
-        <w:br/>
-      </w:r>
-      <w:r>
-        <w:rPr>
-          <w:rFonts w:ascii="Courier New" w:hAnsi="Courier New"/>
-          <w:color w:val="282828"/>
-          <w:sz w:val="15"/>
-        </w:rPr>
-        <w:t xml:space="preserve">    $realization   = $reimb + $nonReimb + SUM(unclassified get_realizsum);</w:t>
-      </w:r>
-      <w:r>
-        <w:br/>
-      </w:r>
-      <w:r>
-        <w:rPr>
-          <w:rFonts w:ascii="Courier New" w:hAnsi="Courier New"/>
-          <w:color w:val="282828"/>
-          <w:sz w:val="15"/>
-        </w:rPr>
-        <w:t xml:space="preserve">    $delta         = $paidByRoutine - $realization;</w:t>
-      </w:r>
-      <w:r>
-        <w:br/>
-      </w:r>
-      <w:r>
-        <w:rPr>
-          <w:rFonts w:ascii="Courier New" w:hAnsi="Courier New"/>
-          <w:color w:val="282828"/>
-          <w:sz w:val="15"/>
-        </w:rPr>
-        <w:t>}</w:t>
-      </w:r>
     </w:p>
     <w:tbl>
       <w:tblGrid>
@@ -5371,7 +6791,7 @@
                 <w:color w:val="1E1E1E"/>
                 <w:sz w:val="14"/>
               </w:rPr>
-              <w:t>`Спецификация {spec_num}` из `veda_specs.f_num`.</w:t>
+              <w:t>`{view_specs.spec_type} №{spec_number}`; если тип пустой, `Поставка №{veda_specs.f_num}`.</w:t>
             </w:r>
           </w:p>
         </w:tc>
@@ -6122,7 +7542,7 @@
                 <w:color w:val="1E1E1E"/>
                 <w:sz w:val="19"/>
               </w:rPr>
-              <w:t>В репозитории рабочая реализация проверки находится в `tools/server_mariadb_reconciliation_report.py`. Она не является production PHP-кодом, но фиксирует SQL-связи, формулы, структуру JSON и правила XLSX, которые PHP-разработчик должен повторить в ERP.</w:t>
+              <w:t>В репозитории рабочая проверка находится в `tools/server_mariadb_reconciliation_report.py`. Она не является production-кодом, но фиксирует SQL-связи, формулы, структуру данных и правила XLSX, которые нужно реализовать в ERP.</w:t>
             </w:r>
           </w:p>
         </w:tc>
@@ -6132,11 +7552,6 @@
       <w:pPr>
         <w:spacing w:after="40"/>
       </w:pPr>
-    </w:p>
-    <w:p>
-      <w:r>
-        <w:br w:type="page"/>
-      </w:r>
     </w:p>
     <w:p>
       <w:pPr>
@@ -6390,7 +7805,7 @@
                 <w:color w:val="1E1E1E"/>
                 <w:sz w:val="15"/>
               </w:rPr>
-              <w:t>veda_specs.f_num, f_id, f_kod1cb/f_kod1cp</w:t>
+              <w:t>view_specs.spec_type/spec_subtype/spec_number/spec_num_short, veda_specs.f_id, f_kod1cb/f_kod1cp</w:t>
             </w:r>
           </w:p>
         </w:tc>
@@ -6417,7 +7832,7 @@
                 <w:color w:val="1E1E1E"/>
                 <w:sz w:val="15"/>
               </w:rPr>
-              <w:t>договор-заявка/спецификация в 1С. Если кода договора нет, полный `ОК` запрещен.</w:t>
+              <w:t>тип строки брать из ERP: `Заявка`, `Спецификация`, `Сертификация` и т.д.; не хардкодить `Спецификация {num}`.</w:t>
             </w:r>
           </w:p>
         </w:tc>
@@ -8238,7 +9653,7 @@
           <w:color w:val="1E1E1E"/>
           <w:sz w:val="21"/>
         </w:rPr>
-        <w:t>Excel не должен быть простым экспортом экранной матрицы. Требуется бухгалтерская форма: счета и оплаты идут строками, а расходы, СФ/УПД и дельта объединяются по количеству строк счетов внутри спецификации.</w:t>
+        <w:t>Excel не должен быть простым экспортом экранной матрицы. Требуется бухгалтерская форма: счета и оплаты идут строками, а расходы, СФ/УПД и дельта объединяются по количеству строк счетов внутри поставки.</w:t>
       </w:r>
     </w:p>
     <w:tbl>
@@ -8364,7 +9779,7 @@
                 <w:color w:val="1E1E1E"/>
                 <w:sz w:val="16"/>
               </w:rPr>
-              <w:t>объединить по строкам счетов; текст вида `Спецификация 1063`</w:t>
+              <w:t>объединить по строкам счетов; текст вида `{тип ERP} №{номер}`, например `Заявка №1063`; тип брать из `view_specs.spec_type/spec_subtype`</w:t>
             </w:r>
           </w:p>
         </w:tc>
@@ -9416,7 +10831,7 @@
           <w:color w:val="1E1E1E"/>
           <w:sz w:val="21"/>
         </w:rPr>
-        <w:t>Проверка выполнялась на свежих поставках договора 660/1. Итоговый расчет ниже воспроизводится из MariaDB ERP и должен совпадать с production-логикой PHP.</w:t>
+        <w:t>Проверка выполнялась на выбранных свежих поставках договора 660/1. Это не расчет по всему договору целиком. Итоговый расчет ниже воспроизводится из MariaDB ERP и должен совпадать с production-логикой ERP.</w:t>
       </w:r>
     </w:p>
     <w:tbl>
@@ -9683,7 +11098,7 @@
                 <w:color w:val="1E1E1E"/>
                 <w:sz w:val="16"/>
               </w:rPr>
-              <w:t>Поставки</w:t>
+              <w:t>Состав набора</w:t>
             </w:r>
           </w:p>
         </w:tc>
@@ -9710,7 +11125,7 @@
                 <w:color w:val="1E1E1E"/>
                 <w:sz w:val="16"/>
               </w:rPr>
-              <w:t>1063, 1064, 1065, 1068, 1072, 1073, 1074, 1076</w:t>
+              <w:t>8 выбранных поставок договора 660/1, а не весь договор целиком.</w:t>
             </w:r>
           </w:p>
         </w:tc>
@@ -9739,7 +11154,7 @@
                 <w:color w:val="1E1E1E"/>
                 <w:sz w:val="16"/>
               </w:rPr>
-              <w:t>Итоги</w:t>
+              <w:t>Поставки</w:t>
             </w:r>
           </w:p>
         </w:tc>
@@ -9766,7 +11181,7 @@
                 <w:color w:val="1E1E1E"/>
                 <w:sz w:val="16"/>
               </w:rPr>
-              <w:t>поступления/get_paidsum 2 331 111,33; реализация/get_realizsum: возмещаемые 2 152 392,27 и невозмещаемые 263 133,46; сальдо -84 414,40</w:t>
+              <w:t>spec_id 20351/1063, 20352/1064, 20353/1065, 20818/1068, 20824/1072, 20825/1073, 20822/1074, 20858/1076.</w:t>
             </w:r>
           </w:p>
         </w:tc>
@@ -9795,6 +11210,62 @@
                 <w:color w:val="1E1E1E"/>
                 <w:sz w:val="16"/>
               </w:rPr>
+              <w:t>Итоги</w:t>
+            </w:r>
+          </w:p>
+        </w:tc>
+        <w:tc>
+          <w:tcPr>
+            <w:tcW w:type="dxa" w:w="6810"/>
+            <w:tcMar>
+              <w:top w:w="80" w:type="dxa"/>
+              <w:start w:w="120" w:type="dxa"/>
+              <w:bottom w:w="80" w:type="dxa"/>
+              <w:end w:w="120" w:type="dxa"/>
+            </w:tcMar>
+            <w:vAlign w:val="center"/>
+          </w:tcPr>
+          <w:p>
+            <w:pPr>
+              <w:spacing w:before="0" w:after="0" w:line="252" w:lineRule="auto"/>
+            </w:pPr>
+            <w:r/>
+            <w:r>
+              <w:rPr>
+                <w:rFonts w:ascii="Calibri" w:hAnsi="Calibri"/>
+                <w:b w:val="0"/>
+                <w:color w:val="1E1E1E"/>
+                <w:sz w:val="16"/>
+              </w:rPr>
+              <w:t>поступления/get_paidsum 2 331 111,33; реализация/get_realizsum: возмещаемые 2 152 392,27 и невозмещаемые 263 133,46; сальдо -84 414,40</w:t>
+            </w:r>
+          </w:p>
+        </w:tc>
+      </w:tr>
+      <w:tr>
+        <w:tc>
+          <w:tcPr>
+            <w:tcW w:type="dxa" w:w="2550"/>
+            <w:tcMar>
+              <w:top w:w="80" w:type="dxa"/>
+              <w:start w:w="120" w:type="dxa"/>
+              <w:bottom w:w="80" w:type="dxa"/>
+              <w:end w:w="120" w:type="dxa"/>
+            </w:tcMar>
+            <w:vAlign w:val="center"/>
+          </w:tcPr>
+          <w:p>
+            <w:pPr>
+              <w:spacing w:before="0" w:after="0" w:line="252" w:lineRule="auto"/>
+            </w:pPr>
+            <w:r/>
+            <w:r>
+              <w:rPr>
+                <w:rFonts w:ascii="Calibri" w:hAnsi="Calibri"/>
+                <w:b w:val="0"/>
+                <w:color w:val="1E1E1E"/>
+                <w:sz w:val="16"/>
+              </w:rPr>
               <w:t>Особенность</w:t>
             </w:r>
           </w:p>
@@ -9823,6 +11294,1516 @@
                 <w:sz w:val="16"/>
               </w:rPr>
               <w:t>`get_paidsum` совпал с `SUM(veda_acchist_docs.f_clssum)`; подрядные расходы без клиентской реализации исключаются из взаиморасчета, но логируются</w:t>
+            </w:r>
+          </w:p>
+        </w:tc>
+      </w:tr>
+    </w:tbl>
+    <w:p>
+      <w:pPr>
+        <w:spacing w:after="40"/>
+      </w:pPr>
+    </w:p>
+    <w:tbl>
+      <w:tblGrid>
+        <w:gridCol w:w="850"/>
+        <w:gridCol w:w="850"/>
+        <w:gridCol w:w="1050"/>
+        <w:gridCol w:w="1050"/>
+        <w:gridCol w:w="1300"/>
+        <w:gridCol w:w="4260"/>
+      </w:tblGrid>
+      <w:tblPr>
+        <w:tblStyle w:val="TableGrid"/>
+        <w:tblW w:type="dxa" w:w="9360"/>
+        <w:tblLayout w:type="fixed"/>
+        <w:tblLook w:firstColumn="1" w:firstRow="1" w:lastColumn="0" w:lastRow="0" w:noHBand="0" w:noVBand="1" w:val="04A0"/>
+        <w:tblInd w:w="120" w:type="dxa"/>
+      </w:tblPr>
+      <w:tr>
+        <w:tc>
+          <w:tcPr>
+            <w:tcW w:type="dxa" w:w="850"/>
+            <w:tcMar>
+              <w:top w:w="80" w:type="dxa"/>
+              <w:start w:w="120" w:type="dxa"/>
+              <w:bottom w:w="80" w:type="dxa"/>
+              <w:end w:w="120" w:type="dxa"/>
+            </w:tcMar>
+            <w:vAlign w:val="center"/>
+            <w:shd w:fill="E8EEF5"/>
+          </w:tcPr>
+          <w:p>
+            <w:pPr>
+              <w:spacing w:before="0" w:after="0" w:line="252" w:lineRule="auto"/>
+              <w:jc w:val="center"/>
+            </w:pPr>
+            <w:r/>
+            <w:r>
+              <w:rPr>
+                <w:rFonts w:ascii="Calibri" w:hAnsi="Calibri"/>
+                <w:b/>
+                <w:color w:val="1F4D78"/>
+                <w:sz w:val="15"/>
+              </w:rPr>
+              <w:t>spec_id</w:t>
+            </w:r>
+          </w:p>
+        </w:tc>
+        <w:tc>
+          <w:tcPr>
+            <w:tcW w:type="dxa" w:w="850"/>
+            <w:tcMar>
+              <w:top w:w="80" w:type="dxa"/>
+              <w:start w:w="120" w:type="dxa"/>
+              <w:bottom w:w="80" w:type="dxa"/>
+              <w:end w:w="120" w:type="dxa"/>
+            </w:tcMar>
+            <w:vAlign w:val="center"/>
+            <w:shd w:fill="E8EEF5"/>
+          </w:tcPr>
+          <w:p>
+            <w:pPr>
+              <w:spacing w:before="0" w:after="0" w:line="252" w:lineRule="auto"/>
+              <w:jc w:val="center"/>
+            </w:pPr>
+            <w:r/>
+            <w:r>
+              <w:rPr>
+                <w:rFonts w:ascii="Calibri" w:hAnsi="Calibri"/>
+                <w:b/>
+                <w:color w:val="1F4D78"/>
+                <w:sz w:val="15"/>
+              </w:rPr>
+              <w:t>Номер</w:t>
+            </w:r>
+          </w:p>
+        </w:tc>
+        <w:tc>
+          <w:tcPr>
+            <w:tcW w:type="dxa" w:w="1050"/>
+            <w:tcMar>
+              <w:top w:w="80" w:type="dxa"/>
+              <w:start w:w="120" w:type="dxa"/>
+              <w:bottom w:w="80" w:type="dxa"/>
+              <w:end w:w="120" w:type="dxa"/>
+            </w:tcMar>
+            <w:vAlign w:val="center"/>
+            <w:shd w:fill="E8EEF5"/>
+          </w:tcPr>
+          <w:p>
+            <w:pPr>
+              <w:spacing w:before="0" w:after="0" w:line="252" w:lineRule="auto"/>
+              <w:jc w:val="center"/>
+            </w:pPr>
+            <w:r/>
+            <w:r>
+              <w:rPr>
+                <w:rFonts w:ascii="Calibri" w:hAnsi="Calibri"/>
+                <w:b/>
+                <w:color w:val="1F4D78"/>
+                <w:sz w:val="15"/>
+              </w:rPr>
+              <w:t>Тип</w:t>
+            </w:r>
+          </w:p>
+        </w:tc>
+        <w:tc>
+          <w:tcPr>
+            <w:tcW w:type="dxa" w:w="1050"/>
+            <w:tcMar>
+              <w:top w:w="80" w:type="dxa"/>
+              <w:start w:w="120" w:type="dxa"/>
+              <w:bottom w:w="80" w:type="dxa"/>
+              <w:end w:w="120" w:type="dxa"/>
+            </w:tcMar>
+            <w:vAlign w:val="center"/>
+            <w:shd w:fill="E8EEF5"/>
+          </w:tcPr>
+          <w:p>
+            <w:pPr>
+              <w:spacing w:before="0" w:after="0" w:line="252" w:lineRule="auto"/>
+              <w:jc w:val="center"/>
+            </w:pPr>
+            <w:r/>
+            <w:r>
+              <w:rPr>
+                <w:rFonts w:ascii="Calibri" w:hAnsi="Calibri"/>
+                <w:b/>
+                <w:color w:val="1F4D78"/>
+                <w:sz w:val="15"/>
+              </w:rPr>
+              <w:t>Подтип</w:t>
+            </w:r>
+          </w:p>
+        </w:tc>
+        <w:tc>
+          <w:tcPr>
+            <w:tcW w:type="dxa" w:w="1300"/>
+            <w:tcMar>
+              <w:top w:w="80" w:type="dxa"/>
+              <w:start w:w="120" w:type="dxa"/>
+              <w:bottom w:w="80" w:type="dxa"/>
+              <w:end w:w="120" w:type="dxa"/>
+            </w:tcMar>
+            <w:vAlign w:val="center"/>
+            <w:shd w:fill="E8EEF5"/>
+          </w:tcPr>
+          <w:p>
+            <w:pPr>
+              <w:spacing w:before="0" w:after="0" w:line="252" w:lineRule="auto"/>
+              <w:jc w:val="center"/>
+            </w:pPr>
+            <w:r/>
+            <w:r>
+              <w:rPr>
+                <w:rFonts w:ascii="Calibri" w:hAnsi="Calibri"/>
+                <w:b/>
+                <w:color w:val="1F4D78"/>
+                <w:sz w:val="15"/>
+              </w:rPr>
+              <w:t>Дата</w:t>
+            </w:r>
+          </w:p>
+        </w:tc>
+        <w:tc>
+          <w:tcPr>
+            <w:tcW w:type="dxa" w:w="4260"/>
+            <w:tcMar>
+              <w:top w:w="80" w:type="dxa"/>
+              <w:start w:w="120" w:type="dxa"/>
+              <w:bottom w:w="80" w:type="dxa"/>
+              <w:end w:w="120" w:type="dxa"/>
+            </w:tcMar>
+            <w:vAlign w:val="center"/>
+            <w:shd w:fill="E8EEF5"/>
+          </w:tcPr>
+          <w:p>
+            <w:pPr>
+              <w:spacing w:before="0" w:after="0" w:line="252" w:lineRule="auto"/>
+              <w:jc w:val="center"/>
+            </w:pPr>
+            <w:r/>
+            <w:r>
+              <w:rPr>
+                <w:rFonts w:ascii="Calibri" w:hAnsi="Calibri"/>
+                <w:b/>
+                <w:color w:val="1F4D78"/>
+                <w:sz w:val="15"/>
+              </w:rPr>
+              <w:t>Наименование ERP</w:t>
+            </w:r>
+          </w:p>
+        </w:tc>
+      </w:tr>
+      <w:tr>
+        <w:tc>
+          <w:tcPr>
+            <w:tcW w:type="dxa" w:w="850"/>
+            <w:tcMar>
+              <w:top w:w="80" w:type="dxa"/>
+              <w:start w:w="120" w:type="dxa"/>
+              <w:bottom w:w="80" w:type="dxa"/>
+              <w:end w:w="120" w:type="dxa"/>
+            </w:tcMar>
+            <w:vAlign w:val="center"/>
+          </w:tcPr>
+          <w:p>
+            <w:pPr>
+              <w:spacing w:before="0" w:after="0" w:line="252" w:lineRule="auto"/>
+            </w:pPr>
+            <w:r/>
+            <w:r>
+              <w:rPr>
+                <w:rFonts w:ascii="Calibri" w:hAnsi="Calibri"/>
+                <w:b w:val="0"/>
+                <w:color w:val="1E1E1E"/>
+                <w:sz w:val="15"/>
+              </w:rPr>
+              <w:t>20351</w:t>
+            </w:r>
+          </w:p>
+        </w:tc>
+        <w:tc>
+          <w:tcPr>
+            <w:tcW w:type="dxa" w:w="850"/>
+            <w:tcMar>
+              <w:top w:w="80" w:type="dxa"/>
+              <w:start w:w="120" w:type="dxa"/>
+              <w:bottom w:w="80" w:type="dxa"/>
+              <w:end w:w="120" w:type="dxa"/>
+            </w:tcMar>
+            <w:vAlign w:val="center"/>
+          </w:tcPr>
+          <w:p>
+            <w:pPr>
+              <w:spacing w:before="0" w:after="0" w:line="252" w:lineRule="auto"/>
+            </w:pPr>
+            <w:r/>
+            <w:r>
+              <w:rPr>
+                <w:rFonts w:ascii="Calibri" w:hAnsi="Calibri"/>
+                <w:b w:val="0"/>
+                <w:color w:val="1E1E1E"/>
+                <w:sz w:val="15"/>
+              </w:rPr>
+              <w:t>1063</w:t>
+            </w:r>
+          </w:p>
+        </w:tc>
+        <w:tc>
+          <w:tcPr>
+            <w:tcW w:type="dxa" w:w="1050"/>
+            <w:tcMar>
+              <w:top w:w="80" w:type="dxa"/>
+              <w:start w:w="120" w:type="dxa"/>
+              <w:bottom w:w="80" w:type="dxa"/>
+              <w:end w:w="120" w:type="dxa"/>
+            </w:tcMar>
+            <w:vAlign w:val="center"/>
+          </w:tcPr>
+          <w:p>
+            <w:pPr>
+              <w:spacing w:before="0" w:after="0" w:line="252" w:lineRule="auto"/>
+            </w:pPr>
+            <w:r/>
+            <w:r>
+              <w:rPr>
+                <w:rFonts w:ascii="Calibri" w:hAnsi="Calibri"/>
+                <w:b w:val="0"/>
+                <w:color w:val="1E1E1E"/>
+                <w:sz w:val="15"/>
+              </w:rPr>
+              <w:t>Заявка</w:t>
+            </w:r>
+          </w:p>
+        </w:tc>
+        <w:tc>
+          <w:tcPr>
+            <w:tcW w:type="dxa" w:w="1050"/>
+            <w:tcMar>
+              <w:top w:w="80" w:type="dxa"/>
+              <w:start w:w="120" w:type="dxa"/>
+              <w:bottom w:w="80" w:type="dxa"/>
+              <w:end w:w="120" w:type="dxa"/>
+            </w:tcMar>
+            <w:vAlign w:val="center"/>
+          </w:tcPr>
+          <w:p>
+            <w:pPr>
+              <w:spacing w:before="0" w:after="0" w:line="252" w:lineRule="auto"/>
+            </w:pPr>
+            <w:r/>
+            <w:r>
+              <w:rPr>
+                <w:rFonts w:ascii="Calibri" w:hAnsi="Calibri"/>
+                <w:b w:val="0"/>
+                <w:color w:val="1E1E1E"/>
+                <w:sz w:val="15"/>
+              </w:rPr>
+              <w:t>Заявка</w:t>
+            </w:r>
+          </w:p>
+        </w:tc>
+        <w:tc>
+          <w:tcPr>
+            <w:tcW w:type="dxa" w:w="1300"/>
+            <w:tcMar>
+              <w:top w:w="80" w:type="dxa"/>
+              <w:start w:w="120" w:type="dxa"/>
+              <w:bottom w:w="80" w:type="dxa"/>
+              <w:end w:w="120" w:type="dxa"/>
+            </w:tcMar>
+            <w:vAlign w:val="center"/>
+          </w:tcPr>
+          <w:p>
+            <w:pPr>
+              <w:spacing w:before="0" w:after="0" w:line="252" w:lineRule="auto"/>
+            </w:pPr>
+            <w:r/>
+            <w:r>
+              <w:rPr>
+                <w:rFonts w:ascii="Calibri" w:hAnsi="Calibri"/>
+                <w:b w:val="0"/>
+                <w:color w:val="1E1E1E"/>
+                <w:sz w:val="15"/>
+              </w:rPr>
+              <w:t>2025-05-12</w:t>
+            </w:r>
+          </w:p>
+        </w:tc>
+        <w:tc>
+          <w:tcPr>
+            <w:tcW w:type="dxa" w:w="4260"/>
+            <w:tcMar>
+              <w:top w:w="80" w:type="dxa"/>
+              <w:start w:w="120" w:type="dxa"/>
+              <w:bottom w:w="80" w:type="dxa"/>
+              <w:end w:w="120" w:type="dxa"/>
+            </w:tcMar>
+            <w:vAlign w:val="center"/>
+          </w:tcPr>
+          <w:p>
+            <w:pPr>
+              <w:spacing w:before="0" w:after="0" w:line="252" w:lineRule="auto"/>
+            </w:pPr>
+            <w:r/>
+            <w:r>
+              <w:rPr>
+                <w:rFonts w:ascii="Calibri" w:hAnsi="Calibri"/>
+                <w:b w:val="0"/>
+                <w:color w:val="1E1E1E"/>
+                <w:sz w:val="15"/>
+              </w:rPr>
+              <w:t>660/1/1063/ВА/АЭРО-ТРЕЙД</w:t>
+            </w:r>
+          </w:p>
+        </w:tc>
+      </w:tr>
+      <w:tr>
+        <w:tc>
+          <w:tcPr>
+            <w:tcW w:type="dxa" w:w="850"/>
+            <w:tcMar>
+              <w:top w:w="80" w:type="dxa"/>
+              <w:start w:w="120" w:type="dxa"/>
+              <w:bottom w:w="80" w:type="dxa"/>
+              <w:end w:w="120" w:type="dxa"/>
+            </w:tcMar>
+            <w:vAlign w:val="center"/>
+          </w:tcPr>
+          <w:p>
+            <w:pPr>
+              <w:spacing w:before="0" w:after="0" w:line="252" w:lineRule="auto"/>
+            </w:pPr>
+            <w:r/>
+            <w:r>
+              <w:rPr>
+                <w:rFonts w:ascii="Calibri" w:hAnsi="Calibri"/>
+                <w:b w:val="0"/>
+                <w:color w:val="1E1E1E"/>
+                <w:sz w:val="15"/>
+              </w:rPr>
+              <w:t>20352</w:t>
+            </w:r>
+          </w:p>
+        </w:tc>
+        <w:tc>
+          <w:tcPr>
+            <w:tcW w:type="dxa" w:w="850"/>
+            <w:tcMar>
+              <w:top w:w="80" w:type="dxa"/>
+              <w:start w:w="120" w:type="dxa"/>
+              <w:bottom w:w="80" w:type="dxa"/>
+              <w:end w:w="120" w:type="dxa"/>
+            </w:tcMar>
+            <w:vAlign w:val="center"/>
+          </w:tcPr>
+          <w:p>
+            <w:pPr>
+              <w:spacing w:before="0" w:after="0" w:line="252" w:lineRule="auto"/>
+            </w:pPr>
+            <w:r/>
+            <w:r>
+              <w:rPr>
+                <w:rFonts w:ascii="Calibri" w:hAnsi="Calibri"/>
+                <w:b w:val="0"/>
+                <w:color w:val="1E1E1E"/>
+                <w:sz w:val="15"/>
+              </w:rPr>
+              <w:t>1064</w:t>
+            </w:r>
+          </w:p>
+        </w:tc>
+        <w:tc>
+          <w:tcPr>
+            <w:tcW w:type="dxa" w:w="1050"/>
+            <w:tcMar>
+              <w:top w:w="80" w:type="dxa"/>
+              <w:start w:w="120" w:type="dxa"/>
+              <w:bottom w:w="80" w:type="dxa"/>
+              <w:end w:w="120" w:type="dxa"/>
+            </w:tcMar>
+            <w:vAlign w:val="center"/>
+          </w:tcPr>
+          <w:p>
+            <w:pPr>
+              <w:spacing w:before="0" w:after="0" w:line="252" w:lineRule="auto"/>
+            </w:pPr>
+            <w:r/>
+            <w:r>
+              <w:rPr>
+                <w:rFonts w:ascii="Calibri" w:hAnsi="Calibri"/>
+                <w:b w:val="0"/>
+                <w:color w:val="1E1E1E"/>
+                <w:sz w:val="15"/>
+              </w:rPr>
+              <w:t>Заявка</w:t>
+            </w:r>
+          </w:p>
+        </w:tc>
+        <w:tc>
+          <w:tcPr>
+            <w:tcW w:type="dxa" w:w="1050"/>
+            <w:tcMar>
+              <w:top w:w="80" w:type="dxa"/>
+              <w:start w:w="120" w:type="dxa"/>
+              <w:bottom w:w="80" w:type="dxa"/>
+              <w:end w:w="120" w:type="dxa"/>
+            </w:tcMar>
+            <w:vAlign w:val="center"/>
+          </w:tcPr>
+          <w:p>
+            <w:pPr>
+              <w:spacing w:before="0" w:after="0" w:line="252" w:lineRule="auto"/>
+            </w:pPr>
+            <w:r/>
+            <w:r>
+              <w:rPr>
+                <w:rFonts w:ascii="Calibri" w:hAnsi="Calibri"/>
+                <w:b w:val="0"/>
+                <w:color w:val="1E1E1E"/>
+                <w:sz w:val="15"/>
+              </w:rPr>
+              <w:t>Заявка</w:t>
+            </w:r>
+          </w:p>
+        </w:tc>
+        <w:tc>
+          <w:tcPr>
+            <w:tcW w:type="dxa" w:w="1300"/>
+            <w:tcMar>
+              <w:top w:w="80" w:type="dxa"/>
+              <w:start w:w="120" w:type="dxa"/>
+              <w:bottom w:w="80" w:type="dxa"/>
+              <w:end w:w="120" w:type="dxa"/>
+            </w:tcMar>
+            <w:vAlign w:val="center"/>
+          </w:tcPr>
+          <w:p>
+            <w:pPr>
+              <w:spacing w:before="0" w:after="0" w:line="252" w:lineRule="auto"/>
+            </w:pPr>
+            <w:r/>
+            <w:r>
+              <w:rPr>
+                <w:rFonts w:ascii="Calibri" w:hAnsi="Calibri"/>
+                <w:b w:val="0"/>
+                <w:color w:val="1E1E1E"/>
+                <w:sz w:val="15"/>
+              </w:rPr>
+              <w:t>2025-05-12</w:t>
+            </w:r>
+          </w:p>
+        </w:tc>
+        <w:tc>
+          <w:tcPr>
+            <w:tcW w:type="dxa" w:w="4260"/>
+            <w:tcMar>
+              <w:top w:w="80" w:type="dxa"/>
+              <w:start w:w="120" w:type="dxa"/>
+              <w:bottom w:w="80" w:type="dxa"/>
+              <w:end w:w="120" w:type="dxa"/>
+            </w:tcMar>
+            <w:vAlign w:val="center"/>
+          </w:tcPr>
+          <w:p>
+            <w:pPr>
+              <w:spacing w:before="0" w:after="0" w:line="252" w:lineRule="auto"/>
+            </w:pPr>
+            <w:r/>
+            <w:r>
+              <w:rPr>
+                <w:rFonts w:ascii="Calibri" w:hAnsi="Calibri"/>
+                <w:b w:val="0"/>
+                <w:color w:val="1E1E1E"/>
+                <w:sz w:val="15"/>
+              </w:rPr>
+              <w:t>660/1/1064/ВА/АЭРО-ТРЕЙД</w:t>
+            </w:r>
+          </w:p>
+        </w:tc>
+      </w:tr>
+      <w:tr>
+        <w:tc>
+          <w:tcPr>
+            <w:tcW w:type="dxa" w:w="850"/>
+            <w:tcMar>
+              <w:top w:w="80" w:type="dxa"/>
+              <w:start w:w="120" w:type="dxa"/>
+              <w:bottom w:w="80" w:type="dxa"/>
+              <w:end w:w="120" w:type="dxa"/>
+            </w:tcMar>
+            <w:vAlign w:val="center"/>
+          </w:tcPr>
+          <w:p>
+            <w:pPr>
+              <w:spacing w:before="0" w:after="0" w:line="252" w:lineRule="auto"/>
+            </w:pPr>
+            <w:r/>
+            <w:r>
+              <w:rPr>
+                <w:rFonts w:ascii="Calibri" w:hAnsi="Calibri"/>
+                <w:b w:val="0"/>
+                <w:color w:val="1E1E1E"/>
+                <w:sz w:val="15"/>
+              </w:rPr>
+              <w:t>20353</w:t>
+            </w:r>
+          </w:p>
+        </w:tc>
+        <w:tc>
+          <w:tcPr>
+            <w:tcW w:type="dxa" w:w="850"/>
+            <w:tcMar>
+              <w:top w:w="80" w:type="dxa"/>
+              <w:start w:w="120" w:type="dxa"/>
+              <w:bottom w:w="80" w:type="dxa"/>
+              <w:end w:w="120" w:type="dxa"/>
+            </w:tcMar>
+            <w:vAlign w:val="center"/>
+          </w:tcPr>
+          <w:p>
+            <w:pPr>
+              <w:spacing w:before="0" w:after="0" w:line="252" w:lineRule="auto"/>
+            </w:pPr>
+            <w:r/>
+            <w:r>
+              <w:rPr>
+                <w:rFonts w:ascii="Calibri" w:hAnsi="Calibri"/>
+                <w:b w:val="0"/>
+                <w:color w:val="1E1E1E"/>
+                <w:sz w:val="15"/>
+              </w:rPr>
+              <w:t>1065</w:t>
+            </w:r>
+          </w:p>
+        </w:tc>
+        <w:tc>
+          <w:tcPr>
+            <w:tcW w:type="dxa" w:w="1050"/>
+            <w:tcMar>
+              <w:top w:w="80" w:type="dxa"/>
+              <w:start w:w="120" w:type="dxa"/>
+              <w:bottom w:w="80" w:type="dxa"/>
+              <w:end w:w="120" w:type="dxa"/>
+            </w:tcMar>
+            <w:vAlign w:val="center"/>
+          </w:tcPr>
+          <w:p>
+            <w:pPr>
+              <w:spacing w:before="0" w:after="0" w:line="252" w:lineRule="auto"/>
+            </w:pPr>
+            <w:r/>
+            <w:r>
+              <w:rPr>
+                <w:rFonts w:ascii="Calibri" w:hAnsi="Calibri"/>
+                <w:b w:val="0"/>
+                <w:color w:val="1E1E1E"/>
+                <w:sz w:val="15"/>
+              </w:rPr>
+              <w:t>Заявка</w:t>
+            </w:r>
+          </w:p>
+        </w:tc>
+        <w:tc>
+          <w:tcPr>
+            <w:tcW w:type="dxa" w:w="1050"/>
+            <w:tcMar>
+              <w:top w:w="80" w:type="dxa"/>
+              <w:start w:w="120" w:type="dxa"/>
+              <w:bottom w:w="80" w:type="dxa"/>
+              <w:end w:w="120" w:type="dxa"/>
+            </w:tcMar>
+            <w:vAlign w:val="center"/>
+          </w:tcPr>
+          <w:p>
+            <w:pPr>
+              <w:spacing w:before="0" w:after="0" w:line="252" w:lineRule="auto"/>
+            </w:pPr>
+            <w:r/>
+            <w:r>
+              <w:rPr>
+                <w:rFonts w:ascii="Calibri" w:hAnsi="Calibri"/>
+                <w:b w:val="0"/>
+                <w:color w:val="1E1E1E"/>
+                <w:sz w:val="15"/>
+              </w:rPr>
+              <w:t>Заявка</w:t>
+            </w:r>
+          </w:p>
+        </w:tc>
+        <w:tc>
+          <w:tcPr>
+            <w:tcW w:type="dxa" w:w="1300"/>
+            <w:tcMar>
+              <w:top w:w="80" w:type="dxa"/>
+              <w:start w:w="120" w:type="dxa"/>
+              <w:bottom w:w="80" w:type="dxa"/>
+              <w:end w:w="120" w:type="dxa"/>
+            </w:tcMar>
+            <w:vAlign w:val="center"/>
+          </w:tcPr>
+          <w:p>
+            <w:pPr>
+              <w:spacing w:before="0" w:after="0" w:line="252" w:lineRule="auto"/>
+            </w:pPr>
+            <w:r/>
+            <w:r>
+              <w:rPr>
+                <w:rFonts w:ascii="Calibri" w:hAnsi="Calibri"/>
+                <w:b w:val="0"/>
+                <w:color w:val="1E1E1E"/>
+                <w:sz w:val="15"/>
+              </w:rPr>
+              <w:t>2025-05-12</w:t>
+            </w:r>
+          </w:p>
+        </w:tc>
+        <w:tc>
+          <w:tcPr>
+            <w:tcW w:type="dxa" w:w="4260"/>
+            <w:tcMar>
+              <w:top w:w="80" w:type="dxa"/>
+              <w:start w:w="120" w:type="dxa"/>
+              <w:bottom w:w="80" w:type="dxa"/>
+              <w:end w:w="120" w:type="dxa"/>
+            </w:tcMar>
+            <w:vAlign w:val="center"/>
+          </w:tcPr>
+          <w:p>
+            <w:pPr>
+              <w:spacing w:before="0" w:after="0" w:line="252" w:lineRule="auto"/>
+            </w:pPr>
+            <w:r/>
+            <w:r>
+              <w:rPr>
+                <w:rFonts w:ascii="Calibri" w:hAnsi="Calibri"/>
+                <w:b w:val="0"/>
+                <w:color w:val="1E1E1E"/>
+                <w:sz w:val="15"/>
+              </w:rPr>
+              <w:t>660/1/1065/ВА/АЭРО-ТРЕЙД</w:t>
+            </w:r>
+          </w:p>
+        </w:tc>
+      </w:tr>
+      <w:tr>
+        <w:tc>
+          <w:tcPr>
+            <w:tcW w:type="dxa" w:w="850"/>
+            <w:tcMar>
+              <w:top w:w="80" w:type="dxa"/>
+              <w:start w:w="120" w:type="dxa"/>
+              <w:bottom w:w="80" w:type="dxa"/>
+              <w:end w:w="120" w:type="dxa"/>
+            </w:tcMar>
+            <w:vAlign w:val="center"/>
+          </w:tcPr>
+          <w:p>
+            <w:pPr>
+              <w:spacing w:before="0" w:after="0" w:line="252" w:lineRule="auto"/>
+            </w:pPr>
+            <w:r/>
+            <w:r>
+              <w:rPr>
+                <w:rFonts w:ascii="Calibri" w:hAnsi="Calibri"/>
+                <w:b w:val="0"/>
+                <w:color w:val="1E1E1E"/>
+                <w:sz w:val="15"/>
+              </w:rPr>
+              <w:t>20818</w:t>
+            </w:r>
+          </w:p>
+        </w:tc>
+        <w:tc>
+          <w:tcPr>
+            <w:tcW w:type="dxa" w:w="850"/>
+            <w:tcMar>
+              <w:top w:w="80" w:type="dxa"/>
+              <w:start w:w="120" w:type="dxa"/>
+              <w:bottom w:w="80" w:type="dxa"/>
+              <w:end w:w="120" w:type="dxa"/>
+            </w:tcMar>
+            <w:vAlign w:val="center"/>
+          </w:tcPr>
+          <w:p>
+            <w:pPr>
+              <w:spacing w:before="0" w:after="0" w:line="252" w:lineRule="auto"/>
+            </w:pPr>
+            <w:r/>
+            <w:r>
+              <w:rPr>
+                <w:rFonts w:ascii="Calibri" w:hAnsi="Calibri"/>
+                <w:b w:val="0"/>
+                <w:color w:val="1E1E1E"/>
+                <w:sz w:val="15"/>
+              </w:rPr>
+              <w:t>1068</w:t>
+            </w:r>
+          </w:p>
+        </w:tc>
+        <w:tc>
+          <w:tcPr>
+            <w:tcW w:type="dxa" w:w="1050"/>
+            <w:tcMar>
+              <w:top w:w="80" w:type="dxa"/>
+              <w:start w:w="120" w:type="dxa"/>
+              <w:bottom w:w="80" w:type="dxa"/>
+              <w:end w:w="120" w:type="dxa"/>
+            </w:tcMar>
+            <w:vAlign w:val="center"/>
+          </w:tcPr>
+          <w:p>
+            <w:pPr>
+              <w:spacing w:before="0" w:after="0" w:line="252" w:lineRule="auto"/>
+            </w:pPr>
+            <w:r/>
+            <w:r>
+              <w:rPr>
+                <w:rFonts w:ascii="Calibri" w:hAnsi="Calibri"/>
+                <w:b w:val="0"/>
+                <w:color w:val="1E1E1E"/>
+                <w:sz w:val="15"/>
+              </w:rPr>
+              <w:t>Заявка</w:t>
+            </w:r>
+          </w:p>
+        </w:tc>
+        <w:tc>
+          <w:tcPr>
+            <w:tcW w:type="dxa" w:w="1050"/>
+            <w:tcMar>
+              <w:top w:w="80" w:type="dxa"/>
+              <w:start w:w="120" w:type="dxa"/>
+              <w:bottom w:w="80" w:type="dxa"/>
+              <w:end w:w="120" w:type="dxa"/>
+            </w:tcMar>
+            <w:vAlign w:val="center"/>
+          </w:tcPr>
+          <w:p>
+            <w:pPr>
+              <w:spacing w:before="0" w:after="0" w:line="252" w:lineRule="auto"/>
+            </w:pPr>
+            <w:r/>
+            <w:r>
+              <w:rPr>
+                <w:rFonts w:ascii="Calibri" w:hAnsi="Calibri"/>
+                <w:b w:val="0"/>
+                <w:color w:val="1E1E1E"/>
+                <w:sz w:val="15"/>
+              </w:rPr>
+              <w:t>Заявка</w:t>
+            </w:r>
+          </w:p>
+        </w:tc>
+        <w:tc>
+          <w:tcPr>
+            <w:tcW w:type="dxa" w:w="1300"/>
+            <w:tcMar>
+              <w:top w:w="80" w:type="dxa"/>
+              <w:start w:w="120" w:type="dxa"/>
+              <w:bottom w:w="80" w:type="dxa"/>
+              <w:end w:w="120" w:type="dxa"/>
+            </w:tcMar>
+            <w:vAlign w:val="center"/>
+          </w:tcPr>
+          <w:p>
+            <w:pPr>
+              <w:spacing w:before="0" w:after="0" w:line="252" w:lineRule="auto"/>
+            </w:pPr>
+            <w:r/>
+            <w:r>
+              <w:rPr>
+                <w:rFonts w:ascii="Calibri" w:hAnsi="Calibri"/>
+                <w:b w:val="0"/>
+                <w:color w:val="1E1E1E"/>
+                <w:sz w:val="15"/>
+              </w:rPr>
+              <w:t>2025-05-26</w:t>
+            </w:r>
+          </w:p>
+        </w:tc>
+        <w:tc>
+          <w:tcPr>
+            <w:tcW w:type="dxa" w:w="4260"/>
+            <w:tcMar>
+              <w:top w:w="80" w:type="dxa"/>
+              <w:start w:w="120" w:type="dxa"/>
+              <w:bottom w:w="80" w:type="dxa"/>
+              <w:end w:w="120" w:type="dxa"/>
+            </w:tcMar>
+            <w:vAlign w:val="center"/>
+          </w:tcPr>
+          <w:p>
+            <w:pPr>
+              <w:spacing w:before="0" w:after="0" w:line="252" w:lineRule="auto"/>
+            </w:pPr>
+            <w:r/>
+            <w:r>
+              <w:rPr>
+                <w:rFonts w:ascii="Calibri" w:hAnsi="Calibri"/>
+                <w:b w:val="0"/>
+                <w:color w:val="1E1E1E"/>
+                <w:sz w:val="15"/>
+              </w:rPr>
+              <w:t>660/1/1068/ВА/АЭРО-ТРЕЙД</w:t>
+            </w:r>
+          </w:p>
+        </w:tc>
+      </w:tr>
+      <w:tr>
+        <w:tc>
+          <w:tcPr>
+            <w:tcW w:type="dxa" w:w="850"/>
+            <w:tcMar>
+              <w:top w:w="80" w:type="dxa"/>
+              <w:start w:w="120" w:type="dxa"/>
+              <w:bottom w:w="80" w:type="dxa"/>
+              <w:end w:w="120" w:type="dxa"/>
+            </w:tcMar>
+            <w:vAlign w:val="center"/>
+          </w:tcPr>
+          <w:p>
+            <w:pPr>
+              <w:spacing w:before="0" w:after="0" w:line="252" w:lineRule="auto"/>
+            </w:pPr>
+            <w:r/>
+            <w:r>
+              <w:rPr>
+                <w:rFonts w:ascii="Calibri" w:hAnsi="Calibri"/>
+                <w:b w:val="0"/>
+                <w:color w:val="1E1E1E"/>
+                <w:sz w:val="15"/>
+              </w:rPr>
+              <w:t>20824</w:t>
+            </w:r>
+          </w:p>
+        </w:tc>
+        <w:tc>
+          <w:tcPr>
+            <w:tcW w:type="dxa" w:w="850"/>
+            <w:tcMar>
+              <w:top w:w="80" w:type="dxa"/>
+              <w:start w:w="120" w:type="dxa"/>
+              <w:bottom w:w="80" w:type="dxa"/>
+              <w:end w:w="120" w:type="dxa"/>
+            </w:tcMar>
+            <w:vAlign w:val="center"/>
+          </w:tcPr>
+          <w:p>
+            <w:pPr>
+              <w:spacing w:before="0" w:after="0" w:line="252" w:lineRule="auto"/>
+            </w:pPr>
+            <w:r/>
+            <w:r>
+              <w:rPr>
+                <w:rFonts w:ascii="Calibri" w:hAnsi="Calibri"/>
+                <w:b w:val="0"/>
+                <w:color w:val="1E1E1E"/>
+                <w:sz w:val="15"/>
+              </w:rPr>
+              <w:t>1072</w:t>
+            </w:r>
+          </w:p>
+        </w:tc>
+        <w:tc>
+          <w:tcPr>
+            <w:tcW w:type="dxa" w:w="1050"/>
+            <w:tcMar>
+              <w:top w:w="80" w:type="dxa"/>
+              <w:start w:w="120" w:type="dxa"/>
+              <w:bottom w:w="80" w:type="dxa"/>
+              <w:end w:w="120" w:type="dxa"/>
+            </w:tcMar>
+            <w:vAlign w:val="center"/>
+          </w:tcPr>
+          <w:p>
+            <w:pPr>
+              <w:spacing w:before="0" w:after="0" w:line="252" w:lineRule="auto"/>
+            </w:pPr>
+            <w:r/>
+            <w:r>
+              <w:rPr>
+                <w:rFonts w:ascii="Calibri" w:hAnsi="Calibri"/>
+                <w:b w:val="0"/>
+                <w:color w:val="1E1E1E"/>
+                <w:sz w:val="15"/>
+              </w:rPr>
+              <w:t>Заявка</w:t>
+            </w:r>
+          </w:p>
+        </w:tc>
+        <w:tc>
+          <w:tcPr>
+            <w:tcW w:type="dxa" w:w="1050"/>
+            <w:tcMar>
+              <w:top w:w="80" w:type="dxa"/>
+              <w:start w:w="120" w:type="dxa"/>
+              <w:bottom w:w="80" w:type="dxa"/>
+              <w:end w:w="120" w:type="dxa"/>
+            </w:tcMar>
+            <w:vAlign w:val="center"/>
+          </w:tcPr>
+          <w:p>
+            <w:pPr>
+              <w:spacing w:before="0" w:after="0" w:line="252" w:lineRule="auto"/>
+            </w:pPr>
+            <w:r/>
+            <w:r>
+              <w:rPr>
+                <w:rFonts w:ascii="Calibri" w:hAnsi="Calibri"/>
+                <w:b w:val="0"/>
+                <w:color w:val="1E1E1E"/>
+                <w:sz w:val="15"/>
+              </w:rPr>
+              <w:t>Заявка</w:t>
+            </w:r>
+          </w:p>
+        </w:tc>
+        <w:tc>
+          <w:tcPr>
+            <w:tcW w:type="dxa" w:w="1300"/>
+            <w:tcMar>
+              <w:top w:w="80" w:type="dxa"/>
+              <w:start w:w="120" w:type="dxa"/>
+              <w:bottom w:w="80" w:type="dxa"/>
+              <w:end w:w="120" w:type="dxa"/>
+            </w:tcMar>
+            <w:vAlign w:val="center"/>
+          </w:tcPr>
+          <w:p>
+            <w:pPr>
+              <w:spacing w:before="0" w:after="0" w:line="252" w:lineRule="auto"/>
+            </w:pPr>
+            <w:r/>
+            <w:r>
+              <w:rPr>
+                <w:rFonts w:ascii="Calibri" w:hAnsi="Calibri"/>
+                <w:b w:val="0"/>
+                <w:color w:val="1E1E1E"/>
+                <w:sz w:val="15"/>
+              </w:rPr>
+              <w:t>2025-05-26</w:t>
+            </w:r>
+          </w:p>
+        </w:tc>
+        <w:tc>
+          <w:tcPr>
+            <w:tcW w:type="dxa" w:w="4260"/>
+            <w:tcMar>
+              <w:top w:w="80" w:type="dxa"/>
+              <w:start w:w="120" w:type="dxa"/>
+              <w:bottom w:w="80" w:type="dxa"/>
+              <w:end w:w="120" w:type="dxa"/>
+            </w:tcMar>
+            <w:vAlign w:val="center"/>
+          </w:tcPr>
+          <w:p>
+            <w:pPr>
+              <w:spacing w:before="0" w:after="0" w:line="252" w:lineRule="auto"/>
+            </w:pPr>
+            <w:r/>
+            <w:r>
+              <w:rPr>
+                <w:rFonts w:ascii="Calibri" w:hAnsi="Calibri"/>
+                <w:b w:val="0"/>
+                <w:color w:val="1E1E1E"/>
+                <w:sz w:val="15"/>
+              </w:rPr>
+              <w:t>660/1/1072/ВА/АЭРО-ТРЕЙД</w:t>
+            </w:r>
+          </w:p>
+        </w:tc>
+      </w:tr>
+      <w:tr>
+        <w:tc>
+          <w:tcPr>
+            <w:tcW w:type="dxa" w:w="850"/>
+            <w:tcMar>
+              <w:top w:w="80" w:type="dxa"/>
+              <w:start w:w="120" w:type="dxa"/>
+              <w:bottom w:w="80" w:type="dxa"/>
+              <w:end w:w="120" w:type="dxa"/>
+            </w:tcMar>
+            <w:vAlign w:val="center"/>
+          </w:tcPr>
+          <w:p>
+            <w:pPr>
+              <w:spacing w:before="0" w:after="0" w:line="252" w:lineRule="auto"/>
+            </w:pPr>
+            <w:r/>
+            <w:r>
+              <w:rPr>
+                <w:rFonts w:ascii="Calibri" w:hAnsi="Calibri"/>
+                <w:b w:val="0"/>
+                <w:color w:val="1E1E1E"/>
+                <w:sz w:val="15"/>
+              </w:rPr>
+              <w:t>20825</w:t>
+            </w:r>
+          </w:p>
+        </w:tc>
+        <w:tc>
+          <w:tcPr>
+            <w:tcW w:type="dxa" w:w="850"/>
+            <w:tcMar>
+              <w:top w:w="80" w:type="dxa"/>
+              <w:start w:w="120" w:type="dxa"/>
+              <w:bottom w:w="80" w:type="dxa"/>
+              <w:end w:w="120" w:type="dxa"/>
+            </w:tcMar>
+            <w:vAlign w:val="center"/>
+          </w:tcPr>
+          <w:p>
+            <w:pPr>
+              <w:spacing w:before="0" w:after="0" w:line="252" w:lineRule="auto"/>
+            </w:pPr>
+            <w:r/>
+            <w:r>
+              <w:rPr>
+                <w:rFonts w:ascii="Calibri" w:hAnsi="Calibri"/>
+                <w:b w:val="0"/>
+                <w:color w:val="1E1E1E"/>
+                <w:sz w:val="15"/>
+              </w:rPr>
+              <w:t>1073</w:t>
+            </w:r>
+          </w:p>
+        </w:tc>
+        <w:tc>
+          <w:tcPr>
+            <w:tcW w:type="dxa" w:w="1050"/>
+            <w:tcMar>
+              <w:top w:w="80" w:type="dxa"/>
+              <w:start w:w="120" w:type="dxa"/>
+              <w:bottom w:w="80" w:type="dxa"/>
+              <w:end w:w="120" w:type="dxa"/>
+            </w:tcMar>
+            <w:vAlign w:val="center"/>
+          </w:tcPr>
+          <w:p>
+            <w:pPr>
+              <w:spacing w:before="0" w:after="0" w:line="252" w:lineRule="auto"/>
+            </w:pPr>
+            <w:r/>
+            <w:r>
+              <w:rPr>
+                <w:rFonts w:ascii="Calibri" w:hAnsi="Calibri"/>
+                <w:b w:val="0"/>
+                <w:color w:val="1E1E1E"/>
+                <w:sz w:val="15"/>
+              </w:rPr>
+              <w:t>Заявка</w:t>
+            </w:r>
+          </w:p>
+        </w:tc>
+        <w:tc>
+          <w:tcPr>
+            <w:tcW w:type="dxa" w:w="1050"/>
+            <w:tcMar>
+              <w:top w:w="80" w:type="dxa"/>
+              <w:start w:w="120" w:type="dxa"/>
+              <w:bottom w:w="80" w:type="dxa"/>
+              <w:end w:w="120" w:type="dxa"/>
+            </w:tcMar>
+            <w:vAlign w:val="center"/>
+          </w:tcPr>
+          <w:p>
+            <w:pPr>
+              <w:spacing w:before="0" w:after="0" w:line="252" w:lineRule="auto"/>
+            </w:pPr>
+            <w:r/>
+            <w:r>
+              <w:rPr>
+                <w:rFonts w:ascii="Calibri" w:hAnsi="Calibri"/>
+                <w:b w:val="0"/>
+                <w:color w:val="1E1E1E"/>
+                <w:sz w:val="15"/>
+              </w:rPr>
+              <w:t>Заявка</w:t>
+            </w:r>
+          </w:p>
+        </w:tc>
+        <w:tc>
+          <w:tcPr>
+            <w:tcW w:type="dxa" w:w="1300"/>
+            <w:tcMar>
+              <w:top w:w="80" w:type="dxa"/>
+              <w:start w:w="120" w:type="dxa"/>
+              <w:bottom w:w="80" w:type="dxa"/>
+              <w:end w:w="120" w:type="dxa"/>
+            </w:tcMar>
+            <w:vAlign w:val="center"/>
+          </w:tcPr>
+          <w:p>
+            <w:pPr>
+              <w:spacing w:before="0" w:after="0" w:line="252" w:lineRule="auto"/>
+            </w:pPr>
+            <w:r/>
+            <w:r>
+              <w:rPr>
+                <w:rFonts w:ascii="Calibri" w:hAnsi="Calibri"/>
+                <w:b w:val="0"/>
+                <w:color w:val="1E1E1E"/>
+                <w:sz w:val="15"/>
+              </w:rPr>
+              <w:t>2025-05-26</w:t>
+            </w:r>
+          </w:p>
+        </w:tc>
+        <w:tc>
+          <w:tcPr>
+            <w:tcW w:type="dxa" w:w="4260"/>
+            <w:tcMar>
+              <w:top w:w="80" w:type="dxa"/>
+              <w:start w:w="120" w:type="dxa"/>
+              <w:bottom w:w="80" w:type="dxa"/>
+              <w:end w:w="120" w:type="dxa"/>
+            </w:tcMar>
+            <w:vAlign w:val="center"/>
+          </w:tcPr>
+          <w:p>
+            <w:pPr>
+              <w:spacing w:before="0" w:after="0" w:line="252" w:lineRule="auto"/>
+            </w:pPr>
+            <w:r/>
+            <w:r>
+              <w:rPr>
+                <w:rFonts w:ascii="Calibri" w:hAnsi="Calibri"/>
+                <w:b w:val="0"/>
+                <w:color w:val="1E1E1E"/>
+                <w:sz w:val="15"/>
+              </w:rPr>
+              <w:t>660/1/1073/ВА/АЭРО-ТРЕЙД</w:t>
+            </w:r>
+          </w:p>
+        </w:tc>
+      </w:tr>
+      <w:tr>
+        <w:tc>
+          <w:tcPr>
+            <w:tcW w:type="dxa" w:w="850"/>
+            <w:tcMar>
+              <w:top w:w="80" w:type="dxa"/>
+              <w:start w:w="120" w:type="dxa"/>
+              <w:bottom w:w="80" w:type="dxa"/>
+              <w:end w:w="120" w:type="dxa"/>
+            </w:tcMar>
+            <w:vAlign w:val="center"/>
+          </w:tcPr>
+          <w:p>
+            <w:pPr>
+              <w:spacing w:before="0" w:after="0" w:line="252" w:lineRule="auto"/>
+            </w:pPr>
+            <w:r/>
+            <w:r>
+              <w:rPr>
+                <w:rFonts w:ascii="Calibri" w:hAnsi="Calibri"/>
+                <w:b w:val="0"/>
+                <w:color w:val="1E1E1E"/>
+                <w:sz w:val="15"/>
+              </w:rPr>
+              <w:t>20822</w:t>
+            </w:r>
+          </w:p>
+        </w:tc>
+        <w:tc>
+          <w:tcPr>
+            <w:tcW w:type="dxa" w:w="850"/>
+            <w:tcMar>
+              <w:top w:w="80" w:type="dxa"/>
+              <w:start w:w="120" w:type="dxa"/>
+              <w:bottom w:w="80" w:type="dxa"/>
+              <w:end w:w="120" w:type="dxa"/>
+            </w:tcMar>
+            <w:vAlign w:val="center"/>
+          </w:tcPr>
+          <w:p>
+            <w:pPr>
+              <w:spacing w:before="0" w:after="0" w:line="252" w:lineRule="auto"/>
+            </w:pPr>
+            <w:r/>
+            <w:r>
+              <w:rPr>
+                <w:rFonts w:ascii="Calibri" w:hAnsi="Calibri"/>
+                <w:b w:val="0"/>
+                <w:color w:val="1E1E1E"/>
+                <w:sz w:val="15"/>
+              </w:rPr>
+              <w:t>1074</w:t>
+            </w:r>
+          </w:p>
+        </w:tc>
+        <w:tc>
+          <w:tcPr>
+            <w:tcW w:type="dxa" w:w="1050"/>
+            <w:tcMar>
+              <w:top w:w="80" w:type="dxa"/>
+              <w:start w:w="120" w:type="dxa"/>
+              <w:bottom w:w="80" w:type="dxa"/>
+              <w:end w:w="120" w:type="dxa"/>
+            </w:tcMar>
+            <w:vAlign w:val="center"/>
+          </w:tcPr>
+          <w:p>
+            <w:pPr>
+              <w:spacing w:before="0" w:after="0" w:line="252" w:lineRule="auto"/>
+            </w:pPr>
+            <w:r/>
+            <w:r>
+              <w:rPr>
+                <w:rFonts w:ascii="Calibri" w:hAnsi="Calibri"/>
+                <w:b w:val="0"/>
+                <w:color w:val="1E1E1E"/>
+                <w:sz w:val="15"/>
+              </w:rPr>
+              <w:t>Заявка</w:t>
+            </w:r>
+          </w:p>
+        </w:tc>
+        <w:tc>
+          <w:tcPr>
+            <w:tcW w:type="dxa" w:w="1050"/>
+            <w:tcMar>
+              <w:top w:w="80" w:type="dxa"/>
+              <w:start w:w="120" w:type="dxa"/>
+              <w:bottom w:w="80" w:type="dxa"/>
+              <w:end w:w="120" w:type="dxa"/>
+            </w:tcMar>
+            <w:vAlign w:val="center"/>
+          </w:tcPr>
+          <w:p>
+            <w:pPr>
+              <w:spacing w:before="0" w:after="0" w:line="252" w:lineRule="auto"/>
+            </w:pPr>
+            <w:r/>
+            <w:r>
+              <w:rPr>
+                <w:rFonts w:ascii="Calibri" w:hAnsi="Calibri"/>
+                <w:b w:val="0"/>
+                <w:color w:val="1E1E1E"/>
+                <w:sz w:val="15"/>
+              </w:rPr>
+              <w:t>Заявка</w:t>
+            </w:r>
+          </w:p>
+        </w:tc>
+        <w:tc>
+          <w:tcPr>
+            <w:tcW w:type="dxa" w:w="1300"/>
+            <w:tcMar>
+              <w:top w:w="80" w:type="dxa"/>
+              <w:start w:w="120" w:type="dxa"/>
+              <w:bottom w:w="80" w:type="dxa"/>
+              <w:end w:w="120" w:type="dxa"/>
+            </w:tcMar>
+            <w:vAlign w:val="center"/>
+          </w:tcPr>
+          <w:p>
+            <w:pPr>
+              <w:spacing w:before="0" w:after="0" w:line="252" w:lineRule="auto"/>
+            </w:pPr>
+            <w:r/>
+            <w:r>
+              <w:rPr>
+                <w:rFonts w:ascii="Calibri" w:hAnsi="Calibri"/>
+                <w:b w:val="0"/>
+                <w:color w:val="1E1E1E"/>
+                <w:sz w:val="15"/>
+              </w:rPr>
+              <w:t>2025-05-26</w:t>
+            </w:r>
+          </w:p>
+        </w:tc>
+        <w:tc>
+          <w:tcPr>
+            <w:tcW w:type="dxa" w:w="4260"/>
+            <w:tcMar>
+              <w:top w:w="80" w:type="dxa"/>
+              <w:start w:w="120" w:type="dxa"/>
+              <w:bottom w:w="80" w:type="dxa"/>
+              <w:end w:w="120" w:type="dxa"/>
+            </w:tcMar>
+            <w:vAlign w:val="center"/>
+          </w:tcPr>
+          <w:p>
+            <w:pPr>
+              <w:spacing w:before="0" w:after="0" w:line="252" w:lineRule="auto"/>
+            </w:pPr>
+            <w:r/>
+            <w:r>
+              <w:rPr>
+                <w:rFonts w:ascii="Calibri" w:hAnsi="Calibri"/>
+                <w:b w:val="0"/>
+                <w:color w:val="1E1E1E"/>
+                <w:sz w:val="15"/>
+              </w:rPr>
+              <w:t>660/1/1074/ВА/АЭРО-ТРЕЙД</w:t>
+            </w:r>
+          </w:p>
+        </w:tc>
+      </w:tr>
+      <w:tr>
+        <w:tc>
+          <w:tcPr>
+            <w:tcW w:type="dxa" w:w="850"/>
+            <w:tcMar>
+              <w:top w:w="80" w:type="dxa"/>
+              <w:start w:w="120" w:type="dxa"/>
+              <w:bottom w:w="80" w:type="dxa"/>
+              <w:end w:w="120" w:type="dxa"/>
+            </w:tcMar>
+            <w:vAlign w:val="center"/>
+          </w:tcPr>
+          <w:p>
+            <w:pPr>
+              <w:spacing w:before="0" w:after="0" w:line="252" w:lineRule="auto"/>
+            </w:pPr>
+            <w:r/>
+            <w:r>
+              <w:rPr>
+                <w:rFonts w:ascii="Calibri" w:hAnsi="Calibri"/>
+                <w:b w:val="0"/>
+                <w:color w:val="1E1E1E"/>
+                <w:sz w:val="15"/>
+              </w:rPr>
+              <w:t>20858</w:t>
+            </w:r>
+          </w:p>
+        </w:tc>
+        <w:tc>
+          <w:tcPr>
+            <w:tcW w:type="dxa" w:w="850"/>
+            <w:tcMar>
+              <w:top w:w="80" w:type="dxa"/>
+              <w:start w:w="120" w:type="dxa"/>
+              <w:bottom w:w="80" w:type="dxa"/>
+              <w:end w:w="120" w:type="dxa"/>
+            </w:tcMar>
+            <w:vAlign w:val="center"/>
+          </w:tcPr>
+          <w:p>
+            <w:pPr>
+              <w:spacing w:before="0" w:after="0" w:line="252" w:lineRule="auto"/>
+            </w:pPr>
+            <w:r/>
+            <w:r>
+              <w:rPr>
+                <w:rFonts w:ascii="Calibri" w:hAnsi="Calibri"/>
+                <w:b w:val="0"/>
+                <w:color w:val="1E1E1E"/>
+                <w:sz w:val="15"/>
+              </w:rPr>
+              <w:t>1076</w:t>
+            </w:r>
+          </w:p>
+        </w:tc>
+        <w:tc>
+          <w:tcPr>
+            <w:tcW w:type="dxa" w:w="1050"/>
+            <w:tcMar>
+              <w:top w:w="80" w:type="dxa"/>
+              <w:start w:w="120" w:type="dxa"/>
+              <w:bottom w:w="80" w:type="dxa"/>
+              <w:end w:w="120" w:type="dxa"/>
+            </w:tcMar>
+            <w:vAlign w:val="center"/>
+          </w:tcPr>
+          <w:p>
+            <w:pPr>
+              <w:spacing w:before="0" w:after="0" w:line="252" w:lineRule="auto"/>
+            </w:pPr>
+            <w:r/>
+            <w:r>
+              <w:rPr>
+                <w:rFonts w:ascii="Calibri" w:hAnsi="Calibri"/>
+                <w:b w:val="0"/>
+                <w:color w:val="1E1E1E"/>
+                <w:sz w:val="15"/>
+              </w:rPr>
+              <w:t>Заявка</w:t>
+            </w:r>
+          </w:p>
+        </w:tc>
+        <w:tc>
+          <w:tcPr>
+            <w:tcW w:type="dxa" w:w="1050"/>
+            <w:tcMar>
+              <w:top w:w="80" w:type="dxa"/>
+              <w:start w:w="120" w:type="dxa"/>
+              <w:bottom w:w="80" w:type="dxa"/>
+              <w:end w:w="120" w:type="dxa"/>
+            </w:tcMar>
+            <w:vAlign w:val="center"/>
+          </w:tcPr>
+          <w:p>
+            <w:pPr>
+              <w:spacing w:before="0" w:after="0" w:line="252" w:lineRule="auto"/>
+            </w:pPr>
+            <w:r/>
+            <w:r>
+              <w:rPr>
+                <w:rFonts w:ascii="Calibri" w:hAnsi="Calibri"/>
+                <w:b w:val="0"/>
+                <w:color w:val="1E1E1E"/>
+                <w:sz w:val="15"/>
+              </w:rPr>
+              <w:t>Заявка</w:t>
+            </w:r>
+          </w:p>
+        </w:tc>
+        <w:tc>
+          <w:tcPr>
+            <w:tcW w:type="dxa" w:w="1300"/>
+            <w:tcMar>
+              <w:top w:w="80" w:type="dxa"/>
+              <w:start w:w="120" w:type="dxa"/>
+              <w:bottom w:w="80" w:type="dxa"/>
+              <w:end w:w="120" w:type="dxa"/>
+            </w:tcMar>
+            <w:vAlign w:val="center"/>
+          </w:tcPr>
+          <w:p>
+            <w:pPr>
+              <w:spacing w:before="0" w:after="0" w:line="252" w:lineRule="auto"/>
+            </w:pPr>
+            <w:r/>
+            <w:r>
+              <w:rPr>
+                <w:rFonts w:ascii="Calibri" w:hAnsi="Calibri"/>
+                <w:b w:val="0"/>
+                <w:color w:val="1E1E1E"/>
+                <w:sz w:val="15"/>
+              </w:rPr>
+              <w:t>2025-05-26</w:t>
+            </w:r>
+          </w:p>
+        </w:tc>
+        <w:tc>
+          <w:tcPr>
+            <w:tcW w:type="dxa" w:w="4260"/>
+            <w:tcMar>
+              <w:top w:w="80" w:type="dxa"/>
+              <w:start w:w="120" w:type="dxa"/>
+              <w:bottom w:w="80" w:type="dxa"/>
+              <w:end w:w="120" w:type="dxa"/>
+            </w:tcMar>
+            <w:vAlign w:val="center"/>
+          </w:tcPr>
+          <w:p>
+            <w:pPr>
+              <w:spacing w:before="0" w:after="0" w:line="252" w:lineRule="auto"/>
+            </w:pPr>
+            <w:r/>
+            <w:r>
+              <w:rPr>
+                <w:rFonts w:ascii="Calibri" w:hAnsi="Calibri"/>
+                <w:b w:val="0"/>
+                <w:color w:val="1E1E1E"/>
+                <w:sz w:val="15"/>
+              </w:rPr>
+              <w:t>660/1/1076/ВА/АЭРО-ТРЕЙД</w:t>
             </w:r>
           </w:p>
         </w:tc>
@@ -11674,6 +14655,32 @@
           <w:sz w:val="20"/>
         </w:rPr>
         <w:t>Свежий кейс 660/1 воспроизводит live-итоги MariaDB: поступления/get_paidsum 2 331 111,33; реализация/get_realizsum 2 415 525,73; сальдо -84 414,40.</w:t>
+      </w:r>
+    </w:p>
+    <w:p>
+      <w:pPr>
+        <w:pStyle w:val="ListBullet"/>
+        <w:spacing w:after="80" w:line="300" w:lineRule="auto"/>
+      </w:pPr>
+      <w:r>
+        <w:rPr>
+          <w:rFonts w:ascii="Calibri" w:hAnsi="Calibri"/>
+          <w:sz w:val="20"/>
+        </w:rPr>
+        <w:t>В названии строки поставки используется тип из ERP (`view_specs.spec_type/spec_subtype`), например `Заявка №1063`, а не хардкод `Спецификация {num}`.</w:t>
+      </w:r>
+    </w:p>
+    <w:p>
+      <w:pPr>
+        <w:pStyle w:val="ListBullet"/>
+        <w:spacing w:after="80" w:line="300" w:lineRule="auto"/>
+      </w:pPr>
+      <w:r>
+        <w:rPr>
+          <w:rFonts w:ascii="Calibri" w:hAnsi="Calibri"/>
+          <w:sz w:val="20"/>
+        </w:rPr>
+        <w:t>На экране действует лимит до 50 поставок на запрос; большие периоды требуют пагинации или фоновой XLSX-задачи.</w:t>
       </w:r>
     </w:p>
     <w:p>

</xml_diff>

<commit_message>
Remove ERP view dependencies from matrix requirements
</commit_message>
<xml_diff>
--- a/docs/TZ_ERP_1C_Akt_Sverki_Matrix.docx
+++ b/docs/TZ_ERP_1C_Akt_Sverki_Matrix.docx
@@ -2365,7 +2365,7 @@
                 <w:color w:val="1E1E1E"/>
                 <w:sz w:val="15"/>
               </w:rPr>
-              <w:t>view_specs / veda_specs</w:t>
+              <w:t>veda_specs + veda_spr</w:t>
             </w:r>
           </w:p>
         </w:tc>
@@ -2419,7 +2419,7 @@
                 <w:color w:val="1E1E1E"/>
                 <w:sz w:val="15"/>
               </w:rPr>
-              <w:t>spec_id, spec_number, spec_num_short, spec_type/spec_subtype или f_typez/f_subtype, f_kod1cb, f_kod1cp</w:t>
+              <w:t>veda_specs.f_id, f_num, f_typez, f_subtype, f_kod1cb, f_kod1cp; тип через veda_spr f_type=33, подтип через f_type=130</w:t>
             </w:r>
           </w:p>
         </w:tc>
@@ -2446,7 +2446,7 @@
                 <w:color w:val="1E1E1E"/>
                 <w:sz w:val="15"/>
               </w:rPr>
-              <w:t>№ спецификации / заявки</w:t>
+              <w:t>№ спецификации / заявки; view_specinv/view_specs не использовать</w:t>
             </w:r>
           </w:p>
         </w:tc>
@@ -3856,7 +3856,7 @@
                 <w:color w:val="1E1E1E"/>
                 <w:sz w:val="14"/>
               </w:rPr>
-              <w:t>`spec_id`, `f_num`, `view_specs.spec_type`, `spec_subtype`, `f_kod1cb/f_kod1cp`</w:t>
+              <w:t>`veda_specs.f_id`, `f_num`, `f_typez`, `f_subtype`, `f_kod1cb/f_kod1cp`, расшифровка через `veda_spr`</w:t>
             </w:r>
           </w:p>
         </w:tc>
@@ -3910,7 +3910,7 @@
                 <w:color w:val="1E1E1E"/>
                 <w:sz w:val="14"/>
               </w:rPr>
-              <w:t>тип и номер выводятся из ERP; полный ОК возможен только если код 1С найден</w:t>
+              <w:t>тип и номер выводятся из исходных таблиц ERP; полный ОК возможен только если код 1С найден</w:t>
             </w:r>
           </w:p>
         </w:tc>
@@ -5688,7 +5688,7 @@
                 <w:color w:val="1E1E1E"/>
                 <w:sz w:val="14"/>
               </w:rPr>
-              <w:t>`veda_contacts -&gt; veda_clients -&gt; veda_dogs -&gt; view_specs/veda_specs`; фильтры `contact_id`, `client_id`, `dog_id`, период или список `spec_id/f_num`.</w:t>
+              <w:t>`veda_contacts -&gt; veda_clients -&gt; veda_dogs -&gt; veda_specs`; тип поставки через `veda_spr(f_type=33)`, подтип через `veda_spr(f_type=130)`; фильтры `contact_id`, `client_id`, `dog_id`, период или список `spec_id/f_num`.</w:t>
             </w:r>
           </w:p>
         </w:tc>
@@ -6791,7 +6791,7 @@
                 <w:color w:val="1E1E1E"/>
                 <w:sz w:val="14"/>
               </w:rPr>
-              <w:t>`{view_specs.spec_type} №{spec_number}`; если тип пустой, `Поставка №{veda_specs.f_num}`.</w:t>
+              <w:t>`{veda_spr.f_name/f_dopprstr по f_type=33} №{veda_specs.f_num}`; если тип пустой, `Поставка №{veda_specs.f_num}`.</w:t>
             </w:r>
           </w:p>
         </w:tc>
@@ -7805,7 +7805,7 @@
                 <w:color w:val="1E1E1E"/>
                 <w:sz w:val="15"/>
               </w:rPr>
-              <w:t>view_specs.spec_type/spec_subtype/spec_number/spec_num_short, veda_specs.f_id, f_kod1cb/f_kod1cp</w:t>
+              <w:t>veda_specs.f_typez/f_subtype/f_num/f_id/f_kod1cb/f_kod1cp + veda_spr(f_type=33/130)</w:t>
             </w:r>
           </w:p>
         </w:tc>
@@ -7832,7 +7832,7 @@
                 <w:color w:val="1E1E1E"/>
                 <w:sz w:val="15"/>
               </w:rPr>
-              <w:t>тип строки брать из ERP: `Заявка`, `Спецификация`, `Сертификация` и т.д.; не хардкодить `Спецификация {num}`.</w:t>
+              <w:t>тип строки брать из исходных таблиц ERP: `Заявка`, `Спецификация`, `Сертификация` и т.д.; не хардкодить `Спецификация {num}`; не использовать view_specinv/view_specs.</w:t>
             </w:r>
           </w:p>
         </w:tc>
@@ -9779,7 +9779,7 @@
                 <w:color w:val="1E1E1E"/>
                 <w:sz w:val="16"/>
               </w:rPr>
-              <w:t>объединить по строкам счетов; текст вида `{тип ERP} №{номер}`, например `Заявка №1063`; тип брать из `view_specs.spec_type/spec_subtype`</w:t>
+              <w:t>объединить по строкам счетов; текст вида `{тип ERP} №{номер}`, например `Заявка №1063`; тип брать из `veda_specs.f_typez/f_subtype` через `veda_spr`, без view</w:t>
             </w:r>
           </w:p>
         </w:tc>
@@ -14667,7 +14667,7 @@
           <w:rFonts w:ascii="Calibri" w:hAnsi="Calibri"/>
           <w:sz w:val="20"/>
         </w:rPr>
-        <w:t>В названии строки поставки используется тип из ERP (`view_specs.spec_type/spec_subtype`), например `Заявка №1063`, а не хардкод `Спецификация {num}`.</w:t>
+        <w:t>В названии строки поставки используется тип из исходных таблиц ERP (`veda_specs.f_typez/f_subtype` + `veda_spr`), например `Заявка №1063`, а не хардкод `Спецификация {num}` и не view.</w:t>
       </w:r>
     </w:p>
     <w:p>

</xml_diff>

<commit_message>
Clarify matrix statuses and XLSX UI
</commit_message>
<xml_diff>
--- a/docs/TZ_ERP_1C_Akt_Sverki_Matrix.docx
+++ b/docs/TZ_ERP_1C_Akt_Sverki_Matrix.docx
@@ -1783,7 +1783,7 @@
                 <w:color w:val="1E1E1E"/>
                 <w:sz w:val="16"/>
               </w:rPr>
-              <w:t>Ошибки показываются бейджами. В одной строке допустимо несколько бейджей.</w:t>
+              <w:t>Ошибки показываются бейджами с конкретной причиной: сумма, номер, дата, договор, НДС, отсутствие документа. Общий текст `Реквизиты` без поля не использовать.</w:t>
             </w:r>
           </w:p>
         </w:tc>
@@ -1839,7 +1839,7 @@
                 <w:color w:val="1E1E1E"/>
                 <w:sz w:val="16"/>
               </w:rPr>
-              <w:t>По клиенту, ЮЛ, договору, номеру поставки, счету, акту, СФ/УПД.</w:t>
+              <w:t>По клиенту, ЮЛ, ИНН, `contact_id`, `client_id`, договору, заявке/спецификации, счету, акту, СФ/УПД. `client_id + scope=legal` открывает одно ЮЛ, `contact_id/scope=contact` - все ЮЛ клиента.</w:t>
             </w:r>
           </w:p>
         </w:tc>
@@ -1858,7 +1858,7 @@
       <w:r>
         <w:drawing>
           <wp:inline xmlns:a="http://schemas.openxmlformats.org/drawingml/2006/main" xmlns:pic="http://schemas.openxmlformats.org/drawingml/2006/picture">
-            <wp:extent cx="5760720" cy="3600450"/>
+            <wp:extent cx="5760720" cy="3456432"/>
             <wp:docPr id="1" name="Picture 1"/>
             <wp:cNvGraphicFramePr>
               <a:graphicFrameLocks noChangeAspect="1"/>
@@ -1879,7 +1879,7 @@
                   <pic:spPr>
                     <a:xfrm>
                       <a:off x="0" y="0"/>
-                      <a:ext cx="5760720" cy="3600450"/>
+                      <a:ext cx="5760720" cy="3456432"/>
                     </a:xfrm>
                     <a:prstGeom prst="rect"/>
                   </pic:spPr>
@@ -1913,7 +1913,7 @@
       <w:r>
         <w:drawing>
           <wp:inline xmlns:a="http://schemas.openxmlformats.org/drawingml/2006/main" xmlns:pic="http://schemas.openxmlformats.org/drawingml/2006/picture">
-            <wp:extent cx="5760720" cy="2743200"/>
+            <wp:extent cx="5760720" cy="3456432"/>
             <wp:docPr id="2" name="Picture 2"/>
             <wp:cNvGraphicFramePr>
               <a:graphicFrameLocks noChangeAspect="1"/>
@@ -1934,7 +1934,7 @@
                   <pic:spPr>
                     <a:xfrm>
                       <a:off x="0" y="0"/>
-                      <a:ext cx="5760720" cy="2743200"/>
+                      <a:ext cx="5760720" cy="3456432"/>
                     </a:xfrm>
                     <a:prstGeom prst="rect"/>
                   </pic:spPr>
@@ -4463,6 +4463,62 @@
                 <w:sz w:val="16"/>
               </w:rPr>
               <w:t>Экран матрицы показывает до 50 поставок за один запрос. Для большего объема нужна пагинация или фоновая XLSX-задача.</w:t>
+            </w:r>
+          </w:p>
+        </w:tc>
+      </w:tr>
+      <w:tr>
+        <w:tc>
+          <w:tcPr>
+            <w:tcW w:type="dxa" w:w="2100"/>
+            <w:tcMar>
+              <w:top w:w="80" w:type="dxa"/>
+              <w:start w:w="120" w:type="dxa"/>
+              <w:bottom w:w="80" w:type="dxa"/>
+              <w:end w:w="120" w:type="dxa"/>
+            </w:tcMar>
+            <w:vAlign w:val="center"/>
+          </w:tcPr>
+          <w:p>
+            <w:pPr>
+              <w:spacing w:before="0" w:after="0" w:line="252" w:lineRule="auto"/>
+            </w:pPr>
+            <w:r/>
+            <w:r>
+              <w:rPr>
+                <w:rFonts w:ascii="Calibri" w:hAnsi="Calibri"/>
+                <w:b w:val="0"/>
+                <w:color w:val="1E1E1E"/>
+                <w:sz w:val="16"/>
+              </w:rPr>
+              <w:t>Поиск по ЮЛ</w:t>
+            </w:r>
+          </w:p>
+        </w:tc>
+        <w:tc>
+          <w:tcPr>
+            <w:tcW w:type="dxa" w:w="7260"/>
+            <w:tcMar>
+              <w:top w:w="80" w:type="dxa"/>
+              <w:start w:w="120" w:type="dxa"/>
+              <w:bottom w:w="80" w:type="dxa"/>
+              <w:end w:w="120" w:type="dxa"/>
+            </w:tcMar>
+            <w:vAlign w:val="center"/>
+          </w:tcPr>
+          <w:p>
+            <w:pPr>
+              <w:spacing w:before="0" w:after="0" w:line="252" w:lineRule="auto"/>
+            </w:pPr>
+            <w:r/>
+            <w:r>
+              <w:rPr>
+                <w:rFonts w:ascii="Calibri" w:hAnsi="Calibri"/>
+                <w:b w:val="0"/>
+                <w:color w:val="1E1E1E"/>
+                <w:sz w:val="16"/>
+              </w:rPr>
+              <w:t>Фильтр должен искать по `veda_contacts`, `veda_clients`, ИНН, `contact_id`, `client_id`, договору, поставке, счету и номеру 1С.</w:t>
             </w:r>
           </w:p>
         </w:tc>
@@ -14720,6 +14776,19 @@
           <w:sz w:val="20"/>
         </w:rPr>
         <w:t>`Нет СФ/УПД` определяется отсутствием закрывающего документа после загрузки источников, а `Вопрос по НДС` - только несовпадением ставки НДС ERP и 1С.</w:t>
+      </w:r>
+    </w:p>
+    <w:p>
+      <w:pPr>
+        <w:pStyle w:val="ListBullet"/>
+        <w:spacing w:after="80" w:line="300" w:lineRule="auto"/>
+      </w:pPr>
+      <w:r>
+        <w:rPr>
+          <w:rFonts w:ascii="Calibri" w:hAnsi="Calibri"/>
+          <w:sz w:val="20"/>
+        </w:rPr>
+        <w:t>Бейдж `1С: X/Y совпало` означает, что X строк сверки совпали из Y найденных строк ERP ↔ 1С; `Остаток` считается как оплата минус возмещаемые и невозмещаемые расходы.</w:t>
       </w:r>
     </w:p>
     <w:p>

</xml_diff>

<commit_message>
Separate delivery balance from ERP 1C reconciliation
</commit_message>
<xml_diff>
--- a/docs/TZ_ERP_1C_Akt_Sverki_Matrix.docx
+++ b/docs/TZ_ERP_1C_Akt_Sverki_Matrix.docx
@@ -26,7 +26,7 @@
           <w:color w:val="5A5A5A"/>
           <w:sz w:val="26"/>
         </w:rPr>
-        <w:t>Матрица акта сверки ERP и 1С в разрезе поставки</w:t>
+        <w:t>Сальдо по поставкам и отдельная сверка ERP ↔ 1С</w:t>
       </w:r>
     </w:p>
     <w:tbl>
@@ -264,7 +264,7 @@
                 <w:color w:val="1E1E1E"/>
                 <w:sz w:val="17"/>
               </w:rPr>
-              <w:t>Сверка взаиморасчетов клиента в иерархии клиент -&gt; ЮЛ -&gt; договор -&gt; поставка.</w:t>
+              <w:t>Разделить две задачи: бухгалтерскую сальдовку по поставкам и техническую сверку полноты ERP ↔ 1С.</w:t>
             </w:r>
           </w:p>
         </w:tc>
@@ -320,7 +320,7 @@
                 <w:color w:val="1E1E1E"/>
                 <w:sz w:val="17"/>
               </w:rPr>
-              <w:t>Экран-матрица, режим ошибок, Excel в бухгалтерском формате, журнал расхождений.</w:t>
+              <w:t>Экран сальдо по поставкам с XLSX и отдельная страница сверки ERP ↔ 1С с протоколом расхождений.</w:t>
             </w:r>
           </w:p>
         </w:tc>
@@ -492,7 +492,7 @@
                 <w:color w:val="1E1E1E"/>
                 <w:sz w:val="19"/>
               </w:rPr>
-              <w:t>Матрица должна считать данные из MariaDB ERP и подтверждать их существующим сервисом 1С. Внешние аналитические файлы могут использоваться только для ручной проверки корректности расчетов и не входят в production-логику.</w:t>
+              <w:t>Текущая матрица не должна называться полноценной сверкой ERP ↔ 1С. Это ERP-сальдо по поставкам. Проверка соответствия двух учетных систем должна быть отдельным экраном и отдельным процессом сверки.</w:t>
             </w:r>
           </w:p>
         </w:tc>
@@ -502,6 +502,11 @@
       <w:pPr>
         <w:spacing w:after="40"/>
       </w:pPr>
+    </w:p>
+    <w:p>
+      <w:r>
+        <w:br w:type="page"/>
+      </w:r>
     </w:p>
     <w:p>
       <w:pPr>
@@ -529,7 +534,7 @@
           <w:color w:val="1E1E1E"/>
           <w:sz w:val="21"/>
         </w:rPr>
-        <w:t>Цель доработки - дать бухгалтеру рабочий экран сверки взаиморасчетов по клиенту в разрезе поставок: увидеть счета, оплаты, возмещаемые и невозмещаемые расходы, закрывающие документы, долг или переплату, а также быстро понять, какие документы не совпали с 1С.</w:t>
+        <w:t>Цель доработки делится на две пользовательские задачи. Первая - дать бухгалтеру рабочий экран сальдо по поставкам: счета, оплаты, возмещаемые и невозмещаемые расходы, долг или переплата. Вторая - дать отдельный инструмент проверки, что документы и сальдо ERP действительно совпадают с 1С.</w:t>
       </w:r>
     </w:p>
     <w:tbl>
@@ -712,7 +717,7 @@
                 <w:color w:val="1E1E1E"/>
                 <w:sz w:val="15"/>
               </w:rPr>
-              <w:t>Видит один экран с итогами и может раскрыть проблемную поставку до документов.</w:t>
+              <w:t>Видит сальдо по поставкам и может выгрузить бухгалтерскую XLSX-форму.</w:t>
             </w:r>
           </w:p>
         </w:tc>
@@ -768,7 +773,7 @@
                 <w:color w:val="1E1E1E"/>
                 <w:sz w:val="15"/>
               </w:rPr>
-              <w:t>Понять, почему поставка не сходится: нет документа, другая сумма, другой НДС, нет ключа 1С, долг или переплата.</w:t>
+              <w:t>Запустить отдельную сверку ERP ↔ 1С по ЮЛ, договору, периоду или поставке.</w:t>
             </w:r>
           </w:p>
         </w:tc>
@@ -795,7 +800,7 @@
                 <w:color w:val="1E1E1E"/>
                 <w:sz w:val="15"/>
               </w:rPr>
-              <w:t>Получает конкретный статус и поле расхождения, а не общий текст без причины.</w:t>
+              <w:t>Получает протокол: что есть в ERP, чего нет в 1С, что есть в 1С, чего нет в ERP, где расходятся суммы, даты, номера, НДС и сальдо.</w:t>
             </w:r>
           </w:p>
         </w:tc>
@@ -961,7 +966,7 @@
                 <w:color w:val="1E1E1E"/>
                 <w:sz w:val="15"/>
               </w:rPr>
-              <w:t>Получает журнал расхождений, по которому можно анализировать причины и объем проблем.</w:t>
+              <w:t>Получает журнал расхождений отдельной сверки ERP ↔ 1С, по которому можно анализировать причины и объем проблем.</w:t>
             </w:r>
           </w:p>
         </w:tc>
@@ -1017,7 +1022,7 @@
                 <w:color w:val="1E1E1E"/>
                 <w:sz w:val="15"/>
               </w:rPr>
-              <w:t>Реализовать экран без догадок по источникам данных.</w:t>
+              <w:t>Реализовать два разных экрана без смешения задач.</w:t>
             </w:r>
           </w:p>
         </w:tc>
@@ -1044,7 +1049,7 @@
                 <w:color w:val="1E1E1E"/>
                 <w:sz w:val="15"/>
               </w:rPr>
-              <w:t>Использует описанные таблицы, поля, SQL-связи, SOAP-методы, формулы и критерии приемки.</w:t>
+              <w:t>Использует описанные SQL-связи, SOAP-методы, формулы сальдо, протокол расхождений и критерии приемки.</w:t>
             </w:r>
           </w:p>
         </w:tc>
@@ -1167,7 +1172,7 @@
                 <w:color w:val="1E1E1E"/>
                 <w:sz w:val="15"/>
               </w:rPr>
-              <w:t>Экран внутри текущей PHP ERP, работающий с MariaDB ERP и существующим SOAP-сервисом 1С.</w:t>
+              <w:t>Экран `Сальдо по поставкам` внутри текущей PHP ERP, работающий только по данным MariaDB ERP.</w:t>
             </w:r>
           </w:p>
         </w:tc>
@@ -1194,7 +1199,7 @@
                 <w:color w:val="1E1E1E"/>
                 <w:sz w:val="15"/>
               </w:rPr>
-              <w:t>Отдельный внешний модуль сверки, новая база данных, замена действующего ERP-интерфейса.</w:t>
+              <w:t>Называть этот экран полноценной сверкой ERP ↔ 1С.</w:t>
             </w:r>
           </w:p>
         </w:tc>
@@ -1223,7 +1228,7 @@
                 <w:color w:val="1E1E1E"/>
                 <w:sz w:val="15"/>
               </w:rPr>
-              <w:t>Расчет матрицы и XLSX по выбранным клиентам, ЮЛ, договорам, поставкам и периоду.</w:t>
+              <w:t>Отдельный экран `Сверка ERP ↔ 1С` с запуском проверки, протоколом расхождений и сравнением итогов.</w:t>
             </w:r>
           </w:p>
         </w:tc>
@@ -1279,7 +1284,7 @@
                 <w:color w:val="1E1E1E"/>
                 <w:sz w:val="15"/>
               </w:rPr>
-              <w:t>Сверка ERP-документов с 1С: счета покупателю, оплаты, акты/УПД/СФ, договоры и итоговые сальдо.</w:t>
+              <w:t>Сверка ERP-документов с 1С: счета покупателю, оплаты, акты/УПД/СФ, договоры и итоговые сальдо на отдельной странице.</w:t>
             </w:r>
           </w:p>
         </w:tc>
@@ -1363,6 +1368,563 @@
                 <w:sz w:val="15"/>
               </w:rPr>
               <w:t>Изменение бизнес-логики формирования первичных документов в ERP или 1С.</w:t>
+            </w:r>
+          </w:p>
+        </w:tc>
+      </w:tr>
+    </w:tbl>
+    <w:p>
+      <w:pPr>
+        <w:spacing w:after="40"/>
+      </w:pPr>
+    </w:p>
+    <w:p>
+      <w:pPr>
+        <w:pStyle w:val="Heading2"/>
+        <w:keepNext/>
+      </w:pPr>
+      <w:r/>
+      <w:r>
+        <w:rPr>
+          <w:rFonts w:ascii="Calibri" w:hAnsi="Calibri"/>
+          <w:b/>
+          <w:color w:val="2E74B5"/>
+          <w:sz w:val="26"/>
+        </w:rPr>
+        <w:t>1.2 Декомпозиция на два экрана</w:t>
+      </w:r>
+    </w:p>
+    <w:p>
+      <w:pPr>
+        <w:spacing w:before="0" w:after="120" w:line="300" w:lineRule="auto"/>
+      </w:pPr>
+      <w:r>
+        <w:rPr>
+          <w:rFonts w:ascii="Calibri" w:hAnsi="Calibri"/>
+          <w:color w:val="1E1E1E"/>
+          <w:sz w:val="21"/>
+        </w:rPr>
+        <w:t>Чтобы не смешивать разные пользовательские цели, решение должно состоять из двух самостоятельных страниц. Первая закрывает бухгалтерское сальдо по поставкам. Вторая закрывает контроль полноты и совпадения ERP и 1С.</w:t>
+      </w:r>
+    </w:p>
+    <w:tbl>
+      <w:tblGrid>
+        <w:gridCol w:w="1700"/>
+        <w:gridCol w:w="3300"/>
+        <w:gridCol w:w="2620"/>
+        <w:gridCol w:w="1740"/>
+      </w:tblGrid>
+      <w:tblPr>
+        <w:tblStyle w:val="TableGrid"/>
+        <w:tblW w:type="dxa" w:w="9360"/>
+        <w:tblLayout w:type="fixed"/>
+        <w:tblLook w:firstColumn="1" w:firstRow="1" w:lastColumn="0" w:lastRow="0" w:noHBand="0" w:noVBand="1" w:val="04A0"/>
+        <w:tblInd w:w="120" w:type="dxa"/>
+      </w:tblPr>
+      <w:tr>
+        <w:tc>
+          <w:tcPr>
+            <w:tcW w:type="dxa" w:w="1700"/>
+            <w:tcMar>
+              <w:top w:w="80" w:type="dxa"/>
+              <w:start w:w="120" w:type="dxa"/>
+              <w:bottom w:w="80" w:type="dxa"/>
+              <w:end w:w="120" w:type="dxa"/>
+            </w:tcMar>
+            <w:vAlign w:val="center"/>
+            <w:shd w:fill="E8EEF5"/>
+          </w:tcPr>
+          <w:p>
+            <w:pPr>
+              <w:spacing w:before="0" w:after="0" w:line="252" w:lineRule="auto"/>
+              <w:jc w:val="center"/>
+            </w:pPr>
+            <w:r/>
+            <w:r>
+              <w:rPr>
+                <w:rFonts w:ascii="Calibri" w:hAnsi="Calibri"/>
+                <w:b/>
+                <w:color w:val="1F4D78"/>
+                <w:sz w:val="14"/>
+              </w:rPr>
+              <w:t>Страница</w:t>
+            </w:r>
+          </w:p>
+        </w:tc>
+        <w:tc>
+          <w:tcPr>
+            <w:tcW w:type="dxa" w:w="3300"/>
+            <w:tcMar>
+              <w:top w:w="80" w:type="dxa"/>
+              <w:start w:w="120" w:type="dxa"/>
+              <w:bottom w:w="80" w:type="dxa"/>
+              <w:end w:w="120" w:type="dxa"/>
+            </w:tcMar>
+            <w:vAlign w:val="center"/>
+            <w:shd w:fill="E8EEF5"/>
+          </w:tcPr>
+          <w:p>
+            <w:pPr>
+              <w:spacing w:before="0" w:after="0" w:line="252" w:lineRule="auto"/>
+              <w:jc w:val="center"/>
+            </w:pPr>
+            <w:r/>
+            <w:r>
+              <w:rPr>
+                <w:rFonts w:ascii="Calibri" w:hAnsi="Calibri"/>
+                <w:b/>
+                <w:color w:val="1F4D78"/>
+                <w:sz w:val="14"/>
+              </w:rPr>
+              <w:t>Назначение</w:t>
+            </w:r>
+          </w:p>
+        </w:tc>
+        <w:tc>
+          <w:tcPr>
+            <w:tcW w:type="dxa" w:w="2620"/>
+            <w:tcMar>
+              <w:top w:w="80" w:type="dxa"/>
+              <w:start w:w="120" w:type="dxa"/>
+              <w:bottom w:w="80" w:type="dxa"/>
+              <w:end w:w="120" w:type="dxa"/>
+            </w:tcMar>
+            <w:vAlign w:val="center"/>
+            <w:shd w:fill="E8EEF5"/>
+          </w:tcPr>
+          <w:p>
+            <w:pPr>
+              <w:spacing w:before="0" w:after="0" w:line="252" w:lineRule="auto"/>
+              <w:jc w:val="center"/>
+            </w:pPr>
+            <w:r/>
+            <w:r>
+              <w:rPr>
+                <w:rFonts w:ascii="Calibri" w:hAnsi="Calibri"/>
+                <w:b/>
+                <w:color w:val="1F4D78"/>
+                <w:sz w:val="14"/>
+              </w:rPr>
+              <w:t>Источник данных</w:t>
+            </w:r>
+          </w:p>
+        </w:tc>
+        <w:tc>
+          <w:tcPr>
+            <w:tcW w:type="dxa" w:w="1740"/>
+            <w:tcMar>
+              <w:top w:w="80" w:type="dxa"/>
+              <w:start w:w="120" w:type="dxa"/>
+              <w:bottom w:w="80" w:type="dxa"/>
+              <w:end w:w="120" w:type="dxa"/>
+            </w:tcMar>
+            <w:vAlign w:val="center"/>
+            <w:shd w:fill="E8EEF5"/>
+          </w:tcPr>
+          <w:p>
+            <w:pPr>
+              <w:spacing w:before="0" w:after="0" w:line="252" w:lineRule="auto"/>
+              <w:jc w:val="center"/>
+            </w:pPr>
+            <w:r/>
+            <w:r>
+              <w:rPr>
+                <w:rFonts w:ascii="Calibri" w:hAnsi="Calibri"/>
+                <w:b/>
+                <w:color w:val="1F4D78"/>
+                <w:sz w:val="14"/>
+              </w:rPr>
+              <w:t>Что является результатом</w:t>
+            </w:r>
+          </w:p>
+        </w:tc>
+      </w:tr>
+      <w:tr>
+        <w:tc>
+          <w:tcPr>
+            <w:tcW w:type="dxa" w:w="1700"/>
+            <w:tcMar>
+              <w:top w:w="80" w:type="dxa"/>
+              <w:start w:w="120" w:type="dxa"/>
+              <w:bottom w:w="80" w:type="dxa"/>
+              <w:end w:w="120" w:type="dxa"/>
+            </w:tcMar>
+            <w:vAlign w:val="center"/>
+          </w:tcPr>
+          <w:p>
+            <w:pPr>
+              <w:spacing w:before="0" w:after="0" w:line="252" w:lineRule="auto"/>
+            </w:pPr>
+            <w:r/>
+            <w:r>
+              <w:rPr>
+                <w:rFonts w:ascii="Calibri" w:hAnsi="Calibri"/>
+                <w:b w:val="0"/>
+                <w:color w:val="1E1E1E"/>
+                <w:sz w:val="14"/>
+              </w:rPr>
+              <w:t>Сальдо по поставкам</w:t>
+            </w:r>
+          </w:p>
+        </w:tc>
+        <w:tc>
+          <w:tcPr>
+            <w:tcW w:type="dxa" w:w="3300"/>
+            <w:tcMar>
+              <w:top w:w="80" w:type="dxa"/>
+              <w:start w:w="120" w:type="dxa"/>
+              <w:bottom w:w="80" w:type="dxa"/>
+              <w:end w:w="120" w:type="dxa"/>
+            </w:tcMar>
+            <w:vAlign w:val="center"/>
+          </w:tcPr>
+          <w:p>
+            <w:pPr>
+              <w:spacing w:before="0" w:after="0" w:line="252" w:lineRule="auto"/>
+            </w:pPr>
+            <w:r/>
+            <w:r>
+              <w:rPr>
+                <w:rFonts w:ascii="Calibri" w:hAnsi="Calibri"/>
+                <w:b w:val="0"/>
+                <w:color w:val="1E1E1E"/>
+                <w:sz w:val="14"/>
+              </w:rPr>
+              <w:t>Показать клиенту/бухгалтеру, сколько выставлено, оплачено, отражено возмещаемых/невозмещаемых расходов, какой долг или переплата по поставкам.</w:t>
+            </w:r>
+          </w:p>
+        </w:tc>
+        <w:tc>
+          <w:tcPr>
+            <w:tcW w:type="dxa" w:w="2620"/>
+            <w:tcMar>
+              <w:top w:w="80" w:type="dxa"/>
+              <w:start w:w="120" w:type="dxa"/>
+              <w:bottom w:w="80" w:type="dxa"/>
+              <w:end w:w="120" w:type="dxa"/>
+            </w:tcMar>
+            <w:vAlign w:val="center"/>
+          </w:tcPr>
+          <w:p>
+            <w:pPr>
+              <w:spacing w:before="0" w:after="0" w:line="252" w:lineRule="auto"/>
+            </w:pPr>
+            <w:r/>
+            <w:r>
+              <w:rPr>
+                <w:rFonts w:ascii="Calibri" w:hAnsi="Calibri"/>
+                <w:b w:val="0"/>
+                <w:color w:val="1E1E1E"/>
+                <w:sz w:val="14"/>
+              </w:rPr>
+              <w:t>MariaDB ERP: `veda_specs`, `veda_spec_invoices`, `veda_schets`, `veda_acchist_docs`, `get_paidsum`, `get_realizsum`.</w:t>
+            </w:r>
+          </w:p>
+        </w:tc>
+        <w:tc>
+          <w:tcPr>
+            <w:tcW w:type="dxa" w:w="1740"/>
+            <w:tcMar>
+              <w:top w:w="80" w:type="dxa"/>
+              <w:start w:w="120" w:type="dxa"/>
+              <w:bottom w:w="80" w:type="dxa"/>
+              <w:end w:w="120" w:type="dxa"/>
+            </w:tcMar>
+            <w:vAlign w:val="center"/>
+          </w:tcPr>
+          <w:p>
+            <w:pPr>
+              <w:spacing w:before="0" w:after="0" w:line="252" w:lineRule="auto"/>
+            </w:pPr>
+            <w:r/>
+            <w:r>
+              <w:rPr>
+                <w:rFonts w:ascii="Calibri" w:hAnsi="Calibri"/>
+                <w:b w:val="0"/>
+                <w:color w:val="1E1E1E"/>
+                <w:sz w:val="14"/>
+              </w:rPr>
+              <w:t>Экран с агрегатами по поставкам и XLSX в бухгалтерском формате. Это не доказательство совпадения ERP и 1С.</w:t>
+            </w:r>
+          </w:p>
+        </w:tc>
+      </w:tr>
+      <w:tr>
+        <w:tc>
+          <w:tcPr>
+            <w:tcW w:type="dxa" w:w="1700"/>
+            <w:tcMar>
+              <w:top w:w="80" w:type="dxa"/>
+              <w:start w:w="120" w:type="dxa"/>
+              <w:bottom w:w="80" w:type="dxa"/>
+              <w:end w:w="120" w:type="dxa"/>
+            </w:tcMar>
+            <w:vAlign w:val="center"/>
+          </w:tcPr>
+          <w:p>
+            <w:pPr>
+              <w:spacing w:before="0" w:after="0" w:line="252" w:lineRule="auto"/>
+            </w:pPr>
+            <w:r/>
+            <w:r>
+              <w:rPr>
+                <w:rFonts w:ascii="Calibri" w:hAnsi="Calibri"/>
+                <w:b w:val="0"/>
+                <w:color w:val="1E1E1E"/>
+                <w:sz w:val="14"/>
+              </w:rPr>
+              <w:t>Сверка ERP ↔ 1С</w:t>
+            </w:r>
+          </w:p>
+        </w:tc>
+        <w:tc>
+          <w:tcPr>
+            <w:tcW w:type="dxa" w:w="3300"/>
+            <w:tcMar>
+              <w:top w:w="80" w:type="dxa"/>
+              <w:start w:w="120" w:type="dxa"/>
+              <w:bottom w:w="80" w:type="dxa"/>
+              <w:end w:w="120" w:type="dxa"/>
+            </w:tcMar>
+            <w:vAlign w:val="center"/>
+          </w:tcPr>
+          <w:p>
+            <w:pPr>
+              <w:spacing w:before="0" w:after="0" w:line="252" w:lineRule="auto"/>
+            </w:pPr>
+            <w:r/>
+            <w:r>
+              <w:rPr>
+                <w:rFonts w:ascii="Calibri" w:hAnsi="Calibri"/>
+                <w:b w:val="0"/>
+                <w:color w:val="1E1E1E"/>
+                <w:sz w:val="14"/>
+              </w:rPr>
+              <w:t>Проверить, что учетные системы совпадают: все документы ERP есть в 1С, все документы 1С есть в ERP, суммы/даты/НДС/договоры совпадают, сальдо на начало и конец совпадает.</w:t>
+            </w:r>
+          </w:p>
+        </w:tc>
+        <w:tc>
+          <w:tcPr>
+            <w:tcW w:type="dxa" w:w="2620"/>
+            <w:tcMar>
+              <w:top w:w="80" w:type="dxa"/>
+              <w:start w:w="120" w:type="dxa"/>
+              <w:bottom w:w="80" w:type="dxa"/>
+              <w:end w:w="120" w:type="dxa"/>
+            </w:tcMar>
+            <w:vAlign w:val="center"/>
+          </w:tcPr>
+          <w:p>
+            <w:pPr>
+              <w:spacing w:before="0" w:after="0" w:line="252" w:lineRule="auto"/>
+            </w:pPr>
+            <w:r/>
+            <w:r>
+              <w:rPr>
+                <w:rFonts w:ascii="Calibri" w:hAnsi="Calibri"/>
+                <w:b w:val="0"/>
+                <w:color w:val="1E1E1E"/>
+                <w:sz w:val="14"/>
+              </w:rPr>
+              <w:t>MariaDB ERP + существующий SOAP-сервис 1С. При необходимости отдельный 1С-метод для оборотов/сальдо.</w:t>
+            </w:r>
+          </w:p>
+        </w:tc>
+        <w:tc>
+          <w:tcPr>
+            <w:tcW w:type="dxa" w:w="1740"/>
+            <w:tcMar>
+              <w:top w:w="80" w:type="dxa"/>
+              <w:start w:w="120" w:type="dxa"/>
+              <w:bottom w:w="80" w:type="dxa"/>
+              <w:end w:w="120" w:type="dxa"/>
+            </w:tcMar>
+            <w:vAlign w:val="center"/>
+          </w:tcPr>
+          <w:p>
+            <w:pPr>
+              <w:spacing w:before="0" w:after="0" w:line="252" w:lineRule="auto"/>
+            </w:pPr>
+            <w:r/>
+            <w:r>
+              <w:rPr>
+                <w:rFonts w:ascii="Calibri" w:hAnsi="Calibri"/>
+                <w:b w:val="0"/>
+                <w:color w:val="1E1E1E"/>
+                <w:sz w:val="14"/>
+              </w:rPr>
+              <w:t>Протокол запуска сверки, список расхождений, итоговый статус по документам и сальдо.</w:t>
+            </w:r>
+          </w:p>
+        </w:tc>
+      </w:tr>
+      <w:tr>
+        <w:tc>
+          <w:tcPr>
+            <w:tcW w:type="dxa" w:w="1700"/>
+            <w:tcMar>
+              <w:top w:w="80" w:type="dxa"/>
+              <w:start w:w="120" w:type="dxa"/>
+              <w:bottom w:w="80" w:type="dxa"/>
+              <w:end w:w="120" w:type="dxa"/>
+            </w:tcMar>
+            <w:vAlign w:val="center"/>
+          </w:tcPr>
+          <w:p>
+            <w:pPr>
+              <w:spacing w:before="0" w:after="0" w:line="252" w:lineRule="auto"/>
+            </w:pPr>
+            <w:r/>
+            <w:r>
+              <w:rPr>
+                <w:rFonts w:ascii="Calibri" w:hAnsi="Calibri"/>
+                <w:b w:val="0"/>
+                <w:color w:val="1E1E1E"/>
+                <w:sz w:val="14"/>
+              </w:rPr>
+              <w:t>Фоновый runner</w:t>
+            </w:r>
+          </w:p>
+        </w:tc>
+        <w:tc>
+          <w:tcPr>
+            <w:tcW w:type="dxa" w:w="3300"/>
+            <w:tcMar>
+              <w:top w:w="80" w:type="dxa"/>
+              <w:start w:w="120" w:type="dxa"/>
+              <w:bottom w:w="80" w:type="dxa"/>
+              <w:end w:w="120" w:type="dxa"/>
+            </w:tcMar>
+            <w:vAlign w:val="center"/>
+          </w:tcPr>
+          <w:p>
+            <w:pPr>
+              <w:spacing w:before="0" w:after="0" w:line="252" w:lineRule="auto"/>
+            </w:pPr>
+            <w:r/>
+            <w:r>
+              <w:rPr>
+                <w:rFonts w:ascii="Calibri" w:hAnsi="Calibri"/>
+                <w:b w:val="0"/>
+                <w:color w:val="1E1E1E"/>
+                <w:sz w:val="14"/>
+              </w:rPr>
+              <w:t>Считать тяжелые исторические сверки по расписанию или по ручному запуску без блокировки интерфейса.</w:t>
+            </w:r>
+          </w:p>
+        </w:tc>
+        <w:tc>
+          <w:tcPr>
+            <w:tcW w:type="dxa" w:w="2620"/>
+            <w:tcMar>
+              <w:top w:w="80" w:type="dxa"/>
+              <w:start w:w="120" w:type="dxa"/>
+              <w:bottom w:w="80" w:type="dxa"/>
+              <w:end w:w="120" w:type="dxa"/>
+            </w:tcMar>
+            <w:vAlign w:val="center"/>
+          </w:tcPr>
+          <w:p>
+            <w:pPr>
+              <w:spacing w:before="0" w:after="0" w:line="252" w:lineRule="auto"/>
+            </w:pPr>
+            <w:r/>
+            <w:r>
+              <w:rPr>
+                <w:rFonts w:ascii="Calibri" w:hAnsi="Calibri"/>
+                <w:b w:val="0"/>
+                <w:color w:val="1E1E1E"/>
+                <w:sz w:val="14"/>
+              </w:rPr>
+              <w:t>Те же источники, но в batch-режиме с сохранением снапшота результата.</w:t>
+            </w:r>
+          </w:p>
+        </w:tc>
+        <w:tc>
+          <w:tcPr>
+            <w:tcW w:type="dxa" w:w="1740"/>
+            <w:tcMar>
+              <w:top w:w="80" w:type="dxa"/>
+              <w:start w:w="120" w:type="dxa"/>
+              <w:bottom w:w="80" w:type="dxa"/>
+              <w:end w:w="120" w:type="dxa"/>
+            </w:tcMar>
+            <w:vAlign w:val="center"/>
+          </w:tcPr>
+          <w:p>
+            <w:pPr>
+              <w:spacing w:before="0" w:after="0" w:line="252" w:lineRule="auto"/>
+            </w:pPr>
+            <w:r/>
+            <w:r>
+              <w:rPr>
+                <w:rFonts w:ascii="Calibri" w:hAnsi="Calibri"/>
+                <w:b w:val="0"/>
+                <w:color w:val="1E1E1E"/>
+                <w:sz w:val="14"/>
+              </w:rPr>
+              <w:t>Готовый результат сверки/выгрузки, который открывается из истории запусков.</w:t>
+            </w:r>
+          </w:p>
+        </w:tc>
+      </w:tr>
+    </w:tbl>
+    <w:p>
+      <w:pPr>
+        <w:spacing w:after="40"/>
+      </w:pPr>
+    </w:p>
+    <w:tbl>
+      <w:tblGrid>
+        <w:gridCol w:w="9360"/>
+      </w:tblGrid>
+      <w:tblPr>
+        <w:tblStyle w:val="TableGrid"/>
+        <w:tblW w:type="dxa" w:w="9360"/>
+        <w:tblLayout w:type="fixed"/>
+        <w:tblLook w:firstColumn="1" w:firstRow="1" w:lastColumn="0" w:lastRow="0" w:noHBand="0" w:noVBand="1" w:val="04A0"/>
+        <w:tblInd w:w="120" w:type="dxa"/>
+      </w:tblPr>
+      <w:tr>
+        <w:tc>
+          <w:tcPr>
+            <w:tcW w:type="dxa" w:w="9360"/>
+            <w:tcMar>
+              <w:top w:w="80" w:type="dxa"/>
+              <w:start w:w="120" w:type="dxa"/>
+              <w:bottom w:w="80" w:type="dxa"/>
+              <w:end w:w="120" w:type="dxa"/>
+            </w:tcMar>
+            <w:vAlign w:val="center"/>
+            <w:shd w:fill="FFF1EB"/>
+          </w:tcPr>
+          <w:p>
+            <w:pPr>
+              <w:spacing w:after="60"/>
+            </w:pPr>
+            <w:r/>
+            <w:r>
+              <w:rPr>
+                <w:rFonts w:ascii="Calibri" w:hAnsi="Calibri"/>
+                <w:b/>
+                <w:color w:val="1F4D78"/>
+                <w:sz w:val="20"/>
+              </w:rPr>
+              <w:t>Терминология</w:t>
+            </w:r>
+          </w:p>
+          <w:p>
+            <w:pPr>
+              <w:spacing w:after="0" w:line="288" w:lineRule="auto"/>
+            </w:pPr>
+            <w:r>
+              <w:rPr>
+                <w:rFonts w:ascii="Calibri" w:hAnsi="Calibri"/>
+                <w:color w:val="1E1E1E"/>
+                <w:sz w:val="19"/>
+              </w:rPr>
+              <w:t>`Сальдо по поставкам` - ERP-расчет по выбранным поставкам. `Сверка ERP ↔ 1С` - отдельный процесс сравнения двух систем. Бейдж вида `9/9 ОК` в матрице документов не означает, что сальдо ERP равно сальдо 1С.</w:t>
             </w:r>
           </w:p>
         </w:tc>
@@ -1399,7 +1961,7 @@
           <w:rFonts w:ascii="Calibri" w:hAnsi="Calibri"/>
           <w:sz w:val="20"/>
         </w:rPr>
-        <w:t>Бухгалтер открывает страницу сверки из ERP: из поставки, клиента, договора или общего раздела `Сверки`.</w:t>
+        <w:t>Бухгалтер открывает страницу `Сальдо по поставкам` из ERP: из клиента, договора, поставки или общего раздела.</w:t>
       </w:r>
     </w:p>
     <w:p>
@@ -1412,7 +1974,7 @@
           <w:rFonts w:ascii="Calibri" w:hAnsi="Calibri"/>
           <w:sz w:val="20"/>
         </w:rPr>
-        <w:t>Выбирает клиента, период и при необходимости договор. ERP подтягивает все ЮЛ клиента через `veda_contacts -&gt; veda_clients`.</w:t>
+        <w:t>Выбирает клиента, ЮЛ, договор, период или конкретный набор поставок. ERP считает только выбранный срез, без обращения к 1С.</w:t>
       </w:r>
     </w:p>
     <w:p>
@@ -1425,7 +1987,7 @@
           <w:rFonts w:ascii="Calibri" w:hAnsi="Calibri"/>
           <w:sz w:val="20"/>
         </w:rPr>
-        <w:t>Нажимает `Сверить с 1С`. Backend собирает ERP-срез и вызывает существующие SOAP-методы сервиса 1С.</w:t>
+        <w:t>Экран показывает агрегированную иерархию и ERP-сальдо: счета, оплаты, возмещаемые расходы, невозмещаемые расходы, долг или переплату.</w:t>
       </w:r>
     </w:p>
     <w:p>
@@ -1438,7 +2000,7 @@
           <w:rFonts w:ascii="Calibri" w:hAnsi="Calibri"/>
           <w:sz w:val="20"/>
         </w:rPr>
-        <w:t>ERP нормализует документы в общий формат: тип, дата, номер, код 1С, организация, контрагент, договор, поставка, сумма, НДС, источник.</w:t>
+        <w:t>Кнопка `Выгрузить Excel` формирует бухгалтерскую форму с объединенными ячейками по поставке.</w:t>
       </w:r>
     </w:p>
     <w:p>
@@ -1451,7 +2013,7 @@
           <w:rFonts w:ascii="Calibri" w:hAnsi="Calibri"/>
           <w:sz w:val="20"/>
         </w:rPr>
-        <w:t>Экран показывает агрегированную иерархию и статусы. Документы раскрываются только внутри поставки.</w:t>
+        <w:t>Если бухгалтеру нужна проверка учетных систем, он открывает отдельную страницу `Сверка ERP ↔ 1С`.</w:t>
       </w:r>
     </w:p>
     <w:p>
@@ -1464,7 +2026,7 @@
           <w:rFonts w:ascii="Calibri" w:hAnsi="Calibri"/>
           <w:sz w:val="20"/>
         </w:rPr>
-        <w:t>Кнопка `Ошибки` фильтрует строки с расхождениями и показывает причину, источник и предложенное действие.</w:t>
+        <w:t>На странице сверки выбирает ЮЛ, договор, период и при необходимости поставку; нажимает `Запустить сверку`.</w:t>
       </w:r>
     </w:p>
     <w:p>
@@ -1477,7 +2039,7 @@
           <w:rFonts w:ascii="Calibri" w:hAnsi="Calibri"/>
           <w:sz w:val="20"/>
         </w:rPr>
-        <w:t>Кнопка `Выгрузить Excel` формирует бухгалтерскую форму с объединенными ячейками по спецификации.</w:t>
+        <w:t>Backend создает запуск сверки, собирает ERP-срез, получает 1С-срез через SOAP, сравнивает документы и сальдо, сохраняет протокол.</w:t>
       </w:r>
     </w:p>
     <w:p>
@@ -1490,7 +2052,20 @@
           <w:rFonts w:ascii="Calibri" w:hAnsi="Calibri"/>
           <w:sz w:val="20"/>
         </w:rPr>
-        <w:t>Каждая проверка пишет журнал расхождений для анализа частоты проблем по типам операций и видам ошибок.</w:t>
+        <w:t>Пользователь видит итог: совпало ли сальдо, сколько документов совпало, чего нет в 1С, чего нет в ERP, какие поля расходятся.</w:t>
+      </w:r>
+    </w:p>
+    <w:p>
+      <w:pPr>
+        <w:pStyle w:val="ListNumber"/>
+        <w:spacing w:after="80" w:line="300" w:lineRule="auto"/>
+      </w:pPr>
+      <w:r>
+        <w:rPr>
+          <w:rFonts w:ascii="Calibri" w:hAnsi="Calibri"/>
+          <w:sz w:val="20"/>
+        </w:rPr>
+        <w:t>Фоновые runner-задачи могут запускать тяжелую историческую сверку по расписанию и сохранять результат для просмотра без пересчета на экране.</w:t>
       </w:r>
     </w:p>
     <w:p>
@@ -1662,7 +2237,7 @@
                 <w:color w:val="1E1E1E"/>
                 <w:sz w:val="14"/>
               </w:rPr>
-              <w:t>Страница открывается из раздела сверок, карточки клиента, договора или поставки. В URL допускаются параметры `contact_id`, `client_id`, `dog_id`, `spec_id`, `period`, `limit`, `scope`, `compare_1c`.</w:t>
+              <w:t>Страница `Сальдо по поставкам` открывается из карточки клиента, договора, поставки или общего раздела. В URL допускаются параметры `contact_id`, `client_id`, `dog_id`, `spec_id`, `period`, `limit`, `scope`.</w:t>
             </w:r>
           </w:p>
         </w:tc>
@@ -2077,7 +2652,7 @@
                 <w:color w:val="1E1E1E"/>
                 <w:sz w:val="14"/>
               </w:rPr>
-              <w:t>Система сверяет с 1С через существующий PHP/SOAP-слой, а не через прямой доступ к базе 1С.</w:t>
+              <w:t>Страница `Сверка ERP ↔ 1С` запускается отдельно от матрицы сальдо и работает через существующий PHP/SOAP-слой.</w:t>
             </w:r>
           </w:p>
         </w:tc>
@@ -2104,7 +2679,7 @@
                 <w:color w:val="1E1E1E"/>
                 <w:sz w:val="14"/>
               </w:rPr>
-              <w:t>Для документов возвращаются статусы `ОК`, `Нет в 1С`, `Нет в ERP`, `Сумма расходится`, `Вопрос по НДС`, `Нет СФ/УПД` и другие коды из раздела статусов.</w:t>
+              <w:t>Результат страницы - протокол расхождений, а не бухгалтерская сальдовка по поставкам.</w:t>
             </w:r>
           </w:p>
         </w:tc>
@@ -2160,7 +2735,7 @@
                 <w:color w:val="1E1E1E"/>
                 <w:sz w:val="14"/>
               </w:rPr>
-              <w:t>Кнопка `Ошибки` оставляет на экране строки, у которых есть хотя бы один проблемный статус.</w:t>
+              <w:t>Сверка ERP ↔ 1С возвращает статусы `ОК`, `Нет в 1С`, `Нет в ERP`, `Сумма расходится`, `Вопрос по НДС`, `Нет СФ/УПД`, `Сальдо расходится`, `Ошибка источника`.</w:t>
             </w:r>
           </w:p>
         </w:tc>
@@ -2187,7 +2762,7 @@
                 <w:color w:val="1E1E1E"/>
                 <w:sz w:val="14"/>
               </w:rPr>
-              <w:t>Пользователь видит причину, ERP-значение, 1С-значение и поле расхождения.</w:t>
+              <w:t>Пользователь видит причину, ERP-значение, 1С-значение, поле расхождения и ссылку на исходный документ.</w:t>
             </w:r>
           </w:p>
         </w:tc>
@@ -2409,7 +2984,7 @@
                 <w:color w:val="1E1E1E"/>
                 <w:sz w:val="14"/>
               </w:rPr>
-              <w:t>Каждая сверка пишет журнал запуска и журнал расхождений.</w:t>
+              <w:t>Каждый запуск страницы `Сверка ERP ↔ 1С` пишет журнал запуска и журнал расхождений.</w:t>
             </w:r>
           </w:p>
         </w:tc>
@@ -2437,6 +3012,2138 @@
                 <w:sz w:val="14"/>
               </w:rPr>
               <w:t>По журналу можно посчитать частоту проблем по клиенту, договору, поставке, типу операции и коду ошибки.</w:t>
+            </w:r>
+          </w:p>
+        </w:tc>
+      </w:tr>
+      <w:tr>
+        <w:tc>
+          <w:tcPr>
+            <w:tcW w:type="dxa" w:w="850"/>
+            <w:tcMar>
+              <w:top w:w="80" w:type="dxa"/>
+              <w:start w:w="120" w:type="dxa"/>
+              <w:bottom w:w="80" w:type="dxa"/>
+              <w:end w:w="120" w:type="dxa"/>
+            </w:tcMar>
+            <w:vAlign w:val="center"/>
+          </w:tcPr>
+          <w:p>
+            <w:pPr>
+              <w:spacing w:before="0" w:after="0" w:line="252" w:lineRule="auto"/>
+            </w:pPr>
+            <w:r/>
+            <w:r>
+              <w:rPr>
+                <w:rFonts w:ascii="Calibri" w:hAnsi="Calibri"/>
+                <w:b w:val="0"/>
+                <w:color w:val="1E1E1E"/>
+                <w:sz w:val="14"/>
+              </w:rPr>
+              <w:t>FR-11</w:t>
+            </w:r>
+          </w:p>
+        </w:tc>
+        <w:tc>
+          <w:tcPr>
+            <w:tcW w:type="dxa" w:w="5450"/>
+            <w:tcMar>
+              <w:top w:w="80" w:type="dxa"/>
+              <w:start w:w="120" w:type="dxa"/>
+              <w:bottom w:w="80" w:type="dxa"/>
+              <w:end w:w="120" w:type="dxa"/>
+            </w:tcMar>
+            <w:vAlign w:val="center"/>
+          </w:tcPr>
+          <w:p>
+            <w:pPr>
+              <w:spacing w:before="0" w:after="0" w:line="252" w:lineRule="auto"/>
+            </w:pPr>
+            <w:r/>
+            <w:r>
+              <w:rPr>
+                <w:rFonts w:ascii="Calibri" w:hAnsi="Calibri"/>
+                <w:b w:val="0"/>
+                <w:color w:val="1E1E1E"/>
+                <w:sz w:val="14"/>
+              </w:rPr>
+              <w:t>Runner может выполнять тяжелые сверки по расписанию или вручную в фоне.</w:t>
+            </w:r>
+          </w:p>
+        </w:tc>
+        <w:tc>
+          <w:tcPr>
+            <w:tcW w:type="dxa" w:w="3060"/>
+            <w:tcMar>
+              <w:top w:w="80" w:type="dxa"/>
+              <w:start w:w="120" w:type="dxa"/>
+              <w:bottom w:w="80" w:type="dxa"/>
+              <w:end w:w="120" w:type="dxa"/>
+            </w:tcMar>
+            <w:vAlign w:val="center"/>
+          </w:tcPr>
+          <w:p>
+            <w:pPr>
+              <w:spacing w:before="0" w:after="0" w:line="252" w:lineRule="auto"/>
+            </w:pPr>
+            <w:r/>
+            <w:r>
+              <w:rPr>
+                <w:rFonts w:ascii="Calibri" w:hAnsi="Calibri"/>
+                <w:b w:val="0"/>
+                <w:color w:val="1E1E1E"/>
+                <w:sz w:val="14"/>
+              </w:rPr>
+              <w:t>Пользователь видит историю запусков, статус выполнения, дату актуальности данных и ссылку на результат.</w:t>
+            </w:r>
+          </w:p>
+        </w:tc>
+      </w:tr>
+      <w:tr>
+        <w:tc>
+          <w:tcPr>
+            <w:tcW w:type="dxa" w:w="850"/>
+            <w:tcMar>
+              <w:top w:w="80" w:type="dxa"/>
+              <w:start w:w="120" w:type="dxa"/>
+              <w:bottom w:w="80" w:type="dxa"/>
+              <w:end w:w="120" w:type="dxa"/>
+            </w:tcMar>
+            <w:vAlign w:val="center"/>
+          </w:tcPr>
+          <w:p>
+            <w:pPr>
+              <w:spacing w:before="0" w:after="0" w:line="252" w:lineRule="auto"/>
+            </w:pPr>
+            <w:r/>
+            <w:r>
+              <w:rPr>
+                <w:rFonts w:ascii="Calibri" w:hAnsi="Calibri"/>
+                <w:b w:val="0"/>
+                <w:color w:val="1E1E1E"/>
+                <w:sz w:val="14"/>
+              </w:rPr>
+              <w:t>FR-12</w:t>
+            </w:r>
+          </w:p>
+        </w:tc>
+        <w:tc>
+          <w:tcPr>
+            <w:tcW w:type="dxa" w:w="5450"/>
+            <w:tcMar>
+              <w:top w:w="80" w:type="dxa"/>
+              <w:start w:w="120" w:type="dxa"/>
+              <w:bottom w:w="80" w:type="dxa"/>
+              <w:end w:w="120" w:type="dxa"/>
+            </w:tcMar>
+            <w:vAlign w:val="center"/>
+          </w:tcPr>
+          <w:p>
+            <w:pPr>
+              <w:spacing w:before="0" w:after="0" w:line="252" w:lineRule="auto"/>
+            </w:pPr>
+            <w:r/>
+            <w:r>
+              <w:rPr>
+                <w:rFonts w:ascii="Calibri" w:hAnsi="Calibri"/>
+                <w:b w:val="0"/>
+                <w:color w:val="1E1E1E"/>
+                <w:sz w:val="14"/>
+              </w:rPr>
+              <w:t>Сверка ERP ↔ 1С должна сравнивать не только документы, но и сальдо.</w:t>
+            </w:r>
+          </w:p>
+        </w:tc>
+        <w:tc>
+          <w:tcPr>
+            <w:tcW w:type="dxa" w:w="3060"/>
+            <w:tcMar>
+              <w:top w:w="80" w:type="dxa"/>
+              <w:start w:w="120" w:type="dxa"/>
+              <w:bottom w:w="80" w:type="dxa"/>
+              <w:end w:w="120" w:type="dxa"/>
+            </w:tcMar>
+            <w:vAlign w:val="center"/>
+          </w:tcPr>
+          <w:p>
+            <w:pPr>
+              <w:spacing w:before="0" w:after="0" w:line="252" w:lineRule="auto"/>
+            </w:pPr>
+            <w:r/>
+            <w:r>
+              <w:rPr>
+                <w:rFonts w:ascii="Calibri" w:hAnsi="Calibri"/>
+                <w:b w:val="0"/>
+                <w:color w:val="1E1E1E"/>
+                <w:sz w:val="14"/>
+              </w:rPr>
+              <w:t>Итоговый статус включает начальное сальдо, обороты за период, конечное сальдо и документные расхождения.</w:t>
+            </w:r>
+          </w:p>
+        </w:tc>
+      </w:tr>
+    </w:tbl>
+    <w:p>
+      <w:pPr>
+        <w:spacing w:after="40"/>
+      </w:pPr>
+    </w:p>
+    <w:p>
+      <w:pPr>
+        <w:pStyle w:val="Heading2"/>
+        <w:keepNext/>
+      </w:pPr>
+      <w:r/>
+      <w:r>
+        <w:rPr>
+          <w:rFonts w:ascii="Calibri" w:hAnsi="Calibri"/>
+          <w:b/>
+          <w:color w:val="2E74B5"/>
+          <w:sz w:val="26"/>
+        </w:rPr>
+        <w:t>3.1 Отдельная страница сверки ERP ↔ 1С</w:t>
+      </w:r>
+    </w:p>
+    <w:p>
+      <w:pPr>
+        <w:spacing w:before="0" w:after="120" w:line="300" w:lineRule="auto"/>
+      </w:pPr>
+      <w:r>
+        <w:rPr>
+          <w:rFonts w:ascii="Calibri" w:hAnsi="Calibri"/>
+          <w:color w:val="1E1E1E"/>
+          <w:sz w:val="21"/>
+        </w:rPr>
+        <w:t>Эта страница нужна не для подготовки клиентской Excel-сальдовки, а для контроля качества интеграции и учета: все ли документы ERP выгружены в 1С, нет ли лишних документов в 1С, совпадают ли суммы, реквизиты, НДС и сальдо.</w:t>
+      </w:r>
+    </w:p>
+    <w:tbl>
+      <w:tblGrid>
+        <w:gridCol w:w="2300"/>
+        <w:gridCol w:w="7060"/>
+      </w:tblGrid>
+      <w:tblPr>
+        <w:tblStyle w:val="TableGrid"/>
+        <w:tblW w:type="dxa" w:w="9360"/>
+        <w:tblLayout w:type="fixed"/>
+        <w:tblLook w:firstColumn="1" w:firstRow="1" w:lastColumn="0" w:lastRow="0" w:noHBand="0" w:noVBand="1" w:val="04A0"/>
+        <w:tblInd w:w="120" w:type="dxa"/>
+      </w:tblPr>
+      <w:tr>
+        <w:tc>
+          <w:tcPr>
+            <w:tcW w:type="dxa" w:w="2300"/>
+            <w:tcMar>
+              <w:top w:w="80" w:type="dxa"/>
+              <w:start w:w="120" w:type="dxa"/>
+              <w:bottom w:w="80" w:type="dxa"/>
+              <w:end w:w="120" w:type="dxa"/>
+            </w:tcMar>
+            <w:vAlign w:val="center"/>
+            <w:shd w:fill="E8EEF5"/>
+          </w:tcPr>
+          <w:p>
+            <w:pPr>
+              <w:spacing w:before="0" w:after="0" w:line="252" w:lineRule="auto"/>
+              <w:jc w:val="center"/>
+            </w:pPr>
+            <w:r/>
+            <w:r>
+              <w:rPr>
+                <w:rFonts w:ascii="Calibri" w:hAnsi="Calibri"/>
+                <w:b/>
+                <w:color w:val="1F4D78"/>
+                <w:sz w:val="15"/>
+              </w:rPr>
+              <w:t>Блок страницы</w:t>
+            </w:r>
+          </w:p>
+        </w:tc>
+        <w:tc>
+          <w:tcPr>
+            <w:tcW w:type="dxa" w:w="7060"/>
+            <w:tcMar>
+              <w:top w:w="80" w:type="dxa"/>
+              <w:start w:w="120" w:type="dxa"/>
+              <w:bottom w:w="80" w:type="dxa"/>
+              <w:end w:w="120" w:type="dxa"/>
+            </w:tcMar>
+            <w:vAlign w:val="center"/>
+            <w:shd w:fill="E8EEF5"/>
+          </w:tcPr>
+          <w:p>
+            <w:pPr>
+              <w:spacing w:before="0" w:after="0" w:line="252" w:lineRule="auto"/>
+              <w:jc w:val="center"/>
+            </w:pPr>
+            <w:r/>
+            <w:r>
+              <w:rPr>
+                <w:rFonts w:ascii="Calibri" w:hAnsi="Calibri"/>
+                <w:b/>
+                <w:color w:val="1F4D78"/>
+                <w:sz w:val="15"/>
+              </w:rPr>
+              <w:t>Требование</w:t>
+            </w:r>
+          </w:p>
+        </w:tc>
+      </w:tr>
+      <w:tr>
+        <w:tc>
+          <w:tcPr>
+            <w:tcW w:type="dxa" w:w="2300"/>
+            <w:tcMar>
+              <w:top w:w="80" w:type="dxa"/>
+              <w:start w:w="120" w:type="dxa"/>
+              <w:bottom w:w="80" w:type="dxa"/>
+              <w:end w:w="120" w:type="dxa"/>
+            </w:tcMar>
+            <w:vAlign w:val="center"/>
+          </w:tcPr>
+          <w:p>
+            <w:pPr>
+              <w:spacing w:before="0" w:after="0" w:line="252" w:lineRule="auto"/>
+            </w:pPr>
+            <w:r/>
+            <w:r>
+              <w:rPr>
+                <w:rFonts w:ascii="Calibri" w:hAnsi="Calibri"/>
+                <w:b w:val="0"/>
+                <w:color w:val="1E1E1E"/>
+                <w:sz w:val="15"/>
+              </w:rPr>
+              <w:t>Фильтры запуска</w:t>
+            </w:r>
+          </w:p>
+        </w:tc>
+        <w:tc>
+          <w:tcPr>
+            <w:tcW w:type="dxa" w:w="7060"/>
+            <w:tcMar>
+              <w:top w:w="80" w:type="dxa"/>
+              <w:start w:w="120" w:type="dxa"/>
+              <w:bottom w:w="80" w:type="dxa"/>
+              <w:end w:w="120" w:type="dxa"/>
+            </w:tcMar>
+            <w:vAlign w:val="center"/>
+          </w:tcPr>
+          <w:p>
+            <w:pPr>
+              <w:spacing w:before="0" w:after="0" w:line="252" w:lineRule="auto"/>
+            </w:pPr>
+            <w:r/>
+            <w:r>
+              <w:rPr>
+                <w:rFonts w:ascii="Calibri" w:hAnsi="Calibri"/>
+                <w:b w:val="0"/>
+                <w:color w:val="1E1E1E"/>
+                <w:sz w:val="15"/>
+              </w:rPr>
+              <w:t>ЮЛ, организация, договор, период `date_from/date_to`; опционально поставка или список поставок. Для полноценного акта сверки обязателен непрерывный период, а не произвольный набор поставок.</w:t>
+            </w:r>
+          </w:p>
+        </w:tc>
+      </w:tr>
+      <w:tr>
+        <w:tc>
+          <w:tcPr>
+            <w:tcW w:type="dxa" w:w="2300"/>
+            <w:tcMar>
+              <w:top w:w="80" w:type="dxa"/>
+              <w:start w:w="120" w:type="dxa"/>
+              <w:bottom w:w="80" w:type="dxa"/>
+              <w:end w:w="120" w:type="dxa"/>
+            </w:tcMar>
+            <w:vAlign w:val="center"/>
+          </w:tcPr>
+          <w:p>
+            <w:pPr>
+              <w:spacing w:before="0" w:after="0" w:line="252" w:lineRule="auto"/>
+            </w:pPr>
+            <w:r/>
+            <w:r>
+              <w:rPr>
+                <w:rFonts w:ascii="Calibri" w:hAnsi="Calibri"/>
+                <w:b w:val="0"/>
+                <w:color w:val="1E1E1E"/>
+                <w:sz w:val="15"/>
+              </w:rPr>
+              <w:t>Кнопка запуска</w:t>
+            </w:r>
+          </w:p>
+        </w:tc>
+        <w:tc>
+          <w:tcPr>
+            <w:tcW w:type="dxa" w:w="7060"/>
+            <w:tcMar>
+              <w:top w:w="80" w:type="dxa"/>
+              <w:start w:w="120" w:type="dxa"/>
+              <w:bottom w:w="80" w:type="dxa"/>
+              <w:end w:w="120" w:type="dxa"/>
+            </w:tcMar>
+            <w:vAlign w:val="center"/>
+          </w:tcPr>
+          <w:p>
+            <w:pPr>
+              <w:spacing w:before="0" w:after="0" w:line="252" w:lineRule="auto"/>
+            </w:pPr>
+            <w:r/>
+            <w:r>
+              <w:rPr>
+                <w:rFonts w:ascii="Calibri" w:hAnsi="Calibri"/>
+                <w:b w:val="0"/>
+                <w:color w:val="1E1E1E"/>
+                <w:sz w:val="15"/>
+              </w:rPr>
+              <w:t>`Запустить сверку` создает `run_id`. Если объем малый - расчет синхронный; если период большой или много договоров - фоновая задача.</w:t>
+            </w:r>
+          </w:p>
+        </w:tc>
+      </w:tr>
+      <w:tr>
+        <w:tc>
+          <w:tcPr>
+            <w:tcW w:type="dxa" w:w="2300"/>
+            <w:tcMar>
+              <w:top w:w="80" w:type="dxa"/>
+              <w:start w:w="120" w:type="dxa"/>
+              <w:bottom w:w="80" w:type="dxa"/>
+              <w:end w:w="120" w:type="dxa"/>
+            </w:tcMar>
+            <w:vAlign w:val="center"/>
+          </w:tcPr>
+          <w:p>
+            <w:pPr>
+              <w:spacing w:before="0" w:after="0" w:line="252" w:lineRule="auto"/>
+            </w:pPr>
+            <w:r/>
+            <w:r>
+              <w:rPr>
+                <w:rFonts w:ascii="Calibri" w:hAnsi="Calibri"/>
+                <w:b w:val="0"/>
+                <w:color w:val="1E1E1E"/>
+                <w:sz w:val="15"/>
+              </w:rPr>
+              <w:t>Сводка результата</w:t>
+            </w:r>
+          </w:p>
+        </w:tc>
+        <w:tc>
+          <w:tcPr>
+            <w:tcW w:type="dxa" w:w="7060"/>
+            <w:tcMar>
+              <w:top w:w="80" w:type="dxa"/>
+              <w:start w:w="120" w:type="dxa"/>
+              <w:bottom w:w="80" w:type="dxa"/>
+              <w:end w:w="120" w:type="dxa"/>
+            </w:tcMar>
+            <w:vAlign w:val="center"/>
+          </w:tcPr>
+          <w:p>
+            <w:pPr>
+              <w:spacing w:before="0" w:after="0" w:line="252" w:lineRule="auto"/>
+            </w:pPr>
+            <w:r/>
+            <w:r>
+              <w:rPr>
+                <w:rFonts w:ascii="Calibri" w:hAnsi="Calibri"/>
+                <w:b w:val="0"/>
+                <w:color w:val="1E1E1E"/>
+                <w:sz w:val="15"/>
+              </w:rPr>
+              <w:t>Показать `Сальдо ERP`, `Сальдо 1С`, `Расхождение`, количество документов ERP, количество документов 1С, сколько совпало, сколько отсутствует, сколько расходится.</w:t>
+            </w:r>
+          </w:p>
+        </w:tc>
+      </w:tr>
+      <w:tr>
+        <w:tc>
+          <w:tcPr>
+            <w:tcW w:type="dxa" w:w="2300"/>
+            <w:tcMar>
+              <w:top w:w="80" w:type="dxa"/>
+              <w:start w:w="120" w:type="dxa"/>
+              <w:bottom w:w="80" w:type="dxa"/>
+              <w:end w:w="120" w:type="dxa"/>
+            </w:tcMar>
+            <w:vAlign w:val="center"/>
+          </w:tcPr>
+          <w:p>
+            <w:pPr>
+              <w:spacing w:before="0" w:after="0" w:line="252" w:lineRule="auto"/>
+            </w:pPr>
+            <w:r/>
+            <w:r>
+              <w:rPr>
+                <w:rFonts w:ascii="Calibri" w:hAnsi="Calibri"/>
+                <w:b w:val="0"/>
+                <w:color w:val="1E1E1E"/>
+                <w:sz w:val="15"/>
+              </w:rPr>
+              <w:t>Вкладка `Расхождения`</w:t>
+            </w:r>
+          </w:p>
+        </w:tc>
+        <w:tc>
+          <w:tcPr>
+            <w:tcW w:type="dxa" w:w="7060"/>
+            <w:tcMar>
+              <w:top w:w="80" w:type="dxa"/>
+              <w:start w:w="120" w:type="dxa"/>
+              <w:bottom w:w="80" w:type="dxa"/>
+              <w:end w:w="120" w:type="dxa"/>
+            </w:tcMar>
+            <w:vAlign w:val="center"/>
+          </w:tcPr>
+          <w:p>
+            <w:pPr>
+              <w:spacing w:before="0" w:after="0" w:line="252" w:lineRule="auto"/>
+            </w:pPr>
+            <w:r/>
+            <w:r>
+              <w:rPr>
+                <w:rFonts w:ascii="Calibri" w:hAnsi="Calibri"/>
+                <w:b w:val="0"/>
+                <w:color w:val="1E1E1E"/>
+                <w:sz w:val="15"/>
+              </w:rPr>
+              <w:t>Таблица строк, где есть проблема: тип документа, ERP-документ, 1С-документ, поле расхождения, значение ERP, значение 1С, сумма разницы, действие.</w:t>
+            </w:r>
+          </w:p>
+        </w:tc>
+      </w:tr>
+      <w:tr>
+        <w:tc>
+          <w:tcPr>
+            <w:tcW w:type="dxa" w:w="2300"/>
+            <w:tcMar>
+              <w:top w:w="80" w:type="dxa"/>
+              <w:start w:w="120" w:type="dxa"/>
+              <w:bottom w:w="80" w:type="dxa"/>
+              <w:end w:w="120" w:type="dxa"/>
+            </w:tcMar>
+            <w:vAlign w:val="center"/>
+          </w:tcPr>
+          <w:p>
+            <w:pPr>
+              <w:spacing w:before="0" w:after="0" w:line="252" w:lineRule="auto"/>
+            </w:pPr>
+            <w:r/>
+            <w:r>
+              <w:rPr>
+                <w:rFonts w:ascii="Calibri" w:hAnsi="Calibri"/>
+                <w:b w:val="0"/>
+                <w:color w:val="1E1E1E"/>
+                <w:sz w:val="15"/>
+              </w:rPr>
+              <w:t>Вкладка `ERP без 1С`</w:t>
+            </w:r>
+          </w:p>
+        </w:tc>
+        <w:tc>
+          <w:tcPr>
+            <w:tcW w:type="dxa" w:w="7060"/>
+            <w:tcMar>
+              <w:top w:w="80" w:type="dxa"/>
+              <w:start w:w="120" w:type="dxa"/>
+              <w:bottom w:w="80" w:type="dxa"/>
+              <w:end w:w="120" w:type="dxa"/>
+            </w:tcMar>
+            <w:vAlign w:val="center"/>
+          </w:tcPr>
+          <w:p>
+            <w:pPr>
+              <w:spacing w:before="0" w:after="0" w:line="252" w:lineRule="auto"/>
+            </w:pPr>
+            <w:r/>
+            <w:r>
+              <w:rPr>
+                <w:rFonts w:ascii="Calibri" w:hAnsi="Calibri"/>
+                <w:b w:val="0"/>
+                <w:color w:val="1E1E1E"/>
+                <w:sz w:val="15"/>
+              </w:rPr>
+              <w:t>Документы, которые есть в ERP и должны быть в 1С, но не найдены: счет, оплата, акт, УПД/СФ, договор/поставка.</w:t>
+            </w:r>
+          </w:p>
+        </w:tc>
+      </w:tr>
+      <w:tr>
+        <w:tc>
+          <w:tcPr>
+            <w:tcW w:type="dxa" w:w="2300"/>
+            <w:tcMar>
+              <w:top w:w="80" w:type="dxa"/>
+              <w:start w:w="120" w:type="dxa"/>
+              <w:bottom w:w="80" w:type="dxa"/>
+              <w:end w:w="120" w:type="dxa"/>
+            </w:tcMar>
+            <w:vAlign w:val="center"/>
+          </w:tcPr>
+          <w:p>
+            <w:pPr>
+              <w:spacing w:before="0" w:after="0" w:line="252" w:lineRule="auto"/>
+            </w:pPr>
+            <w:r/>
+            <w:r>
+              <w:rPr>
+                <w:rFonts w:ascii="Calibri" w:hAnsi="Calibri"/>
+                <w:b w:val="0"/>
+                <w:color w:val="1E1E1E"/>
+                <w:sz w:val="15"/>
+              </w:rPr>
+              <w:t>Вкладка `1С без ERP`</w:t>
+            </w:r>
+          </w:p>
+        </w:tc>
+        <w:tc>
+          <w:tcPr>
+            <w:tcW w:type="dxa" w:w="7060"/>
+            <w:tcMar>
+              <w:top w:w="80" w:type="dxa"/>
+              <w:start w:w="120" w:type="dxa"/>
+              <w:bottom w:w="80" w:type="dxa"/>
+              <w:end w:w="120" w:type="dxa"/>
+            </w:tcMar>
+            <w:vAlign w:val="center"/>
+          </w:tcPr>
+          <w:p>
+            <w:pPr>
+              <w:spacing w:before="0" w:after="0" w:line="252" w:lineRule="auto"/>
+            </w:pPr>
+            <w:r/>
+            <w:r>
+              <w:rPr>
+                <w:rFonts w:ascii="Calibri" w:hAnsi="Calibri"/>
+                <w:b w:val="0"/>
+                <w:color w:val="1E1E1E"/>
+                <w:sz w:val="15"/>
+              </w:rPr>
+              <w:t>Документы, которые вернула 1С, но ERP-аналог не найден. Это обязательный блок: без него сверка односторонняя.</w:t>
+            </w:r>
+          </w:p>
+        </w:tc>
+      </w:tr>
+      <w:tr>
+        <w:tc>
+          <w:tcPr>
+            <w:tcW w:type="dxa" w:w="2300"/>
+            <w:tcMar>
+              <w:top w:w="80" w:type="dxa"/>
+              <w:start w:w="120" w:type="dxa"/>
+              <w:bottom w:w="80" w:type="dxa"/>
+              <w:end w:w="120" w:type="dxa"/>
+            </w:tcMar>
+            <w:vAlign w:val="center"/>
+          </w:tcPr>
+          <w:p>
+            <w:pPr>
+              <w:spacing w:before="0" w:after="0" w:line="252" w:lineRule="auto"/>
+            </w:pPr>
+            <w:r/>
+            <w:r>
+              <w:rPr>
+                <w:rFonts w:ascii="Calibri" w:hAnsi="Calibri"/>
+                <w:b w:val="0"/>
+                <w:color w:val="1E1E1E"/>
+                <w:sz w:val="15"/>
+              </w:rPr>
+              <w:t>Вкладка `Сальдо`</w:t>
+            </w:r>
+          </w:p>
+        </w:tc>
+        <w:tc>
+          <w:tcPr>
+            <w:tcW w:type="dxa" w:w="7060"/>
+            <w:tcMar>
+              <w:top w:w="80" w:type="dxa"/>
+              <w:start w:w="120" w:type="dxa"/>
+              <w:bottom w:w="80" w:type="dxa"/>
+              <w:end w:w="120" w:type="dxa"/>
+            </w:tcMar>
+            <w:vAlign w:val="center"/>
+          </w:tcPr>
+          <w:p>
+            <w:pPr>
+              <w:spacing w:before="0" w:after="0" w:line="252" w:lineRule="auto"/>
+            </w:pPr>
+            <w:r/>
+            <w:r>
+              <w:rPr>
+                <w:rFonts w:ascii="Calibri" w:hAnsi="Calibri"/>
+                <w:b w:val="0"/>
+                <w:color w:val="1E1E1E"/>
+                <w:sz w:val="15"/>
+              </w:rPr>
+              <w:t>Начальное сальдо ERP/1С, обороты ERP/1С, конечное сальдо ERP/1С. Если выбран произвольный набор поставок, вместо акта показывать предупреждение: `Нельзя рассчитать начальное сальдо для произвольного набора поставок`.</w:t>
+            </w:r>
+          </w:p>
+        </w:tc>
+      </w:tr>
+      <w:tr>
+        <w:tc>
+          <w:tcPr>
+            <w:tcW w:type="dxa" w:w="2300"/>
+            <w:tcMar>
+              <w:top w:w="80" w:type="dxa"/>
+              <w:start w:w="120" w:type="dxa"/>
+              <w:bottom w:w="80" w:type="dxa"/>
+              <w:end w:w="120" w:type="dxa"/>
+            </w:tcMar>
+            <w:vAlign w:val="center"/>
+          </w:tcPr>
+          <w:p>
+            <w:pPr>
+              <w:spacing w:before="0" w:after="0" w:line="252" w:lineRule="auto"/>
+            </w:pPr>
+            <w:r/>
+            <w:r>
+              <w:rPr>
+                <w:rFonts w:ascii="Calibri" w:hAnsi="Calibri"/>
+                <w:b w:val="0"/>
+                <w:color w:val="1E1E1E"/>
+                <w:sz w:val="15"/>
+              </w:rPr>
+              <w:t>История запусков</w:t>
+            </w:r>
+          </w:p>
+        </w:tc>
+        <w:tc>
+          <w:tcPr>
+            <w:tcW w:type="dxa" w:w="7060"/>
+            <w:tcMar>
+              <w:top w:w="80" w:type="dxa"/>
+              <w:start w:w="120" w:type="dxa"/>
+              <w:bottom w:w="80" w:type="dxa"/>
+              <w:end w:w="120" w:type="dxa"/>
+            </w:tcMar>
+            <w:vAlign w:val="center"/>
+          </w:tcPr>
+          <w:p>
+            <w:pPr>
+              <w:spacing w:before="0" w:after="0" w:line="252" w:lineRule="auto"/>
+            </w:pPr>
+            <w:r/>
+            <w:r>
+              <w:rPr>
+                <w:rFonts w:ascii="Calibri" w:hAnsi="Calibri"/>
+                <w:b w:val="0"/>
+                <w:color w:val="1E1E1E"/>
+                <w:sz w:val="15"/>
+              </w:rPr>
+              <w:t>Список запусков с параметрами, временем, пользователем, статусом, длительностью, количеством расхождений и ссылкой на результат.</w:t>
+            </w:r>
+          </w:p>
+        </w:tc>
+      </w:tr>
+    </w:tbl>
+    <w:p>
+      <w:pPr>
+        <w:spacing w:after="40"/>
+      </w:pPr>
+    </w:p>
+    <w:tbl>
+      <w:tblGrid>
+        <w:gridCol w:w="1500"/>
+        <w:gridCol w:w="2520"/>
+        <w:gridCol w:w="2300"/>
+        <w:gridCol w:w="3040"/>
+      </w:tblGrid>
+      <w:tblPr>
+        <w:tblStyle w:val="TableGrid"/>
+        <w:tblW w:type="dxa" w:w="9360"/>
+        <w:tblLayout w:type="fixed"/>
+        <w:tblLook w:firstColumn="1" w:firstRow="1" w:lastColumn="0" w:lastRow="0" w:noHBand="0" w:noVBand="1" w:val="04A0"/>
+        <w:tblInd w:w="120" w:type="dxa"/>
+      </w:tblPr>
+      <w:tr>
+        <w:tc>
+          <w:tcPr>
+            <w:tcW w:type="dxa" w:w="1500"/>
+            <w:tcMar>
+              <w:top w:w="80" w:type="dxa"/>
+              <w:start w:w="120" w:type="dxa"/>
+              <w:bottom w:w="80" w:type="dxa"/>
+              <w:end w:w="120" w:type="dxa"/>
+            </w:tcMar>
+            <w:vAlign w:val="center"/>
+            <w:shd w:fill="E8EEF5"/>
+          </w:tcPr>
+          <w:p>
+            <w:pPr>
+              <w:spacing w:before="0" w:after="0" w:line="252" w:lineRule="auto"/>
+              <w:jc w:val="center"/>
+            </w:pPr>
+            <w:r/>
+            <w:r>
+              <w:rPr>
+                <w:rFonts w:ascii="Calibri" w:hAnsi="Calibri"/>
+                <w:b/>
+                <w:color w:val="1F4D78"/>
+                <w:sz w:val="14"/>
+              </w:rPr>
+              <w:t>Что сравниваем</w:t>
+            </w:r>
+          </w:p>
+        </w:tc>
+        <w:tc>
+          <w:tcPr>
+            <w:tcW w:type="dxa" w:w="2520"/>
+            <w:tcMar>
+              <w:top w:w="80" w:type="dxa"/>
+              <w:start w:w="120" w:type="dxa"/>
+              <w:bottom w:w="80" w:type="dxa"/>
+              <w:end w:w="120" w:type="dxa"/>
+            </w:tcMar>
+            <w:vAlign w:val="center"/>
+            <w:shd w:fill="E8EEF5"/>
+          </w:tcPr>
+          <w:p>
+            <w:pPr>
+              <w:spacing w:before="0" w:after="0" w:line="252" w:lineRule="auto"/>
+              <w:jc w:val="center"/>
+            </w:pPr>
+            <w:r/>
+            <w:r>
+              <w:rPr>
+                <w:rFonts w:ascii="Calibri" w:hAnsi="Calibri"/>
+                <w:b/>
+                <w:color w:val="1F4D78"/>
+                <w:sz w:val="14"/>
+              </w:rPr>
+              <w:t>ERP-сторона</w:t>
+            </w:r>
+          </w:p>
+        </w:tc>
+        <w:tc>
+          <w:tcPr>
+            <w:tcW w:type="dxa" w:w="2300"/>
+            <w:tcMar>
+              <w:top w:w="80" w:type="dxa"/>
+              <w:start w:w="120" w:type="dxa"/>
+              <w:bottom w:w="80" w:type="dxa"/>
+              <w:end w:w="120" w:type="dxa"/>
+            </w:tcMar>
+            <w:vAlign w:val="center"/>
+            <w:shd w:fill="E8EEF5"/>
+          </w:tcPr>
+          <w:p>
+            <w:pPr>
+              <w:spacing w:before="0" w:after="0" w:line="252" w:lineRule="auto"/>
+              <w:jc w:val="center"/>
+            </w:pPr>
+            <w:r/>
+            <w:r>
+              <w:rPr>
+                <w:rFonts w:ascii="Calibri" w:hAnsi="Calibri"/>
+                <w:b/>
+                <w:color w:val="1F4D78"/>
+                <w:sz w:val="14"/>
+              </w:rPr>
+              <w:t>1С-сторона</w:t>
+            </w:r>
+          </w:p>
+        </w:tc>
+        <w:tc>
+          <w:tcPr>
+            <w:tcW w:type="dxa" w:w="3040"/>
+            <w:tcMar>
+              <w:top w:w="80" w:type="dxa"/>
+              <w:start w:w="120" w:type="dxa"/>
+              <w:bottom w:w="80" w:type="dxa"/>
+              <w:end w:w="120" w:type="dxa"/>
+            </w:tcMar>
+            <w:vAlign w:val="center"/>
+            <w:shd w:fill="E8EEF5"/>
+          </w:tcPr>
+          <w:p>
+            <w:pPr>
+              <w:spacing w:before="0" w:after="0" w:line="252" w:lineRule="auto"/>
+              <w:jc w:val="center"/>
+            </w:pPr>
+            <w:r/>
+            <w:r>
+              <w:rPr>
+                <w:rFonts w:ascii="Calibri" w:hAnsi="Calibri"/>
+                <w:b/>
+                <w:color w:val="1F4D78"/>
+                <w:sz w:val="14"/>
+              </w:rPr>
+              <w:t>Статус при расхождении</w:t>
+            </w:r>
+          </w:p>
+        </w:tc>
+      </w:tr>
+      <w:tr>
+        <w:tc>
+          <w:tcPr>
+            <w:tcW w:type="dxa" w:w="1500"/>
+            <w:tcMar>
+              <w:top w:w="80" w:type="dxa"/>
+              <w:start w:w="120" w:type="dxa"/>
+              <w:bottom w:w="80" w:type="dxa"/>
+              <w:end w:w="120" w:type="dxa"/>
+            </w:tcMar>
+            <w:vAlign w:val="center"/>
+          </w:tcPr>
+          <w:p>
+            <w:pPr>
+              <w:spacing w:before="0" w:after="0" w:line="252" w:lineRule="auto"/>
+            </w:pPr>
+            <w:r/>
+            <w:r>
+              <w:rPr>
+                <w:rFonts w:ascii="Calibri" w:hAnsi="Calibri"/>
+                <w:b w:val="0"/>
+                <w:color w:val="1E1E1E"/>
+                <w:sz w:val="14"/>
+              </w:rPr>
+              <w:t>Начальное сальдо</w:t>
+            </w:r>
+          </w:p>
+        </w:tc>
+        <w:tc>
+          <w:tcPr>
+            <w:tcW w:type="dxa" w:w="2520"/>
+            <w:tcMar>
+              <w:top w:w="80" w:type="dxa"/>
+              <w:start w:w="120" w:type="dxa"/>
+              <w:bottom w:w="80" w:type="dxa"/>
+              <w:end w:w="120" w:type="dxa"/>
+            </w:tcMar>
+            <w:vAlign w:val="center"/>
+          </w:tcPr>
+          <w:p>
+            <w:pPr>
+              <w:spacing w:before="0" w:after="0" w:line="252" w:lineRule="auto"/>
+            </w:pPr>
+            <w:r/>
+            <w:r>
+              <w:rPr>
+                <w:rFonts w:ascii="Calibri" w:hAnsi="Calibri"/>
+                <w:b w:val="0"/>
+                <w:color w:val="1E1E1E"/>
+                <w:sz w:val="14"/>
+              </w:rPr>
+              <w:t>ERP-оборотка до `date_from` по ЮЛ/договору</w:t>
+            </w:r>
+          </w:p>
+        </w:tc>
+        <w:tc>
+          <w:tcPr>
+            <w:tcW w:type="dxa" w:w="2300"/>
+            <w:tcMar>
+              <w:top w:w="80" w:type="dxa"/>
+              <w:start w:w="120" w:type="dxa"/>
+              <w:bottom w:w="80" w:type="dxa"/>
+              <w:end w:w="120" w:type="dxa"/>
+            </w:tcMar>
+            <w:vAlign w:val="center"/>
+          </w:tcPr>
+          <w:p>
+            <w:pPr>
+              <w:spacing w:before="0" w:after="0" w:line="252" w:lineRule="auto"/>
+            </w:pPr>
+            <w:r/>
+            <w:r>
+              <w:rPr>
+                <w:rFonts w:ascii="Calibri" w:hAnsi="Calibri"/>
+                <w:b w:val="0"/>
+                <w:color w:val="1E1E1E"/>
+                <w:sz w:val="14"/>
+              </w:rPr>
+              <w:t>1С-сальдо на начало периода</w:t>
+            </w:r>
+          </w:p>
+        </w:tc>
+        <w:tc>
+          <w:tcPr>
+            <w:tcW w:type="dxa" w:w="3040"/>
+            <w:tcMar>
+              <w:top w:w="80" w:type="dxa"/>
+              <w:start w:w="120" w:type="dxa"/>
+              <w:bottom w:w="80" w:type="dxa"/>
+              <w:end w:w="120" w:type="dxa"/>
+            </w:tcMar>
+            <w:vAlign w:val="center"/>
+          </w:tcPr>
+          <w:p>
+            <w:pPr>
+              <w:spacing w:before="0" w:after="0" w:line="252" w:lineRule="auto"/>
+            </w:pPr>
+            <w:r/>
+            <w:r>
+              <w:rPr>
+                <w:rFonts w:ascii="Calibri" w:hAnsi="Calibri"/>
+                <w:b w:val="0"/>
+                <w:color w:val="1E1E1E"/>
+                <w:sz w:val="14"/>
+              </w:rPr>
+              <w:t>`OPENING_BALANCE_MISMATCH`</w:t>
+            </w:r>
+          </w:p>
+        </w:tc>
+      </w:tr>
+      <w:tr>
+        <w:tc>
+          <w:tcPr>
+            <w:tcW w:type="dxa" w:w="1500"/>
+            <w:tcMar>
+              <w:top w:w="80" w:type="dxa"/>
+              <w:start w:w="120" w:type="dxa"/>
+              <w:bottom w:w="80" w:type="dxa"/>
+              <w:end w:w="120" w:type="dxa"/>
+            </w:tcMar>
+            <w:vAlign w:val="center"/>
+          </w:tcPr>
+          <w:p>
+            <w:pPr>
+              <w:spacing w:before="0" w:after="0" w:line="252" w:lineRule="auto"/>
+            </w:pPr>
+            <w:r/>
+            <w:r>
+              <w:rPr>
+                <w:rFonts w:ascii="Calibri" w:hAnsi="Calibri"/>
+                <w:b w:val="0"/>
+                <w:color w:val="1E1E1E"/>
+                <w:sz w:val="14"/>
+              </w:rPr>
+              <w:t>Обороты периода</w:t>
+            </w:r>
+          </w:p>
+        </w:tc>
+        <w:tc>
+          <w:tcPr>
+            <w:tcW w:type="dxa" w:w="2520"/>
+            <w:tcMar>
+              <w:top w:w="80" w:type="dxa"/>
+              <w:start w:w="120" w:type="dxa"/>
+              <w:bottom w:w="80" w:type="dxa"/>
+              <w:end w:w="120" w:type="dxa"/>
+            </w:tcMar>
+            <w:vAlign w:val="center"/>
+          </w:tcPr>
+          <w:p>
+            <w:pPr>
+              <w:spacing w:before="0" w:after="0" w:line="252" w:lineRule="auto"/>
+            </w:pPr>
+            <w:r/>
+            <w:r>
+              <w:rPr>
+                <w:rFonts w:ascii="Calibri" w:hAnsi="Calibri"/>
+                <w:b w:val="0"/>
+                <w:color w:val="1E1E1E"/>
+                <w:sz w:val="14"/>
+              </w:rPr>
+              <w:t>ERP-документы и движения за период</w:t>
+            </w:r>
+          </w:p>
+        </w:tc>
+        <w:tc>
+          <w:tcPr>
+            <w:tcW w:type="dxa" w:w="2300"/>
+            <w:tcMar>
+              <w:top w:w="80" w:type="dxa"/>
+              <w:start w:w="120" w:type="dxa"/>
+              <w:bottom w:w="80" w:type="dxa"/>
+              <w:end w:w="120" w:type="dxa"/>
+            </w:tcMar>
+            <w:vAlign w:val="center"/>
+          </w:tcPr>
+          <w:p>
+            <w:pPr>
+              <w:spacing w:before="0" w:after="0" w:line="252" w:lineRule="auto"/>
+            </w:pPr>
+            <w:r/>
+            <w:r>
+              <w:rPr>
+                <w:rFonts w:ascii="Calibri" w:hAnsi="Calibri"/>
+                <w:b w:val="0"/>
+                <w:color w:val="1E1E1E"/>
+                <w:sz w:val="14"/>
+              </w:rPr>
+              <w:t>1С-документы и движения за период</w:t>
+            </w:r>
+          </w:p>
+        </w:tc>
+        <w:tc>
+          <w:tcPr>
+            <w:tcW w:type="dxa" w:w="3040"/>
+            <w:tcMar>
+              <w:top w:w="80" w:type="dxa"/>
+              <w:start w:w="120" w:type="dxa"/>
+              <w:bottom w:w="80" w:type="dxa"/>
+              <w:end w:w="120" w:type="dxa"/>
+            </w:tcMar>
+            <w:vAlign w:val="center"/>
+          </w:tcPr>
+          <w:p>
+            <w:pPr>
+              <w:spacing w:before="0" w:after="0" w:line="252" w:lineRule="auto"/>
+            </w:pPr>
+            <w:r/>
+            <w:r>
+              <w:rPr>
+                <w:rFonts w:ascii="Calibri" w:hAnsi="Calibri"/>
+                <w:b w:val="0"/>
+                <w:color w:val="1E1E1E"/>
+                <w:sz w:val="14"/>
+              </w:rPr>
+              <w:t>`TURNOVER_MISMATCH`</w:t>
+            </w:r>
+          </w:p>
+        </w:tc>
+      </w:tr>
+      <w:tr>
+        <w:tc>
+          <w:tcPr>
+            <w:tcW w:type="dxa" w:w="1500"/>
+            <w:tcMar>
+              <w:top w:w="80" w:type="dxa"/>
+              <w:start w:w="120" w:type="dxa"/>
+              <w:bottom w:w="80" w:type="dxa"/>
+              <w:end w:w="120" w:type="dxa"/>
+            </w:tcMar>
+            <w:vAlign w:val="center"/>
+          </w:tcPr>
+          <w:p>
+            <w:pPr>
+              <w:spacing w:before="0" w:after="0" w:line="252" w:lineRule="auto"/>
+            </w:pPr>
+            <w:r/>
+            <w:r>
+              <w:rPr>
+                <w:rFonts w:ascii="Calibri" w:hAnsi="Calibri"/>
+                <w:b w:val="0"/>
+                <w:color w:val="1E1E1E"/>
+                <w:sz w:val="14"/>
+              </w:rPr>
+              <w:t>Конечное сальдо</w:t>
+            </w:r>
+          </w:p>
+        </w:tc>
+        <w:tc>
+          <w:tcPr>
+            <w:tcW w:type="dxa" w:w="2520"/>
+            <w:tcMar>
+              <w:top w:w="80" w:type="dxa"/>
+              <w:start w:w="120" w:type="dxa"/>
+              <w:bottom w:w="80" w:type="dxa"/>
+              <w:end w:w="120" w:type="dxa"/>
+            </w:tcMar>
+            <w:vAlign w:val="center"/>
+          </w:tcPr>
+          <w:p>
+            <w:pPr>
+              <w:spacing w:before="0" w:after="0" w:line="252" w:lineRule="auto"/>
+            </w:pPr>
+            <w:r/>
+            <w:r>
+              <w:rPr>
+                <w:rFonts w:ascii="Calibri" w:hAnsi="Calibri"/>
+                <w:b w:val="0"/>
+                <w:color w:val="1E1E1E"/>
+                <w:sz w:val="14"/>
+              </w:rPr>
+              <w:t>начальное ERP + обороты ERP</w:t>
+            </w:r>
+          </w:p>
+        </w:tc>
+        <w:tc>
+          <w:tcPr>
+            <w:tcW w:type="dxa" w:w="2300"/>
+            <w:tcMar>
+              <w:top w:w="80" w:type="dxa"/>
+              <w:start w:w="120" w:type="dxa"/>
+              <w:bottom w:w="80" w:type="dxa"/>
+              <w:end w:w="120" w:type="dxa"/>
+            </w:tcMar>
+            <w:vAlign w:val="center"/>
+          </w:tcPr>
+          <w:p>
+            <w:pPr>
+              <w:spacing w:before="0" w:after="0" w:line="252" w:lineRule="auto"/>
+            </w:pPr>
+            <w:r/>
+            <w:r>
+              <w:rPr>
+                <w:rFonts w:ascii="Calibri" w:hAnsi="Calibri"/>
+                <w:b w:val="0"/>
+                <w:color w:val="1E1E1E"/>
+                <w:sz w:val="14"/>
+              </w:rPr>
+              <w:t>начальное 1С + обороты 1С</w:t>
+            </w:r>
+          </w:p>
+        </w:tc>
+        <w:tc>
+          <w:tcPr>
+            <w:tcW w:type="dxa" w:w="3040"/>
+            <w:tcMar>
+              <w:top w:w="80" w:type="dxa"/>
+              <w:start w:w="120" w:type="dxa"/>
+              <w:bottom w:w="80" w:type="dxa"/>
+              <w:end w:w="120" w:type="dxa"/>
+            </w:tcMar>
+            <w:vAlign w:val="center"/>
+          </w:tcPr>
+          <w:p>
+            <w:pPr>
+              <w:spacing w:before="0" w:after="0" w:line="252" w:lineRule="auto"/>
+            </w:pPr>
+            <w:r/>
+            <w:r>
+              <w:rPr>
+                <w:rFonts w:ascii="Calibri" w:hAnsi="Calibri"/>
+                <w:b w:val="0"/>
+                <w:color w:val="1E1E1E"/>
+                <w:sz w:val="14"/>
+              </w:rPr>
+              <w:t>`CLOSING_BALANCE_MISMATCH`</w:t>
+            </w:r>
+          </w:p>
+        </w:tc>
+      </w:tr>
+      <w:tr>
+        <w:tc>
+          <w:tcPr>
+            <w:tcW w:type="dxa" w:w="1500"/>
+            <w:tcMar>
+              <w:top w:w="80" w:type="dxa"/>
+              <w:start w:w="120" w:type="dxa"/>
+              <w:bottom w:w="80" w:type="dxa"/>
+              <w:end w:w="120" w:type="dxa"/>
+            </w:tcMar>
+            <w:vAlign w:val="center"/>
+          </w:tcPr>
+          <w:p>
+            <w:pPr>
+              <w:spacing w:before="0" w:after="0" w:line="252" w:lineRule="auto"/>
+            </w:pPr>
+            <w:r/>
+            <w:r>
+              <w:rPr>
+                <w:rFonts w:ascii="Calibri" w:hAnsi="Calibri"/>
+                <w:b w:val="0"/>
+                <w:color w:val="1E1E1E"/>
+                <w:sz w:val="14"/>
+              </w:rPr>
+              <w:t>Счет покупателю</w:t>
+            </w:r>
+          </w:p>
+        </w:tc>
+        <w:tc>
+          <w:tcPr>
+            <w:tcW w:type="dxa" w:w="2520"/>
+            <w:tcMar>
+              <w:top w:w="80" w:type="dxa"/>
+              <w:start w:w="120" w:type="dxa"/>
+              <w:bottom w:w="80" w:type="dxa"/>
+              <w:end w:w="120" w:type="dxa"/>
+            </w:tcMar>
+            <w:vAlign w:val="center"/>
+          </w:tcPr>
+          <w:p>
+            <w:pPr>
+              <w:spacing w:before="0" w:after="0" w:line="252" w:lineRule="auto"/>
+            </w:pPr>
+            <w:r/>
+            <w:r>
+              <w:rPr>
+                <w:rFonts w:ascii="Calibri" w:hAnsi="Calibri"/>
+                <w:b w:val="0"/>
+                <w:color w:val="1E1E1E"/>
+                <w:sz w:val="14"/>
+              </w:rPr>
+              <w:t>`veda_schets` покупателя</w:t>
+            </w:r>
+          </w:p>
+        </w:tc>
+        <w:tc>
+          <w:tcPr>
+            <w:tcW w:type="dxa" w:w="2300"/>
+            <w:tcMar>
+              <w:top w:w="80" w:type="dxa"/>
+              <w:start w:w="120" w:type="dxa"/>
+              <w:bottom w:w="80" w:type="dxa"/>
+              <w:end w:w="120" w:type="dxa"/>
+            </w:tcMar>
+            <w:vAlign w:val="center"/>
+          </w:tcPr>
+          <w:p>
+            <w:pPr>
+              <w:spacing w:before="0" w:after="0" w:line="252" w:lineRule="auto"/>
+            </w:pPr>
+            <w:r/>
+            <w:r>
+              <w:rPr>
+                <w:rFonts w:ascii="Calibri" w:hAnsi="Calibri"/>
+                <w:b w:val="0"/>
+                <w:color w:val="1E1E1E"/>
+                <w:sz w:val="14"/>
+              </w:rPr>
+              <w:t>1С счет покупателю</w:t>
+            </w:r>
+          </w:p>
+        </w:tc>
+        <w:tc>
+          <w:tcPr>
+            <w:tcW w:type="dxa" w:w="3040"/>
+            <w:tcMar>
+              <w:top w:w="80" w:type="dxa"/>
+              <w:start w:w="120" w:type="dxa"/>
+              <w:bottom w:w="80" w:type="dxa"/>
+              <w:end w:w="120" w:type="dxa"/>
+            </w:tcMar>
+            <w:vAlign w:val="center"/>
+          </w:tcPr>
+          <w:p>
+            <w:pPr>
+              <w:spacing w:before="0" w:after="0" w:line="252" w:lineRule="auto"/>
+            </w:pPr>
+            <w:r/>
+            <w:r>
+              <w:rPr>
+                <w:rFonts w:ascii="Calibri" w:hAnsi="Calibri"/>
+                <w:b w:val="0"/>
+                <w:color w:val="1E1E1E"/>
+                <w:sz w:val="14"/>
+              </w:rPr>
+              <w:t>`MISSING_1C`, `MISSING_ERP`, `AMOUNT_MISMATCH`, `DATE_MISMATCH`</w:t>
+            </w:r>
+          </w:p>
+        </w:tc>
+      </w:tr>
+      <w:tr>
+        <w:tc>
+          <w:tcPr>
+            <w:tcW w:type="dxa" w:w="1500"/>
+            <w:tcMar>
+              <w:top w:w="80" w:type="dxa"/>
+              <w:start w:w="120" w:type="dxa"/>
+              <w:bottom w:w="80" w:type="dxa"/>
+              <w:end w:w="120" w:type="dxa"/>
+            </w:tcMar>
+            <w:vAlign w:val="center"/>
+          </w:tcPr>
+          <w:p>
+            <w:pPr>
+              <w:spacing w:before="0" w:after="0" w:line="252" w:lineRule="auto"/>
+            </w:pPr>
+            <w:r/>
+            <w:r>
+              <w:rPr>
+                <w:rFonts w:ascii="Calibri" w:hAnsi="Calibri"/>
+                <w:b w:val="0"/>
+                <w:color w:val="1E1E1E"/>
+                <w:sz w:val="14"/>
+              </w:rPr>
+              <w:t>Оплата</w:t>
+            </w:r>
+          </w:p>
+        </w:tc>
+        <w:tc>
+          <w:tcPr>
+            <w:tcW w:type="dxa" w:w="2520"/>
+            <w:tcMar>
+              <w:top w:w="80" w:type="dxa"/>
+              <w:start w:w="120" w:type="dxa"/>
+              <w:bottom w:w="80" w:type="dxa"/>
+              <w:end w:w="120" w:type="dxa"/>
+            </w:tcMar>
+            <w:vAlign w:val="center"/>
+          </w:tcPr>
+          <w:p>
+            <w:pPr>
+              <w:spacing w:before="0" w:after="0" w:line="252" w:lineRule="auto"/>
+            </w:pPr>
+            <w:r/>
+            <w:r>
+              <w:rPr>
+                <w:rFonts w:ascii="Calibri" w:hAnsi="Calibri"/>
+                <w:b w:val="0"/>
+                <w:color w:val="1E1E1E"/>
+                <w:sz w:val="14"/>
+              </w:rPr>
+              <w:t>`veda_acchist_docs.f_clssum` + банковский документ</w:t>
+            </w:r>
+          </w:p>
+        </w:tc>
+        <w:tc>
+          <w:tcPr>
+            <w:tcW w:type="dxa" w:w="2300"/>
+            <w:tcMar>
+              <w:top w:w="80" w:type="dxa"/>
+              <w:start w:w="120" w:type="dxa"/>
+              <w:bottom w:w="80" w:type="dxa"/>
+              <w:end w:w="120" w:type="dxa"/>
+            </w:tcMar>
+            <w:vAlign w:val="center"/>
+          </w:tcPr>
+          <w:p>
+            <w:pPr>
+              <w:spacing w:before="0" w:after="0" w:line="252" w:lineRule="auto"/>
+            </w:pPr>
+            <w:r/>
+            <w:r>
+              <w:rPr>
+                <w:rFonts w:ascii="Calibri" w:hAnsi="Calibri"/>
+                <w:b w:val="0"/>
+                <w:color w:val="1E1E1E"/>
+                <w:sz w:val="14"/>
+              </w:rPr>
+              <w:t>1С поступление/списание и расшифровка</w:t>
+            </w:r>
+          </w:p>
+        </w:tc>
+        <w:tc>
+          <w:tcPr>
+            <w:tcW w:type="dxa" w:w="3040"/>
+            <w:tcMar>
+              <w:top w:w="80" w:type="dxa"/>
+              <w:start w:w="120" w:type="dxa"/>
+              <w:bottom w:w="80" w:type="dxa"/>
+              <w:end w:w="120" w:type="dxa"/>
+            </w:tcMar>
+            <w:vAlign w:val="center"/>
+          </w:tcPr>
+          <w:p>
+            <w:pPr>
+              <w:spacing w:before="0" w:after="0" w:line="252" w:lineRule="auto"/>
+            </w:pPr>
+            <w:r/>
+            <w:r>
+              <w:rPr>
+                <w:rFonts w:ascii="Calibri" w:hAnsi="Calibri"/>
+                <w:b w:val="0"/>
+                <w:color w:val="1E1E1E"/>
+                <w:sz w:val="14"/>
+              </w:rPr>
+              <w:t>`PAYMENT_MISSING`, `PAYMENT_AMOUNT_MISMATCH`</w:t>
+            </w:r>
+          </w:p>
+        </w:tc>
+      </w:tr>
+      <w:tr>
+        <w:tc>
+          <w:tcPr>
+            <w:tcW w:type="dxa" w:w="1500"/>
+            <w:tcMar>
+              <w:top w:w="80" w:type="dxa"/>
+              <w:start w:w="120" w:type="dxa"/>
+              <w:bottom w:w="80" w:type="dxa"/>
+              <w:end w:w="120" w:type="dxa"/>
+            </w:tcMar>
+            <w:vAlign w:val="center"/>
+          </w:tcPr>
+          <w:p>
+            <w:pPr>
+              <w:spacing w:before="0" w:after="0" w:line="252" w:lineRule="auto"/>
+            </w:pPr>
+            <w:r/>
+            <w:r>
+              <w:rPr>
+                <w:rFonts w:ascii="Calibri" w:hAnsi="Calibri"/>
+                <w:b w:val="0"/>
+                <w:color w:val="1E1E1E"/>
+                <w:sz w:val="14"/>
+              </w:rPr>
+              <w:t>Акт/УПД/СФ</w:t>
+            </w:r>
+          </w:p>
+        </w:tc>
+        <w:tc>
+          <w:tcPr>
+            <w:tcW w:type="dxa" w:w="2520"/>
+            <w:tcMar>
+              <w:top w:w="80" w:type="dxa"/>
+              <w:start w:w="120" w:type="dxa"/>
+              <w:bottom w:w="80" w:type="dxa"/>
+              <w:end w:w="120" w:type="dxa"/>
+            </w:tcMar>
+            <w:vAlign w:val="center"/>
+          </w:tcPr>
+          <w:p>
+            <w:pPr>
+              <w:spacing w:before="0" w:after="0" w:line="252" w:lineRule="auto"/>
+            </w:pPr>
+            <w:r/>
+            <w:r>
+              <w:rPr>
+                <w:rFonts w:ascii="Calibri" w:hAnsi="Calibri"/>
+                <w:b w:val="0"/>
+                <w:color w:val="1E1E1E"/>
+                <w:sz w:val="14"/>
+              </w:rPr>
+              <w:t>`veda_akts` и детали</w:t>
+            </w:r>
+          </w:p>
+        </w:tc>
+        <w:tc>
+          <w:tcPr>
+            <w:tcW w:type="dxa" w:w="2300"/>
+            <w:tcMar>
+              <w:top w:w="80" w:type="dxa"/>
+              <w:start w:w="120" w:type="dxa"/>
+              <w:bottom w:w="80" w:type="dxa"/>
+              <w:end w:w="120" w:type="dxa"/>
+            </w:tcMar>
+            <w:vAlign w:val="center"/>
+          </w:tcPr>
+          <w:p>
+            <w:pPr>
+              <w:spacing w:before="0" w:after="0" w:line="252" w:lineRule="auto"/>
+            </w:pPr>
+            <w:r/>
+            <w:r>
+              <w:rPr>
+                <w:rFonts w:ascii="Calibri" w:hAnsi="Calibri"/>
+                <w:b w:val="0"/>
+                <w:color w:val="1E1E1E"/>
+                <w:sz w:val="14"/>
+              </w:rPr>
+              <w:t>1С реализация/поступление/ЭДО</w:t>
+            </w:r>
+          </w:p>
+        </w:tc>
+        <w:tc>
+          <w:tcPr>
+            <w:tcW w:type="dxa" w:w="3040"/>
+            <w:tcMar>
+              <w:top w:w="80" w:type="dxa"/>
+              <w:start w:w="120" w:type="dxa"/>
+              <w:bottom w:w="80" w:type="dxa"/>
+              <w:end w:w="120" w:type="dxa"/>
+            </w:tcMar>
+            <w:vAlign w:val="center"/>
+          </w:tcPr>
+          <w:p>
+            <w:pPr>
+              <w:spacing w:before="0" w:after="0" w:line="252" w:lineRule="auto"/>
+            </w:pPr>
+            <w:r/>
+            <w:r>
+              <w:rPr>
+                <w:rFonts w:ascii="Calibri" w:hAnsi="Calibri"/>
+                <w:b w:val="0"/>
+                <w:color w:val="1E1E1E"/>
+                <w:sz w:val="14"/>
+              </w:rPr>
+              <w:t>`NO_SF_UPD`, `VAT_MISMATCH`, `AMOUNT_MISMATCH`</w:t>
+            </w:r>
+          </w:p>
+        </w:tc>
+      </w:tr>
+      <w:tr>
+        <w:tc>
+          <w:tcPr>
+            <w:tcW w:type="dxa" w:w="1500"/>
+            <w:tcMar>
+              <w:top w:w="80" w:type="dxa"/>
+              <w:start w:w="120" w:type="dxa"/>
+              <w:bottom w:w="80" w:type="dxa"/>
+              <w:end w:w="120" w:type="dxa"/>
+            </w:tcMar>
+            <w:vAlign w:val="center"/>
+          </w:tcPr>
+          <w:p>
+            <w:pPr>
+              <w:spacing w:before="0" w:after="0" w:line="252" w:lineRule="auto"/>
+            </w:pPr>
+            <w:r/>
+            <w:r>
+              <w:rPr>
+                <w:rFonts w:ascii="Calibri" w:hAnsi="Calibri"/>
+                <w:b w:val="0"/>
+                <w:color w:val="1E1E1E"/>
+                <w:sz w:val="14"/>
+              </w:rPr>
+              <w:t>Договор/поставка</w:t>
+            </w:r>
+          </w:p>
+        </w:tc>
+        <w:tc>
+          <w:tcPr>
+            <w:tcW w:type="dxa" w:w="2520"/>
+            <w:tcMar>
+              <w:top w:w="80" w:type="dxa"/>
+              <w:start w:w="120" w:type="dxa"/>
+              <w:bottom w:w="80" w:type="dxa"/>
+              <w:end w:w="120" w:type="dxa"/>
+            </w:tcMar>
+            <w:vAlign w:val="center"/>
+          </w:tcPr>
+          <w:p>
+            <w:pPr>
+              <w:spacing w:before="0" w:after="0" w:line="252" w:lineRule="auto"/>
+            </w:pPr>
+            <w:r/>
+            <w:r>
+              <w:rPr>
+                <w:rFonts w:ascii="Calibri" w:hAnsi="Calibri"/>
+                <w:b w:val="0"/>
+                <w:color w:val="1E1E1E"/>
+                <w:sz w:val="14"/>
+              </w:rPr>
+              <w:t>`veda_dogs`, `veda_specs`, коды 1С</w:t>
+            </w:r>
+          </w:p>
+        </w:tc>
+        <w:tc>
+          <w:tcPr>
+            <w:tcW w:type="dxa" w:w="2300"/>
+            <w:tcMar>
+              <w:top w:w="80" w:type="dxa"/>
+              <w:start w:w="120" w:type="dxa"/>
+              <w:bottom w:w="80" w:type="dxa"/>
+              <w:end w:w="120" w:type="dxa"/>
+            </w:tcMar>
+            <w:vAlign w:val="center"/>
+          </w:tcPr>
+          <w:p>
+            <w:pPr>
+              <w:spacing w:before="0" w:after="0" w:line="252" w:lineRule="auto"/>
+            </w:pPr>
+            <w:r/>
+            <w:r>
+              <w:rPr>
+                <w:rFonts w:ascii="Calibri" w:hAnsi="Calibri"/>
+                <w:b w:val="0"/>
+                <w:color w:val="1E1E1E"/>
+                <w:sz w:val="14"/>
+              </w:rPr>
+              <w:t>1С договоры контрагентов</w:t>
+            </w:r>
+          </w:p>
+        </w:tc>
+        <w:tc>
+          <w:tcPr>
+            <w:tcW w:type="dxa" w:w="3040"/>
+            <w:tcMar>
+              <w:top w:w="80" w:type="dxa"/>
+              <w:start w:w="120" w:type="dxa"/>
+              <w:bottom w:w="80" w:type="dxa"/>
+              <w:end w:w="120" w:type="dxa"/>
+            </w:tcMar>
+            <w:vAlign w:val="center"/>
+          </w:tcPr>
+          <w:p>
+            <w:pPr>
+              <w:spacing w:before="0" w:after="0" w:line="252" w:lineRule="auto"/>
+            </w:pPr>
+            <w:r/>
+            <w:r>
+              <w:rPr>
+                <w:rFonts w:ascii="Calibri" w:hAnsi="Calibri"/>
+                <w:b w:val="0"/>
+                <w:color w:val="1E1E1E"/>
+                <w:sz w:val="14"/>
+              </w:rPr>
+              <w:t>`CONTRACT_MISMATCH`, `SPEC_KEY_MISSING`</w:t>
+            </w:r>
+          </w:p>
+        </w:tc>
+      </w:tr>
+    </w:tbl>
+    <w:p>
+      <w:pPr>
+        <w:spacing w:after="40"/>
+      </w:pPr>
+    </w:p>
+    <w:tbl>
+      <w:tblGrid>
+        <w:gridCol w:w="9360"/>
+      </w:tblGrid>
+      <w:tblPr>
+        <w:tblStyle w:val="TableGrid"/>
+        <w:tblW w:type="dxa" w:w="9360"/>
+        <w:tblLayout w:type="fixed"/>
+        <w:tblLook w:firstColumn="1" w:firstRow="1" w:lastColumn="0" w:lastRow="0" w:noHBand="0" w:noVBand="1" w:val="04A0"/>
+        <w:tblInd w:w="120" w:type="dxa"/>
+      </w:tblPr>
+      <w:tr>
+        <w:tc>
+          <w:tcPr>
+            <w:tcW w:type="dxa" w:w="9360"/>
+            <w:tcMar>
+              <w:top w:w="80" w:type="dxa"/>
+              <w:start w:w="120" w:type="dxa"/>
+              <w:bottom w:w="80" w:type="dxa"/>
+              <w:end w:w="120" w:type="dxa"/>
+            </w:tcMar>
+            <w:vAlign w:val="center"/>
+            <w:shd w:fill="F4F6F9"/>
+          </w:tcPr>
+          <w:p>
+            <w:pPr>
+              <w:spacing w:after="60"/>
+            </w:pPr>
+            <w:r/>
+            <w:r>
+              <w:rPr>
+                <w:rFonts w:ascii="Calibri" w:hAnsi="Calibri"/>
+                <w:b/>
+                <w:color w:val="1F4D78"/>
+                <w:sz w:val="20"/>
+              </w:rPr>
+              <w:t>Ключевое отличие от матрицы сальдо</w:t>
+            </w:r>
+          </w:p>
+          <w:p>
+            <w:pPr>
+              <w:spacing w:after="0" w:line="288" w:lineRule="auto"/>
+            </w:pPr>
+            <w:r>
+              <w:rPr>
+                <w:rFonts w:ascii="Calibri" w:hAnsi="Calibri"/>
+                <w:color w:val="1E1E1E"/>
+                <w:sz w:val="19"/>
+              </w:rPr>
+              <w:t>Матрица сальдо отвечает на вопрос `сколько клиент должен/переплатил по выбранным поставкам`. Страница сверки ERP ↔ 1С отвечает на вопрос `совпадают ли две учетные системы`. Это разные интерфейсы, разные статусы и разные критерии приемки.</w:t>
+            </w:r>
+          </w:p>
+        </w:tc>
+      </w:tr>
+    </w:tbl>
+    <w:p>
+      <w:pPr>
+        <w:spacing w:after="40"/>
+      </w:pPr>
+    </w:p>
+    <w:p>
+      <w:pPr>
+        <w:pStyle w:val="Heading2"/>
+        <w:keepNext/>
+      </w:pPr>
+      <w:r/>
+      <w:r>
+        <w:rPr>
+          <w:rFonts w:ascii="Calibri" w:hAnsi="Calibri"/>
+          <w:b/>
+          <w:color w:val="2E74B5"/>
+          <w:sz w:val="26"/>
+        </w:rPr>
+        <w:t>3.2 Фоновый runner для тяжелых сверок</w:t>
+      </w:r>
+    </w:p>
+    <w:p>
+      <w:pPr>
+        <w:spacing w:before="0" w:after="120" w:line="300" w:lineRule="auto"/>
+      </w:pPr>
+      <w:r>
+        <w:rPr>
+          <w:rFonts w:ascii="Calibri" w:hAnsi="Calibri"/>
+          <w:color w:val="1E1E1E"/>
+          <w:sz w:val="21"/>
+        </w:rPr>
+        <w:t>Историческая сверка по всем клиентам и всем договорам не должна выполняться как обычный HTTP-запрос экрана. Для этого нужен runner, который запускается по расписанию или вручную и сохраняет результат.</w:t>
+      </w:r>
+    </w:p>
+    <w:tbl>
+      <w:tblGrid>
+        <w:gridCol w:w="2300"/>
+        <w:gridCol w:w="7060"/>
+      </w:tblGrid>
+      <w:tblPr>
+        <w:tblStyle w:val="TableGrid"/>
+        <w:tblW w:type="dxa" w:w="9360"/>
+        <w:tblLayout w:type="fixed"/>
+        <w:tblLook w:firstColumn="1" w:firstRow="1" w:lastColumn="0" w:lastRow="0" w:noHBand="0" w:noVBand="1" w:val="04A0"/>
+        <w:tblInd w:w="120" w:type="dxa"/>
+      </w:tblPr>
+      <w:tr>
+        <w:tc>
+          <w:tcPr>
+            <w:tcW w:type="dxa" w:w="2300"/>
+            <w:tcMar>
+              <w:top w:w="80" w:type="dxa"/>
+              <w:start w:w="120" w:type="dxa"/>
+              <w:bottom w:w="80" w:type="dxa"/>
+              <w:end w:w="120" w:type="dxa"/>
+            </w:tcMar>
+            <w:vAlign w:val="center"/>
+            <w:shd w:fill="E8EEF5"/>
+          </w:tcPr>
+          <w:p>
+            <w:pPr>
+              <w:spacing w:before="0" w:after="0" w:line="252" w:lineRule="auto"/>
+              <w:jc w:val="center"/>
+            </w:pPr>
+            <w:r/>
+            <w:r>
+              <w:rPr>
+                <w:rFonts w:ascii="Calibri" w:hAnsi="Calibri"/>
+                <w:b/>
+                <w:color w:val="1F4D78"/>
+                <w:sz w:val="15"/>
+              </w:rPr>
+              <w:t>Требование</w:t>
+            </w:r>
+          </w:p>
+        </w:tc>
+        <w:tc>
+          <w:tcPr>
+            <w:tcW w:type="dxa" w:w="7060"/>
+            <w:tcMar>
+              <w:top w:w="80" w:type="dxa"/>
+              <w:start w:w="120" w:type="dxa"/>
+              <w:bottom w:w="80" w:type="dxa"/>
+              <w:end w:w="120" w:type="dxa"/>
+            </w:tcMar>
+            <w:vAlign w:val="center"/>
+            <w:shd w:fill="E8EEF5"/>
+          </w:tcPr>
+          <w:p>
+            <w:pPr>
+              <w:spacing w:before="0" w:after="0" w:line="252" w:lineRule="auto"/>
+              <w:jc w:val="center"/>
+            </w:pPr>
+            <w:r/>
+            <w:r>
+              <w:rPr>
+                <w:rFonts w:ascii="Calibri" w:hAnsi="Calibri"/>
+                <w:b/>
+                <w:color w:val="1F4D78"/>
+                <w:sz w:val="15"/>
+              </w:rPr>
+              <w:t>Описание</w:t>
+            </w:r>
+          </w:p>
+        </w:tc>
+      </w:tr>
+      <w:tr>
+        <w:tc>
+          <w:tcPr>
+            <w:tcW w:type="dxa" w:w="2300"/>
+            <w:tcMar>
+              <w:top w:w="80" w:type="dxa"/>
+              <w:start w:w="120" w:type="dxa"/>
+              <w:bottom w:w="80" w:type="dxa"/>
+              <w:end w:w="120" w:type="dxa"/>
+            </w:tcMar>
+            <w:vAlign w:val="center"/>
+          </w:tcPr>
+          <w:p>
+            <w:pPr>
+              <w:spacing w:before="0" w:after="0" w:line="252" w:lineRule="auto"/>
+            </w:pPr>
+            <w:r/>
+            <w:r>
+              <w:rPr>
+                <w:rFonts w:ascii="Calibri" w:hAnsi="Calibri"/>
+                <w:b w:val="0"/>
+                <w:color w:val="1E1E1E"/>
+                <w:sz w:val="15"/>
+              </w:rPr>
+              <w:t>Режимы запуска</w:t>
+            </w:r>
+          </w:p>
+        </w:tc>
+        <w:tc>
+          <w:tcPr>
+            <w:tcW w:type="dxa" w:w="7060"/>
+            <w:tcMar>
+              <w:top w:w="80" w:type="dxa"/>
+              <w:start w:w="120" w:type="dxa"/>
+              <w:bottom w:w="80" w:type="dxa"/>
+              <w:end w:w="120" w:type="dxa"/>
+            </w:tcMar>
+            <w:vAlign w:val="center"/>
+          </w:tcPr>
+          <w:p>
+            <w:pPr>
+              <w:spacing w:before="0" w:after="0" w:line="252" w:lineRule="auto"/>
+            </w:pPr>
+            <w:r/>
+            <w:r>
+              <w:rPr>
+                <w:rFonts w:ascii="Calibri" w:hAnsi="Calibri"/>
+                <w:b w:val="0"/>
+                <w:color w:val="1E1E1E"/>
+                <w:sz w:val="15"/>
+              </w:rPr>
+              <w:t>ручной запуск по клиенту/договору/периоду; ночной запуск по всем активным клиентам; повторный запуск только проблемных договоров</w:t>
+            </w:r>
+          </w:p>
+        </w:tc>
+      </w:tr>
+      <w:tr>
+        <w:tc>
+          <w:tcPr>
+            <w:tcW w:type="dxa" w:w="2300"/>
+            <w:tcMar>
+              <w:top w:w="80" w:type="dxa"/>
+              <w:start w:w="120" w:type="dxa"/>
+              <w:bottom w:w="80" w:type="dxa"/>
+              <w:end w:w="120" w:type="dxa"/>
+            </w:tcMar>
+            <w:vAlign w:val="center"/>
+          </w:tcPr>
+          <w:p>
+            <w:pPr>
+              <w:spacing w:before="0" w:after="0" w:line="252" w:lineRule="auto"/>
+            </w:pPr>
+            <w:r/>
+            <w:r>
+              <w:rPr>
+                <w:rFonts w:ascii="Calibri" w:hAnsi="Calibri"/>
+                <w:b w:val="0"/>
+                <w:color w:val="1E1E1E"/>
+                <w:sz w:val="15"/>
+              </w:rPr>
+              <w:t>Сохранение снапшота</w:t>
+            </w:r>
+          </w:p>
+        </w:tc>
+        <w:tc>
+          <w:tcPr>
+            <w:tcW w:type="dxa" w:w="7060"/>
+            <w:tcMar>
+              <w:top w:w="80" w:type="dxa"/>
+              <w:start w:w="120" w:type="dxa"/>
+              <w:bottom w:w="80" w:type="dxa"/>
+              <w:end w:w="120" w:type="dxa"/>
+            </w:tcMar>
+            <w:vAlign w:val="center"/>
+          </w:tcPr>
+          <w:p>
+            <w:pPr>
+              <w:spacing w:before="0" w:after="0" w:line="252" w:lineRule="auto"/>
+            </w:pPr>
+            <w:r/>
+            <w:r>
+              <w:rPr>
+                <w:rFonts w:ascii="Calibri" w:hAnsi="Calibri"/>
+                <w:b w:val="0"/>
+                <w:color w:val="1E1E1E"/>
+                <w:sz w:val="15"/>
+              </w:rPr>
+              <w:t>сохранять параметры запуска, ERP-срез, 1С-срез, итоговые суммы и строки расхождений; экран открывает сохраненный результат</w:t>
+            </w:r>
+          </w:p>
+        </w:tc>
+      </w:tr>
+      <w:tr>
+        <w:tc>
+          <w:tcPr>
+            <w:tcW w:type="dxa" w:w="2300"/>
+            <w:tcMar>
+              <w:top w:w="80" w:type="dxa"/>
+              <w:start w:w="120" w:type="dxa"/>
+              <w:bottom w:w="80" w:type="dxa"/>
+              <w:end w:w="120" w:type="dxa"/>
+            </w:tcMar>
+            <w:vAlign w:val="center"/>
+          </w:tcPr>
+          <w:p>
+            <w:pPr>
+              <w:spacing w:before="0" w:after="0" w:line="252" w:lineRule="auto"/>
+            </w:pPr>
+            <w:r/>
+            <w:r>
+              <w:rPr>
+                <w:rFonts w:ascii="Calibri" w:hAnsi="Calibri"/>
+                <w:b w:val="0"/>
+                <w:color w:val="1E1E1E"/>
+                <w:sz w:val="15"/>
+              </w:rPr>
+              <w:t>Ограничение нагрузки</w:t>
+            </w:r>
+          </w:p>
+        </w:tc>
+        <w:tc>
+          <w:tcPr>
+            <w:tcW w:type="dxa" w:w="7060"/>
+            <w:tcMar>
+              <w:top w:w="80" w:type="dxa"/>
+              <w:start w:w="120" w:type="dxa"/>
+              <w:bottom w:w="80" w:type="dxa"/>
+              <w:end w:w="120" w:type="dxa"/>
+            </w:tcMar>
+            <w:vAlign w:val="center"/>
+          </w:tcPr>
+          <w:p>
+            <w:pPr>
+              <w:spacing w:before="0" w:after="0" w:line="252" w:lineRule="auto"/>
+            </w:pPr>
+            <w:r/>
+            <w:r>
+              <w:rPr>
+                <w:rFonts w:ascii="Calibri" w:hAnsi="Calibri"/>
+                <w:b w:val="0"/>
+                <w:color w:val="1E1E1E"/>
+                <w:sz w:val="15"/>
+              </w:rPr>
+              <w:t>batch по клиентам/договорам, лимит параллельности, таймаут SOAP, повтор при временной ошибке 1С</w:t>
+            </w:r>
+          </w:p>
+        </w:tc>
+      </w:tr>
+      <w:tr>
+        <w:tc>
+          <w:tcPr>
+            <w:tcW w:type="dxa" w:w="2300"/>
+            <w:tcMar>
+              <w:top w:w="80" w:type="dxa"/>
+              <w:start w:w="120" w:type="dxa"/>
+              <w:bottom w:w="80" w:type="dxa"/>
+              <w:end w:w="120" w:type="dxa"/>
+            </w:tcMar>
+            <w:vAlign w:val="center"/>
+          </w:tcPr>
+          <w:p>
+            <w:pPr>
+              <w:spacing w:before="0" w:after="0" w:line="252" w:lineRule="auto"/>
+            </w:pPr>
+            <w:r/>
+            <w:r>
+              <w:rPr>
+                <w:rFonts w:ascii="Calibri" w:hAnsi="Calibri"/>
+                <w:b w:val="0"/>
+                <w:color w:val="1E1E1E"/>
+                <w:sz w:val="15"/>
+              </w:rPr>
+              <w:t>Актуальность</w:t>
+            </w:r>
+          </w:p>
+        </w:tc>
+        <w:tc>
+          <w:tcPr>
+            <w:tcW w:type="dxa" w:w="7060"/>
+            <w:tcMar>
+              <w:top w:w="80" w:type="dxa"/>
+              <w:start w:w="120" w:type="dxa"/>
+              <w:bottom w:w="80" w:type="dxa"/>
+              <w:end w:w="120" w:type="dxa"/>
+            </w:tcMar>
+            <w:vAlign w:val="center"/>
+          </w:tcPr>
+          <w:p>
+            <w:pPr>
+              <w:spacing w:before="0" w:after="0" w:line="252" w:lineRule="auto"/>
+            </w:pPr>
+            <w:r/>
+            <w:r>
+              <w:rPr>
+                <w:rFonts w:ascii="Calibri" w:hAnsi="Calibri"/>
+                <w:b w:val="0"/>
+                <w:color w:val="1E1E1E"/>
+                <w:sz w:val="15"/>
+              </w:rPr>
+              <w:t>у каждого результата показывать дату расчета и источник: live ERP, live 1С, cached 1С, ошибка источника</w:t>
+            </w:r>
+          </w:p>
+        </w:tc>
+      </w:tr>
+      <w:tr>
+        <w:tc>
+          <w:tcPr>
+            <w:tcW w:type="dxa" w:w="2300"/>
+            <w:tcMar>
+              <w:top w:w="80" w:type="dxa"/>
+              <w:start w:w="120" w:type="dxa"/>
+              <w:bottom w:w="80" w:type="dxa"/>
+              <w:end w:w="120" w:type="dxa"/>
+            </w:tcMar>
+            <w:vAlign w:val="center"/>
+          </w:tcPr>
+          <w:p>
+            <w:pPr>
+              <w:spacing w:before="0" w:after="0" w:line="252" w:lineRule="auto"/>
+            </w:pPr>
+            <w:r/>
+            <w:r>
+              <w:rPr>
+                <w:rFonts w:ascii="Calibri" w:hAnsi="Calibri"/>
+                <w:b w:val="0"/>
+                <w:color w:val="1E1E1E"/>
+                <w:sz w:val="15"/>
+              </w:rPr>
+              <w:t>Повторяемость</w:t>
+            </w:r>
+          </w:p>
+        </w:tc>
+        <w:tc>
+          <w:tcPr>
+            <w:tcW w:type="dxa" w:w="7060"/>
+            <w:tcMar>
+              <w:top w:w="80" w:type="dxa"/>
+              <w:start w:w="120" w:type="dxa"/>
+              <w:bottom w:w="80" w:type="dxa"/>
+              <w:end w:w="120" w:type="dxa"/>
+            </w:tcMar>
+            <w:vAlign w:val="center"/>
+          </w:tcPr>
+          <w:p>
+            <w:pPr>
+              <w:spacing w:before="0" w:after="0" w:line="252" w:lineRule="auto"/>
+            </w:pPr>
+            <w:r/>
+            <w:r>
+              <w:rPr>
+                <w:rFonts w:ascii="Calibri" w:hAnsi="Calibri"/>
+                <w:b w:val="0"/>
+                <w:color w:val="1E1E1E"/>
+                <w:sz w:val="15"/>
+              </w:rPr>
+              <w:t>один и тот же `run_id` должен хранить использованные входные данные, чтобы итог можно было объяснить позже</w:t>
+            </w:r>
+          </w:p>
+        </w:tc>
+      </w:tr>
+      <w:tr>
+        <w:tc>
+          <w:tcPr>
+            <w:tcW w:type="dxa" w:w="2300"/>
+            <w:tcMar>
+              <w:top w:w="80" w:type="dxa"/>
+              <w:start w:w="120" w:type="dxa"/>
+              <w:bottom w:w="80" w:type="dxa"/>
+              <w:end w:w="120" w:type="dxa"/>
+            </w:tcMar>
+            <w:vAlign w:val="center"/>
+          </w:tcPr>
+          <w:p>
+            <w:pPr>
+              <w:spacing w:before="0" w:after="0" w:line="252" w:lineRule="auto"/>
+            </w:pPr>
+            <w:r/>
+            <w:r>
+              <w:rPr>
+                <w:rFonts w:ascii="Calibri" w:hAnsi="Calibri"/>
+                <w:b w:val="0"/>
+                <w:color w:val="1E1E1E"/>
+                <w:sz w:val="15"/>
+              </w:rPr>
+              <w:t>Экспорт</w:t>
+            </w:r>
+          </w:p>
+        </w:tc>
+        <w:tc>
+          <w:tcPr>
+            <w:tcW w:type="dxa" w:w="7060"/>
+            <w:tcMar>
+              <w:top w:w="80" w:type="dxa"/>
+              <w:start w:w="120" w:type="dxa"/>
+              <w:bottom w:w="80" w:type="dxa"/>
+              <w:end w:w="120" w:type="dxa"/>
+            </w:tcMar>
+            <w:vAlign w:val="center"/>
+          </w:tcPr>
+          <w:p>
+            <w:pPr>
+              <w:spacing w:before="0" w:after="0" w:line="252" w:lineRule="auto"/>
+            </w:pPr>
+            <w:r/>
+            <w:r>
+              <w:rPr>
+                <w:rFonts w:ascii="Calibri" w:hAnsi="Calibri"/>
+                <w:b w:val="0"/>
+                <w:color w:val="1E1E1E"/>
+                <w:sz w:val="15"/>
+              </w:rPr>
+              <w:t>XLSX по результату runner формируется из сохраненного результата, а не пересчитывает тяжелые SQL и SOAP заново</w:t>
             </w:r>
           </w:p>
         </w:tc>
@@ -3799,7 +6506,20 @@
           <w:color w:val="2E74B5"/>
           <w:sz w:val="32"/>
         </w:rPr>
-        <w:t>6. Требования к интерфейсу</w:t>
+        <w:t>6. Требования к интерфейсу сальдо по поставкам</w:t>
+      </w:r>
+    </w:p>
+    <w:p>
+      <w:pPr>
+        <w:spacing w:before="0" w:after="120" w:line="300" w:lineRule="auto"/>
+      </w:pPr>
+      <w:r>
+        <w:rPr>
+          <w:rFonts w:ascii="Calibri" w:hAnsi="Calibri"/>
+          <w:color w:val="1E1E1E"/>
+          <w:sz w:val="21"/>
+        </w:rPr>
+        <w:t>Этот экран остается полезным бухгалтерским инструментом, но не является финальным протоколом сверки ERP ↔ 1С. Он показывает ERP-сальдо по выбранным поставкам и готовит XLSX для работы с клиентом.</w:t>
       </w:r>
     </w:p>
     <w:tbl>
@@ -4268,7 +6988,7 @@
           <w:color w:val="5A5A5A"/>
           <w:sz w:val="16"/>
         </w:rPr>
-        <w:t>Рисунок 1. Целевой вид матрицы по свежему кейсу 660/1.</w:t>
+        <w:t>Рисунок 1. Целевой вид экрана `Сальдо по поставкам` по свежему кейсу 660/1.</w:t>
       </w:r>
     </w:p>
     <w:p>
@@ -4323,7 +7043,7 @@
           <w:color w:val="5A5A5A"/>
           <w:sz w:val="16"/>
         </w:rPr>
-        <w:t>Рисунок 2. Режим ошибок: фильтр проблемных строк и карточка причины.</w:t>
+        <w:t>Рисунок 2. Диагностический режим текущей матрицы: это не заменяет отдельную страницу сверки ERP ↔ 1С.</w:t>
       </w:r>
     </w:p>
     <w:p>
@@ -14237,7 +16957,7 @@
                 <w:color w:val="1E1E1E"/>
                 <w:sz w:val="14"/>
               </w:rPr>
-              <w:t>Договор расходится</w:t>
+              <w:t>Сальдо расходится</w:t>
             </w:r>
           </w:p>
         </w:tc>
@@ -14264,7 +16984,7 @@
                 <w:color w:val="1E1E1E"/>
                 <w:sz w:val="14"/>
               </w:rPr>
-              <w:t>сумма или номер найдены, но договор/заявка не совпадает</w:t>
+              <w:t>начальное, обороты или конечное сальдо ERP и 1С отличаются</w:t>
             </w:r>
           </w:p>
         </w:tc>
@@ -14291,7 +17011,7 @@
                 <w:color w:val="1E1E1E"/>
                 <w:sz w:val="14"/>
               </w:rPr>
-              <w:t>dogcode, spec code, владелец, организация</w:t>
+              <w:t>только для отдельной страницы сверки ERP ↔ 1С</w:t>
             </w:r>
           </w:p>
         </w:tc>
@@ -14320,7 +17040,7 @@
                 <w:color w:val="1E1E1E"/>
                 <w:sz w:val="14"/>
               </w:rPr>
-              <w:t>Нет СФ/УПД</w:t>
+              <w:t>Договор расходится</w:t>
             </w:r>
           </w:p>
         </w:tc>
@@ -14347,7 +17067,7 @@
                 <w:color w:val="1E1E1E"/>
                 <w:sz w:val="14"/>
               </w:rPr>
-              <w:t>после успешной загрузки источников нет ожидаемого закрывающего документа</w:t>
+              <w:t>сумма или номер найдены, но договор/заявка не совпадает</w:t>
             </w:r>
           </w:p>
         </w:tc>
@@ -14374,7 +17094,7 @@
                 <w:color w:val="1E1E1E"/>
                 <w:sz w:val="14"/>
               </w:rPr>
-              <w:t>наличие акта/УПД/СФ в ERP и 1С; не путать с возмещаемостью</w:t>
+              <w:t>dogcode, spec code, владелец, организация</w:t>
             </w:r>
           </w:p>
         </w:tc>
@@ -14403,7 +17123,7 @@
                 <w:color w:val="1E1E1E"/>
                 <w:sz w:val="14"/>
               </w:rPr>
-              <w:t>Вопрос по НДС</w:t>
+              <w:t>Нет СФ/УПД</w:t>
             </w:r>
           </w:p>
         </w:tc>
@@ -14430,7 +17150,7 @@
                 <w:color w:val="1E1E1E"/>
                 <w:sz w:val="14"/>
               </w:rPr>
-              <w:t>расход или акт найден, но ставка НДС ERP и ставка НДС 1С различаются</w:t>
+              <w:t>после успешной загрузки источников нет ожидаемого закрывающего документа</w:t>
             </w:r>
           </w:p>
         </w:tc>
@@ -14457,7 +17177,7 @@
                 <w:color w:val="1E1E1E"/>
                 <w:sz w:val="14"/>
               </w:rPr>
-              <w:t>только ставка НДС и сумма НДС; `f_isvozm` не является причиной этого статуса</w:t>
+              <w:t>наличие акта/УПД/СФ в ERP и 1С; не путать с возмещаемостью</w:t>
             </w:r>
           </w:p>
         </w:tc>
@@ -14486,7 +17206,7 @@
                 <w:color w:val="1E1E1E"/>
                 <w:sz w:val="14"/>
               </w:rPr>
-              <w:t>Ожидает ключ 1С</w:t>
+              <w:t>Вопрос по НДС</w:t>
             </w:r>
           </w:p>
         </w:tc>
@@ -14513,7 +17233,7 @@
                 <w:color w:val="1E1E1E"/>
                 <w:sz w:val="14"/>
               </w:rPr>
-              <w:t>ERP-документ есть, но нет кода/даты 1С для надежного матчинга</w:t>
+              <w:t>расход или акт найден, но ставка НДС ERP и ставка НДС 1С различаются</w:t>
             </w:r>
           </w:p>
         </w:tc>
@@ -14540,7 +17260,7 @@
                 <w:color w:val="1E1E1E"/>
                 <w:sz w:val="14"/>
               </w:rPr>
-              <w:t>f_kod1c, f_dt1c, номер, дата</w:t>
+              <w:t>только ставка НДС и сумма НДС; `f_isvozm` не является причиной этого статуса</w:t>
             </w:r>
           </w:p>
         </w:tc>
@@ -14569,7 +17289,7 @@
                 <w:color w:val="1E1E1E"/>
                 <w:sz w:val="14"/>
               </w:rPr>
-              <w:t>Подтверждено строкой 1С</w:t>
+              <w:t>Ожидает ключ 1С</w:t>
             </w:r>
           </w:p>
         </w:tc>
@@ -14596,7 +17316,7 @@
                 <w:color w:val="1E1E1E"/>
                 <w:sz w:val="14"/>
               </w:rPr>
-              <w:t>сумма найдена в строке 1С, но договор-заявка строки недоступен</w:t>
+              <w:t>ERP-документ есть, но нет кода/даты 1С для надежного матчинга</w:t>
             </w:r>
           </w:p>
         </w:tc>
@@ -14623,7 +17343,7 @@
                 <w:color w:val="1E1E1E"/>
                 <w:sz w:val="14"/>
               </w:rPr>
-              <w:t>разрешено как желтый статус, не полный `ОК`</w:t>
+              <w:t>f_kod1c, f_dt1c, номер, дата</w:t>
             </w:r>
           </w:p>
         </w:tc>
@@ -14652,7 +17372,7 @@
                 <w:color w:val="1E1E1E"/>
                 <w:sz w:val="14"/>
               </w:rPr>
-              <w:t>Исключено из сальдо</w:t>
+              <w:t>Подтверждено строкой 1С</w:t>
             </w:r>
           </w:p>
         </w:tc>
@@ -14679,7 +17399,7 @@
                 <w:color w:val="1E1E1E"/>
                 <w:sz w:val="14"/>
               </w:rPr>
-              <w:t>расход подрядчика `f_isvozm=2` через детали операций</w:t>
+              <w:t>сумма найдена в строке 1С, но договор-заявка строки недоступен</w:t>
             </w:r>
           </w:p>
         </w:tc>
@@ -14706,7 +17426,7 @@
                 <w:color w:val="1E1E1E"/>
                 <w:sz w:val="14"/>
               </w:rPr>
-              <w:t>логировать, но не включать в взаиморасчет с клиентом</w:t>
+              <w:t>разрешено как желтый статус, не полный `ОК`</w:t>
             </w:r>
           </w:p>
         </w:tc>
@@ -14735,7 +17455,7 @@
                 <w:color w:val="1E1E1E"/>
                 <w:sz w:val="14"/>
               </w:rPr>
-              <w:t>Смешанные валюты</w:t>
+              <w:t>Исключено из сальдо</w:t>
             </w:r>
           </w:p>
         </w:tc>
@@ -14762,7 +17482,7 @@
                 <w:color w:val="1E1E1E"/>
                 <w:sz w:val="14"/>
               </w:rPr>
-              <w:t>в счетах есть разные валюты без утвержденной конвертации</w:t>
+              <w:t>расход подрядчика `f_isvozm=2` через детали операций</w:t>
             </w:r>
           </w:p>
         </w:tc>
@@ -14789,7 +17509,7 @@
                 <w:color w:val="1E1E1E"/>
                 <w:sz w:val="14"/>
               </w:rPr>
-              <w:t>показывать суммы отдельно по валютам</w:t>
+              <w:t>логировать, но не включать в взаиморасчет с клиентом</w:t>
             </w:r>
           </w:p>
         </w:tc>
@@ -14818,6 +17538,89 @@
                 <w:color w:val="1E1E1E"/>
                 <w:sz w:val="14"/>
               </w:rPr>
+              <w:t>Смешанные валюты</w:t>
+            </w:r>
+          </w:p>
+        </w:tc>
+        <w:tc>
+          <w:tcPr>
+            <w:tcW w:type="dxa" w:w="3730"/>
+            <w:tcMar>
+              <w:top w:w="80" w:type="dxa"/>
+              <w:start w:w="120" w:type="dxa"/>
+              <w:bottom w:w="80" w:type="dxa"/>
+              <w:end w:w="120" w:type="dxa"/>
+            </w:tcMar>
+            <w:vAlign w:val="center"/>
+          </w:tcPr>
+          <w:p>
+            <w:pPr>
+              <w:spacing w:before="0" w:after="0" w:line="252" w:lineRule="auto"/>
+            </w:pPr>
+            <w:r/>
+            <w:r>
+              <w:rPr>
+                <w:rFonts w:ascii="Calibri" w:hAnsi="Calibri"/>
+                <w:b w:val="0"/>
+                <w:color w:val="1E1E1E"/>
+                <w:sz w:val="14"/>
+              </w:rPr>
+              <w:t>в счетах есть разные валюты без утвержденной конвертации</w:t>
+            </w:r>
+          </w:p>
+        </w:tc>
+        <w:tc>
+          <w:tcPr>
+            <w:tcW w:type="dxa" w:w="4130"/>
+            <w:tcMar>
+              <w:top w:w="80" w:type="dxa"/>
+              <w:start w:w="120" w:type="dxa"/>
+              <w:bottom w:w="80" w:type="dxa"/>
+              <w:end w:w="120" w:type="dxa"/>
+            </w:tcMar>
+            <w:vAlign w:val="center"/>
+          </w:tcPr>
+          <w:p>
+            <w:pPr>
+              <w:spacing w:before="0" w:after="0" w:line="252" w:lineRule="auto"/>
+            </w:pPr>
+            <w:r/>
+            <w:r>
+              <w:rPr>
+                <w:rFonts w:ascii="Calibri" w:hAnsi="Calibri"/>
+                <w:b w:val="0"/>
+                <w:color w:val="1E1E1E"/>
+                <w:sz w:val="14"/>
+              </w:rPr>
+              <w:t>показывать суммы отдельно по валютам</w:t>
+            </w:r>
+          </w:p>
+        </w:tc>
+      </w:tr>
+      <w:tr>
+        <w:tc>
+          <w:tcPr>
+            <w:tcW w:type="dxa" w:w="1500"/>
+            <w:tcMar>
+              <w:top w:w="80" w:type="dxa"/>
+              <w:start w:w="120" w:type="dxa"/>
+              <w:bottom w:w="80" w:type="dxa"/>
+              <w:end w:w="120" w:type="dxa"/>
+            </w:tcMar>
+            <w:vAlign w:val="center"/>
+          </w:tcPr>
+          <w:p>
+            <w:pPr>
+              <w:spacing w:before="0" w:after="0" w:line="252" w:lineRule="auto"/>
+            </w:pPr>
+            <w:r/>
+            <w:r>
+              <w:rPr>
+                <w:rFonts w:ascii="Calibri" w:hAnsi="Calibri"/>
+                <w:b w:val="0"/>
+                <w:color w:val="1E1E1E"/>
+                <w:sz w:val="14"/>
+              </w:rPr>
               <w:t>Корректировки</w:t>
             </w:r>
           </w:p>
@@ -14873,6 +17676,66 @@
                 <w:sz w:val="14"/>
               </w:rPr>
               <w:t>основной отчет и корректировки показывать отдельными уровнями</w:t>
+            </w:r>
+          </w:p>
+        </w:tc>
+      </w:tr>
+    </w:tbl>
+    <w:p>
+      <w:pPr>
+        <w:spacing w:after="40"/>
+      </w:pPr>
+    </w:p>
+    <w:tbl>
+      <w:tblGrid>
+        <w:gridCol w:w="9360"/>
+      </w:tblGrid>
+      <w:tblPr>
+        <w:tblStyle w:val="TableGrid"/>
+        <w:tblW w:type="dxa" w:w="9360"/>
+        <w:tblLayout w:type="fixed"/>
+        <w:tblLook w:firstColumn="1" w:firstRow="1" w:lastColumn="0" w:lastRow="0" w:noHBand="0" w:noVBand="1" w:val="04A0"/>
+        <w:tblInd w:w="120" w:type="dxa"/>
+      </w:tblPr>
+      <w:tr>
+        <w:tc>
+          <w:tcPr>
+            <w:tcW w:type="dxa" w:w="9360"/>
+            <w:tcMar>
+              <w:top w:w="80" w:type="dxa"/>
+              <w:start w:w="120" w:type="dxa"/>
+              <w:bottom w:w="80" w:type="dxa"/>
+              <w:end w:w="120" w:type="dxa"/>
+            </w:tcMar>
+            <w:vAlign w:val="center"/>
+            <w:shd w:fill="FFF1EB"/>
+          </w:tcPr>
+          <w:p>
+            <w:pPr>
+              <w:spacing w:after="60"/>
+            </w:pPr>
+            <w:r/>
+            <w:r>
+              <w:rPr>
+                <w:rFonts w:ascii="Calibri" w:hAnsi="Calibri"/>
+                <w:b/>
+                <w:color w:val="1F4D78"/>
+                <w:sz w:val="20"/>
+              </w:rPr>
+              <w:t>Ограничение документного статуса</w:t>
+            </w:r>
+          </w:p>
+          <w:p>
+            <w:pPr>
+              <w:spacing w:after="0" w:line="288" w:lineRule="auto"/>
+            </w:pPr>
+            <w:r>
+              <w:rPr>
+                <w:rFonts w:ascii="Calibri" w:hAnsi="Calibri"/>
+                <w:color w:val="1E1E1E"/>
+                <w:sz w:val="19"/>
+              </w:rPr>
+              <w:t>Статус вида `9/9 ОК` может означать только, что девять сопоставленных документов не дали полевых расхождений. Он не доказывает, что сальдо ERP равно сальдо 1С. Для этого нужен отдельный сальдовый блок сверки.</w:t>
             </w:r>
           </w:p>
         </w:tc>
@@ -14896,7 +17759,7 @@
           <w:color w:val="2E74B5"/>
           <w:sz w:val="32"/>
         </w:rPr>
-        <w:t>12. Excel-выгрузка</w:t>
+        <w:t>12. Excel-выгрузка сальдо по поставкам</w:t>
       </w:r>
     </w:p>
     <w:p>
@@ -14909,7 +17772,7 @@
           <w:color w:val="1E1E1E"/>
           <w:sz w:val="21"/>
         </w:rPr>
-        <w:t>Excel не должен быть простым экспортом экранной матрицы. Требуется бухгалтерская форма: счета и оплаты идут строками, а расходы, СФ/УПД и дельта объединяются по количеству строк счетов внутри поставки.</w:t>
+        <w:t>Excel этого экрана не является протоколом сверки ERP ↔ 1С. Это бухгалтерская форма сальдо по поставкам: счета и оплаты идут строками, а расходы, СФ/УПД и дельта объединяются по количеству строк счетов внутри поставки.</w:t>
       </w:r>
     </w:p>
     <w:tbl>
@@ -19858,6 +22721,66 @@
         <w:spacing w:after="40"/>
       </w:pPr>
     </w:p>
+    <w:tbl>
+      <w:tblGrid>
+        <w:gridCol w:w="9360"/>
+      </w:tblGrid>
+      <w:tblPr>
+        <w:tblStyle w:val="TableGrid"/>
+        <w:tblW w:type="dxa" w:w="9360"/>
+        <w:tblLayout w:type="fixed"/>
+        <w:tblLook w:firstColumn="1" w:firstRow="1" w:lastColumn="0" w:lastRow="0" w:noHBand="0" w:noVBand="1" w:val="04A0"/>
+        <w:tblInd w:w="120" w:type="dxa"/>
+      </w:tblPr>
+      <w:tr>
+        <w:tc>
+          <w:tcPr>
+            <w:tcW w:type="dxa" w:w="9360"/>
+            <w:tcMar>
+              <w:top w:w="80" w:type="dxa"/>
+              <w:start w:w="120" w:type="dxa"/>
+              <w:bottom w:w="80" w:type="dxa"/>
+              <w:end w:w="120" w:type="dxa"/>
+            </w:tcMar>
+            <w:vAlign w:val="center"/>
+            <w:shd w:fill="FFF1EB"/>
+          </w:tcPr>
+          <w:p>
+            <w:pPr>
+              <w:spacing w:after="60"/>
+            </w:pPr>
+            <w:r/>
+            <w:r>
+              <w:rPr>
+                <w:rFonts w:ascii="Calibri" w:hAnsi="Calibri"/>
+                <w:b/>
+                <w:color w:val="1F4D78"/>
+                <w:sz w:val="20"/>
+              </w:rPr>
+              <w:t>Что этот кейс не доказывает</w:t>
+            </w:r>
+          </w:p>
+          <w:p>
+            <w:pPr>
+              <w:spacing w:after="0" w:line="288" w:lineRule="auto"/>
+            </w:pPr>
+            <w:r>
+              <w:rPr>
+                <w:rFonts w:ascii="Calibri" w:hAnsi="Calibri"/>
+                <w:color w:val="1E1E1E"/>
+                <w:sz w:val="19"/>
+              </w:rPr>
+              <w:t>Контрольный кейс 660/1 подтверждает корректность ERP-сальдовки по выбранным поставкам. Он не подтверждает, что сальдо ERP и 1С совпадает по договору за период. Для такого вывода нужен отдельный запуск страницы `Сверка ERP ↔ 1С` с сальдо на начало, оборотами и сальдо на конец.</w:t>
+            </w:r>
+          </w:p>
+        </w:tc>
+      </w:tr>
+    </w:tbl>
+    <w:p>
+      <w:pPr>
+        <w:spacing w:after="40"/>
+      </w:pPr>
+    </w:p>
     <w:p>
       <w:pPr>
         <w:spacing w:before="0" w:after="120" w:line="300" w:lineRule="auto"/>
@@ -19897,7 +22820,7 @@
           <w:rFonts w:ascii="Calibri" w:hAnsi="Calibri"/>
           <w:sz w:val="20"/>
         </w:rPr>
-        <w:t>Экран строит иерархию `veda_contacts -&gt; veda_clients -&gt; veda_dogs -&gt; veda_specs` и не смешивает уровни цифрами.</w:t>
+        <w:t>Текущий экран называется и описывается как `Сальдо по поставкам`, а не как полноценная сверка ERP ↔ 1С.</w:t>
       </w:r>
     </w:p>
     <w:p>
@@ -19910,7 +22833,20 @@
           <w:rFonts w:ascii="Calibri" w:hAnsi="Calibri"/>
           <w:sz w:val="20"/>
         </w:rPr>
-        <w:t>Свежий кейс 660/1 воспроизводит live-итоги MariaDB: поступления/get_paidsum 2 331 111,33; реализация/get_realizsum 2 415 525,73; сальдо -84 414,40.</w:t>
+        <w:t>Экран сальдо строит иерархию `veda_contacts -&gt; veda_clients -&gt; veda_dogs -&gt; veda_specs` и не смешивает уровни цифрами.</w:t>
+      </w:r>
+    </w:p>
+    <w:p>
+      <w:pPr>
+        <w:pStyle w:val="ListBullet"/>
+        <w:spacing w:after="80" w:line="300" w:lineRule="auto"/>
+      </w:pPr>
+      <w:r>
+        <w:rPr>
+          <w:rFonts w:ascii="Calibri" w:hAnsi="Calibri"/>
+          <w:sz w:val="20"/>
+        </w:rPr>
+        <w:t>Свежий кейс 660/1 воспроизводит live-итоги MariaDB: поступления/get_paidsum 2 331 111,33; реализация/get_realizsum 2 415 525,73; сальдо -84 414,40. Это критерий ERP-сальдовки, не критерий совпадения с 1С.</w:t>
       </w:r>
     </w:p>
     <w:p>
@@ -19988,7 +22924,46 @@
           <w:rFonts w:ascii="Calibri" w:hAnsi="Calibri"/>
           <w:sz w:val="20"/>
         </w:rPr>
-        <w:t>Бейдж `1С: X/Y совпало` означает, что X строк сверки совпали из Y найденных строк ERP ↔ 1С; `Долг` и `Переплата` считаются как оплата минус возмещаемые и невозмещаемые расходы.</w:t>
+        <w:t>Бейдж `1С: X/Y совпало` означает только документное сопоставление и не используется как итоговый статус совпадения сальдо.</w:t>
+      </w:r>
+    </w:p>
+    <w:p>
+      <w:pPr>
+        <w:pStyle w:val="ListBullet"/>
+        <w:spacing w:after="80" w:line="300" w:lineRule="auto"/>
+      </w:pPr>
+      <w:r>
+        <w:rPr>
+          <w:rFonts w:ascii="Calibri" w:hAnsi="Calibri"/>
+          <w:sz w:val="20"/>
+        </w:rPr>
+        <w:t>Для настоящей сверки ERP ↔ 1С есть отдельная страница с запуском `run_id`, статусом источников, блоком `ERP без 1С`, блоком `1С без ERP`, блоком полевых расхождений и блоком сальдо.</w:t>
+      </w:r>
+    </w:p>
+    <w:p>
+      <w:pPr>
+        <w:pStyle w:val="ListBullet"/>
+        <w:spacing w:after="80" w:line="300" w:lineRule="auto"/>
+      </w:pPr>
+      <w:r>
+        <w:rPr>
+          <w:rFonts w:ascii="Calibri" w:hAnsi="Calibri"/>
+          <w:sz w:val="20"/>
+        </w:rPr>
+        <w:t>Отдельная страница сверки показывает начальное сальдо, обороты и конечное сальдо ERP/1С; при произвольном наборе поставок предупреждает, что полноценный акт сверки невозможен.</w:t>
+      </w:r>
+    </w:p>
+    <w:p>
+      <w:pPr>
+        <w:pStyle w:val="ListBullet"/>
+        <w:spacing w:after="80" w:line="300" w:lineRule="auto"/>
+      </w:pPr>
+      <w:r>
+        <w:rPr>
+          <w:rFonts w:ascii="Calibri" w:hAnsi="Calibri"/>
+          <w:sz w:val="20"/>
+        </w:rPr>
+        <w:t>Runner для тяжелой исторической сверки сохраняет результат и не блокирует интерфейс синхронным пересчетом всей истории.</w:t>
       </w:r>
     </w:p>
     <w:p>
@@ -20055,7 +23030,7 @@
         <w:color w:val="5A5A5A"/>
         <w:sz w:val="16"/>
       </w:rPr>
-      <w:t>ТЗ ERP ↔ 1С / матрица акта сверки</w:t>
+      <w:t>ТЗ: сальдо по поставкам + сверка ERP ↔ 1С</w:t>
     </w:r>
   </w:p>
 </w:ftr>

</xml_diff>

<commit_message>
Finalize ERP saldo and 1C monitor requirements
</commit_message>
<xml_diff>
--- a/docs/TZ_ERP_1C_Akt_Sverki_Matrix.docx
+++ b/docs/TZ_ERP_1C_Akt_Sverki_Matrix.docx
@@ -152,7 +152,7 @@
                 <w:color w:val="1E1E1E"/>
                 <w:sz w:val="17"/>
               </w:rPr>
-              <w:t>LIVE MariaDB + тестовый монитор 1С / 2026-06-25 / финальное ТЗ для ERP-разработчика</w:t>
+              <w:t>PHP ERP + MariaDB + сервис 1С / 2026-06-25 / финальное ТЗ для ERP-разработчика</w:t>
             </w:r>
           </w:p>
         </w:tc>
@@ -208,7 +208,7 @@
                 <w:color w:val="1E1E1E"/>
                 <w:sz w:val="17"/>
               </w:rPr>
-              <w:t>Встроенный экран текущей PHP ERP, MariaDB, существующий SOAP-обмен с 1С; тестовый стенд может использовать загруженную выгрузку 1С в PostgreSQL только как кэш источника 1С.</w:t>
+              <w:t>Встроенный экран текущей PHP ERP, MariaDB, существующий SOAP-обмен с 1С.</w:t>
             </w:r>
           </w:p>
         </w:tc>
@@ -376,7 +376,7 @@
                 <w:color w:val="1E1E1E"/>
                 <w:sz w:val="17"/>
               </w:rPr>
-              <w:t>отдельный Python-модуль, новая БД, замена действующего ERP-интерфейса, внешние аналитические источники как часть production-расчета.</w:t>
+              <w:t>новая отдельная система, новая БД, замена действующего ERP-интерфейса, внешние аналитические файлы как источник расчета.</w:t>
             </w:r>
           </w:p>
         </w:tc>
@@ -1255,7 +1255,7 @@
                 <w:color w:val="1E1E1E"/>
                 <w:sz w:val="15"/>
               </w:rPr>
-              <w:t>Использование Google Sheets, аналитических XLSX или Python-скриптов как production-источника данных.</w:t>
+              <w:t>Использование внешних аналитических файлов как production-источника данных.</w:t>
             </w:r>
           </w:p>
         </w:tc>
@@ -1727,7 +1727,7 @@
                 <w:color w:val="1E1E1E"/>
                 <w:sz w:val="14"/>
               </w:rPr>
-              <w:t>MariaDB ERP + существующий SOAP-сервис 1С. На тестовом стенде допускается PostgreSQL-кэш загруженной выгрузки 1С; он не является новым production-источником.</w:t>
+              <w:t>MariaDB ERP + существующий SOAP-сервис 1С.</w:t>
             </w:r>
           </w:p>
         </w:tc>
@@ -1783,7 +1783,7 @@
                 <w:color w:val="1E1E1E"/>
                 <w:sz w:val="14"/>
               </w:rPr>
-              <w:t>Фоновый runner</w:t>
+              <w:t>Фоновый обработчик</w:t>
             </w:r>
           </w:p>
         </w:tc>
@@ -1837,7 +1837,7 @@
                 <w:color w:val="1E1E1E"/>
                 <w:sz w:val="14"/>
               </w:rPr>
-              <w:t>Те же источники, но в batch-режиме с сохранением снапшота результата.</w:t>
+              <w:t>Те же источники, но в пакетном режиме с сохранением снапшота результата.</w:t>
             </w:r>
           </w:p>
         </w:tc>
@@ -1924,7 +1924,7 @@
                 <w:color w:val="1E1E1E"/>
                 <w:sz w:val="19"/>
               </w:rPr>
-              <w:t>`Сальдо по поставкам` - ERP-расчет по выбранным поставкам. `Монитор ERP ↔ 1С` - отдельный процесс сравнения двух систем. Бейдж вида `9/9 ОК` в матрице документов не означает, что сальдо ERP равно сальдо 1С.</w:t>
+              <w:t>`Сальдо по поставкам` - ERP-расчет по выбранным поставкам. `Монитор ERP ↔ 1С` - отдельный процесс сравнения двух систем. На странице сальдо нельзя показывать документные статусы 1С: там остаются только `Долг` и `Переплата`.</w:t>
             </w:r>
           </w:p>
         </w:tc>
@@ -2052,7 +2052,7 @@
           <w:rFonts w:ascii="Calibri" w:hAnsi="Calibri"/>
           <w:sz w:val="20"/>
         </w:rPr>
-        <w:t>Пользователь видит итог: совпало ли сальдо, сколько документов совпало, чего нет в 1С, чего нет в ERP, какие поля расходятся.</w:t>
+        <w:t>Пользователь видит итог: совпало ли сальдо, сколько документов совпало, чего нет в 1С, чего нет в ERP, какие реквизиты или суммы расходятся.</w:t>
       </w:r>
     </w:p>
     <w:p>
@@ -2065,7 +2065,7 @@
           <w:rFonts w:ascii="Calibri" w:hAnsi="Calibri"/>
           <w:sz w:val="20"/>
         </w:rPr>
-        <w:t>Фоновые runner-задачи могут запускать тяжелую историческую сверку по расписанию и сохранять результат для просмотра без пересчета на экране.</w:t>
+        <w:t>Фоновые обработчики могут запускать тяжелую историческую сверку по расписанию и сохранять результат для просмотра без пересчета на экране.</w:t>
       </w:r>
     </w:p>
     <w:p>
@@ -2652,7 +2652,7 @@
                 <w:color w:val="1E1E1E"/>
                 <w:sz w:val="14"/>
               </w:rPr>
-              <w:t>Страница `Монитор ERP ↔ 1С` запускается отдельно от матрицы сальдо и работает через существующий PHP/SOAP-слой или согласованный кэш выгрузки 1С.</w:t>
+              <w:t>Страница `Монитор ERP ↔ 1С` запускается отдельно от матрицы сальдо и работает через текущий PHP ERP и существующий сервис 1С.</w:t>
             </w:r>
           </w:p>
         </w:tc>
@@ -2735,7 +2735,7 @@
                 <w:color w:val="1E1E1E"/>
                 <w:sz w:val="14"/>
               </w:rPr>
-              <w:t>Сверка ERP ↔ 1С возвращает статусы `ОК`, `Нет в 1С`, `Нет в ERP`, `Сумма расходится`, `Вопрос по НДС`, `Нет СФ/УПД`, `Сальдо расходится`, `Ошибка источника`.</w:t>
+              <w:t>Сверка ERP ↔ 1С возвращает статусы `ОК`, `Нет в 1С`, `Нет в ERP`, `Сумма расходится`, `Дата расходится`, `Номер расходится`, `Договор/заявка расходится`, `НДС расходится`, `Нет СФ/УПД`, `Сальдо расходится`, `Ошибка источника`.</w:t>
             </w:r>
           </w:p>
         </w:tc>
@@ -2762,7 +2762,7 @@
                 <w:color w:val="1E1E1E"/>
                 <w:sz w:val="14"/>
               </w:rPr>
-              <w:t>Пользователь видит причину, ERP-значение, 1С-значение, поле расхождения и ссылку на исходный документ.</w:t>
+              <w:t>Пользователь видит причину, ERP-значение, 1С-значение, конкретный вид расхождения и ссылку на исходный документ.</w:t>
             </w:r>
           </w:p>
         </w:tc>
@@ -3067,7 +3067,7 @@
                 <w:color w:val="1E1E1E"/>
                 <w:sz w:val="14"/>
               </w:rPr>
-              <w:t>Runner может выполнять тяжелые сверки по расписанию или вручную в фоне.</w:t>
+              <w:t>Фоновый обработчик может выполнять тяжелые сверки по расписанию или вручную.</w:t>
             </w:r>
           </w:p>
         </w:tc>
@@ -4724,7 +4724,7 @@
           <w:color w:val="2E74B5"/>
           <w:sz w:val="26"/>
         </w:rPr>
-        <w:t>3.2 Фоновый runner для тяжелых сверок</w:t>
+        <w:t>3.2 Фоновый обработчик для тяжелых сверок</w:t>
       </w:r>
     </w:p>
     <w:p>
@@ -4737,7 +4737,7 @@
           <w:color w:val="1E1E1E"/>
           <w:sz w:val="21"/>
         </w:rPr>
-        <w:t>Историческая сверка по всем клиентам и всем договорам не должна выполняться как обычный HTTP-запрос экрана. Для этого нужен runner, который запускается по расписанию или вручную и сохраняет результат.</w:t>
+        <w:t>Историческая сверка по всем клиентам и всем договорам не должна выполняться как обычный HTTP-запрос экрана. Для этого нужен фоновый обработчик, который запускается по расписанию или вручную и сохраняет результат.</w:t>
       </w:r>
     </w:p>
     <w:tbl>
@@ -5031,7 +5031,7 @@
                 <w:color w:val="1E1E1E"/>
                 <w:sz w:val="15"/>
               </w:rPr>
-              <w:t>у каждого результата показывать дату расчета и источник: live ERP, live 1С, cached 1С, ошибка источника</w:t>
+              <w:t>у каждого результата показывать дату расчета и источник: ERP, 1С, сохраненный результат, ошибка источника</w:t>
             </w:r>
           </w:p>
         </w:tc>
@@ -5143,7 +5143,7 @@
                 <w:color w:val="1E1E1E"/>
                 <w:sz w:val="15"/>
               </w:rPr>
-              <w:t>XLSX по результату runner формируется из сохраненного результата, а не пересчитывает тяжелые SQL и SOAP заново</w:t>
+              <w:t>XLSX по результату фонового обработчика формируется из сохраненного результата, а не пересчитывает тяжелые SQL и SOAP заново</w:t>
             </w:r>
           </w:p>
         </w:tc>
@@ -5293,7 +5293,7 @@
                 <w:color w:val="1E1E1E"/>
                 <w:sz w:val="15"/>
               </w:rPr>
-              <w:t>На экране нельзя запускать расчет по всему клиенту без лимита. Live-экран должен иметь малый лимит по умолчанию и пагинацию: контрольная проверка показала, что 3 поставки считаются десятки секунд, а 10 поставок уже неприемлемы как обычный HTTP-запрос. Тяжелые процедуры `get_paidsum/get_realizsum/get_expensessum/get_profit` выполнять только по выбранным `spec_id`. Большие выборки - только через runner/кэш результата.</w:t>
+              <w:t>На экране нельзя запускать расчет по всему клиенту без лимита. Онлайн-экран должен иметь малый лимит по умолчанию и пагинацию: контрольная проверка показала, что 3 поставки считаются десятки секунд, а 10 поставок уже неприемлемы как обычный HTTP-запрос. Тяжелые процедуры `get_paidsum/get_realizsum/get_expensessum/get_profit` выполнять только по выбранным `spec_id`. Большие выборки - только через фоновый обработчик/кэш результата.</w:t>
             </w:r>
           </w:p>
         </w:tc>
@@ -5461,7 +5461,7 @@
                 <w:color w:val="1E1E1E"/>
                 <w:sz w:val="15"/>
               </w:rPr>
-              <w:t>Production-реализация остается в текущем PHP ERP + MariaDB + SOAP 1С. Python-скрипты, Google Drive/Sheets и тестовые JSON/XLSX не являются частью промышленного контура. PostgreSQL можно использовать только как технический кэш загруженной выгрузки 1С, если это отдельно утверждено архитектурой.</w:t>
+              <w:t>Production-реализация остается в текущем PHP ERP + MariaDB + сервис 1С. Внешние аналитические файлы не являются источником расчета.</w:t>
             </w:r>
           </w:p>
         </w:tc>
@@ -6869,7 +6869,7 @@
                 <w:color w:val="1E1E1E"/>
                 <w:sz w:val="16"/>
               </w:rPr>
-              <w:t>Ошибки показываются бейджами с конкретной причиной: сумма, номер, дата, договор, НДС, отсутствие документа. Общий текст `Реквизиты` без поля не использовать.</w:t>
+              <w:t>На странице сальдо показывать только `Долг` и `Переплата`. Документные статусы 1С (`Нет в 1С`, `Сумма расходится`, `Договор/заявка расходится`) показывать только на странице `Монитор ERP ↔ 1С`.</w:t>
             </w:r>
           </w:p>
         </w:tc>
@@ -6944,7 +6944,7 @@
       <w:r>
         <w:drawing>
           <wp:inline xmlns:a="http://schemas.openxmlformats.org/drawingml/2006/main" xmlns:pic="http://schemas.openxmlformats.org/drawingml/2006/picture">
-            <wp:extent cx="5760720" cy="3343918"/>
+            <wp:extent cx="5760720" cy="3600450"/>
             <wp:docPr id="1" name="Picture 1"/>
             <wp:cNvGraphicFramePr>
               <a:graphicFrameLocks noChangeAspect="1"/>
@@ -6965,7 +6965,7 @@
                   <pic:spPr>
                     <a:xfrm>
                       <a:off x="0" y="0"/>
-                      <a:ext cx="5760720" cy="3343918"/>
+                      <a:ext cx="5760720" cy="3600450"/>
                     </a:xfrm>
                     <a:prstGeom prst="rect"/>
                   </pic:spPr>
@@ -6988,7 +6988,7 @@
           <w:color w:val="5A5A5A"/>
           <w:sz w:val="16"/>
         </w:rPr>
-        <w:t>Рисунок 1. Тестовый вид экрана `Сальдо по поставкам`: несколько поставок договора 660/1, ERP-расчет без обращения к 1С.</w:t>
+        <w:t>Рисунок 1. Референсный вид экрана `Сальдо по поставкам`: несколько поставок договора 660/1, ERP-расчет без обращения к 1С.</w:t>
       </w:r>
     </w:p>
     <w:p>
@@ -6999,7 +6999,7 @@
       <w:r>
         <w:drawing>
           <wp:inline xmlns:a="http://schemas.openxmlformats.org/drawingml/2006/main" xmlns:pic="http://schemas.openxmlformats.org/drawingml/2006/picture">
-            <wp:extent cx="5760720" cy="3928991"/>
+            <wp:extent cx="5760720" cy="3600450"/>
             <wp:docPr id="2" name="Picture 2"/>
             <wp:cNvGraphicFramePr>
               <a:graphicFrameLocks noChangeAspect="1"/>
@@ -7020,7 +7020,7 @@
                   <pic:spPr>
                     <a:xfrm>
                       <a:off x="0" y="0"/>
-                      <a:ext cx="5760720" cy="3928991"/>
+                      <a:ext cx="5760720" cy="3600450"/>
                     </a:xfrm>
                     <a:prstGeom prst="rect"/>
                   </pic:spPr>
@@ -7043,7 +7043,7 @@
           <w:color w:val="5A5A5A"/>
           <w:sz w:val="16"/>
         </w:rPr>
-        <w:t>Рисунок 2. Тестовый вид страницы `Монитор ERP ↔ 1С`: проверка документов по нескольким поставкам с источником 1С.</w:t>
+        <w:t>Рисунок 2. Референсный вид страницы `Монитор ERP ↔ 1С`: проверка документов по нескольким поставкам с источником 1С.</w:t>
       </w:r>
     </w:p>
     <w:p>
@@ -7054,7 +7054,7 @@
       <w:r>
         <w:drawing>
           <wp:inline xmlns:a="http://schemas.openxmlformats.org/drawingml/2006/main" xmlns:pic="http://schemas.openxmlformats.org/drawingml/2006/picture">
-            <wp:extent cx="5760720" cy="3240405"/>
+            <wp:extent cx="5760720" cy="3600450"/>
             <wp:docPr id="3" name="Picture 3"/>
             <wp:cNvGraphicFramePr>
               <a:graphicFrameLocks noChangeAspect="1"/>
@@ -7075,7 +7075,7 @@
                   <pic:spPr>
                     <a:xfrm>
                       <a:off x="0" y="0"/>
-                      <a:ext cx="5760720" cy="3240405"/>
+                      <a:ext cx="5760720" cy="3600450"/>
                     </a:xfrm>
                     <a:prstGeom prst="rect"/>
                   </pic:spPr>
@@ -11631,7 +11631,7 @@
                 <w:color w:val="1E1E1E"/>
                 <w:sz w:val="16"/>
               </w:rPr>
-              <w:t>Live-экран показывает небольшой срез поставок: рекомендуемый стартовый лимит 3-5, все остальное через пагинацию или фоновую XLSX/runner-задачу. Проверка `limit=10` на договоре 660/1 не уложилась в приемлемое время.</w:t>
+              <w:t>Онлайн-экран показывает небольшой срез поставок: рекомендуемый стартовый лимит 3-5, все остальное через пагинацию или фоновую XLSX-задачу. Проверка 10 поставок на договоре 660/1 не уложилась в приемлемое время.</w:t>
             </w:r>
           </w:p>
         </w:tc>
@@ -14658,7 +14658,7 @@
                 <w:color w:val="1E1E1E"/>
                 <w:sz w:val="15"/>
               </w:rPr>
-              <w:t>массив кодов расхождений с суммами ERP/1С, операцией, документом и причиной.</w:t>
+              <w:t>для сальдо: только `Долг`/`Переплата`; для монитора ERP ↔ 1С: массив кодов расхождений с суммами ERP/1С, операцией, документом и причиной.</w:t>
             </w:r>
           </w:p>
         </w:tc>
@@ -15524,65 +15524,18 @@
         <w:spacing w:after="40"/>
       </w:pPr>
     </w:p>
-    <w:tbl>
-      <w:tblGrid>
-        <w:gridCol w:w="9360"/>
-      </w:tblGrid>
-      <w:tblPr>
-        <w:tblStyle w:val="TableGrid"/>
-        <w:tblW w:type="dxa" w:w="9360"/>
-        <w:tblLayout w:type="fixed"/>
-        <w:tblLook w:firstColumn="1" w:firstRow="1" w:lastColumn="0" w:lastRow="0" w:noHBand="0" w:noVBand="1" w:val="04A0"/>
-        <w:tblInd w:w="120" w:type="dxa"/>
-      </w:tblPr>
-      <w:tr>
-        <w:tc>
-          <w:tcPr>
-            <w:tcW w:type="dxa" w:w="9360"/>
-            <w:tcMar>
-              <w:top w:w="80" w:type="dxa"/>
-              <w:start w:w="120" w:type="dxa"/>
-              <w:bottom w:w="80" w:type="dxa"/>
-              <w:end w:w="120" w:type="dxa"/>
-            </w:tcMar>
-            <w:vAlign w:val="center"/>
-            <w:shd w:fill="F4F6F9"/>
-          </w:tcPr>
-          <w:p>
-            <w:pPr>
-              <w:spacing w:after="60"/>
-            </w:pPr>
-            <w:r/>
-            <w:r>
-              <w:rPr>
-                <w:rFonts w:ascii="Calibri" w:hAnsi="Calibri"/>
-                <w:b/>
-                <w:color w:val="1F4D78"/>
-                <w:sz w:val="20"/>
-              </w:rPr>
-              <w:t>Где смотреть рабочий пример</w:t>
-            </w:r>
-          </w:p>
-          <w:p>
-            <w:pPr>
-              <w:spacing w:after="0" w:line="288" w:lineRule="auto"/>
-            </w:pPr>
-            <w:r>
-              <w:rPr>
-                <w:rFonts w:ascii="Calibri" w:hAnsi="Calibri"/>
-                <w:color w:val="1E1E1E"/>
-                <w:sz w:val="19"/>
-              </w:rPr>
-              <w:t>В репозитории рабочая проверка находится в `tools/server_mariadb_reconciliation_report.py`. Она не является production-кодом, но фиксирует SQL-связи, формулы, структуру данных и правила XLSX, которые нужно реализовать в ERP.</w:t>
-            </w:r>
-          </w:p>
-        </w:tc>
-      </w:tr>
-    </w:tbl>
     <w:p>
       <w:pPr>
-        <w:spacing w:after="40"/>
+        <w:spacing w:before="0" w:after="120" w:line="300" w:lineRule="auto"/>
       </w:pPr>
+      <w:r>
+        <w:rPr>
+          <w:rFonts w:ascii="Calibri" w:hAnsi="Calibri"/>
+          <w:color w:val="1E1E1E"/>
+          <w:sz w:val="21"/>
+        </w:rPr>
+        <w:t>Источник экрана и XLSX должен быть один: нормализованный набор блоков поставок, собранный из исходных таблиц ERP по правилам выше.</w:t>
+      </w:r>
     </w:p>
     <w:p>
       <w:pPr>
@@ -16500,7 +16453,7 @@
                 <w:color w:val="1E1E1E"/>
                 <w:sz w:val="15"/>
               </w:rPr>
-              <w:t>результат проверок ERP + 1С</w:t>
+              <w:t>расчет сальдо ERP</w:t>
             </w:r>
           </w:p>
         </w:tc>
@@ -16527,7 +16480,7 @@
                 <w:color w:val="1E1E1E"/>
                 <w:sz w:val="15"/>
               </w:rPr>
-              <w:t>один или несколько бейджей.</w:t>
+              <w:t>`Долг`, `Переплата` или пусто при нулевой дельте. Документные статусы 1С здесь не показывать.</w:t>
             </w:r>
           </w:p>
         </w:tc>
@@ -16556,9 +16509,10 @@
     </w:p>
     <w:tbl>
       <w:tblGrid>
-        <w:gridCol w:w="1500"/>
-        <w:gridCol w:w="3730"/>
-        <w:gridCol w:w="4130"/>
+        <w:gridCol w:w="1450"/>
+        <w:gridCol w:w="1600"/>
+        <w:gridCol w:w="3270"/>
+        <w:gridCol w:w="3040"/>
       </w:tblGrid>
       <w:tblPr>
         <w:tblStyle w:val="TableGrid"/>
@@ -16570,7 +16524,7 @@
       <w:tr>
         <w:tc>
           <w:tcPr>
-            <w:tcW w:type="dxa" w:w="1500"/>
+            <w:tcW w:type="dxa" w:w="1450"/>
             <w:tcMar>
               <w:top w:w="80" w:type="dxa"/>
               <w:start w:w="120" w:type="dxa"/>
@@ -16591,15 +16545,15 @@
                 <w:rFonts w:ascii="Calibri" w:hAnsi="Calibri"/>
                 <w:b/>
                 <w:color w:val="1F4D78"/>
-                <w:sz w:val="14"/>
-              </w:rPr>
-              <w:t>Статус</w:t>
-            </w:r>
-          </w:p>
-        </w:tc>
-        <w:tc>
-          <w:tcPr>
-            <w:tcW w:type="dxa" w:w="3730"/>
+                <w:sz w:val="13"/>
+              </w:rPr>
+              <w:t>Страница</w:t>
+            </w:r>
+          </w:p>
+        </w:tc>
+        <w:tc>
+          <w:tcPr>
+            <w:tcW w:type="dxa" w:w="1600"/>
             <w:tcMar>
               <w:top w:w="80" w:type="dxa"/>
               <w:start w:w="120" w:type="dxa"/>
@@ -16620,15 +16574,15 @@
                 <w:rFonts w:ascii="Calibri" w:hAnsi="Calibri"/>
                 <w:b/>
                 <w:color w:val="1F4D78"/>
-                <w:sz w:val="14"/>
-              </w:rPr>
-              <w:t>Когда ставим</w:t>
-            </w:r>
-          </w:p>
-        </w:tc>
-        <w:tc>
-          <w:tcPr>
-            <w:tcW w:type="dxa" w:w="4130"/>
+                <w:sz w:val="13"/>
+              </w:rPr>
+              <w:t>Статус</w:t>
+            </w:r>
+          </w:p>
+        </w:tc>
+        <w:tc>
+          <w:tcPr>
+            <w:tcW w:type="dxa" w:w="3270"/>
             <w:tcMar>
               <w:top w:w="80" w:type="dxa"/>
               <w:start w:w="120" w:type="dxa"/>
@@ -16649,7 +16603,36 @@
                 <w:rFonts w:ascii="Calibri" w:hAnsi="Calibri"/>
                 <w:b/>
                 <w:color w:val="1F4D78"/>
-                <w:sz w:val="14"/>
+                <w:sz w:val="13"/>
+              </w:rPr>
+              <w:t>Когда ставим</w:t>
+            </w:r>
+          </w:p>
+        </w:tc>
+        <w:tc>
+          <w:tcPr>
+            <w:tcW w:type="dxa" w:w="3040"/>
+            <w:tcMar>
+              <w:top w:w="80" w:type="dxa"/>
+              <w:start w:w="120" w:type="dxa"/>
+              <w:bottom w:w="80" w:type="dxa"/>
+              <w:end w:w="120" w:type="dxa"/>
+            </w:tcMar>
+            <w:vAlign w:val="center"/>
+            <w:shd w:fill="E8EEF5"/>
+          </w:tcPr>
+          <w:p>
+            <w:pPr>
+              <w:spacing w:before="0" w:after="0" w:line="252" w:lineRule="auto"/>
+              <w:jc w:val="center"/>
+            </w:pPr>
+            <w:r/>
+            <w:r>
+              <w:rPr>
+                <w:rFonts w:ascii="Calibri" w:hAnsi="Calibri"/>
+                <w:b/>
+                <w:color w:val="1F4D78"/>
+                <w:sz w:val="13"/>
               </w:rPr>
               <w:t>Что сравниваем</w:t>
             </w:r>
@@ -16659,82 +16642,109 @@
       <w:tr>
         <w:tc>
           <w:tcPr>
-            <w:tcW w:type="dxa" w:w="1500"/>
-            <w:tcMar>
-              <w:top w:w="80" w:type="dxa"/>
-              <w:start w:w="120" w:type="dxa"/>
-              <w:bottom w:w="80" w:type="dxa"/>
-              <w:end w:w="120" w:type="dxa"/>
-            </w:tcMar>
-            <w:vAlign w:val="center"/>
-          </w:tcPr>
-          <w:p>
-            <w:pPr>
-              <w:spacing w:before="0" w:after="0" w:line="252" w:lineRule="auto"/>
-            </w:pPr>
-            <w:r/>
-            <w:r>
-              <w:rPr>
-                <w:rFonts w:ascii="Calibri" w:hAnsi="Calibri"/>
-                <w:b w:val="0"/>
-                <w:color w:val="1E1E1E"/>
-                <w:sz w:val="14"/>
-              </w:rPr>
-              <w:t>ОК</w:t>
-            </w:r>
-          </w:p>
-        </w:tc>
-        <w:tc>
-          <w:tcPr>
-            <w:tcW w:type="dxa" w:w="3730"/>
-            <w:tcMar>
-              <w:top w:w="80" w:type="dxa"/>
-              <w:start w:w="120" w:type="dxa"/>
-              <w:bottom w:w="80" w:type="dxa"/>
-              <w:end w:w="120" w:type="dxa"/>
-            </w:tcMar>
-            <w:vAlign w:val="center"/>
-          </w:tcPr>
-          <w:p>
-            <w:pPr>
-              <w:spacing w:before="0" w:after="0" w:line="252" w:lineRule="auto"/>
-            </w:pPr>
-            <w:r/>
-            <w:r>
-              <w:rPr>
-                <w:rFonts w:ascii="Calibri" w:hAnsi="Calibri"/>
-                <w:b w:val="0"/>
-                <w:color w:val="1E1E1E"/>
-                <w:sz w:val="14"/>
-              </w:rPr>
-              <w:t>ключ документа найден в ERP и 1С, суммы и обязательные поля совпали</w:t>
-            </w:r>
-          </w:p>
-        </w:tc>
-        <w:tc>
-          <w:tcPr>
-            <w:tcW w:type="dxa" w:w="4130"/>
-            <w:tcMar>
-              <w:top w:w="80" w:type="dxa"/>
-              <w:start w:w="120" w:type="dxa"/>
-              <w:bottom w:w="80" w:type="dxa"/>
-              <w:end w:w="120" w:type="dxa"/>
-            </w:tcMar>
-            <w:vAlign w:val="center"/>
-          </w:tcPr>
-          <w:p>
-            <w:pPr>
-              <w:spacing w:before="0" w:after="0" w:line="252" w:lineRule="auto"/>
-            </w:pPr>
-            <w:r/>
-            <w:r>
-              <w:rPr>
-                <w:rFonts w:ascii="Calibri" w:hAnsi="Calibri"/>
-                <w:b w:val="0"/>
-                <w:color w:val="1E1E1E"/>
-                <w:sz w:val="14"/>
-              </w:rPr>
-              <w:t>код/номер/дата, организация, контрагент, договор, сумма, валюта, НДС при наличии</w:t>
+            <w:tcW w:type="dxa" w:w="1450"/>
+            <w:tcMar>
+              <w:top w:w="80" w:type="dxa"/>
+              <w:start w:w="120" w:type="dxa"/>
+              <w:bottom w:w="80" w:type="dxa"/>
+              <w:end w:w="120" w:type="dxa"/>
+            </w:tcMar>
+            <w:vAlign w:val="center"/>
+          </w:tcPr>
+          <w:p>
+            <w:pPr>
+              <w:spacing w:before="0" w:after="0" w:line="252" w:lineRule="auto"/>
+            </w:pPr>
+            <w:r/>
+            <w:r>
+              <w:rPr>
+                <w:rFonts w:ascii="Calibri" w:hAnsi="Calibri"/>
+                <w:b w:val="0"/>
+                <w:color w:val="1E1E1E"/>
+                <w:sz w:val="13"/>
+              </w:rPr>
+              <w:t>Сальдо</w:t>
+            </w:r>
+          </w:p>
+        </w:tc>
+        <w:tc>
+          <w:tcPr>
+            <w:tcW w:type="dxa" w:w="1600"/>
+            <w:tcMar>
+              <w:top w:w="80" w:type="dxa"/>
+              <w:start w:w="120" w:type="dxa"/>
+              <w:bottom w:w="80" w:type="dxa"/>
+              <w:end w:w="120" w:type="dxa"/>
+            </w:tcMar>
+            <w:vAlign w:val="center"/>
+          </w:tcPr>
+          <w:p>
+            <w:pPr>
+              <w:spacing w:before="0" w:after="0" w:line="252" w:lineRule="auto"/>
+            </w:pPr>
+            <w:r/>
+            <w:r>
+              <w:rPr>
+                <w:rFonts w:ascii="Calibri" w:hAnsi="Calibri"/>
+                <w:b w:val="0"/>
+                <w:color w:val="1E1E1E"/>
+                <w:sz w:val="13"/>
+              </w:rPr>
+              <w:t>Долг</w:t>
+            </w:r>
+          </w:p>
+        </w:tc>
+        <w:tc>
+          <w:tcPr>
+            <w:tcW w:type="dxa" w:w="3270"/>
+            <w:tcMar>
+              <w:top w:w="80" w:type="dxa"/>
+              <w:start w:w="120" w:type="dxa"/>
+              <w:bottom w:w="80" w:type="dxa"/>
+              <w:end w:w="120" w:type="dxa"/>
+            </w:tcMar>
+            <w:vAlign w:val="center"/>
+          </w:tcPr>
+          <w:p>
+            <w:pPr>
+              <w:spacing w:before="0" w:after="0" w:line="252" w:lineRule="auto"/>
+            </w:pPr>
+            <w:r/>
+            <w:r>
+              <w:rPr>
+                <w:rFonts w:ascii="Calibri" w:hAnsi="Calibri"/>
+                <w:b w:val="0"/>
+                <w:color w:val="1E1E1E"/>
+                <w:sz w:val="13"/>
+              </w:rPr>
+              <w:t>`SUM(get_paidsum) - SUM(get_realizsum) &lt; -0,01`</w:t>
+            </w:r>
+          </w:p>
+        </w:tc>
+        <w:tc>
+          <w:tcPr>
+            <w:tcW w:type="dxa" w:w="3040"/>
+            <w:tcMar>
+              <w:top w:w="80" w:type="dxa"/>
+              <w:start w:w="120" w:type="dxa"/>
+              <w:bottom w:w="80" w:type="dxa"/>
+              <w:end w:w="120" w:type="dxa"/>
+            </w:tcMar>
+            <w:vAlign w:val="center"/>
+          </w:tcPr>
+          <w:p>
+            <w:pPr>
+              <w:spacing w:before="0" w:after="0" w:line="252" w:lineRule="auto"/>
+            </w:pPr>
+            <w:r/>
+            <w:r>
+              <w:rPr>
+                <w:rFonts w:ascii="Calibri" w:hAnsi="Calibri"/>
+                <w:b w:val="0"/>
+                <w:color w:val="1E1E1E"/>
+                <w:sz w:val="13"/>
+              </w:rPr>
+              <w:t>только ERP-расчет по выбранным поставкам</w:t>
             </w:r>
           </w:p>
         </w:tc>
@@ -16742,82 +16752,109 @@
       <w:tr>
         <w:tc>
           <w:tcPr>
-            <w:tcW w:type="dxa" w:w="1500"/>
-            <w:tcMar>
-              <w:top w:w="80" w:type="dxa"/>
-              <w:start w:w="120" w:type="dxa"/>
-              <w:bottom w:w="80" w:type="dxa"/>
-              <w:end w:w="120" w:type="dxa"/>
-            </w:tcMar>
-            <w:vAlign w:val="center"/>
-          </w:tcPr>
-          <w:p>
-            <w:pPr>
-              <w:spacing w:before="0" w:after="0" w:line="252" w:lineRule="auto"/>
-            </w:pPr>
-            <w:r/>
-            <w:r>
-              <w:rPr>
-                <w:rFonts w:ascii="Calibri" w:hAnsi="Calibri"/>
-                <w:b w:val="0"/>
-                <w:color w:val="1E1E1E"/>
-                <w:sz w:val="14"/>
-              </w:rPr>
-              <w:t>Нет в 1С</w:t>
-            </w:r>
-          </w:p>
-        </w:tc>
-        <w:tc>
-          <w:tcPr>
-            <w:tcW w:type="dxa" w:w="3730"/>
-            <w:tcMar>
-              <w:top w:w="80" w:type="dxa"/>
-              <w:start w:w="120" w:type="dxa"/>
-              <w:bottom w:w="80" w:type="dxa"/>
-              <w:end w:w="120" w:type="dxa"/>
-            </w:tcMar>
-            <w:vAlign w:val="center"/>
-          </w:tcPr>
-          <w:p>
-            <w:pPr>
-              <w:spacing w:before="0" w:after="0" w:line="252" w:lineRule="auto"/>
-            </w:pPr>
-            <w:r/>
-            <w:r>
-              <w:rPr>
-                <w:rFonts w:ascii="Calibri" w:hAnsi="Calibri"/>
-                <w:b w:val="0"/>
-                <w:color w:val="1E1E1E"/>
-                <w:sz w:val="14"/>
-              </w:rPr>
-              <w:t>ERP-документ должен быть выгружен/найден, но 1С-сервис его не вернул</w:t>
-            </w:r>
-          </w:p>
-        </w:tc>
-        <w:tc>
-          <w:tcPr>
-            <w:tcW w:type="dxa" w:w="4130"/>
-            <w:tcMar>
-              <w:top w:w="80" w:type="dxa"/>
-              <w:start w:w="120" w:type="dxa"/>
-              <w:bottom w:w="80" w:type="dxa"/>
-              <w:end w:w="120" w:type="dxa"/>
-            </w:tcMar>
-            <w:vAlign w:val="center"/>
-          </w:tcPr>
-          <w:p>
-            <w:pPr>
-              <w:spacing w:before="0" w:after="0" w:line="252" w:lineRule="auto"/>
-            </w:pPr>
-            <w:r/>
-            <w:r>
-              <w:rPr>
-                <w:rFonts w:ascii="Calibri" w:hAnsi="Calibri"/>
-                <w:b w:val="0"/>
-                <w:color w:val="1E1E1E"/>
-                <w:sz w:val="14"/>
-              </w:rPr>
-              <w:t>по типу документа, коду 1С, номеру, дате и организации</w:t>
+            <w:tcW w:type="dxa" w:w="1450"/>
+            <w:tcMar>
+              <w:top w:w="80" w:type="dxa"/>
+              <w:start w:w="120" w:type="dxa"/>
+              <w:bottom w:w="80" w:type="dxa"/>
+              <w:end w:w="120" w:type="dxa"/>
+            </w:tcMar>
+            <w:vAlign w:val="center"/>
+          </w:tcPr>
+          <w:p>
+            <w:pPr>
+              <w:spacing w:before="0" w:after="0" w:line="252" w:lineRule="auto"/>
+            </w:pPr>
+            <w:r/>
+            <w:r>
+              <w:rPr>
+                <w:rFonts w:ascii="Calibri" w:hAnsi="Calibri"/>
+                <w:b w:val="0"/>
+                <w:color w:val="1E1E1E"/>
+                <w:sz w:val="13"/>
+              </w:rPr>
+              <w:t>Сальдо</w:t>
+            </w:r>
+          </w:p>
+        </w:tc>
+        <w:tc>
+          <w:tcPr>
+            <w:tcW w:type="dxa" w:w="1600"/>
+            <w:tcMar>
+              <w:top w:w="80" w:type="dxa"/>
+              <w:start w:w="120" w:type="dxa"/>
+              <w:bottom w:w="80" w:type="dxa"/>
+              <w:end w:w="120" w:type="dxa"/>
+            </w:tcMar>
+            <w:vAlign w:val="center"/>
+          </w:tcPr>
+          <w:p>
+            <w:pPr>
+              <w:spacing w:before="0" w:after="0" w:line="252" w:lineRule="auto"/>
+            </w:pPr>
+            <w:r/>
+            <w:r>
+              <w:rPr>
+                <w:rFonts w:ascii="Calibri" w:hAnsi="Calibri"/>
+                <w:b w:val="0"/>
+                <w:color w:val="1E1E1E"/>
+                <w:sz w:val="13"/>
+              </w:rPr>
+              <w:t>Переплата</w:t>
+            </w:r>
+          </w:p>
+        </w:tc>
+        <w:tc>
+          <w:tcPr>
+            <w:tcW w:type="dxa" w:w="3270"/>
+            <w:tcMar>
+              <w:top w:w="80" w:type="dxa"/>
+              <w:start w:w="120" w:type="dxa"/>
+              <w:bottom w:w="80" w:type="dxa"/>
+              <w:end w:w="120" w:type="dxa"/>
+            </w:tcMar>
+            <w:vAlign w:val="center"/>
+          </w:tcPr>
+          <w:p>
+            <w:pPr>
+              <w:spacing w:before="0" w:after="0" w:line="252" w:lineRule="auto"/>
+            </w:pPr>
+            <w:r/>
+            <w:r>
+              <w:rPr>
+                <w:rFonts w:ascii="Calibri" w:hAnsi="Calibri"/>
+                <w:b w:val="0"/>
+                <w:color w:val="1E1E1E"/>
+                <w:sz w:val="13"/>
+              </w:rPr>
+              <w:t>`SUM(get_paidsum) - SUM(get_realizsum) &gt; 0,01`</w:t>
+            </w:r>
+          </w:p>
+        </w:tc>
+        <w:tc>
+          <w:tcPr>
+            <w:tcW w:type="dxa" w:w="3040"/>
+            <w:tcMar>
+              <w:top w:w="80" w:type="dxa"/>
+              <w:start w:w="120" w:type="dxa"/>
+              <w:bottom w:w="80" w:type="dxa"/>
+              <w:end w:w="120" w:type="dxa"/>
+            </w:tcMar>
+            <w:vAlign w:val="center"/>
+          </w:tcPr>
+          <w:p>
+            <w:pPr>
+              <w:spacing w:before="0" w:after="0" w:line="252" w:lineRule="auto"/>
+            </w:pPr>
+            <w:r/>
+            <w:r>
+              <w:rPr>
+                <w:rFonts w:ascii="Calibri" w:hAnsi="Calibri"/>
+                <w:b w:val="0"/>
+                <w:color w:val="1E1E1E"/>
+                <w:sz w:val="13"/>
+              </w:rPr>
+              <w:t>только ERP-расчет по выбранным поставкам</w:t>
             </w:r>
           </w:p>
         </w:tc>
@@ -16825,82 +16862,109 @@
       <w:tr>
         <w:tc>
           <w:tcPr>
-            <w:tcW w:type="dxa" w:w="1500"/>
-            <w:tcMar>
-              <w:top w:w="80" w:type="dxa"/>
-              <w:start w:w="120" w:type="dxa"/>
-              <w:bottom w:w="80" w:type="dxa"/>
-              <w:end w:w="120" w:type="dxa"/>
-            </w:tcMar>
-            <w:vAlign w:val="center"/>
-          </w:tcPr>
-          <w:p>
-            <w:pPr>
-              <w:spacing w:before="0" w:after="0" w:line="252" w:lineRule="auto"/>
-            </w:pPr>
-            <w:r/>
-            <w:r>
-              <w:rPr>
-                <w:rFonts w:ascii="Calibri" w:hAnsi="Calibri"/>
-                <w:b w:val="0"/>
-                <w:color w:val="1E1E1E"/>
-                <w:sz w:val="14"/>
-              </w:rPr>
-              <w:t>Нет в ERP</w:t>
-            </w:r>
-          </w:p>
-        </w:tc>
-        <w:tc>
-          <w:tcPr>
-            <w:tcW w:type="dxa" w:w="3730"/>
-            <w:tcMar>
-              <w:top w:w="80" w:type="dxa"/>
-              <w:start w:w="120" w:type="dxa"/>
-              <w:bottom w:w="80" w:type="dxa"/>
-              <w:end w:w="120" w:type="dxa"/>
-            </w:tcMar>
-            <w:vAlign w:val="center"/>
-          </w:tcPr>
-          <w:p>
-            <w:pPr>
-              <w:spacing w:before="0" w:after="0" w:line="252" w:lineRule="auto"/>
-            </w:pPr>
-            <w:r/>
-            <w:r>
-              <w:rPr>
-                <w:rFonts w:ascii="Calibri" w:hAnsi="Calibri"/>
-                <w:b w:val="0"/>
-                <w:color w:val="1E1E1E"/>
-                <w:sz w:val="14"/>
-              </w:rPr>
-              <w:t>1С вернула документ, которому нет ERP-аналога</w:t>
-            </w:r>
-          </w:p>
-        </w:tc>
-        <w:tc>
-          <w:tcPr>
-            <w:tcW w:type="dxa" w:w="4130"/>
-            <w:tcMar>
-              <w:top w:w="80" w:type="dxa"/>
-              <w:start w:w="120" w:type="dxa"/>
-              <w:bottom w:w="80" w:type="dxa"/>
-              <w:end w:w="120" w:type="dxa"/>
-            </w:tcMar>
-            <w:vAlign w:val="center"/>
-          </w:tcPr>
-          <w:p>
-            <w:pPr>
-              <w:spacing w:before="0" w:after="0" w:line="252" w:lineRule="auto"/>
-            </w:pPr>
-            <w:r/>
-            <w:r>
-              <w:rPr>
-                <w:rFonts w:ascii="Calibri" w:hAnsi="Calibri"/>
-                <w:b w:val="0"/>
-                <w:color w:val="1E1E1E"/>
-                <w:sz w:val="14"/>
-              </w:rPr>
-              <w:t>номер/дата/организация/контрагент/договор/сумма</w:t>
+            <w:tcW w:type="dxa" w:w="1450"/>
+            <w:tcMar>
+              <w:top w:w="80" w:type="dxa"/>
+              <w:start w:w="120" w:type="dxa"/>
+              <w:bottom w:w="80" w:type="dxa"/>
+              <w:end w:w="120" w:type="dxa"/>
+            </w:tcMar>
+            <w:vAlign w:val="center"/>
+          </w:tcPr>
+          <w:p>
+            <w:pPr>
+              <w:spacing w:before="0" w:after="0" w:line="252" w:lineRule="auto"/>
+            </w:pPr>
+            <w:r/>
+            <w:r>
+              <w:rPr>
+                <w:rFonts w:ascii="Calibri" w:hAnsi="Calibri"/>
+                <w:b w:val="0"/>
+                <w:color w:val="1E1E1E"/>
+                <w:sz w:val="13"/>
+              </w:rPr>
+              <w:t>Сальдо</w:t>
+            </w:r>
+          </w:p>
+        </w:tc>
+        <w:tc>
+          <w:tcPr>
+            <w:tcW w:type="dxa" w:w="1600"/>
+            <w:tcMar>
+              <w:top w:w="80" w:type="dxa"/>
+              <w:start w:w="120" w:type="dxa"/>
+              <w:bottom w:w="80" w:type="dxa"/>
+              <w:end w:w="120" w:type="dxa"/>
+            </w:tcMar>
+            <w:vAlign w:val="center"/>
+          </w:tcPr>
+          <w:p>
+            <w:pPr>
+              <w:spacing w:before="0" w:after="0" w:line="252" w:lineRule="auto"/>
+            </w:pPr>
+            <w:r/>
+            <w:r>
+              <w:rPr>
+                <w:rFonts w:ascii="Calibri" w:hAnsi="Calibri"/>
+                <w:b w:val="0"/>
+                <w:color w:val="1E1E1E"/>
+                <w:sz w:val="13"/>
+              </w:rPr>
+              <w:t>пусто</w:t>
+            </w:r>
+          </w:p>
+        </w:tc>
+        <w:tc>
+          <w:tcPr>
+            <w:tcW w:type="dxa" w:w="3270"/>
+            <w:tcMar>
+              <w:top w:w="80" w:type="dxa"/>
+              <w:start w:w="120" w:type="dxa"/>
+              <w:bottom w:w="80" w:type="dxa"/>
+              <w:end w:w="120" w:type="dxa"/>
+            </w:tcMar>
+            <w:vAlign w:val="center"/>
+          </w:tcPr>
+          <w:p>
+            <w:pPr>
+              <w:spacing w:before="0" w:after="0" w:line="252" w:lineRule="auto"/>
+            </w:pPr>
+            <w:r/>
+            <w:r>
+              <w:rPr>
+                <w:rFonts w:ascii="Calibri" w:hAnsi="Calibri"/>
+                <w:b w:val="0"/>
+                <w:color w:val="1E1E1E"/>
+                <w:sz w:val="13"/>
+              </w:rPr>
+              <w:t>дельта в пределах допуска 0,01</w:t>
+            </w:r>
+          </w:p>
+        </w:tc>
+        <w:tc>
+          <w:tcPr>
+            <w:tcW w:type="dxa" w:w="3040"/>
+            <w:tcMar>
+              <w:top w:w="80" w:type="dxa"/>
+              <w:start w:w="120" w:type="dxa"/>
+              <w:bottom w:w="80" w:type="dxa"/>
+              <w:end w:w="120" w:type="dxa"/>
+            </w:tcMar>
+            <w:vAlign w:val="center"/>
+          </w:tcPr>
+          <w:p>
+            <w:pPr>
+              <w:spacing w:before="0" w:after="0" w:line="252" w:lineRule="auto"/>
+            </w:pPr>
+            <w:r/>
+            <w:r>
+              <w:rPr>
+                <w:rFonts w:ascii="Calibri" w:hAnsi="Calibri"/>
+                <w:b w:val="0"/>
+                <w:color w:val="1E1E1E"/>
+                <w:sz w:val="13"/>
+              </w:rPr>
+              <w:t>не показывать `ОК` и не показывать статусы 1С</w:t>
             </w:r>
           </w:p>
         </w:tc>
@@ -16908,82 +16972,109 @@
       <w:tr>
         <w:tc>
           <w:tcPr>
-            <w:tcW w:type="dxa" w:w="1500"/>
-            <w:tcMar>
-              <w:top w:w="80" w:type="dxa"/>
-              <w:start w:w="120" w:type="dxa"/>
-              <w:bottom w:w="80" w:type="dxa"/>
-              <w:end w:w="120" w:type="dxa"/>
-            </w:tcMar>
-            <w:vAlign w:val="center"/>
-          </w:tcPr>
-          <w:p>
-            <w:pPr>
-              <w:spacing w:before="0" w:after="0" w:line="252" w:lineRule="auto"/>
-            </w:pPr>
-            <w:r/>
-            <w:r>
-              <w:rPr>
-                <w:rFonts w:ascii="Calibri" w:hAnsi="Calibri"/>
-                <w:b w:val="0"/>
-                <w:color w:val="1E1E1E"/>
-                <w:sz w:val="14"/>
-              </w:rPr>
-              <w:t>Сумма расходится</w:t>
-            </w:r>
-          </w:p>
-        </w:tc>
-        <w:tc>
-          <w:tcPr>
-            <w:tcW w:type="dxa" w:w="3730"/>
-            <w:tcMar>
-              <w:top w:w="80" w:type="dxa"/>
-              <w:start w:w="120" w:type="dxa"/>
-              <w:bottom w:w="80" w:type="dxa"/>
-              <w:end w:w="120" w:type="dxa"/>
-            </w:tcMar>
-            <w:vAlign w:val="center"/>
-          </w:tcPr>
-          <w:p>
-            <w:pPr>
-              <w:spacing w:before="0" w:after="0" w:line="252" w:lineRule="auto"/>
-            </w:pPr>
-            <w:r/>
-            <w:r>
-              <w:rPr>
-                <w:rFonts w:ascii="Calibri" w:hAnsi="Calibri"/>
-                <w:b w:val="0"/>
-                <w:color w:val="1E1E1E"/>
-                <w:sz w:val="14"/>
-              </w:rPr>
-              <w:t>документ или агрегат найден, но сумма отличается больше допуска</w:t>
-            </w:r>
-          </w:p>
-        </w:tc>
-        <w:tc>
-          <w:tcPr>
-            <w:tcW w:type="dxa" w:w="4130"/>
-            <w:tcMar>
-              <w:top w:w="80" w:type="dxa"/>
-              <w:start w:w="120" w:type="dxa"/>
-              <w:bottom w:w="80" w:type="dxa"/>
-              <w:end w:w="120" w:type="dxa"/>
-            </w:tcMar>
-            <w:vAlign w:val="center"/>
-          </w:tcPr>
-          <w:p>
-            <w:pPr>
-              <w:spacing w:before="0" w:after="0" w:line="252" w:lineRule="auto"/>
-            </w:pPr>
-            <w:r/>
-            <w:r>
-              <w:rPr>
-                <w:rFonts w:ascii="Calibri" w:hAnsi="Calibri"/>
-                <w:b w:val="0"/>
-                <w:color w:val="1E1E1E"/>
-                <w:sz w:val="14"/>
-              </w:rPr>
-              <w:t>счет, оплата, акт, расход или итог поставки</w:t>
+            <w:tcW w:type="dxa" w:w="1450"/>
+            <w:tcMar>
+              <w:top w:w="80" w:type="dxa"/>
+              <w:start w:w="120" w:type="dxa"/>
+              <w:bottom w:w="80" w:type="dxa"/>
+              <w:end w:w="120" w:type="dxa"/>
+            </w:tcMar>
+            <w:vAlign w:val="center"/>
+          </w:tcPr>
+          <w:p>
+            <w:pPr>
+              <w:spacing w:before="0" w:after="0" w:line="252" w:lineRule="auto"/>
+            </w:pPr>
+            <w:r/>
+            <w:r>
+              <w:rPr>
+                <w:rFonts w:ascii="Calibri" w:hAnsi="Calibri"/>
+                <w:b w:val="0"/>
+                <w:color w:val="1E1E1E"/>
+                <w:sz w:val="13"/>
+              </w:rPr>
+              <w:t>Монитор ERP ↔ 1С</w:t>
+            </w:r>
+          </w:p>
+        </w:tc>
+        <w:tc>
+          <w:tcPr>
+            <w:tcW w:type="dxa" w:w="1600"/>
+            <w:tcMar>
+              <w:top w:w="80" w:type="dxa"/>
+              <w:start w:w="120" w:type="dxa"/>
+              <w:bottom w:w="80" w:type="dxa"/>
+              <w:end w:w="120" w:type="dxa"/>
+            </w:tcMar>
+            <w:vAlign w:val="center"/>
+          </w:tcPr>
+          <w:p>
+            <w:pPr>
+              <w:spacing w:before="0" w:after="0" w:line="252" w:lineRule="auto"/>
+            </w:pPr>
+            <w:r/>
+            <w:r>
+              <w:rPr>
+                <w:rFonts w:ascii="Calibri" w:hAnsi="Calibri"/>
+                <w:b w:val="0"/>
+                <w:color w:val="1E1E1E"/>
+                <w:sz w:val="13"/>
+              </w:rPr>
+              <w:t>ОК</w:t>
+            </w:r>
+          </w:p>
+        </w:tc>
+        <w:tc>
+          <w:tcPr>
+            <w:tcW w:type="dxa" w:w="3270"/>
+            <w:tcMar>
+              <w:top w:w="80" w:type="dxa"/>
+              <w:start w:w="120" w:type="dxa"/>
+              <w:bottom w:w="80" w:type="dxa"/>
+              <w:end w:w="120" w:type="dxa"/>
+            </w:tcMar>
+            <w:vAlign w:val="center"/>
+          </w:tcPr>
+          <w:p>
+            <w:pPr>
+              <w:spacing w:before="0" w:after="0" w:line="252" w:lineRule="auto"/>
+            </w:pPr>
+            <w:r/>
+            <w:r>
+              <w:rPr>
+                <w:rFonts w:ascii="Calibri" w:hAnsi="Calibri"/>
+                <w:b w:val="0"/>
+                <w:color w:val="1E1E1E"/>
+                <w:sz w:val="13"/>
+              </w:rPr>
+              <w:t>ключ документа найден в ERP и 1С, суммы и обязательные реквизиты совпали</w:t>
+            </w:r>
+          </w:p>
+        </w:tc>
+        <w:tc>
+          <w:tcPr>
+            <w:tcW w:type="dxa" w:w="3040"/>
+            <w:tcMar>
+              <w:top w:w="80" w:type="dxa"/>
+              <w:start w:w="120" w:type="dxa"/>
+              <w:bottom w:w="80" w:type="dxa"/>
+              <w:end w:w="120" w:type="dxa"/>
+            </w:tcMar>
+            <w:vAlign w:val="center"/>
+          </w:tcPr>
+          <w:p>
+            <w:pPr>
+              <w:spacing w:before="0" w:after="0" w:line="252" w:lineRule="auto"/>
+            </w:pPr>
+            <w:r/>
+            <w:r>
+              <w:rPr>
+                <w:rFonts w:ascii="Calibri" w:hAnsi="Calibri"/>
+                <w:b w:val="0"/>
+                <w:color w:val="1E1E1E"/>
+                <w:sz w:val="13"/>
+              </w:rPr>
+              <w:t>код/номер/дата, организация, контрагент, договор, сумма, валюта, НДС при наличии</w:t>
             </w:r>
           </w:p>
         </w:tc>
@@ -16991,82 +17082,109 @@
       <w:tr>
         <w:tc>
           <w:tcPr>
-            <w:tcW w:type="dxa" w:w="1500"/>
-            <w:tcMar>
-              <w:top w:w="80" w:type="dxa"/>
-              <w:start w:w="120" w:type="dxa"/>
-              <w:bottom w:w="80" w:type="dxa"/>
-              <w:end w:w="120" w:type="dxa"/>
-            </w:tcMar>
-            <w:vAlign w:val="center"/>
-          </w:tcPr>
-          <w:p>
-            <w:pPr>
-              <w:spacing w:before="0" w:after="0" w:line="252" w:lineRule="auto"/>
-            </w:pPr>
-            <w:r/>
-            <w:r>
-              <w:rPr>
-                <w:rFonts w:ascii="Calibri" w:hAnsi="Calibri"/>
-                <w:b w:val="0"/>
-                <w:color w:val="1E1E1E"/>
-                <w:sz w:val="14"/>
-              </w:rPr>
-              <w:t>Сальдо расходится</w:t>
-            </w:r>
-          </w:p>
-        </w:tc>
-        <w:tc>
-          <w:tcPr>
-            <w:tcW w:type="dxa" w:w="3730"/>
-            <w:tcMar>
-              <w:top w:w="80" w:type="dxa"/>
-              <w:start w:w="120" w:type="dxa"/>
-              <w:bottom w:w="80" w:type="dxa"/>
-              <w:end w:w="120" w:type="dxa"/>
-            </w:tcMar>
-            <w:vAlign w:val="center"/>
-          </w:tcPr>
-          <w:p>
-            <w:pPr>
-              <w:spacing w:before="0" w:after="0" w:line="252" w:lineRule="auto"/>
-            </w:pPr>
-            <w:r/>
-            <w:r>
-              <w:rPr>
-                <w:rFonts w:ascii="Calibri" w:hAnsi="Calibri"/>
-                <w:b w:val="0"/>
-                <w:color w:val="1E1E1E"/>
-                <w:sz w:val="14"/>
-              </w:rPr>
-              <w:t>начальное, обороты или конечное сальдо ERP и 1С отличаются</w:t>
-            </w:r>
-          </w:p>
-        </w:tc>
-        <w:tc>
-          <w:tcPr>
-            <w:tcW w:type="dxa" w:w="4130"/>
-            <w:tcMar>
-              <w:top w:w="80" w:type="dxa"/>
-              <w:start w:w="120" w:type="dxa"/>
-              <w:bottom w:w="80" w:type="dxa"/>
-              <w:end w:w="120" w:type="dxa"/>
-            </w:tcMar>
-            <w:vAlign w:val="center"/>
-          </w:tcPr>
-          <w:p>
-            <w:pPr>
-              <w:spacing w:before="0" w:after="0" w:line="252" w:lineRule="auto"/>
-            </w:pPr>
-            <w:r/>
-            <w:r>
-              <w:rPr>
-                <w:rFonts w:ascii="Calibri" w:hAnsi="Calibri"/>
-                <w:b w:val="0"/>
-                <w:color w:val="1E1E1E"/>
-                <w:sz w:val="14"/>
-              </w:rPr>
-              <w:t>только для отдельной страницы сверки ERP ↔ 1С</w:t>
+            <w:tcW w:type="dxa" w:w="1450"/>
+            <w:tcMar>
+              <w:top w:w="80" w:type="dxa"/>
+              <w:start w:w="120" w:type="dxa"/>
+              <w:bottom w:w="80" w:type="dxa"/>
+              <w:end w:w="120" w:type="dxa"/>
+            </w:tcMar>
+            <w:vAlign w:val="center"/>
+          </w:tcPr>
+          <w:p>
+            <w:pPr>
+              <w:spacing w:before="0" w:after="0" w:line="252" w:lineRule="auto"/>
+            </w:pPr>
+            <w:r/>
+            <w:r>
+              <w:rPr>
+                <w:rFonts w:ascii="Calibri" w:hAnsi="Calibri"/>
+                <w:b w:val="0"/>
+                <w:color w:val="1E1E1E"/>
+                <w:sz w:val="13"/>
+              </w:rPr>
+              <w:t>Монитор ERP ↔ 1С</w:t>
+            </w:r>
+          </w:p>
+        </w:tc>
+        <w:tc>
+          <w:tcPr>
+            <w:tcW w:type="dxa" w:w="1600"/>
+            <w:tcMar>
+              <w:top w:w="80" w:type="dxa"/>
+              <w:start w:w="120" w:type="dxa"/>
+              <w:bottom w:w="80" w:type="dxa"/>
+              <w:end w:w="120" w:type="dxa"/>
+            </w:tcMar>
+            <w:vAlign w:val="center"/>
+          </w:tcPr>
+          <w:p>
+            <w:pPr>
+              <w:spacing w:before="0" w:after="0" w:line="252" w:lineRule="auto"/>
+            </w:pPr>
+            <w:r/>
+            <w:r>
+              <w:rPr>
+                <w:rFonts w:ascii="Calibri" w:hAnsi="Calibri"/>
+                <w:b w:val="0"/>
+                <w:color w:val="1E1E1E"/>
+                <w:sz w:val="13"/>
+              </w:rPr>
+              <w:t>Нет в 1С</w:t>
+            </w:r>
+          </w:p>
+        </w:tc>
+        <w:tc>
+          <w:tcPr>
+            <w:tcW w:type="dxa" w:w="3270"/>
+            <w:tcMar>
+              <w:top w:w="80" w:type="dxa"/>
+              <w:start w:w="120" w:type="dxa"/>
+              <w:bottom w:w="80" w:type="dxa"/>
+              <w:end w:w="120" w:type="dxa"/>
+            </w:tcMar>
+            <w:vAlign w:val="center"/>
+          </w:tcPr>
+          <w:p>
+            <w:pPr>
+              <w:spacing w:before="0" w:after="0" w:line="252" w:lineRule="auto"/>
+            </w:pPr>
+            <w:r/>
+            <w:r>
+              <w:rPr>
+                <w:rFonts w:ascii="Calibri" w:hAnsi="Calibri"/>
+                <w:b w:val="0"/>
+                <w:color w:val="1E1E1E"/>
+                <w:sz w:val="13"/>
+              </w:rPr>
+              <w:t>ERP-документ должен быть выгружен/найден, но 1С-сервис его не вернул</w:t>
+            </w:r>
+          </w:p>
+        </w:tc>
+        <w:tc>
+          <w:tcPr>
+            <w:tcW w:type="dxa" w:w="3040"/>
+            <w:tcMar>
+              <w:top w:w="80" w:type="dxa"/>
+              <w:start w:w="120" w:type="dxa"/>
+              <w:bottom w:w="80" w:type="dxa"/>
+              <w:end w:w="120" w:type="dxa"/>
+            </w:tcMar>
+            <w:vAlign w:val="center"/>
+          </w:tcPr>
+          <w:p>
+            <w:pPr>
+              <w:spacing w:before="0" w:after="0" w:line="252" w:lineRule="auto"/>
+            </w:pPr>
+            <w:r/>
+            <w:r>
+              <w:rPr>
+                <w:rFonts w:ascii="Calibri" w:hAnsi="Calibri"/>
+                <w:b w:val="0"/>
+                <w:color w:val="1E1E1E"/>
+                <w:sz w:val="13"/>
+              </w:rPr>
+              <w:t>тип документа, код 1С, номер, дата, организация</w:t>
             </w:r>
           </w:p>
         </w:tc>
@@ -17074,82 +17192,109 @@
       <w:tr>
         <w:tc>
           <w:tcPr>
-            <w:tcW w:type="dxa" w:w="1500"/>
-            <w:tcMar>
-              <w:top w:w="80" w:type="dxa"/>
-              <w:start w:w="120" w:type="dxa"/>
-              <w:bottom w:w="80" w:type="dxa"/>
-              <w:end w:w="120" w:type="dxa"/>
-            </w:tcMar>
-            <w:vAlign w:val="center"/>
-          </w:tcPr>
-          <w:p>
-            <w:pPr>
-              <w:spacing w:before="0" w:after="0" w:line="252" w:lineRule="auto"/>
-            </w:pPr>
-            <w:r/>
-            <w:r>
-              <w:rPr>
-                <w:rFonts w:ascii="Calibri" w:hAnsi="Calibri"/>
-                <w:b w:val="0"/>
-                <w:color w:val="1E1E1E"/>
-                <w:sz w:val="14"/>
-              </w:rPr>
-              <w:t>Договор расходится</w:t>
-            </w:r>
-          </w:p>
-        </w:tc>
-        <w:tc>
-          <w:tcPr>
-            <w:tcW w:type="dxa" w:w="3730"/>
-            <w:tcMar>
-              <w:top w:w="80" w:type="dxa"/>
-              <w:start w:w="120" w:type="dxa"/>
-              <w:bottom w:w="80" w:type="dxa"/>
-              <w:end w:w="120" w:type="dxa"/>
-            </w:tcMar>
-            <w:vAlign w:val="center"/>
-          </w:tcPr>
-          <w:p>
-            <w:pPr>
-              <w:spacing w:before="0" w:after="0" w:line="252" w:lineRule="auto"/>
-            </w:pPr>
-            <w:r/>
-            <w:r>
-              <w:rPr>
-                <w:rFonts w:ascii="Calibri" w:hAnsi="Calibri"/>
-                <w:b w:val="0"/>
-                <w:color w:val="1E1E1E"/>
-                <w:sz w:val="14"/>
-              </w:rPr>
-              <w:t>сумма или номер найдены, но договор/заявка не совпадает</w:t>
-            </w:r>
-          </w:p>
-        </w:tc>
-        <w:tc>
-          <w:tcPr>
-            <w:tcW w:type="dxa" w:w="4130"/>
-            <w:tcMar>
-              <w:top w:w="80" w:type="dxa"/>
-              <w:start w:w="120" w:type="dxa"/>
-              <w:bottom w:w="80" w:type="dxa"/>
-              <w:end w:w="120" w:type="dxa"/>
-            </w:tcMar>
-            <w:vAlign w:val="center"/>
-          </w:tcPr>
-          <w:p>
-            <w:pPr>
-              <w:spacing w:before="0" w:after="0" w:line="252" w:lineRule="auto"/>
-            </w:pPr>
-            <w:r/>
-            <w:r>
-              <w:rPr>
-                <w:rFonts w:ascii="Calibri" w:hAnsi="Calibri"/>
-                <w:b w:val="0"/>
-                <w:color w:val="1E1E1E"/>
-                <w:sz w:val="14"/>
-              </w:rPr>
-              <w:t>dogcode, spec code, владелец, организация</w:t>
+            <w:tcW w:type="dxa" w:w="1450"/>
+            <w:tcMar>
+              <w:top w:w="80" w:type="dxa"/>
+              <w:start w:w="120" w:type="dxa"/>
+              <w:bottom w:w="80" w:type="dxa"/>
+              <w:end w:w="120" w:type="dxa"/>
+            </w:tcMar>
+            <w:vAlign w:val="center"/>
+          </w:tcPr>
+          <w:p>
+            <w:pPr>
+              <w:spacing w:before="0" w:after="0" w:line="252" w:lineRule="auto"/>
+            </w:pPr>
+            <w:r/>
+            <w:r>
+              <w:rPr>
+                <w:rFonts w:ascii="Calibri" w:hAnsi="Calibri"/>
+                <w:b w:val="0"/>
+                <w:color w:val="1E1E1E"/>
+                <w:sz w:val="13"/>
+              </w:rPr>
+              <w:t>Монитор ERP ↔ 1С</w:t>
+            </w:r>
+          </w:p>
+        </w:tc>
+        <w:tc>
+          <w:tcPr>
+            <w:tcW w:type="dxa" w:w="1600"/>
+            <w:tcMar>
+              <w:top w:w="80" w:type="dxa"/>
+              <w:start w:w="120" w:type="dxa"/>
+              <w:bottom w:w="80" w:type="dxa"/>
+              <w:end w:w="120" w:type="dxa"/>
+            </w:tcMar>
+            <w:vAlign w:val="center"/>
+          </w:tcPr>
+          <w:p>
+            <w:pPr>
+              <w:spacing w:before="0" w:after="0" w:line="252" w:lineRule="auto"/>
+            </w:pPr>
+            <w:r/>
+            <w:r>
+              <w:rPr>
+                <w:rFonts w:ascii="Calibri" w:hAnsi="Calibri"/>
+                <w:b w:val="0"/>
+                <w:color w:val="1E1E1E"/>
+                <w:sz w:val="13"/>
+              </w:rPr>
+              <w:t>Нет в ERP</w:t>
+            </w:r>
+          </w:p>
+        </w:tc>
+        <w:tc>
+          <w:tcPr>
+            <w:tcW w:type="dxa" w:w="3270"/>
+            <w:tcMar>
+              <w:top w:w="80" w:type="dxa"/>
+              <w:start w:w="120" w:type="dxa"/>
+              <w:bottom w:w="80" w:type="dxa"/>
+              <w:end w:w="120" w:type="dxa"/>
+            </w:tcMar>
+            <w:vAlign w:val="center"/>
+          </w:tcPr>
+          <w:p>
+            <w:pPr>
+              <w:spacing w:before="0" w:after="0" w:line="252" w:lineRule="auto"/>
+            </w:pPr>
+            <w:r/>
+            <w:r>
+              <w:rPr>
+                <w:rFonts w:ascii="Calibri" w:hAnsi="Calibri"/>
+                <w:b w:val="0"/>
+                <w:color w:val="1E1E1E"/>
+                <w:sz w:val="13"/>
+              </w:rPr>
+              <w:t>1С вернула документ, которому нет ERP-аналога</w:t>
+            </w:r>
+          </w:p>
+        </w:tc>
+        <w:tc>
+          <w:tcPr>
+            <w:tcW w:type="dxa" w:w="3040"/>
+            <w:tcMar>
+              <w:top w:w="80" w:type="dxa"/>
+              <w:start w:w="120" w:type="dxa"/>
+              <w:bottom w:w="80" w:type="dxa"/>
+              <w:end w:w="120" w:type="dxa"/>
+            </w:tcMar>
+            <w:vAlign w:val="center"/>
+          </w:tcPr>
+          <w:p>
+            <w:pPr>
+              <w:spacing w:before="0" w:after="0" w:line="252" w:lineRule="auto"/>
+            </w:pPr>
+            <w:r/>
+            <w:r>
+              <w:rPr>
+                <w:rFonts w:ascii="Calibri" w:hAnsi="Calibri"/>
+                <w:b w:val="0"/>
+                <w:color w:val="1E1E1E"/>
+                <w:sz w:val="13"/>
+              </w:rPr>
+              <w:t>номер/дата/организация/контрагент/договор/сумма</w:t>
             </w:r>
           </w:p>
         </w:tc>
@@ -17157,82 +17302,109 @@
       <w:tr>
         <w:tc>
           <w:tcPr>
-            <w:tcW w:type="dxa" w:w="1500"/>
-            <w:tcMar>
-              <w:top w:w="80" w:type="dxa"/>
-              <w:start w:w="120" w:type="dxa"/>
-              <w:bottom w:w="80" w:type="dxa"/>
-              <w:end w:w="120" w:type="dxa"/>
-            </w:tcMar>
-            <w:vAlign w:val="center"/>
-          </w:tcPr>
-          <w:p>
-            <w:pPr>
-              <w:spacing w:before="0" w:after="0" w:line="252" w:lineRule="auto"/>
-            </w:pPr>
-            <w:r/>
-            <w:r>
-              <w:rPr>
-                <w:rFonts w:ascii="Calibri" w:hAnsi="Calibri"/>
-                <w:b w:val="0"/>
-                <w:color w:val="1E1E1E"/>
-                <w:sz w:val="14"/>
-              </w:rPr>
-              <w:t>Нет СФ/УПД</w:t>
-            </w:r>
-          </w:p>
-        </w:tc>
-        <w:tc>
-          <w:tcPr>
-            <w:tcW w:type="dxa" w:w="3730"/>
-            <w:tcMar>
-              <w:top w:w="80" w:type="dxa"/>
-              <w:start w:w="120" w:type="dxa"/>
-              <w:bottom w:w="80" w:type="dxa"/>
-              <w:end w:w="120" w:type="dxa"/>
-            </w:tcMar>
-            <w:vAlign w:val="center"/>
-          </w:tcPr>
-          <w:p>
-            <w:pPr>
-              <w:spacing w:before="0" w:after="0" w:line="252" w:lineRule="auto"/>
-            </w:pPr>
-            <w:r/>
-            <w:r>
-              <w:rPr>
-                <w:rFonts w:ascii="Calibri" w:hAnsi="Calibri"/>
-                <w:b w:val="0"/>
-                <w:color w:val="1E1E1E"/>
-                <w:sz w:val="14"/>
-              </w:rPr>
-              <w:t>после успешной загрузки источников нет ожидаемого закрывающего документа</w:t>
-            </w:r>
-          </w:p>
-        </w:tc>
-        <w:tc>
-          <w:tcPr>
-            <w:tcW w:type="dxa" w:w="4130"/>
-            <w:tcMar>
-              <w:top w:w="80" w:type="dxa"/>
-              <w:start w:w="120" w:type="dxa"/>
-              <w:bottom w:w="80" w:type="dxa"/>
-              <w:end w:w="120" w:type="dxa"/>
-            </w:tcMar>
-            <w:vAlign w:val="center"/>
-          </w:tcPr>
-          <w:p>
-            <w:pPr>
-              <w:spacing w:before="0" w:after="0" w:line="252" w:lineRule="auto"/>
-            </w:pPr>
-            <w:r/>
-            <w:r>
-              <w:rPr>
-                <w:rFonts w:ascii="Calibri" w:hAnsi="Calibri"/>
-                <w:b w:val="0"/>
-                <w:color w:val="1E1E1E"/>
-                <w:sz w:val="14"/>
-              </w:rPr>
-              <w:t>наличие акта/УПД/СФ в ERP и 1С; не путать с возмещаемостью</w:t>
+            <w:tcW w:type="dxa" w:w="1450"/>
+            <w:tcMar>
+              <w:top w:w="80" w:type="dxa"/>
+              <w:start w:w="120" w:type="dxa"/>
+              <w:bottom w:w="80" w:type="dxa"/>
+              <w:end w:w="120" w:type="dxa"/>
+            </w:tcMar>
+            <w:vAlign w:val="center"/>
+          </w:tcPr>
+          <w:p>
+            <w:pPr>
+              <w:spacing w:before="0" w:after="0" w:line="252" w:lineRule="auto"/>
+            </w:pPr>
+            <w:r/>
+            <w:r>
+              <w:rPr>
+                <w:rFonts w:ascii="Calibri" w:hAnsi="Calibri"/>
+                <w:b w:val="0"/>
+                <w:color w:val="1E1E1E"/>
+                <w:sz w:val="13"/>
+              </w:rPr>
+              <w:t>Монитор ERP ↔ 1С</w:t>
+            </w:r>
+          </w:p>
+        </w:tc>
+        <w:tc>
+          <w:tcPr>
+            <w:tcW w:type="dxa" w:w="1600"/>
+            <w:tcMar>
+              <w:top w:w="80" w:type="dxa"/>
+              <w:start w:w="120" w:type="dxa"/>
+              <w:bottom w:w="80" w:type="dxa"/>
+              <w:end w:w="120" w:type="dxa"/>
+            </w:tcMar>
+            <w:vAlign w:val="center"/>
+          </w:tcPr>
+          <w:p>
+            <w:pPr>
+              <w:spacing w:before="0" w:after="0" w:line="252" w:lineRule="auto"/>
+            </w:pPr>
+            <w:r/>
+            <w:r>
+              <w:rPr>
+                <w:rFonts w:ascii="Calibri" w:hAnsi="Calibri"/>
+                <w:b w:val="0"/>
+                <w:color w:val="1E1E1E"/>
+                <w:sz w:val="13"/>
+              </w:rPr>
+              <w:t>Сумма расходится</w:t>
+            </w:r>
+          </w:p>
+        </w:tc>
+        <w:tc>
+          <w:tcPr>
+            <w:tcW w:type="dxa" w:w="3270"/>
+            <w:tcMar>
+              <w:top w:w="80" w:type="dxa"/>
+              <w:start w:w="120" w:type="dxa"/>
+              <w:bottom w:w="80" w:type="dxa"/>
+              <w:end w:w="120" w:type="dxa"/>
+            </w:tcMar>
+            <w:vAlign w:val="center"/>
+          </w:tcPr>
+          <w:p>
+            <w:pPr>
+              <w:spacing w:before="0" w:after="0" w:line="252" w:lineRule="auto"/>
+            </w:pPr>
+            <w:r/>
+            <w:r>
+              <w:rPr>
+                <w:rFonts w:ascii="Calibri" w:hAnsi="Calibri"/>
+                <w:b w:val="0"/>
+                <w:color w:val="1E1E1E"/>
+                <w:sz w:val="13"/>
+              </w:rPr>
+              <w:t>документ или агрегат найден, но сумма отличается больше допуска</w:t>
+            </w:r>
+          </w:p>
+        </w:tc>
+        <w:tc>
+          <w:tcPr>
+            <w:tcW w:type="dxa" w:w="3040"/>
+            <w:tcMar>
+              <w:top w:w="80" w:type="dxa"/>
+              <w:start w:w="120" w:type="dxa"/>
+              <w:bottom w:w="80" w:type="dxa"/>
+              <w:end w:w="120" w:type="dxa"/>
+            </w:tcMar>
+            <w:vAlign w:val="center"/>
+          </w:tcPr>
+          <w:p>
+            <w:pPr>
+              <w:spacing w:before="0" w:after="0" w:line="252" w:lineRule="auto"/>
+            </w:pPr>
+            <w:r/>
+            <w:r>
+              <w:rPr>
+                <w:rFonts w:ascii="Calibri" w:hAnsi="Calibri"/>
+                <w:b w:val="0"/>
+                <w:color w:val="1E1E1E"/>
+                <w:sz w:val="13"/>
+              </w:rPr>
+              <w:t>счет, оплата, акт, расход или итог поставки</w:t>
             </w:r>
           </w:p>
         </w:tc>
@@ -17240,82 +17412,109 @@
       <w:tr>
         <w:tc>
           <w:tcPr>
-            <w:tcW w:type="dxa" w:w="1500"/>
-            <w:tcMar>
-              <w:top w:w="80" w:type="dxa"/>
-              <w:start w:w="120" w:type="dxa"/>
-              <w:bottom w:w="80" w:type="dxa"/>
-              <w:end w:w="120" w:type="dxa"/>
-            </w:tcMar>
-            <w:vAlign w:val="center"/>
-          </w:tcPr>
-          <w:p>
-            <w:pPr>
-              <w:spacing w:before="0" w:after="0" w:line="252" w:lineRule="auto"/>
-            </w:pPr>
-            <w:r/>
-            <w:r>
-              <w:rPr>
-                <w:rFonts w:ascii="Calibri" w:hAnsi="Calibri"/>
-                <w:b w:val="0"/>
-                <w:color w:val="1E1E1E"/>
-                <w:sz w:val="14"/>
-              </w:rPr>
-              <w:t>Вопрос по НДС</w:t>
-            </w:r>
-          </w:p>
-        </w:tc>
-        <w:tc>
-          <w:tcPr>
-            <w:tcW w:type="dxa" w:w="3730"/>
-            <w:tcMar>
-              <w:top w:w="80" w:type="dxa"/>
-              <w:start w:w="120" w:type="dxa"/>
-              <w:bottom w:w="80" w:type="dxa"/>
-              <w:end w:w="120" w:type="dxa"/>
-            </w:tcMar>
-            <w:vAlign w:val="center"/>
-          </w:tcPr>
-          <w:p>
-            <w:pPr>
-              <w:spacing w:before="0" w:after="0" w:line="252" w:lineRule="auto"/>
-            </w:pPr>
-            <w:r/>
-            <w:r>
-              <w:rPr>
-                <w:rFonts w:ascii="Calibri" w:hAnsi="Calibri"/>
-                <w:b w:val="0"/>
-                <w:color w:val="1E1E1E"/>
-                <w:sz w:val="14"/>
-              </w:rPr>
-              <w:t>расход или акт найден, но ставка НДС ERP и ставка НДС 1С различаются</w:t>
-            </w:r>
-          </w:p>
-        </w:tc>
-        <w:tc>
-          <w:tcPr>
-            <w:tcW w:type="dxa" w:w="4130"/>
-            <w:tcMar>
-              <w:top w:w="80" w:type="dxa"/>
-              <w:start w:w="120" w:type="dxa"/>
-              <w:bottom w:w="80" w:type="dxa"/>
-              <w:end w:w="120" w:type="dxa"/>
-            </w:tcMar>
-            <w:vAlign w:val="center"/>
-          </w:tcPr>
-          <w:p>
-            <w:pPr>
-              <w:spacing w:before="0" w:after="0" w:line="252" w:lineRule="auto"/>
-            </w:pPr>
-            <w:r/>
-            <w:r>
-              <w:rPr>
-                <w:rFonts w:ascii="Calibri" w:hAnsi="Calibri"/>
-                <w:b w:val="0"/>
-                <w:color w:val="1E1E1E"/>
-                <w:sz w:val="14"/>
-              </w:rPr>
-              <w:t>только ставка НДС и сумма НДС; `f_isvozm` не является причиной этого статуса</w:t>
+            <w:tcW w:type="dxa" w:w="1450"/>
+            <w:tcMar>
+              <w:top w:w="80" w:type="dxa"/>
+              <w:start w:w="120" w:type="dxa"/>
+              <w:bottom w:w="80" w:type="dxa"/>
+              <w:end w:w="120" w:type="dxa"/>
+            </w:tcMar>
+            <w:vAlign w:val="center"/>
+          </w:tcPr>
+          <w:p>
+            <w:pPr>
+              <w:spacing w:before="0" w:after="0" w:line="252" w:lineRule="auto"/>
+            </w:pPr>
+            <w:r/>
+            <w:r>
+              <w:rPr>
+                <w:rFonts w:ascii="Calibri" w:hAnsi="Calibri"/>
+                <w:b w:val="0"/>
+                <w:color w:val="1E1E1E"/>
+                <w:sz w:val="13"/>
+              </w:rPr>
+              <w:t>Монитор ERP ↔ 1С</w:t>
+            </w:r>
+          </w:p>
+        </w:tc>
+        <w:tc>
+          <w:tcPr>
+            <w:tcW w:type="dxa" w:w="1600"/>
+            <w:tcMar>
+              <w:top w:w="80" w:type="dxa"/>
+              <w:start w:w="120" w:type="dxa"/>
+              <w:bottom w:w="80" w:type="dxa"/>
+              <w:end w:w="120" w:type="dxa"/>
+            </w:tcMar>
+            <w:vAlign w:val="center"/>
+          </w:tcPr>
+          <w:p>
+            <w:pPr>
+              <w:spacing w:before="0" w:after="0" w:line="252" w:lineRule="auto"/>
+            </w:pPr>
+            <w:r/>
+            <w:r>
+              <w:rPr>
+                <w:rFonts w:ascii="Calibri" w:hAnsi="Calibri"/>
+                <w:b w:val="0"/>
+                <w:color w:val="1E1E1E"/>
+                <w:sz w:val="13"/>
+              </w:rPr>
+              <w:t>Дата расходится</w:t>
+            </w:r>
+          </w:p>
+        </w:tc>
+        <w:tc>
+          <w:tcPr>
+            <w:tcW w:type="dxa" w:w="3270"/>
+            <w:tcMar>
+              <w:top w:w="80" w:type="dxa"/>
+              <w:start w:w="120" w:type="dxa"/>
+              <w:bottom w:w="80" w:type="dxa"/>
+              <w:end w:w="120" w:type="dxa"/>
+            </w:tcMar>
+            <w:vAlign w:val="center"/>
+          </w:tcPr>
+          <w:p>
+            <w:pPr>
+              <w:spacing w:before="0" w:after="0" w:line="252" w:lineRule="auto"/>
+            </w:pPr>
+            <w:r/>
+            <w:r>
+              <w:rPr>
+                <w:rFonts w:ascii="Calibri" w:hAnsi="Calibri"/>
+                <w:b w:val="0"/>
+                <w:color w:val="1E1E1E"/>
+                <w:sz w:val="13"/>
+              </w:rPr>
+              <w:t>документ найден, но дата ERP и дата 1С различаются</w:t>
+            </w:r>
+          </w:p>
+        </w:tc>
+        <w:tc>
+          <w:tcPr>
+            <w:tcW w:type="dxa" w:w="3040"/>
+            <w:tcMar>
+              <w:top w:w="80" w:type="dxa"/>
+              <w:start w:w="120" w:type="dxa"/>
+              <w:bottom w:w="80" w:type="dxa"/>
+              <w:end w:w="120" w:type="dxa"/>
+            </w:tcMar>
+            <w:vAlign w:val="center"/>
+          </w:tcPr>
+          <w:p>
+            <w:pPr>
+              <w:spacing w:before="0" w:after="0" w:line="252" w:lineRule="auto"/>
+            </w:pPr>
+            <w:r/>
+            <w:r>
+              <w:rPr>
+                <w:rFonts w:ascii="Calibri" w:hAnsi="Calibri"/>
+                <w:b w:val="0"/>
+                <w:color w:val="1E1E1E"/>
+                <w:sz w:val="13"/>
+              </w:rPr>
+              <w:t>дата документа/движения</w:t>
             </w:r>
           </w:p>
         </w:tc>
@@ -17323,82 +17522,109 @@
       <w:tr>
         <w:tc>
           <w:tcPr>
-            <w:tcW w:type="dxa" w:w="1500"/>
-            <w:tcMar>
-              <w:top w:w="80" w:type="dxa"/>
-              <w:start w:w="120" w:type="dxa"/>
-              <w:bottom w:w="80" w:type="dxa"/>
-              <w:end w:w="120" w:type="dxa"/>
-            </w:tcMar>
-            <w:vAlign w:val="center"/>
-          </w:tcPr>
-          <w:p>
-            <w:pPr>
-              <w:spacing w:before="0" w:after="0" w:line="252" w:lineRule="auto"/>
-            </w:pPr>
-            <w:r/>
-            <w:r>
-              <w:rPr>
-                <w:rFonts w:ascii="Calibri" w:hAnsi="Calibri"/>
-                <w:b w:val="0"/>
-                <w:color w:val="1E1E1E"/>
-                <w:sz w:val="14"/>
-              </w:rPr>
-              <w:t>Ожидает ключ 1С</w:t>
-            </w:r>
-          </w:p>
-        </w:tc>
-        <w:tc>
-          <w:tcPr>
-            <w:tcW w:type="dxa" w:w="3730"/>
-            <w:tcMar>
-              <w:top w:w="80" w:type="dxa"/>
-              <w:start w:w="120" w:type="dxa"/>
-              <w:bottom w:w="80" w:type="dxa"/>
-              <w:end w:w="120" w:type="dxa"/>
-            </w:tcMar>
-            <w:vAlign w:val="center"/>
-          </w:tcPr>
-          <w:p>
-            <w:pPr>
-              <w:spacing w:before="0" w:after="0" w:line="252" w:lineRule="auto"/>
-            </w:pPr>
-            <w:r/>
-            <w:r>
-              <w:rPr>
-                <w:rFonts w:ascii="Calibri" w:hAnsi="Calibri"/>
-                <w:b w:val="0"/>
-                <w:color w:val="1E1E1E"/>
-                <w:sz w:val="14"/>
-              </w:rPr>
-              <w:t>ERP-документ есть, но нет кода/даты 1С для надежного матчинга</w:t>
-            </w:r>
-          </w:p>
-        </w:tc>
-        <w:tc>
-          <w:tcPr>
-            <w:tcW w:type="dxa" w:w="4130"/>
-            <w:tcMar>
-              <w:top w:w="80" w:type="dxa"/>
-              <w:start w:w="120" w:type="dxa"/>
-              <w:bottom w:w="80" w:type="dxa"/>
-              <w:end w:w="120" w:type="dxa"/>
-            </w:tcMar>
-            <w:vAlign w:val="center"/>
-          </w:tcPr>
-          <w:p>
-            <w:pPr>
-              <w:spacing w:before="0" w:after="0" w:line="252" w:lineRule="auto"/>
-            </w:pPr>
-            <w:r/>
-            <w:r>
-              <w:rPr>
-                <w:rFonts w:ascii="Calibri" w:hAnsi="Calibri"/>
-                <w:b w:val="0"/>
-                <w:color w:val="1E1E1E"/>
-                <w:sz w:val="14"/>
-              </w:rPr>
-              <w:t>f_kod1c, f_dt1c, номер, дата</w:t>
+            <w:tcW w:type="dxa" w:w="1450"/>
+            <w:tcMar>
+              <w:top w:w="80" w:type="dxa"/>
+              <w:start w:w="120" w:type="dxa"/>
+              <w:bottom w:w="80" w:type="dxa"/>
+              <w:end w:w="120" w:type="dxa"/>
+            </w:tcMar>
+            <w:vAlign w:val="center"/>
+          </w:tcPr>
+          <w:p>
+            <w:pPr>
+              <w:spacing w:before="0" w:after="0" w:line="252" w:lineRule="auto"/>
+            </w:pPr>
+            <w:r/>
+            <w:r>
+              <w:rPr>
+                <w:rFonts w:ascii="Calibri" w:hAnsi="Calibri"/>
+                <w:b w:val="0"/>
+                <w:color w:val="1E1E1E"/>
+                <w:sz w:val="13"/>
+              </w:rPr>
+              <w:t>Монитор ERP ↔ 1С</w:t>
+            </w:r>
+          </w:p>
+        </w:tc>
+        <w:tc>
+          <w:tcPr>
+            <w:tcW w:type="dxa" w:w="1600"/>
+            <w:tcMar>
+              <w:top w:w="80" w:type="dxa"/>
+              <w:start w:w="120" w:type="dxa"/>
+              <w:bottom w:w="80" w:type="dxa"/>
+              <w:end w:w="120" w:type="dxa"/>
+            </w:tcMar>
+            <w:vAlign w:val="center"/>
+          </w:tcPr>
+          <w:p>
+            <w:pPr>
+              <w:spacing w:before="0" w:after="0" w:line="252" w:lineRule="auto"/>
+            </w:pPr>
+            <w:r/>
+            <w:r>
+              <w:rPr>
+                <w:rFonts w:ascii="Calibri" w:hAnsi="Calibri"/>
+                <w:b w:val="0"/>
+                <w:color w:val="1E1E1E"/>
+                <w:sz w:val="13"/>
+              </w:rPr>
+              <w:t>Номер расходится</w:t>
+            </w:r>
+          </w:p>
+        </w:tc>
+        <w:tc>
+          <w:tcPr>
+            <w:tcW w:type="dxa" w:w="3270"/>
+            <w:tcMar>
+              <w:top w:w="80" w:type="dxa"/>
+              <w:start w:w="120" w:type="dxa"/>
+              <w:bottom w:w="80" w:type="dxa"/>
+              <w:end w:w="120" w:type="dxa"/>
+            </w:tcMar>
+            <w:vAlign w:val="center"/>
+          </w:tcPr>
+          <w:p>
+            <w:pPr>
+              <w:spacing w:before="0" w:after="0" w:line="252" w:lineRule="auto"/>
+            </w:pPr>
+            <w:r/>
+            <w:r>
+              <w:rPr>
+                <w:rFonts w:ascii="Calibri" w:hAnsi="Calibri"/>
+                <w:b w:val="0"/>
+                <w:color w:val="1E1E1E"/>
+                <w:sz w:val="13"/>
+              </w:rPr>
+              <w:t>документ найден по связке, но номер/код не совпадает</w:t>
+            </w:r>
+          </w:p>
+        </w:tc>
+        <w:tc>
+          <w:tcPr>
+            <w:tcW w:type="dxa" w:w="3040"/>
+            <w:tcMar>
+              <w:top w:w="80" w:type="dxa"/>
+              <w:start w:w="120" w:type="dxa"/>
+              <w:bottom w:w="80" w:type="dxa"/>
+              <w:end w:w="120" w:type="dxa"/>
+            </w:tcMar>
+            <w:vAlign w:val="center"/>
+          </w:tcPr>
+          <w:p>
+            <w:pPr>
+              <w:spacing w:before="0" w:after="0" w:line="252" w:lineRule="auto"/>
+            </w:pPr>
+            <w:r/>
+            <w:r>
+              <w:rPr>
+                <w:rFonts w:ascii="Calibri" w:hAnsi="Calibri"/>
+                <w:b w:val="0"/>
+                <w:color w:val="1E1E1E"/>
+                <w:sz w:val="13"/>
+              </w:rPr>
+              <w:t>номер ERP, код 1С, номер 1С</w:t>
             </w:r>
           </w:p>
         </w:tc>
@@ -17406,82 +17632,109 @@
       <w:tr>
         <w:tc>
           <w:tcPr>
-            <w:tcW w:type="dxa" w:w="1500"/>
-            <w:tcMar>
-              <w:top w:w="80" w:type="dxa"/>
-              <w:start w:w="120" w:type="dxa"/>
-              <w:bottom w:w="80" w:type="dxa"/>
-              <w:end w:w="120" w:type="dxa"/>
-            </w:tcMar>
-            <w:vAlign w:val="center"/>
-          </w:tcPr>
-          <w:p>
-            <w:pPr>
-              <w:spacing w:before="0" w:after="0" w:line="252" w:lineRule="auto"/>
-            </w:pPr>
-            <w:r/>
-            <w:r>
-              <w:rPr>
-                <w:rFonts w:ascii="Calibri" w:hAnsi="Calibri"/>
-                <w:b w:val="0"/>
-                <w:color w:val="1E1E1E"/>
-                <w:sz w:val="14"/>
-              </w:rPr>
-              <w:t>Подтверждено строкой 1С</w:t>
-            </w:r>
-          </w:p>
-        </w:tc>
-        <w:tc>
-          <w:tcPr>
-            <w:tcW w:type="dxa" w:w="3730"/>
-            <w:tcMar>
-              <w:top w:w="80" w:type="dxa"/>
-              <w:start w:w="120" w:type="dxa"/>
-              <w:bottom w:w="80" w:type="dxa"/>
-              <w:end w:w="120" w:type="dxa"/>
-            </w:tcMar>
-            <w:vAlign w:val="center"/>
-          </w:tcPr>
-          <w:p>
-            <w:pPr>
-              <w:spacing w:before="0" w:after="0" w:line="252" w:lineRule="auto"/>
-            </w:pPr>
-            <w:r/>
-            <w:r>
-              <w:rPr>
-                <w:rFonts w:ascii="Calibri" w:hAnsi="Calibri"/>
-                <w:b w:val="0"/>
-                <w:color w:val="1E1E1E"/>
-                <w:sz w:val="14"/>
-              </w:rPr>
-              <w:t>сумма найдена в строке 1С, но договор-заявка строки недоступен</w:t>
-            </w:r>
-          </w:p>
-        </w:tc>
-        <w:tc>
-          <w:tcPr>
-            <w:tcW w:type="dxa" w:w="4130"/>
-            <w:tcMar>
-              <w:top w:w="80" w:type="dxa"/>
-              <w:start w:w="120" w:type="dxa"/>
-              <w:bottom w:w="80" w:type="dxa"/>
-              <w:end w:w="120" w:type="dxa"/>
-            </w:tcMar>
-            <w:vAlign w:val="center"/>
-          </w:tcPr>
-          <w:p>
-            <w:pPr>
-              <w:spacing w:before="0" w:after="0" w:line="252" w:lineRule="auto"/>
-            </w:pPr>
-            <w:r/>
-            <w:r>
-              <w:rPr>
-                <w:rFonts w:ascii="Calibri" w:hAnsi="Calibri"/>
-                <w:b w:val="0"/>
-                <w:color w:val="1E1E1E"/>
-                <w:sz w:val="14"/>
-              </w:rPr>
-              <w:t>разрешено как желтый статус, не полный `ОК`</w:t>
+            <w:tcW w:type="dxa" w:w="1450"/>
+            <w:tcMar>
+              <w:top w:w="80" w:type="dxa"/>
+              <w:start w:w="120" w:type="dxa"/>
+              <w:bottom w:w="80" w:type="dxa"/>
+              <w:end w:w="120" w:type="dxa"/>
+            </w:tcMar>
+            <w:vAlign w:val="center"/>
+          </w:tcPr>
+          <w:p>
+            <w:pPr>
+              <w:spacing w:before="0" w:after="0" w:line="252" w:lineRule="auto"/>
+            </w:pPr>
+            <w:r/>
+            <w:r>
+              <w:rPr>
+                <w:rFonts w:ascii="Calibri" w:hAnsi="Calibri"/>
+                <w:b w:val="0"/>
+                <w:color w:val="1E1E1E"/>
+                <w:sz w:val="13"/>
+              </w:rPr>
+              <w:t>Монитор ERP ↔ 1С</w:t>
+            </w:r>
+          </w:p>
+        </w:tc>
+        <w:tc>
+          <w:tcPr>
+            <w:tcW w:type="dxa" w:w="1600"/>
+            <w:tcMar>
+              <w:top w:w="80" w:type="dxa"/>
+              <w:start w:w="120" w:type="dxa"/>
+              <w:bottom w:w="80" w:type="dxa"/>
+              <w:end w:w="120" w:type="dxa"/>
+            </w:tcMar>
+            <w:vAlign w:val="center"/>
+          </w:tcPr>
+          <w:p>
+            <w:pPr>
+              <w:spacing w:before="0" w:after="0" w:line="252" w:lineRule="auto"/>
+            </w:pPr>
+            <w:r/>
+            <w:r>
+              <w:rPr>
+                <w:rFonts w:ascii="Calibri" w:hAnsi="Calibri"/>
+                <w:b w:val="0"/>
+                <w:color w:val="1E1E1E"/>
+                <w:sz w:val="13"/>
+              </w:rPr>
+              <w:t>Договор/заявка расходится</w:t>
+            </w:r>
+          </w:p>
+        </w:tc>
+        <w:tc>
+          <w:tcPr>
+            <w:tcW w:type="dxa" w:w="3270"/>
+            <w:tcMar>
+              <w:top w:w="80" w:type="dxa"/>
+              <w:start w:w="120" w:type="dxa"/>
+              <w:bottom w:w="80" w:type="dxa"/>
+              <w:end w:w="120" w:type="dxa"/>
+            </w:tcMar>
+            <w:vAlign w:val="center"/>
+          </w:tcPr>
+          <w:p>
+            <w:pPr>
+              <w:spacing w:before="0" w:after="0" w:line="252" w:lineRule="auto"/>
+            </w:pPr>
+            <w:r/>
+            <w:r>
+              <w:rPr>
+                <w:rFonts w:ascii="Calibri" w:hAnsi="Calibri"/>
+                <w:b w:val="0"/>
+                <w:color w:val="1E1E1E"/>
+                <w:sz w:val="13"/>
+              </w:rPr>
+              <w:t>сумма или номер найдены, но договор/заявка не совпадает</w:t>
+            </w:r>
+          </w:p>
+        </w:tc>
+        <w:tc>
+          <w:tcPr>
+            <w:tcW w:type="dxa" w:w="3040"/>
+            <w:tcMar>
+              <w:top w:w="80" w:type="dxa"/>
+              <w:start w:w="120" w:type="dxa"/>
+              <w:bottom w:w="80" w:type="dxa"/>
+              <w:end w:w="120" w:type="dxa"/>
+            </w:tcMar>
+            <w:vAlign w:val="center"/>
+          </w:tcPr>
+          <w:p>
+            <w:pPr>
+              <w:spacing w:before="0" w:after="0" w:line="252" w:lineRule="auto"/>
+            </w:pPr>
+            <w:r/>
+            <w:r>
+              <w:rPr>
+                <w:rFonts w:ascii="Calibri" w:hAnsi="Calibri"/>
+                <w:b w:val="0"/>
+                <w:color w:val="1E1E1E"/>
+                <w:sz w:val="13"/>
+              </w:rPr>
+              <w:t>dogcode, spec code, владелец, организация</w:t>
             </w:r>
           </w:p>
         </w:tc>
@@ -17489,82 +17742,109 @@
       <w:tr>
         <w:tc>
           <w:tcPr>
-            <w:tcW w:type="dxa" w:w="1500"/>
-            <w:tcMar>
-              <w:top w:w="80" w:type="dxa"/>
-              <w:start w:w="120" w:type="dxa"/>
-              <w:bottom w:w="80" w:type="dxa"/>
-              <w:end w:w="120" w:type="dxa"/>
-            </w:tcMar>
-            <w:vAlign w:val="center"/>
-          </w:tcPr>
-          <w:p>
-            <w:pPr>
-              <w:spacing w:before="0" w:after="0" w:line="252" w:lineRule="auto"/>
-            </w:pPr>
-            <w:r/>
-            <w:r>
-              <w:rPr>
-                <w:rFonts w:ascii="Calibri" w:hAnsi="Calibri"/>
-                <w:b w:val="0"/>
-                <w:color w:val="1E1E1E"/>
-                <w:sz w:val="14"/>
-              </w:rPr>
-              <w:t>Исключено из сальдо</w:t>
-            </w:r>
-          </w:p>
-        </w:tc>
-        <w:tc>
-          <w:tcPr>
-            <w:tcW w:type="dxa" w:w="3730"/>
-            <w:tcMar>
-              <w:top w:w="80" w:type="dxa"/>
-              <w:start w:w="120" w:type="dxa"/>
-              <w:bottom w:w="80" w:type="dxa"/>
-              <w:end w:w="120" w:type="dxa"/>
-            </w:tcMar>
-            <w:vAlign w:val="center"/>
-          </w:tcPr>
-          <w:p>
-            <w:pPr>
-              <w:spacing w:before="0" w:after="0" w:line="252" w:lineRule="auto"/>
-            </w:pPr>
-            <w:r/>
-            <w:r>
-              <w:rPr>
-                <w:rFonts w:ascii="Calibri" w:hAnsi="Calibri"/>
-                <w:b w:val="0"/>
-                <w:color w:val="1E1E1E"/>
-                <w:sz w:val="14"/>
-              </w:rPr>
-              <w:t>расход подрядчика `f_isvozm=2` через детали операций</w:t>
-            </w:r>
-          </w:p>
-        </w:tc>
-        <w:tc>
-          <w:tcPr>
-            <w:tcW w:type="dxa" w:w="4130"/>
-            <w:tcMar>
-              <w:top w:w="80" w:type="dxa"/>
-              <w:start w:w="120" w:type="dxa"/>
-              <w:bottom w:w="80" w:type="dxa"/>
-              <w:end w:w="120" w:type="dxa"/>
-            </w:tcMar>
-            <w:vAlign w:val="center"/>
-          </w:tcPr>
-          <w:p>
-            <w:pPr>
-              <w:spacing w:before="0" w:after="0" w:line="252" w:lineRule="auto"/>
-            </w:pPr>
-            <w:r/>
-            <w:r>
-              <w:rPr>
-                <w:rFonts w:ascii="Calibri" w:hAnsi="Calibri"/>
-                <w:b w:val="0"/>
-                <w:color w:val="1E1E1E"/>
-                <w:sz w:val="14"/>
-              </w:rPr>
-              <w:t>логировать, но не включать в взаиморасчет с клиентом</w:t>
+            <w:tcW w:type="dxa" w:w="1450"/>
+            <w:tcMar>
+              <w:top w:w="80" w:type="dxa"/>
+              <w:start w:w="120" w:type="dxa"/>
+              <w:bottom w:w="80" w:type="dxa"/>
+              <w:end w:w="120" w:type="dxa"/>
+            </w:tcMar>
+            <w:vAlign w:val="center"/>
+          </w:tcPr>
+          <w:p>
+            <w:pPr>
+              <w:spacing w:before="0" w:after="0" w:line="252" w:lineRule="auto"/>
+            </w:pPr>
+            <w:r/>
+            <w:r>
+              <w:rPr>
+                <w:rFonts w:ascii="Calibri" w:hAnsi="Calibri"/>
+                <w:b w:val="0"/>
+                <w:color w:val="1E1E1E"/>
+                <w:sz w:val="13"/>
+              </w:rPr>
+              <w:t>Монитор ERP ↔ 1С</w:t>
+            </w:r>
+          </w:p>
+        </w:tc>
+        <w:tc>
+          <w:tcPr>
+            <w:tcW w:type="dxa" w:w="1600"/>
+            <w:tcMar>
+              <w:top w:w="80" w:type="dxa"/>
+              <w:start w:w="120" w:type="dxa"/>
+              <w:bottom w:w="80" w:type="dxa"/>
+              <w:end w:w="120" w:type="dxa"/>
+            </w:tcMar>
+            <w:vAlign w:val="center"/>
+          </w:tcPr>
+          <w:p>
+            <w:pPr>
+              <w:spacing w:before="0" w:after="0" w:line="252" w:lineRule="auto"/>
+            </w:pPr>
+            <w:r/>
+            <w:r>
+              <w:rPr>
+                <w:rFonts w:ascii="Calibri" w:hAnsi="Calibri"/>
+                <w:b w:val="0"/>
+                <w:color w:val="1E1E1E"/>
+                <w:sz w:val="13"/>
+              </w:rPr>
+              <w:t>Нет СФ/УПД</w:t>
+            </w:r>
+          </w:p>
+        </w:tc>
+        <w:tc>
+          <w:tcPr>
+            <w:tcW w:type="dxa" w:w="3270"/>
+            <w:tcMar>
+              <w:top w:w="80" w:type="dxa"/>
+              <w:start w:w="120" w:type="dxa"/>
+              <w:bottom w:w="80" w:type="dxa"/>
+              <w:end w:w="120" w:type="dxa"/>
+            </w:tcMar>
+            <w:vAlign w:val="center"/>
+          </w:tcPr>
+          <w:p>
+            <w:pPr>
+              <w:spacing w:before="0" w:after="0" w:line="252" w:lineRule="auto"/>
+            </w:pPr>
+            <w:r/>
+            <w:r>
+              <w:rPr>
+                <w:rFonts w:ascii="Calibri" w:hAnsi="Calibri"/>
+                <w:b w:val="0"/>
+                <w:color w:val="1E1E1E"/>
+                <w:sz w:val="13"/>
+              </w:rPr>
+              <w:t>после успешной загрузки источников нет ожидаемого закрывающего документа</w:t>
+            </w:r>
+          </w:p>
+        </w:tc>
+        <w:tc>
+          <w:tcPr>
+            <w:tcW w:type="dxa" w:w="3040"/>
+            <w:tcMar>
+              <w:top w:w="80" w:type="dxa"/>
+              <w:start w:w="120" w:type="dxa"/>
+              <w:bottom w:w="80" w:type="dxa"/>
+              <w:end w:w="120" w:type="dxa"/>
+            </w:tcMar>
+            <w:vAlign w:val="center"/>
+          </w:tcPr>
+          <w:p>
+            <w:pPr>
+              <w:spacing w:before="0" w:after="0" w:line="252" w:lineRule="auto"/>
+            </w:pPr>
+            <w:r/>
+            <w:r>
+              <w:rPr>
+                <w:rFonts w:ascii="Calibri" w:hAnsi="Calibri"/>
+                <w:b w:val="0"/>
+                <w:color w:val="1E1E1E"/>
+                <w:sz w:val="13"/>
+              </w:rPr>
+              <w:t>наличие акта/УПД/СФ в ERP и 1С; не путать с возмещаемостью</w:t>
             </w:r>
           </w:p>
         </w:tc>
@@ -17572,82 +17852,109 @@
       <w:tr>
         <w:tc>
           <w:tcPr>
-            <w:tcW w:type="dxa" w:w="1500"/>
-            <w:tcMar>
-              <w:top w:w="80" w:type="dxa"/>
-              <w:start w:w="120" w:type="dxa"/>
-              <w:bottom w:w="80" w:type="dxa"/>
-              <w:end w:w="120" w:type="dxa"/>
-            </w:tcMar>
-            <w:vAlign w:val="center"/>
-          </w:tcPr>
-          <w:p>
-            <w:pPr>
-              <w:spacing w:before="0" w:after="0" w:line="252" w:lineRule="auto"/>
-            </w:pPr>
-            <w:r/>
-            <w:r>
-              <w:rPr>
-                <w:rFonts w:ascii="Calibri" w:hAnsi="Calibri"/>
-                <w:b w:val="0"/>
-                <w:color w:val="1E1E1E"/>
-                <w:sz w:val="14"/>
-              </w:rPr>
-              <w:t>Смешанные валюты</w:t>
-            </w:r>
-          </w:p>
-        </w:tc>
-        <w:tc>
-          <w:tcPr>
-            <w:tcW w:type="dxa" w:w="3730"/>
-            <w:tcMar>
-              <w:top w:w="80" w:type="dxa"/>
-              <w:start w:w="120" w:type="dxa"/>
-              <w:bottom w:w="80" w:type="dxa"/>
-              <w:end w:w="120" w:type="dxa"/>
-            </w:tcMar>
-            <w:vAlign w:val="center"/>
-          </w:tcPr>
-          <w:p>
-            <w:pPr>
-              <w:spacing w:before="0" w:after="0" w:line="252" w:lineRule="auto"/>
-            </w:pPr>
-            <w:r/>
-            <w:r>
-              <w:rPr>
-                <w:rFonts w:ascii="Calibri" w:hAnsi="Calibri"/>
-                <w:b w:val="0"/>
-                <w:color w:val="1E1E1E"/>
-                <w:sz w:val="14"/>
-              </w:rPr>
-              <w:t>в счетах есть разные валюты без утвержденной конвертации</w:t>
-            </w:r>
-          </w:p>
-        </w:tc>
-        <w:tc>
-          <w:tcPr>
-            <w:tcW w:type="dxa" w:w="4130"/>
-            <w:tcMar>
-              <w:top w:w="80" w:type="dxa"/>
-              <w:start w:w="120" w:type="dxa"/>
-              <w:bottom w:w="80" w:type="dxa"/>
-              <w:end w:w="120" w:type="dxa"/>
-            </w:tcMar>
-            <w:vAlign w:val="center"/>
-          </w:tcPr>
-          <w:p>
-            <w:pPr>
-              <w:spacing w:before="0" w:after="0" w:line="252" w:lineRule="auto"/>
-            </w:pPr>
-            <w:r/>
-            <w:r>
-              <w:rPr>
-                <w:rFonts w:ascii="Calibri" w:hAnsi="Calibri"/>
-                <w:b w:val="0"/>
-                <w:color w:val="1E1E1E"/>
-                <w:sz w:val="14"/>
-              </w:rPr>
-              <w:t>показывать суммы отдельно по валютам</w:t>
+            <w:tcW w:type="dxa" w:w="1450"/>
+            <w:tcMar>
+              <w:top w:w="80" w:type="dxa"/>
+              <w:start w:w="120" w:type="dxa"/>
+              <w:bottom w:w="80" w:type="dxa"/>
+              <w:end w:w="120" w:type="dxa"/>
+            </w:tcMar>
+            <w:vAlign w:val="center"/>
+          </w:tcPr>
+          <w:p>
+            <w:pPr>
+              <w:spacing w:before="0" w:after="0" w:line="252" w:lineRule="auto"/>
+            </w:pPr>
+            <w:r/>
+            <w:r>
+              <w:rPr>
+                <w:rFonts w:ascii="Calibri" w:hAnsi="Calibri"/>
+                <w:b w:val="0"/>
+                <w:color w:val="1E1E1E"/>
+                <w:sz w:val="13"/>
+              </w:rPr>
+              <w:t>Монитор ERP ↔ 1С</w:t>
+            </w:r>
+          </w:p>
+        </w:tc>
+        <w:tc>
+          <w:tcPr>
+            <w:tcW w:type="dxa" w:w="1600"/>
+            <w:tcMar>
+              <w:top w:w="80" w:type="dxa"/>
+              <w:start w:w="120" w:type="dxa"/>
+              <w:bottom w:w="80" w:type="dxa"/>
+              <w:end w:w="120" w:type="dxa"/>
+            </w:tcMar>
+            <w:vAlign w:val="center"/>
+          </w:tcPr>
+          <w:p>
+            <w:pPr>
+              <w:spacing w:before="0" w:after="0" w:line="252" w:lineRule="auto"/>
+            </w:pPr>
+            <w:r/>
+            <w:r>
+              <w:rPr>
+                <w:rFonts w:ascii="Calibri" w:hAnsi="Calibri"/>
+                <w:b w:val="0"/>
+                <w:color w:val="1E1E1E"/>
+                <w:sz w:val="13"/>
+              </w:rPr>
+              <w:t>НДС расходится</w:t>
+            </w:r>
+          </w:p>
+        </w:tc>
+        <w:tc>
+          <w:tcPr>
+            <w:tcW w:type="dxa" w:w="3270"/>
+            <w:tcMar>
+              <w:top w:w="80" w:type="dxa"/>
+              <w:start w:w="120" w:type="dxa"/>
+              <w:bottom w:w="80" w:type="dxa"/>
+              <w:end w:w="120" w:type="dxa"/>
+            </w:tcMar>
+            <w:vAlign w:val="center"/>
+          </w:tcPr>
+          <w:p>
+            <w:pPr>
+              <w:spacing w:before="0" w:after="0" w:line="252" w:lineRule="auto"/>
+            </w:pPr>
+            <w:r/>
+            <w:r>
+              <w:rPr>
+                <w:rFonts w:ascii="Calibri" w:hAnsi="Calibri"/>
+                <w:b w:val="0"/>
+                <w:color w:val="1E1E1E"/>
+                <w:sz w:val="13"/>
+              </w:rPr>
+              <w:t>расход или акт найден, но ставка НДС ERP и ставка НДС 1С различаются</w:t>
+            </w:r>
+          </w:p>
+        </w:tc>
+        <w:tc>
+          <w:tcPr>
+            <w:tcW w:type="dxa" w:w="3040"/>
+            <w:tcMar>
+              <w:top w:w="80" w:type="dxa"/>
+              <w:start w:w="120" w:type="dxa"/>
+              <w:bottom w:w="80" w:type="dxa"/>
+              <w:end w:w="120" w:type="dxa"/>
+            </w:tcMar>
+            <w:vAlign w:val="center"/>
+          </w:tcPr>
+          <w:p>
+            <w:pPr>
+              <w:spacing w:before="0" w:after="0" w:line="252" w:lineRule="auto"/>
+            </w:pPr>
+            <w:r/>
+            <w:r>
+              <w:rPr>
+                <w:rFonts w:ascii="Calibri" w:hAnsi="Calibri"/>
+                <w:b w:val="0"/>
+                <w:color w:val="1E1E1E"/>
+                <w:sz w:val="13"/>
+              </w:rPr>
+              <w:t>только ставка НДС и сумма НДС; `f_isvozm` не является причиной этого статуса</w:t>
             </w:r>
           </w:p>
         </w:tc>
@@ -17655,26 +17962,383 @@
       <w:tr>
         <w:tc>
           <w:tcPr>
-            <w:tcW w:type="dxa" w:w="1500"/>
-            <w:tcMar>
-              <w:top w:w="80" w:type="dxa"/>
-              <w:start w:w="120" w:type="dxa"/>
-              <w:bottom w:w="80" w:type="dxa"/>
-              <w:end w:w="120" w:type="dxa"/>
-            </w:tcMar>
-            <w:vAlign w:val="center"/>
-          </w:tcPr>
-          <w:p>
-            <w:pPr>
-              <w:spacing w:before="0" w:after="0" w:line="252" w:lineRule="auto"/>
-            </w:pPr>
-            <w:r/>
-            <w:r>
-              <w:rPr>
-                <w:rFonts w:ascii="Calibri" w:hAnsi="Calibri"/>
-                <w:b w:val="0"/>
-                <w:color w:val="1E1E1E"/>
-                <w:sz w:val="14"/>
+            <w:tcW w:type="dxa" w:w="1450"/>
+            <w:tcMar>
+              <w:top w:w="80" w:type="dxa"/>
+              <w:start w:w="120" w:type="dxa"/>
+              <w:bottom w:w="80" w:type="dxa"/>
+              <w:end w:w="120" w:type="dxa"/>
+            </w:tcMar>
+            <w:vAlign w:val="center"/>
+          </w:tcPr>
+          <w:p>
+            <w:pPr>
+              <w:spacing w:before="0" w:after="0" w:line="252" w:lineRule="auto"/>
+            </w:pPr>
+            <w:r/>
+            <w:r>
+              <w:rPr>
+                <w:rFonts w:ascii="Calibri" w:hAnsi="Calibri"/>
+                <w:b w:val="0"/>
+                <w:color w:val="1E1E1E"/>
+                <w:sz w:val="13"/>
+              </w:rPr>
+              <w:t>Монитор ERP ↔ 1С</w:t>
+            </w:r>
+          </w:p>
+        </w:tc>
+        <w:tc>
+          <w:tcPr>
+            <w:tcW w:type="dxa" w:w="1600"/>
+            <w:tcMar>
+              <w:top w:w="80" w:type="dxa"/>
+              <w:start w:w="120" w:type="dxa"/>
+              <w:bottom w:w="80" w:type="dxa"/>
+              <w:end w:w="120" w:type="dxa"/>
+            </w:tcMar>
+            <w:vAlign w:val="center"/>
+          </w:tcPr>
+          <w:p>
+            <w:pPr>
+              <w:spacing w:before="0" w:after="0" w:line="252" w:lineRule="auto"/>
+            </w:pPr>
+            <w:r/>
+            <w:r>
+              <w:rPr>
+                <w:rFonts w:ascii="Calibri" w:hAnsi="Calibri"/>
+                <w:b w:val="0"/>
+                <w:color w:val="1E1E1E"/>
+                <w:sz w:val="13"/>
+              </w:rPr>
+              <w:t>Нет ключа 1С</w:t>
+            </w:r>
+          </w:p>
+        </w:tc>
+        <w:tc>
+          <w:tcPr>
+            <w:tcW w:type="dxa" w:w="3270"/>
+            <w:tcMar>
+              <w:top w:w="80" w:type="dxa"/>
+              <w:start w:w="120" w:type="dxa"/>
+              <w:bottom w:w="80" w:type="dxa"/>
+              <w:end w:w="120" w:type="dxa"/>
+            </w:tcMar>
+            <w:vAlign w:val="center"/>
+          </w:tcPr>
+          <w:p>
+            <w:pPr>
+              <w:spacing w:before="0" w:after="0" w:line="252" w:lineRule="auto"/>
+            </w:pPr>
+            <w:r/>
+            <w:r>
+              <w:rPr>
+                <w:rFonts w:ascii="Calibri" w:hAnsi="Calibri"/>
+                <w:b w:val="0"/>
+                <w:color w:val="1E1E1E"/>
+                <w:sz w:val="13"/>
+              </w:rPr>
+              <w:t>ERP-документ есть, но нет кода/даты 1С для надежного матчинга</w:t>
+            </w:r>
+          </w:p>
+        </w:tc>
+        <w:tc>
+          <w:tcPr>
+            <w:tcW w:type="dxa" w:w="3040"/>
+            <w:tcMar>
+              <w:top w:w="80" w:type="dxa"/>
+              <w:start w:w="120" w:type="dxa"/>
+              <w:bottom w:w="80" w:type="dxa"/>
+              <w:end w:w="120" w:type="dxa"/>
+            </w:tcMar>
+            <w:vAlign w:val="center"/>
+          </w:tcPr>
+          <w:p>
+            <w:pPr>
+              <w:spacing w:before="0" w:after="0" w:line="252" w:lineRule="auto"/>
+            </w:pPr>
+            <w:r/>
+            <w:r>
+              <w:rPr>
+                <w:rFonts w:ascii="Calibri" w:hAnsi="Calibri"/>
+                <w:b w:val="0"/>
+                <w:color w:val="1E1E1E"/>
+                <w:sz w:val="13"/>
+              </w:rPr>
+              <w:t>f_kod1c, f_dt1c, номер, дата</w:t>
+            </w:r>
+          </w:p>
+        </w:tc>
+      </w:tr>
+      <w:tr>
+        <w:tc>
+          <w:tcPr>
+            <w:tcW w:type="dxa" w:w="1450"/>
+            <w:tcMar>
+              <w:top w:w="80" w:type="dxa"/>
+              <w:start w:w="120" w:type="dxa"/>
+              <w:bottom w:w="80" w:type="dxa"/>
+              <w:end w:w="120" w:type="dxa"/>
+            </w:tcMar>
+            <w:vAlign w:val="center"/>
+          </w:tcPr>
+          <w:p>
+            <w:pPr>
+              <w:spacing w:before="0" w:after="0" w:line="252" w:lineRule="auto"/>
+            </w:pPr>
+            <w:r/>
+            <w:r>
+              <w:rPr>
+                <w:rFonts w:ascii="Calibri" w:hAnsi="Calibri"/>
+                <w:b w:val="0"/>
+                <w:color w:val="1E1E1E"/>
+                <w:sz w:val="13"/>
+              </w:rPr>
+              <w:t>Монитор ERP ↔ 1С</w:t>
+            </w:r>
+          </w:p>
+        </w:tc>
+        <w:tc>
+          <w:tcPr>
+            <w:tcW w:type="dxa" w:w="1600"/>
+            <w:tcMar>
+              <w:top w:w="80" w:type="dxa"/>
+              <w:start w:w="120" w:type="dxa"/>
+              <w:bottom w:w="80" w:type="dxa"/>
+              <w:end w:w="120" w:type="dxa"/>
+            </w:tcMar>
+            <w:vAlign w:val="center"/>
+          </w:tcPr>
+          <w:p>
+            <w:pPr>
+              <w:spacing w:before="0" w:after="0" w:line="252" w:lineRule="auto"/>
+            </w:pPr>
+            <w:r/>
+            <w:r>
+              <w:rPr>
+                <w:rFonts w:ascii="Calibri" w:hAnsi="Calibri"/>
+                <w:b w:val="0"/>
+                <w:color w:val="1E1E1E"/>
+                <w:sz w:val="13"/>
+              </w:rPr>
+              <w:t>Сальдо расходится</w:t>
+            </w:r>
+          </w:p>
+        </w:tc>
+        <w:tc>
+          <w:tcPr>
+            <w:tcW w:type="dxa" w:w="3270"/>
+            <w:tcMar>
+              <w:top w:w="80" w:type="dxa"/>
+              <w:start w:w="120" w:type="dxa"/>
+              <w:bottom w:w="80" w:type="dxa"/>
+              <w:end w:w="120" w:type="dxa"/>
+            </w:tcMar>
+            <w:vAlign w:val="center"/>
+          </w:tcPr>
+          <w:p>
+            <w:pPr>
+              <w:spacing w:before="0" w:after="0" w:line="252" w:lineRule="auto"/>
+            </w:pPr>
+            <w:r/>
+            <w:r>
+              <w:rPr>
+                <w:rFonts w:ascii="Calibri" w:hAnsi="Calibri"/>
+                <w:b w:val="0"/>
+                <w:color w:val="1E1E1E"/>
+                <w:sz w:val="13"/>
+              </w:rPr>
+              <w:t>начальное, обороты или конечное сальдо ERP и 1С отличаются</w:t>
+            </w:r>
+          </w:p>
+        </w:tc>
+        <w:tc>
+          <w:tcPr>
+            <w:tcW w:type="dxa" w:w="3040"/>
+            <w:tcMar>
+              <w:top w:w="80" w:type="dxa"/>
+              <w:start w:w="120" w:type="dxa"/>
+              <w:bottom w:w="80" w:type="dxa"/>
+              <w:end w:w="120" w:type="dxa"/>
+            </w:tcMar>
+            <w:vAlign w:val="center"/>
+          </w:tcPr>
+          <w:p>
+            <w:pPr>
+              <w:spacing w:before="0" w:after="0" w:line="252" w:lineRule="auto"/>
+            </w:pPr>
+            <w:r/>
+            <w:r>
+              <w:rPr>
+                <w:rFonts w:ascii="Calibri" w:hAnsi="Calibri"/>
+                <w:b w:val="0"/>
+                <w:color w:val="1E1E1E"/>
+                <w:sz w:val="13"/>
+              </w:rPr>
+              <w:t>только для отдельной страницы сверки ERP ↔ 1С</w:t>
+            </w:r>
+          </w:p>
+        </w:tc>
+      </w:tr>
+      <w:tr>
+        <w:tc>
+          <w:tcPr>
+            <w:tcW w:type="dxa" w:w="1450"/>
+            <w:tcMar>
+              <w:top w:w="80" w:type="dxa"/>
+              <w:start w:w="120" w:type="dxa"/>
+              <w:bottom w:w="80" w:type="dxa"/>
+              <w:end w:w="120" w:type="dxa"/>
+            </w:tcMar>
+            <w:vAlign w:val="center"/>
+          </w:tcPr>
+          <w:p>
+            <w:pPr>
+              <w:spacing w:before="0" w:after="0" w:line="252" w:lineRule="auto"/>
+            </w:pPr>
+            <w:r/>
+            <w:r>
+              <w:rPr>
+                <w:rFonts w:ascii="Calibri" w:hAnsi="Calibri"/>
+                <w:b w:val="0"/>
+                <w:color w:val="1E1E1E"/>
+                <w:sz w:val="13"/>
+              </w:rPr>
+              <w:t>Оба</w:t>
+            </w:r>
+          </w:p>
+        </w:tc>
+        <w:tc>
+          <w:tcPr>
+            <w:tcW w:type="dxa" w:w="1600"/>
+            <w:tcMar>
+              <w:top w:w="80" w:type="dxa"/>
+              <w:start w:w="120" w:type="dxa"/>
+              <w:bottom w:w="80" w:type="dxa"/>
+              <w:end w:w="120" w:type="dxa"/>
+            </w:tcMar>
+            <w:vAlign w:val="center"/>
+          </w:tcPr>
+          <w:p>
+            <w:pPr>
+              <w:spacing w:before="0" w:after="0" w:line="252" w:lineRule="auto"/>
+            </w:pPr>
+            <w:r/>
+            <w:r>
+              <w:rPr>
+                <w:rFonts w:ascii="Calibri" w:hAnsi="Calibri"/>
+                <w:b w:val="0"/>
+                <w:color w:val="1E1E1E"/>
+                <w:sz w:val="13"/>
+              </w:rPr>
+              <w:t>Смешанные валюты</w:t>
+            </w:r>
+          </w:p>
+        </w:tc>
+        <w:tc>
+          <w:tcPr>
+            <w:tcW w:type="dxa" w:w="3270"/>
+            <w:tcMar>
+              <w:top w:w="80" w:type="dxa"/>
+              <w:start w:w="120" w:type="dxa"/>
+              <w:bottom w:w="80" w:type="dxa"/>
+              <w:end w:w="120" w:type="dxa"/>
+            </w:tcMar>
+            <w:vAlign w:val="center"/>
+          </w:tcPr>
+          <w:p>
+            <w:pPr>
+              <w:spacing w:before="0" w:after="0" w:line="252" w:lineRule="auto"/>
+            </w:pPr>
+            <w:r/>
+            <w:r>
+              <w:rPr>
+                <w:rFonts w:ascii="Calibri" w:hAnsi="Calibri"/>
+                <w:b w:val="0"/>
+                <w:color w:val="1E1E1E"/>
+                <w:sz w:val="13"/>
+              </w:rPr>
+              <w:t>в счетах есть разные валюты без утвержденной конвертации</w:t>
+            </w:r>
+          </w:p>
+        </w:tc>
+        <w:tc>
+          <w:tcPr>
+            <w:tcW w:type="dxa" w:w="3040"/>
+            <w:tcMar>
+              <w:top w:w="80" w:type="dxa"/>
+              <w:start w:w="120" w:type="dxa"/>
+              <w:bottom w:w="80" w:type="dxa"/>
+              <w:end w:w="120" w:type="dxa"/>
+            </w:tcMar>
+            <w:vAlign w:val="center"/>
+          </w:tcPr>
+          <w:p>
+            <w:pPr>
+              <w:spacing w:before="0" w:after="0" w:line="252" w:lineRule="auto"/>
+            </w:pPr>
+            <w:r/>
+            <w:r>
+              <w:rPr>
+                <w:rFonts w:ascii="Calibri" w:hAnsi="Calibri"/>
+                <w:b w:val="0"/>
+                <w:color w:val="1E1E1E"/>
+                <w:sz w:val="13"/>
+              </w:rPr>
+              <w:t>показывать суммы отдельно по валютам</w:t>
+            </w:r>
+          </w:p>
+        </w:tc>
+      </w:tr>
+      <w:tr>
+        <w:tc>
+          <w:tcPr>
+            <w:tcW w:type="dxa" w:w="1450"/>
+            <w:tcMar>
+              <w:top w:w="80" w:type="dxa"/>
+              <w:start w:w="120" w:type="dxa"/>
+              <w:bottom w:w="80" w:type="dxa"/>
+              <w:end w:w="120" w:type="dxa"/>
+            </w:tcMar>
+            <w:vAlign w:val="center"/>
+          </w:tcPr>
+          <w:p>
+            <w:pPr>
+              <w:spacing w:before="0" w:after="0" w:line="252" w:lineRule="auto"/>
+            </w:pPr>
+            <w:r/>
+            <w:r>
+              <w:rPr>
+                <w:rFonts w:ascii="Calibri" w:hAnsi="Calibri"/>
+                <w:b w:val="0"/>
+                <w:color w:val="1E1E1E"/>
+                <w:sz w:val="13"/>
+              </w:rPr>
+              <w:t>Оба</w:t>
+            </w:r>
+          </w:p>
+        </w:tc>
+        <w:tc>
+          <w:tcPr>
+            <w:tcW w:type="dxa" w:w="1600"/>
+            <w:tcMar>
+              <w:top w:w="80" w:type="dxa"/>
+              <w:start w:w="120" w:type="dxa"/>
+              <w:bottom w:w="80" w:type="dxa"/>
+              <w:end w:w="120" w:type="dxa"/>
+            </w:tcMar>
+            <w:vAlign w:val="center"/>
+          </w:tcPr>
+          <w:p>
+            <w:pPr>
+              <w:spacing w:before="0" w:after="0" w:line="252" w:lineRule="auto"/>
+            </w:pPr>
+            <w:r/>
+            <w:r>
+              <w:rPr>
+                <w:rFonts w:ascii="Calibri" w:hAnsi="Calibri"/>
+                <w:b w:val="0"/>
+                <w:color w:val="1E1E1E"/>
+                <w:sz w:val="13"/>
               </w:rPr>
               <w:t>Корректировки</w:t>
             </w:r>
@@ -17682,26 +18346,26 @@
         </w:tc>
         <w:tc>
           <w:tcPr>
-            <w:tcW w:type="dxa" w:w="3730"/>
-            <w:tcMar>
-              <w:top w:w="80" w:type="dxa"/>
-              <w:start w:w="120" w:type="dxa"/>
-              <w:bottom w:w="80" w:type="dxa"/>
-              <w:end w:w="120" w:type="dxa"/>
-            </w:tcMar>
-            <w:vAlign w:val="center"/>
-          </w:tcPr>
-          <w:p>
-            <w:pPr>
-              <w:spacing w:before="0" w:after="0" w:line="252" w:lineRule="auto"/>
-            </w:pPr>
-            <w:r/>
-            <w:r>
-              <w:rPr>
-                <w:rFonts w:ascii="Calibri" w:hAnsi="Calibri"/>
-                <w:b w:val="0"/>
-                <w:color w:val="1E1E1E"/>
-                <w:sz w:val="14"/>
+            <w:tcW w:type="dxa" w:w="3270"/>
+            <w:tcMar>
+              <w:top w:w="80" w:type="dxa"/>
+              <w:start w:w="120" w:type="dxa"/>
+              <w:bottom w:w="80" w:type="dxa"/>
+              <w:end w:w="120" w:type="dxa"/>
+            </w:tcMar>
+            <w:vAlign w:val="center"/>
+          </w:tcPr>
+          <w:p>
+            <w:pPr>
+              <w:spacing w:before="0" w:after="0" w:line="252" w:lineRule="auto"/>
+            </w:pPr>
+            <w:r/>
+            <w:r>
+              <w:rPr>
+                <w:rFonts w:ascii="Calibri" w:hAnsi="Calibri"/>
+                <w:b w:val="0"/>
+                <w:color w:val="1E1E1E"/>
+                <w:sz w:val="13"/>
               </w:rPr>
               <w:t>у поставки есть корректировки, которые меняют срез отчета</w:t>
             </w:r>
@@ -17709,26 +18373,26 @@
         </w:tc>
         <w:tc>
           <w:tcPr>
-            <w:tcW w:type="dxa" w:w="4130"/>
-            <w:tcMar>
-              <w:top w:w="80" w:type="dxa"/>
-              <w:start w:w="120" w:type="dxa"/>
-              <w:bottom w:w="80" w:type="dxa"/>
-              <w:end w:w="120" w:type="dxa"/>
-            </w:tcMar>
-            <w:vAlign w:val="center"/>
-          </w:tcPr>
-          <w:p>
-            <w:pPr>
-              <w:spacing w:before="0" w:after="0" w:line="252" w:lineRule="auto"/>
-            </w:pPr>
-            <w:r/>
-            <w:r>
-              <w:rPr>
-                <w:rFonts w:ascii="Calibri" w:hAnsi="Calibri"/>
-                <w:b w:val="0"/>
-                <w:color w:val="1E1E1E"/>
-                <w:sz w:val="14"/>
+            <w:tcW w:type="dxa" w:w="3040"/>
+            <w:tcMar>
+              <w:top w:w="80" w:type="dxa"/>
+              <w:start w:w="120" w:type="dxa"/>
+              <w:bottom w:w="80" w:type="dxa"/>
+              <w:end w:w="120" w:type="dxa"/>
+            </w:tcMar>
+            <w:vAlign w:val="center"/>
+          </w:tcPr>
+          <w:p>
+            <w:pPr>
+              <w:spacing w:before="0" w:after="0" w:line="252" w:lineRule="auto"/>
+            </w:pPr>
+            <w:r/>
+            <w:r>
+              <w:rPr>
+                <w:rFonts w:ascii="Calibri" w:hAnsi="Calibri"/>
+                <w:b w:val="0"/>
+                <w:color w:val="1E1E1E"/>
+                <w:sz w:val="13"/>
               </w:rPr>
               <w:t>основной отчет и корректировки показывать отдельными уровнями</w:t>
             </w:r>
@@ -17777,7 +18441,7 @@
                 <w:color w:val="1F4D78"/>
                 <w:sz w:val="20"/>
               </w:rPr>
-              <w:t>Ограничение документного статуса</w:t>
+              <w:t>Запрет на смешение статусов</w:t>
             </w:r>
           </w:p>
           <w:p>
@@ -17790,7 +18454,7 @@
                 <w:color w:val="1E1E1E"/>
                 <w:sz w:val="19"/>
               </w:rPr>
-              <w:t>Статус вида `9/9 ОК` может означать только, что девять сопоставленных документов не дали полевых расхождений. Он не доказывает, что сальдо ERP равно сальдо 1С. Для этого нужен отдельный сальдовый блок сверки.</w:t>
+              <w:t>На странице `Сальдо по поставкам` не показывать количество совпавших документов 1С и не использовать статус `ОК`. Документные проверки и причины расхождений показываются только на странице `Монитор ERP ↔ 1С`.</w:t>
             </w:r>
           </w:p>
         </w:tc>
@@ -22765,7 +23429,7 @@
                 <w:color w:val="1E1E1E"/>
                 <w:sz w:val="19"/>
               </w:rPr>
-              <w:t>Контрольный JSON и XLSX собраны серверным скриптом из MariaDB ERP. Для каждой поставки проверено равенство `get_paidsum` и распределенной оплаты `SUM(veda_acchist_docs.f_clssum)`, а дельта рассчитана как `SUM(get_paidsum) - SUM(get_realizsum)`.</w:t>
+              <w:t>Контрольный набор собран серверным SQL-скриптом из MariaDB ERP. Для каждой поставки проверено равенство `get_paidsum` и распределенной оплаты `SUM(veda_acchist_docs.f_clssum)`, а дельта рассчитана как `SUM(get_paidsum) - SUM(get_realizsum)`.</w:t>
             </w:r>
           </w:p>
         </w:tc>
@@ -22849,7 +23513,7 @@
           <w:color w:val="2E74B5"/>
           <w:sz w:val="26"/>
         </w:rPr>
-        <w:t>14.1 Проверка тестового монитора ERP ↔ 1С</w:t>
+        <w:t>14.1 Проверка монитора ERP ↔ 1С</w:t>
       </w:r>
     </w:p>
     <w:p>
@@ -22862,7 +23526,7 @@
           <w:color w:val="1E1E1E"/>
           <w:sz w:val="21"/>
         </w:rPr>
-        <w:t>Для страницы монитора выполнена тестовая проверка по тому же договору 660/1 на небольшом live-срезе. Источник 1С в тесте - загруженная выгрузка 1С в PostgreSQL; в production этот источник должен быть заменен или подтвержден как согласованный кэш SOAP-выгрузки.</w:t>
+        <w:t>Для страницы монитора выполнена проверка по тому же договору 660/1 на небольшом онлайн-срезе. В рабочем контуре источник 1С должен предоставляться текущим сервисом 1С с теми же документами и реквизитами, которые перечислены в маппинге.</w:t>
       </w:r>
     </w:p>
     <w:tbl>
@@ -22961,7 +23625,7 @@
                 <w:color w:val="1E1E1E"/>
                 <w:sz w:val="15"/>
               </w:rPr>
-              <w:t>URL теста</w:t>
+              <w:t>Параметры проверки</w:t>
             </w:r>
           </w:p>
         </w:tc>
@@ -22988,7 +23652,7 @@
                 <w:color w:val="1E1E1E"/>
                 <w:sz w:val="15"/>
               </w:rPr>
-              <w:t>`client_id=221&amp;dog_id=88&amp;limit=3&amp;scope=legal&amp;compare_1c=1`</w:t>
+              <w:t>ЮЛ `client_id=221`, договор `dog_id=88`, 3 свежие поставки договора 660/1</w:t>
             </w:r>
           </w:p>
         </w:tc>
@@ -23212,7 +23876,7 @@
                 <w:color w:val="1E1E1E"/>
                 <w:sz w:val="15"/>
               </w:rPr>
-              <w:t>Такой результат нельзя показывать как `1С ОК`; нужен отдельный статус `Договор/заявка расходится` и запись в журнал расхождений.</w:t>
+              <w:t>Такой результат нельзя показывать как общий `ОК`; нужен отдельный статус `Договор/заявка расходится` и запись в журнал расхождений.</w:t>
             </w:r>
           </w:p>
         </w:tc>
@@ -23268,7 +23932,7 @@
                 <w:color w:val="1E1E1E"/>
                 <w:sz w:val="15"/>
               </w:rPr>
-              <w:t>Live `limit=3` занимает десятки секунд, `limit=10` не подходит для синхронного экрана; полный договор/историю считать runner-ом.</w:t>
+              <w:t>Онлайн-срез из 3 поставок занимает десятки секунд; 10 поставок не подходят для синхронного экрана. Полный договор/историю считать фоновым обработчиком.</w:t>
             </w:r>
           </w:p>
         </w:tc>
@@ -23344,7 +24008,7 @@
           <w:rFonts w:ascii="Calibri" w:hAnsi="Calibri"/>
           <w:sz w:val="20"/>
         </w:rPr>
-        <w:t>Свежий кейс 660/1 воспроизводит live-итоги MariaDB: поступления/get_paidsum 2 331 111,33; реализация/get_realizsum 2 415 525,73; сальдо -84 414,40. Это критерий ERP-сальдовки, не критерий совпадения с 1С.</w:t>
+        <w:t>Свежий кейс 660/1 воспроизводит итоги ERP: поступления/get_paidsum 2 331 111,33; реализация/get_realizsum 2 415 525,73; сальдо -84 414,40. Это критерий ERP-сальдовки, не критерий совпадения с 1С.</w:t>
       </w:r>
     </w:p>
     <w:p>
@@ -23370,7 +24034,7 @@
           <w:rFonts w:ascii="Calibri" w:hAnsi="Calibri"/>
           <w:sz w:val="20"/>
         </w:rPr>
-        <w:t>На live-экране действует малый лимит и пагинация: по контрольному URL `client_id=221&amp;dog_id=88&amp;scope=legal` срез 3 поставок отрабатывает, а попытка 10 поставок уже неприемлема для синхронного запроса.</w:t>
+        <w:t>На онлайн-экране действует малый лимит и пагинация: срез из 3 поставок по ЮЛ `client_id=221` и договору `dog_id=88` отрабатывает, а попытка 10 поставок уже неприемлема для синхронного запроса.</w:t>
       </w:r>
     </w:p>
     <w:p>
@@ -23422,7 +24086,7 @@
           <w:rFonts w:ascii="Calibri" w:hAnsi="Calibri"/>
           <w:sz w:val="20"/>
         </w:rPr>
-        <w:t>Бейдж `1С: X/Y совпало` означает только документное сопоставление и не используется как итоговый статус совпадения сальдо.</w:t>
+        <w:t>На странице сальдо не показываются счетчики совпавших документов 1С; документное сопоставление находится только в `Мониторе ERP ↔ 1С`.</w:t>
       </w:r>
     </w:p>
     <w:p>
@@ -23435,7 +24099,7 @@
           <w:rFonts w:ascii="Calibri" w:hAnsi="Calibri"/>
           <w:sz w:val="20"/>
         </w:rPr>
-        <w:t>Для настоящей сверки ERP ↔ 1С есть отдельная страница `Монитор ERP ↔ 1С` с запуском `run_id`, статусом источников, блоком `ERP без 1С`, блоком `1С без ERP`, блоком полевых расхождений и блоком сальдо.</w:t>
+        <w:t>Для настоящей сверки ERP ↔ 1С есть отдельная страница `Монитор ERP ↔ 1С` с запуском `run_id`, статусом источников, блоком `ERP без 1С`, блоком `1С без ERP`, блоком расхождений по документам и блоком сальдо.</w:t>
       </w:r>
     </w:p>
     <w:p>
@@ -23461,7 +24125,7 @@
           <w:rFonts w:ascii="Calibri" w:hAnsi="Calibri"/>
           <w:sz w:val="20"/>
         </w:rPr>
-        <w:t>Runner для тяжелой исторической сверки сохраняет результат и не блокирует интерфейс синхронным пересчетом всей истории.</w:t>
+        <w:t>Фоновый обработчик для тяжелой исторической сверки сохраняет результат и не блокирует интерфейс синхронным пересчетом всей истории.</w:t>
       </w:r>
     </w:p>
     <w:p>
@@ -23488,19 +24152,6 @@
           <w:sz w:val="20"/>
         </w:rPr>
         <w:t>Журнал расхождений пишет тип ошибки, источник, операцию, суммы и контекст поставки.</w:t>
-      </w:r>
-    </w:p>
-    <w:p>
-      <w:pPr>
-        <w:pStyle w:val="ListBullet"/>
-        <w:spacing w:after="80" w:line="300" w:lineRule="auto"/>
-      </w:pPr>
-      <w:r>
-        <w:rPr>
-          <w:rFonts w:ascii="Calibri" w:hAnsi="Calibri"/>
-          <w:sz w:val="20"/>
-        </w:rPr>
-        <w:t>Автотесты live-валидации проходят: `npm test` по текущему PR.</w:t>
       </w:r>
     </w:p>
     <w:sectPr>

</xml_diff>